<commit_message>
V01 engraved pages 1-3
</commit_message>
<xml_diff>
--- a/Proof Reading and Review/TCB Mvt for Vn and Orch - Errata_v1.docx
+++ b/Proof Reading and Review/TCB Mvt for Vn and Orch - Errata_v1.docx
@@ -468,10 +468,14 @@
             <w:pPr>
               <w:rPr>
                 <w:rFonts w:ascii="Times" w:eastAsia="Times" w:hAnsi="Times" w:cs="Times"/>
-                <w:b/>
-                <w:bCs/>
-              </w:rPr>
-            </w:pPr>
+              </w:rPr>
+            </w:pPr>
+            <w:r>
+              <w:rPr>
+                <w:rFonts w:ascii="Times" w:eastAsia="Times" w:hAnsi="Times" w:cs="Times"/>
+              </w:rPr>
+              <w:t>Harp 1</w:t>
+            </w:r>
           </w:p>
         </w:tc>
         <w:tc>
@@ -489,10 +493,20 @@
             <w:pPr>
               <w:rPr>
                 <w:rFonts w:ascii="Times" w:eastAsia="Times" w:hAnsi="Times" w:cs="Times"/>
-                <w:b/>
-                <w:bCs/>
-              </w:rPr>
-            </w:pPr>
+              </w:rPr>
+            </w:pPr>
+            <w:r>
+              <w:rPr>
+                <w:rFonts w:ascii="Times" w:eastAsia="Times" w:hAnsi="Times" w:cs="Times"/>
+              </w:rPr>
+              <w:t>40</w:t>
+            </w:r>
+            <w:r>
+              <w:rPr>
+                <w:rFonts w:ascii="Times" w:eastAsia="Times" w:hAnsi="Times" w:cs="Times"/>
+              </w:rPr>
+              <w:t>-43</w:t>
+            </w:r>
           </w:p>
         </w:tc>
         <w:tc>
@@ -510,10 +524,62 @@
             <w:pPr>
               <w:rPr>
                 <w:rFonts w:ascii="Times" w:eastAsia="Times" w:hAnsi="Times" w:cs="Times"/>
-                <w:b/>
-                <w:bCs/>
-              </w:rPr>
-            </w:pPr>
+              </w:rPr>
+            </w:pPr>
+            <w:r>
+              <w:rPr>
+                <w:rFonts w:ascii="Times" w:eastAsia="Times" w:hAnsi="Times" w:cs="Times"/>
+              </w:rPr>
+              <w:t xml:space="preserve">Some harp chords don’t have arpeggiation in them. </w:t>
+            </w:r>
+            <w:proofErr w:type="gramStart"/>
+            <w:r>
+              <w:rPr>
+                <w:rFonts w:ascii="Times" w:eastAsia="Times" w:hAnsi="Times" w:cs="Times"/>
+              </w:rPr>
+              <w:t>This is</w:t>
+            </w:r>
+            <w:proofErr w:type="gramEnd"/>
+            <w:r>
+              <w:rPr>
+                <w:rFonts w:ascii="Times" w:eastAsia="Times" w:hAnsi="Times" w:cs="Times"/>
+              </w:rPr>
+              <w:t xml:space="preserve"> </w:t>
+            </w:r>
+            <w:proofErr w:type="gramStart"/>
+            <w:r>
+              <w:rPr>
+                <w:rFonts w:ascii="Times" w:eastAsia="Times" w:hAnsi="Times" w:cs="Times"/>
+              </w:rPr>
+              <w:t>intentional?</w:t>
+            </w:r>
+            <w:proofErr w:type="gramEnd"/>
+            <w:r>
+              <w:rPr>
+                <w:rFonts w:ascii="Times" w:eastAsia="Times" w:hAnsi="Times" w:cs="Times"/>
+              </w:rPr>
+              <w:t xml:space="preserve"> </w:t>
+            </w:r>
+          </w:p>
+          <w:p>
+            <w:pPr>
+              <w:rPr>
+                <w:rFonts w:ascii="Times" w:eastAsia="Times" w:hAnsi="Times" w:cs="Times"/>
+              </w:rPr>
+            </w:pPr>
+          </w:p>
+          <w:p>
+            <w:pPr>
+              <w:rPr>
+                <w:rFonts w:ascii="Times" w:eastAsia="Times" w:hAnsi="Times" w:cs="Times"/>
+              </w:rPr>
+            </w:pPr>
+            <w:r>
+              <w:rPr>
+                <w:rFonts w:ascii="Times" w:eastAsia="Times" w:hAnsi="Times" w:cs="Times"/>
+              </w:rPr>
+              <w:t xml:space="preserve">Likewise, to save space, would you be okay if we use C-flat major instead of D major for the harp’s key signature? </w:t>
+            </w:r>
           </w:p>
         </w:tc>
         <w:tc>
@@ -531,8 +597,6 @@
             <w:pPr>
               <w:rPr>
                 <w:rFonts w:ascii="Times" w:eastAsia="Times" w:hAnsi="Times" w:cs="Times"/>
-                <w:b/>
-                <w:bCs/>
               </w:rPr>
             </w:pPr>
           </w:p>
@@ -557,10 +621,14 @@
             <w:pPr>
               <w:rPr>
                 <w:rFonts w:ascii="Times" w:eastAsia="Times" w:hAnsi="Times" w:cs="Times"/>
-                <w:b/>
-                <w:bCs/>
-              </w:rPr>
-            </w:pPr>
+              </w:rPr>
+            </w:pPr>
+            <w:r>
+              <w:rPr>
+                <w:rFonts w:ascii="Times" w:eastAsia="Times" w:hAnsi="Times" w:cs="Times"/>
+              </w:rPr>
+              <w:t>Viola</w:t>
+            </w:r>
           </w:p>
         </w:tc>
         <w:tc>
@@ -578,10 +646,14 @@
             <w:pPr>
               <w:rPr>
                 <w:rFonts w:ascii="Times" w:eastAsia="Times" w:hAnsi="Times" w:cs="Times"/>
-                <w:b/>
-                <w:bCs/>
-              </w:rPr>
-            </w:pPr>
+              </w:rPr>
+            </w:pPr>
+            <w:r>
+              <w:rPr>
+                <w:rFonts w:ascii="Times" w:eastAsia="Times" w:hAnsi="Times" w:cs="Times"/>
+              </w:rPr>
+              <w:t>43</w:t>
+            </w:r>
           </w:p>
         </w:tc>
         <w:tc>
@@ -599,10 +671,27 @@
             <w:pPr>
               <w:rPr>
                 <w:rFonts w:ascii="Times" w:eastAsia="Times" w:hAnsi="Times" w:cs="Times"/>
-                <w:b/>
-                <w:bCs/>
-              </w:rPr>
-            </w:pPr>
+              </w:rPr>
+            </w:pPr>
+            <w:r>
+              <w:rPr>
+                <w:rFonts w:ascii="Times" w:eastAsia="Times" w:hAnsi="Times" w:cs="Times"/>
+              </w:rPr>
+              <w:t>4</w:t>
+            </w:r>
+            <w:r>
+              <w:rPr>
+                <w:rFonts w:ascii="Times" w:eastAsia="Times" w:hAnsi="Times" w:cs="Times"/>
+                <w:vertAlign w:val="superscript"/>
+              </w:rPr>
+              <w:t>th</w:t>
+            </w:r>
+            <w:r>
+              <w:rPr>
+                <w:rFonts w:ascii="Times" w:eastAsia="Times" w:hAnsi="Times" w:cs="Times"/>
+              </w:rPr>
+              <w:t xml:space="preserve"> beat, slur or tied staccato? </w:t>
+            </w:r>
           </w:p>
         </w:tc>
         <w:tc>
@@ -620,8 +709,6 @@
             <w:pPr>
               <w:rPr>
                 <w:rFonts w:ascii="Times" w:eastAsia="Times" w:hAnsi="Times" w:cs="Times"/>
-                <w:b/>
-                <w:bCs/>
               </w:rPr>
             </w:pPr>
           </w:p>
@@ -646,8 +733,6 @@
             <w:pPr>
               <w:rPr>
                 <w:rFonts w:ascii="Times" w:eastAsia="Times" w:hAnsi="Times" w:cs="Times"/>
-                <w:b/>
-                <w:bCs/>
               </w:rPr>
             </w:pPr>
           </w:p>
@@ -667,8 +752,6 @@
             <w:pPr>
               <w:rPr>
                 <w:rFonts w:ascii="Times" w:eastAsia="Times" w:hAnsi="Times" w:cs="Times"/>
-                <w:b/>
-                <w:bCs/>
               </w:rPr>
             </w:pPr>
           </w:p>
@@ -688,8 +771,6 @@
             <w:pPr>
               <w:rPr>
                 <w:rFonts w:ascii="Times" w:eastAsia="Times" w:hAnsi="Times" w:cs="Times"/>
-                <w:b/>
-                <w:bCs/>
               </w:rPr>
             </w:pPr>
           </w:p>
@@ -709,8 +790,6 @@
             <w:pPr>
               <w:rPr>
                 <w:rFonts w:ascii="Times" w:eastAsia="Times" w:hAnsi="Times" w:cs="Times"/>
-                <w:b/>
-                <w:bCs/>
               </w:rPr>
             </w:pPr>
           </w:p>
@@ -735,8 +814,6 @@
             <w:pPr>
               <w:rPr>
                 <w:rFonts w:ascii="Times" w:eastAsia="Times" w:hAnsi="Times" w:cs="Times"/>
-                <w:b/>
-                <w:bCs/>
               </w:rPr>
             </w:pPr>
           </w:p>
@@ -756,8 +833,6 @@
             <w:pPr>
               <w:rPr>
                 <w:rFonts w:ascii="Times" w:eastAsia="Times" w:hAnsi="Times" w:cs="Times"/>
-                <w:b/>
-                <w:bCs/>
               </w:rPr>
             </w:pPr>
           </w:p>
@@ -777,8 +852,6 @@
             <w:pPr>
               <w:rPr>
                 <w:rFonts w:ascii="Times" w:eastAsia="Times" w:hAnsi="Times" w:cs="Times"/>
-                <w:b/>
-                <w:bCs/>
               </w:rPr>
             </w:pPr>
           </w:p>
@@ -798,8 +871,6 @@
             <w:pPr>
               <w:rPr>
                 <w:rFonts w:ascii="Times" w:eastAsia="Times" w:hAnsi="Times" w:cs="Times"/>
-                <w:b/>
-                <w:bCs/>
               </w:rPr>
             </w:pPr>
           </w:p>
@@ -824,8 +895,6 @@
             <w:pPr>
               <w:rPr>
                 <w:rFonts w:ascii="Times" w:eastAsia="Times" w:hAnsi="Times" w:cs="Times"/>
-                <w:b/>
-                <w:bCs/>
               </w:rPr>
             </w:pPr>
           </w:p>
@@ -845,8 +914,6 @@
             <w:pPr>
               <w:rPr>
                 <w:rFonts w:ascii="Times" w:eastAsia="Times" w:hAnsi="Times" w:cs="Times"/>
-                <w:b/>
-                <w:bCs/>
               </w:rPr>
             </w:pPr>
           </w:p>
@@ -866,8 +933,6 @@
             <w:pPr>
               <w:rPr>
                 <w:rFonts w:ascii="Times" w:eastAsia="Times" w:hAnsi="Times" w:cs="Times"/>
-                <w:b/>
-                <w:bCs/>
               </w:rPr>
             </w:pPr>
           </w:p>
@@ -887,8 +952,6 @@
             <w:pPr>
               <w:rPr>
                 <w:rFonts w:ascii="Times" w:eastAsia="Times" w:hAnsi="Times" w:cs="Times"/>
-                <w:b/>
-                <w:bCs/>
               </w:rPr>
             </w:pPr>
           </w:p>
@@ -913,8 +976,6 @@
             <w:pPr>
               <w:rPr>
                 <w:rFonts w:ascii="Times" w:eastAsia="Times" w:hAnsi="Times" w:cs="Times"/>
-                <w:b/>
-                <w:bCs/>
               </w:rPr>
             </w:pPr>
           </w:p>
@@ -934,8 +995,6 @@
             <w:pPr>
               <w:rPr>
                 <w:rFonts w:ascii="Times" w:eastAsia="Times" w:hAnsi="Times" w:cs="Times"/>
-                <w:b/>
-                <w:bCs/>
               </w:rPr>
             </w:pPr>
           </w:p>
@@ -955,8 +1014,6 @@
             <w:pPr>
               <w:rPr>
                 <w:rFonts w:ascii="Times" w:eastAsia="Times" w:hAnsi="Times" w:cs="Times"/>
-                <w:b/>
-                <w:bCs/>
               </w:rPr>
             </w:pPr>
           </w:p>
@@ -976,8 +1033,6 @@
             <w:pPr>
               <w:rPr>
                 <w:rFonts w:ascii="Times" w:eastAsia="Times" w:hAnsi="Times" w:cs="Times"/>
-                <w:b/>
-                <w:bCs/>
               </w:rPr>
             </w:pPr>
           </w:p>
@@ -1002,8 +1057,6 @@
             <w:pPr>
               <w:rPr>
                 <w:rFonts w:ascii="Times" w:eastAsia="Times" w:hAnsi="Times" w:cs="Times"/>
-                <w:b/>
-                <w:bCs/>
               </w:rPr>
             </w:pPr>
           </w:p>
@@ -1023,8 +1076,6 @@
             <w:pPr>
               <w:rPr>
                 <w:rFonts w:ascii="Times" w:eastAsia="Times" w:hAnsi="Times" w:cs="Times"/>
-                <w:b/>
-                <w:bCs/>
               </w:rPr>
             </w:pPr>
           </w:p>
@@ -1044,8 +1095,6 @@
             <w:pPr>
               <w:rPr>
                 <w:rFonts w:ascii="Times" w:eastAsia="Times" w:hAnsi="Times" w:cs="Times"/>
-                <w:b/>
-                <w:bCs/>
               </w:rPr>
             </w:pPr>
           </w:p>
@@ -1065,8 +1114,6 @@
             <w:pPr>
               <w:rPr>
                 <w:rFonts w:ascii="Times" w:eastAsia="Times" w:hAnsi="Times" w:cs="Times"/>
-                <w:b/>
-                <w:bCs/>
               </w:rPr>
             </w:pPr>
           </w:p>
@@ -1091,8 +1138,6 @@
             <w:pPr>
               <w:rPr>
                 <w:rFonts w:ascii="Times" w:eastAsia="Times" w:hAnsi="Times" w:cs="Times"/>
-                <w:b/>
-                <w:bCs/>
               </w:rPr>
             </w:pPr>
           </w:p>
@@ -1112,8 +1157,6 @@
             <w:pPr>
               <w:rPr>
                 <w:rFonts w:ascii="Times" w:eastAsia="Times" w:hAnsi="Times" w:cs="Times"/>
-                <w:b/>
-                <w:bCs/>
               </w:rPr>
             </w:pPr>
           </w:p>
@@ -1133,8 +1176,6 @@
             <w:pPr>
               <w:rPr>
                 <w:rFonts w:ascii="Times" w:eastAsia="Times" w:hAnsi="Times" w:cs="Times"/>
-                <w:b/>
-                <w:bCs/>
               </w:rPr>
             </w:pPr>
           </w:p>
@@ -1154,8 +1195,6 @@
             <w:pPr>
               <w:rPr>
                 <w:rFonts w:ascii="Times" w:eastAsia="Times" w:hAnsi="Times" w:cs="Times"/>
-                <w:b/>
-                <w:bCs/>
               </w:rPr>
             </w:pPr>
           </w:p>
@@ -1180,8 +1219,6 @@
             <w:pPr>
               <w:rPr>
                 <w:rFonts w:ascii="Times" w:eastAsia="Times" w:hAnsi="Times" w:cs="Times"/>
-                <w:b/>
-                <w:bCs/>
               </w:rPr>
             </w:pPr>
           </w:p>
@@ -1201,8 +1238,6 @@
             <w:pPr>
               <w:rPr>
                 <w:rFonts w:ascii="Times" w:eastAsia="Times" w:hAnsi="Times" w:cs="Times"/>
-                <w:b/>
-                <w:bCs/>
               </w:rPr>
             </w:pPr>
           </w:p>
@@ -1222,8 +1257,6 @@
             <w:pPr>
               <w:rPr>
                 <w:rFonts w:ascii="Times" w:eastAsia="Times" w:hAnsi="Times" w:cs="Times"/>
-                <w:b/>
-                <w:bCs/>
               </w:rPr>
             </w:pPr>
           </w:p>
@@ -1243,8 +1276,6 @@
             <w:pPr>
               <w:rPr>
                 <w:rFonts w:ascii="Times" w:eastAsia="Times" w:hAnsi="Times" w:cs="Times"/>
-                <w:b/>
-                <w:bCs/>
               </w:rPr>
             </w:pPr>
           </w:p>
@@ -1269,8 +1300,6 @@
             <w:pPr>
               <w:rPr>
                 <w:rFonts w:ascii="Times" w:eastAsia="Times" w:hAnsi="Times" w:cs="Times"/>
-                <w:b/>
-                <w:bCs/>
               </w:rPr>
             </w:pPr>
           </w:p>
@@ -1290,8 +1319,6 @@
             <w:pPr>
               <w:rPr>
                 <w:rFonts w:ascii="Times" w:eastAsia="Times" w:hAnsi="Times" w:cs="Times"/>
-                <w:b/>
-                <w:bCs/>
               </w:rPr>
             </w:pPr>
           </w:p>
@@ -1311,8 +1338,6 @@
             <w:pPr>
               <w:rPr>
                 <w:rFonts w:ascii="Times" w:eastAsia="Times" w:hAnsi="Times" w:cs="Times"/>
-                <w:b/>
-                <w:bCs/>
               </w:rPr>
             </w:pPr>
           </w:p>
@@ -1332,8 +1357,6 @@
             <w:pPr>
               <w:rPr>
                 <w:rFonts w:ascii="Times" w:eastAsia="Times" w:hAnsi="Times" w:cs="Times"/>
-                <w:b/>
-                <w:bCs/>
               </w:rPr>
             </w:pPr>
           </w:p>
@@ -1475,7 +1498,6 @@
           <w:b/>
           <w:bCs/>
         </w:rPr>
-        <w:lastRenderedPageBreak/>
         <w:t xml:space="preserve">Prevous Errata (version 0 - solo </w:t>
       </w:r>
       <w:proofErr w:type="spellStart"/>
@@ -1755,21 +1777,7 @@
               <w:rPr>
                 <w:rFonts w:ascii="Times" w:eastAsia="Times" w:hAnsi="Times" w:cs="Times"/>
               </w:rPr>
-              <w:t xml:space="preserve">Technically does the </w:t>
-            </w:r>
-            <w:proofErr w:type="spellStart"/>
-            <w:r>
-              <w:rPr>
-                <w:rFonts w:ascii="Times" w:eastAsia="Times" w:hAnsi="Times" w:cs="Times"/>
-              </w:rPr>
-              <w:t>sul</w:t>
-            </w:r>
-            <w:proofErr w:type="spellEnd"/>
-            <w:r>
-              <w:rPr>
-                <w:rFonts w:ascii="Times" w:eastAsia="Times" w:hAnsi="Times" w:cs="Times"/>
-              </w:rPr>
-              <w:t xml:space="preserve"> G continue from m. 19 till the F in m. 27? Will format accordingly</w:t>
+              <w:t>Technically does the sul G continue from m. 19 till the F in m. 27? Will format accordingly</w:t>
             </w:r>
           </w:p>
         </w:tc>
@@ -2614,6 +2622,44 @@
     </w:sectPr>
   </w:body>
 </w:document>
+</file>
+
+<file path=word/endnotes.xml><?xml version="1.0" encoding="utf-8"?>
+<w:endnotes xmlns:wpc="http://schemas.microsoft.com/office/word/2010/wordprocessingCanvas" xmlns:cx="http://schemas.microsoft.com/office/drawing/2014/chartex" xmlns:cx1="http://schemas.microsoft.com/office/drawing/2015/9/8/chartex" xmlns:cx2="http://schemas.microsoft.com/office/drawing/2015/10/21/chartex" xmlns:cx3="http://schemas.microsoft.com/office/drawing/2016/5/9/chartex" xmlns:cx4="http://schemas.microsoft.com/office/drawing/2016/5/10/chartex" xmlns:cx5="http://schemas.microsoft.com/office/drawing/2016/5/11/chartex" xmlns:cx6="http://schemas.microsoft.com/office/drawing/2016/5/12/chartex" xmlns:cx7="http://schemas.microsoft.com/office/drawing/2016/5/13/chartex" xmlns:cx8="http://schemas.microsoft.com/office/drawing/2016/5/14/chartex" xmlns:mc="http://schemas.openxmlformats.org/markup-compatibility/2006" xmlns:aink="http://schemas.microsoft.com/office/drawing/2016/ink" xmlns:am3d="http://schemas.microsoft.com/office/drawing/2017/model3d" xmlns:o="urn:schemas-microsoft-com:office:office" xmlns:oel="http://schemas.microsoft.com/office/2019/extlst" xmlns:r="http://schemas.openxmlformats.org/officeDocument/2006/relationships" xmlns:m="http://schemas.openxmlformats.org/officeDocument/2006/math" xmlns:v="urn:schemas-microsoft-com:vml" xmlns:wp14="http://schemas.microsoft.com/office/word/2010/wordprocessingDrawing" xmlns:wp="http://schemas.openxmlformats.org/drawingml/2006/wordprocessingDrawing" xmlns:w10="urn:schemas-microsoft-com:office:word" xmlns:w="http://schemas.openxmlformats.org/wordprocessingml/2006/main" xmlns:w14="http://schemas.microsoft.com/office/word/2010/wordml" xmlns:w15="http://schemas.microsoft.com/office/word/2012/wordml" xmlns:w16cex="http://schemas.microsoft.com/office/word/2018/wordml/cex" xmlns:w16cid="http://schemas.microsoft.com/office/word/2016/wordml/cid" xmlns:w16="http://schemas.microsoft.com/office/word/2018/wordml" xmlns:w16du="http://schemas.microsoft.com/office/word/2023/wordml/word16du" xmlns:w16sdtdh="http://schemas.microsoft.com/office/word/2020/wordml/sdtdatahash" xmlns:w16sdtfl="http://schemas.microsoft.com/office/word/2024/wordml/sdtformatlock" xmlns:w16se="http://schemas.microsoft.com/office/word/2015/wordml/symex" xmlns:wpg="http://schemas.microsoft.com/office/word/2010/wordprocessingGroup" xmlns:wpi="http://schemas.microsoft.com/office/word/2010/wordprocessingInk" xmlns:wne="http://schemas.microsoft.com/office/word/2006/wordml" xmlns:wps="http://schemas.microsoft.com/office/word/2010/wordprocessingShape" mc:Ignorable="w14 w15 w16se w16cid w16 w16cex w16sdtdh w16sdtfl w16du wp14">
+  <w:endnote w:type="separator" w:id="-1">
+    <w:p>
+      <w:r>
+        <w:separator/>
+      </w:r>
+    </w:p>
+  </w:endnote>
+  <w:endnote w:type="continuationSeparator" w:id="0">
+    <w:p>
+      <w:r>
+        <w:continuationSeparator/>
+      </w:r>
+    </w:p>
+  </w:endnote>
+</w:endnotes>
+</file>
+
+<file path=word/footnotes.xml><?xml version="1.0" encoding="utf-8"?>
+<w:footnotes xmlns:wpc="http://schemas.microsoft.com/office/word/2010/wordprocessingCanvas" xmlns:cx="http://schemas.microsoft.com/office/drawing/2014/chartex" xmlns:cx1="http://schemas.microsoft.com/office/drawing/2015/9/8/chartex" xmlns:cx2="http://schemas.microsoft.com/office/drawing/2015/10/21/chartex" xmlns:cx3="http://schemas.microsoft.com/office/drawing/2016/5/9/chartex" xmlns:cx4="http://schemas.microsoft.com/office/drawing/2016/5/10/chartex" xmlns:cx5="http://schemas.microsoft.com/office/drawing/2016/5/11/chartex" xmlns:cx6="http://schemas.microsoft.com/office/drawing/2016/5/12/chartex" xmlns:cx7="http://schemas.microsoft.com/office/drawing/2016/5/13/chartex" xmlns:cx8="http://schemas.microsoft.com/office/drawing/2016/5/14/chartex" xmlns:mc="http://schemas.openxmlformats.org/markup-compatibility/2006" xmlns:aink="http://schemas.microsoft.com/office/drawing/2016/ink" xmlns:am3d="http://schemas.microsoft.com/office/drawing/2017/model3d" xmlns:o="urn:schemas-microsoft-com:office:office" xmlns:oel="http://schemas.microsoft.com/office/2019/extlst" xmlns:r="http://schemas.openxmlformats.org/officeDocument/2006/relationships" xmlns:m="http://schemas.openxmlformats.org/officeDocument/2006/math" xmlns:v="urn:schemas-microsoft-com:vml" xmlns:wp14="http://schemas.microsoft.com/office/word/2010/wordprocessingDrawing" xmlns:wp="http://schemas.openxmlformats.org/drawingml/2006/wordprocessingDrawing" xmlns:w10="urn:schemas-microsoft-com:office:word" xmlns:w="http://schemas.openxmlformats.org/wordprocessingml/2006/main" xmlns:w14="http://schemas.microsoft.com/office/word/2010/wordml" xmlns:w15="http://schemas.microsoft.com/office/word/2012/wordml" xmlns:w16cex="http://schemas.microsoft.com/office/word/2018/wordml/cex" xmlns:w16cid="http://schemas.microsoft.com/office/word/2016/wordml/cid" xmlns:w16="http://schemas.microsoft.com/office/word/2018/wordml" xmlns:w16du="http://schemas.microsoft.com/office/word/2023/wordml/word16du" xmlns:w16sdtdh="http://schemas.microsoft.com/office/word/2020/wordml/sdtdatahash" xmlns:w16sdtfl="http://schemas.microsoft.com/office/word/2024/wordml/sdtformatlock" xmlns:w16se="http://schemas.microsoft.com/office/word/2015/wordml/symex" xmlns:wpg="http://schemas.microsoft.com/office/word/2010/wordprocessingGroup" xmlns:wpi="http://schemas.microsoft.com/office/word/2010/wordprocessingInk" xmlns:wne="http://schemas.microsoft.com/office/word/2006/wordml" xmlns:wps="http://schemas.microsoft.com/office/word/2010/wordprocessingShape" mc:Ignorable="w14 w15 w16se w16cid w16 w16cex w16sdtdh w16sdtfl w16du wp14">
+  <w:footnote w:type="separator" w:id="-1">
+    <w:p>
+      <w:r>
+        <w:separator/>
+      </w:r>
+    </w:p>
+  </w:footnote>
+  <w:footnote w:type="continuationSeparator" w:id="0">
+    <w:p>
+      <w:r>
+        <w:continuationSeparator/>
+      </w:r>
+    </w:p>
+  </w:footnote>
+</w:footnotes>
 </file>
 
 <file path=word/numbering.xml><?xml version="1.0" encoding="utf-8"?>
@@ -4298,6 +4344,48 @@
       <w:spacing w:val="5"/>
     </w:rPr>
   </w:style>
+  <w:style w:type="paragraph" w:styleId="Header">
+    <w:name w:val="header"/>
+    <w:basedOn w:val="Normal"/>
+    <w:link w:val="HeaderChar"/>
+    <w:uiPriority w:val="99"/>
+    <w:unhideWhenUsed/>
+    <w:rsid w:val="00E3284F"/>
+    <w:pPr>
+      <w:tabs>
+        <w:tab w:val="center" w:pos="4513"/>
+        <w:tab w:val="right" w:pos="9026"/>
+      </w:tabs>
+    </w:pPr>
+  </w:style>
+  <w:style w:type="character" w:customStyle="1" w:styleId="HeaderChar">
+    <w:name w:val="Header Char"/>
+    <w:basedOn w:val="DefaultParagraphFont"/>
+    <w:link w:val="Header"/>
+    <w:uiPriority w:val="99"/>
+    <w:rsid w:val="00E3284F"/>
+  </w:style>
+  <w:style w:type="paragraph" w:styleId="Footer">
+    <w:name w:val="footer"/>
+    <w:basedOn w:val="Normal"/>
+    <w:link w:val="FooterChar"/>
+    <w:uiPriority w:val="99"/>
+    <w:unhideWhenUsed/>
+    <w:rsid w:val="00E3284F"/>
+    <w:pPr>
+      <w:tabs>
+        <w:tab w:val="center" w:pos="4513"/>
+        <w:tab w:val="right" w:pos="9026"/>
+      </w:tabs>
+    </w:pPr>
+  </w:style>
+  <w:style w:type="character" w:customStyle="1" w:styleId="FooterChar">
+    <w:name w:val="Footer Char"/>
+    <w:basedOn w:val="DefaultParagraphFont"/>
+    <w:link w:val="Footer"/>
+    <w:uiPriority w:val="99"/>
+    <w:rsid w:val="00E3284F"/>
+  </w:style>
 </w:styles>
 </file>
 

</xml_diff>

<commit_message>
V03: Did page 5, made some minor edits to previous pages.
</commit_message>
<xml_diff>
--- a/Proof Reading and Review/TCB Mvt for Vn and Orch - Errata_v1.docx
+++ b/Proof Reading and Review/TCB Mvt for Vn and Orch - Errata_v1.docx
@@ -212,7 +212,7 @@
       <w:r>
         <w:rPr>
           <w:rFonts w:ascii="Times" w:eastAsia="Times" w:hAnsi="Times" w:cs="Times"/>
-          <w:color w:val="E97132" w:themeColor="accent2"/>
+          <w:color w:val="E97132"/>
           <w:sz w:val="20"/>
           <w:szCs w:val="20"/>
         </w:rPr>
@@ -474,7 +474,7 @@
               <w:rPr>
                 <w:rFonts w:ascii="Times" w:eastAsia="Times" w:hAnsi="Times" w:cs="Times"/>
               </w:rPr>
-              <w:t>Harp 1</w:t>
+              <w:t>All instruments</w:t>
             </w:r>
           </w:p>
         </w:tc>
@@ -499,13 +499,7 @@
               <w:rPr>
                 <w:rFonts w:ascii="Times" w:eastAsia="Times" w:hAnsi="Times" w:cs="Times"/>
               </w:rPr>
-              <w:t>40</w:t>
-            </w:r>
-            <w:r>
-              <w:rPr>
-                <w:rFonts w:ascii="Times" w:eastAsia="Times" w:hAnsi="Times" w:cs="Times"/>
-              </w:rPr>
-              <w:t>-43</w:t>
+              <w:t>Whole score</w:t>
             </w:r>
           </w:p>
         </w:tc>
@@ -530,55 +524,62 @@
               <w:rPr>
                 <w:rFonts w:ascii="Times" w:eastAsia="Times" w:hAnsi="Times" w:cs="Times"/>
               </w:rPr>
-              <w:t xml:space="preserve">Some harp chords don’t have arpeggiation in them. </w:t>
-            </w:r>
-            <w:proofErr w:type="gramStart"/>
-            <w:r>
-              <w:rPr>
-                <w:rFonts w:ascii="Times" w:eastAsia="Times" w:hAnsi="Times" w:cs="Times"/>
-              </w:rPr>
-              <w:t>This is</w:t>
-            </w:r>
-            <w:proofErr w:type="gramEnd"/>
-            <w:r>
-              <w:rPr>
-                <w:rFonts w:ascii="Times" w:eastAsia="Times" w:hAnsi="Times" w:cs="Times"/>
-              </w:rPr>
-              <w:t xml:space="preserve"> </w:t>
-            </w:r>
-            <w:proofErr w:type="gramStart"/>
-            <w:r>
-              <w:rPr>
-                <w:rFonts w:ascii="Times" w:eastAsia="Times" w:hAnsi="Times" w:cs="Times"/>
-              </w:rPr>
-              <w:t>intentional?</w:t>
-            </w:r>
-            <w:proofErr w:type="gramEnd"/>
-            <w:r>
-              <w:rPr>
-                <w:rFonts w:ascii="Times" w:eastAsia="Times" w:hAnsi="Times" w:cs="Times"/>
-              </w:rPr>
-              <w:t xml:space="preserve"> </w:t>
-            </w:r>
-          </w:p>
-          <w:p>
-            <w:pPr>
-              <w:rPr>
-                <w:rFonts w:ascii="Times" w:eastAsia="Times" w:hAnsi="Times" w:cs="Times"/>
-              </w:rPr>
-            </w:pPr>
-          </w:p>
-          <w:p>
-            <w:pPr>
-              <w:rPr>
-                <w:rFonts w:ascii="Times" w:eastAsia="Times" w:hAnsi="Times" w:cs="Times"/>
-              </w:rPr>
-            </w:pPr>
-            <w:r>
-              <w:rPr>
-                <w:rFonts w:ascii="Times" w:eastAsia="Times" w:hAnsi="Times" w:cs="Times"/>
-              </w:rPr>
-              <w:t xml:space="preserve">Likewise, to save space, would you be okay if we use C-flat major instead of D major for the harp’s key signature? </w:t>
+              <w:t xml:space="preserve">There </w:t>
+            </w:r>
+            <w:r>
+              <w:rPr>
+                <w:rFonts w:ascii="Times" w:eastAsia="Times" w:hAnsi="Times" w:cs="Times"/>
+              </w:rPr>
+              <w:t xml:space="preserve">are </w:t>
+            </w:r>
+            <w:r>
+              <w:rPr>
+                <w:rFonts w:ascii="Times" w:eastAsia="Times" w:hAnsi="Times" w:cs="Times"/>
+              </w:rPr>
+              <w:t>many cautionary accidentals throughout the piece</w:t>
+            </w:r>
+            <w:r>
+              <w:rPr>
+                <w:rFonts w:ascii="Times" w:eastAsia="Times" w:hAnsi="Times" w:cs="Times"/>
+              </w:rPr>
+              <w:t xml:space="preserve"> that may be deleted since it may be obvious</w:t>
+            </w:r>
+            <w:r>
+              <w:rPr>
+                <w:rFonts w:ascii="Times" w:eastAsia="Times" w:hAnsi="Times" w:cs="Times"/>
+              </w:rPr>
+              <w:t xml:space="preserve">. E.g. Oboe </w:t>
+            </w:r>
+            <w:r>
+              <w:rPr>
+                <w:rFonts w:ascii="Times" w:eastAsia="Times" w:hAnsi="Times" w:cs="Times"/>
+              </w:rPr>
+              <w:t xml:space="preserve">Bar </w:t>
+            </w:r>
+            <w:r>
+              <w:rPr>
+                <w:rFonts w:ascii="Times" w:eastAsia="Times" w:hAnsi="Times" w:cs="Times"/>
+              </w:rPr>
+              <w:t>60, 4</w:t>
+            </w:r>
+            <w:r>
+              <w:rPr>
+                <w:rFonts w:ascii="Times" w:eastAsia="Times" w:hAnsi="Times" w:cs="Times"/>
+                <w:vertAlign w:val="superscript"/>
+              </w:rPr>
+              <w:t>th</w:t>
+            </w:r>
+            <w:r>
+              <w:rPr>
+                <w:rFonts w:ascii="Times" w:eastAsia="Times" w:hAnsi="Times" w:cs="Times"/>
+              </w:rPr>
+              <w:t xml:space="preserve"> beat</w:t>
+            </w:r>
+            <w:r>
+              <w:rPr>
+                <w:rFonts w:ascii="Times" w:eastAsia="Times" w:hAnsi="Times" w:cs="Times"/>
+              </w:rPr>
+              <w:t xml:space="preserve"> obvious C#. </w:t>
             </w:r>
           </w:p>
         </w:tc>
@@ -627,7 +628,13 @@
               <w:rPr>
                 <w:rFonts w:ascii="Times" w:eastAsia="Times" w:hAnsi="Times" w:cs="Times"/>
               </w:rPr>
-              <w:t>Viola</w:t>
+              <w:t xml:space="preserve">Violin </w:t>
+            </w:r>
+            <w:r>
+              <w:rPr>
+                <w:rFonts w:ascii="Times" w:eastAsia="Times" w:hAnsi="Times" w:cs="Times"/>
+              </w:rPr>
+              <w:t>II</w:t>
             </w:r>
           </w:p>
         </w:tc>
@@ -652,7 +659,7 @@
               <w:rPr>
                 <w:rFonts w:ascii="Times" w:eastAsia="Times" w:hAnsi="Times" w:cs="Times"/>
               </w:rPr>
-              <w:t>43</w:t>
+              <w:t>11</w:t>
             </w:r>
           </w:p>
         </w:tc>
@@ -677,20 +684,7 @@
               <w:rPr>
                 <w:rFonts w:ascii="Times" w:eastAsia="Times" w:hAnsi="Times" w:cs="Times"/>
               </w:rPr>
-              <w:t>4</w:t>
-            </w:r>
-            <w:r>
-              <w:rPr>
-                <w:rFonts w:ascii="Times" w:eastAsia="Times" w:hAnsi="Times" w:cs="Times"/>
-                <w:vertAlign w:val="superscript"/>
-              </w:rPr>
-              <w:t>th</w:t>
-            </w:r>
-            <w:r>
-              <w:rPr>
-                <w:rFonts w:ascii="Times" w:eastAsia="Times" w:hAnsi="Times" w:cs="Times"/>
-              </w:rPr>
-              <w:t xml:space="preserve"> beat, slur or tied staccato? </w:t>
+              <w:t xml:space="preserve">Is the slide meant to be glissando or portamento? </w:t>
             </w:r>
           </w:p>
         </w:tc>
@@ -735,6 +729,12 @@
                 <w:rFonts w:ascii="Times" w:eastAsia="Times" w:hAnsi="Times" w:cs="Times"/>
               </w:rPr>
             </w:pPr>
+            <w:r>
+              <w:rPr>
+                <w:rFonts w:ascii="Times" w:eastAsia="Times" w:hAnsi="Times" w:cs="Times"/>
+              </w:rPr>
+              <w:t>Violin I</w:t>
+            </w:r>
           </w:p>
         </w:tc>
         <w:tc>
@@ -754,6 +754,12 @@
                 <w:rFonts w:ascii="Times" w:eastAsia="Times" w:hAnsi="Times" w:cs="Times"/>
               </w:rPr>
             </w:pPr>
+            <w:r>
+              <w:rPr>
+                <w:rFonts w:ascii="Times" w:eastAsia="Times" w:hAnsi="Times" w:cs="Times"/>
+              </w:rPr>
+              <w:t>32</w:t>
+            </w:r>
           </w:p>
         </w:tc>
         <w:tc>
@@ -773,6 +779,12 @@
                 <w:rFonts w:ascii="Times" w:eastAsia="Times" w:hAnsi="Times" w:cs="Times"/>
               </w:rPr>
             </w:pPr>
+            <w:r>
+              <w:rPr>
+                <w:rFonts w:ascii="Times" w:eastAsia="Times" w:hAnsi="Times" w:cs="Times"/>
+              </w:rPr>
+              <w:t xml:space="preserve">Beat 1, possible missing decrescendo? </w:t>
+            </w:r>
           </w:p>
         </w:tc>
         <w:tc>
@@ -816,6 +828,12 @@
                 <w:rFonts w:ascii="Times" w:eastAsia="Times" w:hAnsi="Times" w:cs="Times"/>
               </w:rPr>
             </w:pPr>
+            <w:r>
+              <w:rPr>
+                <w:rFonts w:ascii="Times" w:eastAsia="Times" w:hAnsi="Times" w:cs="Times"/>
+              </w:rPr>
+              <w:t>Harp 1</w:t>
+            </w:r>
           </w:p>
         </w:tc>
         <w:tc>
@@ -835,6 +853,18 @@
                 <w:rFonts w:ascii="Times" w:eastAsia="Times" w:hAnsi="Times" w:cs="Times"/>
               </w:rPr>
             </w:pPr>
+            <w:r>
+              <w:rPr>
+                <w:rFonts w:ascii="Times" w:eastAsia="Times" w:hAnsi="Times" w:cs="Times"/>
+              </w:rPr>
+              <w:t>40</w:t>
+            </w:r>
+            <w:r>
+              <w:rPr>
+                <w:rFonts w:ascii="Times" w:eastAsia="Times" w:hAnsi="Times" w:cs="Times"/>
+              </w:rPr>
+              <w:t>-43</w:t>
+            </w:r>
           </w:p>
         </w:tc>
         <w:tc>
@@ -854,6 +884,32 @@
                 <w:rFonts w:ascii="Times" w:eastAsia="Times" w:hAnsi="Times" w:cs="Times"/>
               </w:rPr>
             </w:pPr>
+            <w:r>
+              <w:rPr>
+                <w:rFonts w:ascii="Times" w:eastAsia="Times" w:hAnsi="Times" w:cs="Times"/>
+              </w:rPr>
+              <w:t xml:space="preserve">Some harp chords don’t have arpeggiation in them. This is intentional? </w:t>
+            </w:r>
+          </w:p>
+          <w:p>
+            <w:pPr>
+              <w:rPr>
+                <w:rFonts w:ascii="Times" w:eastAsia="Times" w:hAnsi="Times" w:cs="Times"/>
+              </w:rPr>
+            </w:pPr>
+          </w:p>
+          <w:p>
+            <w:pPr>
+              <w:rPr>
+                <w:rFonts w:ascii="Times" w:eastAsia="Times" w:hAnsi="Times" w:cs="Times"/>
+              </w:rPr>
+            </w:pPr>
+            <w:r>
+              <w:rPr>
+                <w:rFonts w:ascii="Times" w:eastAsia="Times" w:hAnsi="Times" w:cs="Times"/>
+              </w:rPr>
+              <w:t xml:space="preserve">Likewise, to save space, would you be okay if we use C-flat major instead of D major for the harp’s key signature? </w:t>
+            </w:r>
           </w:p>
         </w:tc>
         <w:tc>
@@ -897,6 +953,12 @@
                 <w:rFonts w:ascii="Times" w:eastAsia="Times" w:hAnsi="Times" w:cs="Times"/>
               </w:rPr>
             </w:pPr>
+            <w:r>
+              <w:rPr>
+                <w:rFonts w:ascii="Times" w:eastAsia="Times" w:hAnsi="Times" w:cs="Times"/>
+              </w:rPr>
+              <w:t>Viola</w:t>
+            </w:r>
           </w:p>
         </w:tc>
         <w:tc>
@@ -916,6 +978,12 @@
                 <w:rFonts w:ascii="Times" w:eastAsia="Times" w:hAnsi="Times" w:cs="Times"/>
               </w:rPr>
             </w:pPr>
+            <w:r>
+              <w:rPr>
+                <w:rFonts w:ascii="Times" w:eastAsia="Times" w:hAnsi="Times" w:cs="Times"/>
+              </w:rPr>
+              <w:t>43</w:t>
+            </w:r>
           </w:p>
         </w:tc>
         <w:tc>
@@ -935,6 +1003,25 @@
                 <w:rFonts w:ascii="Times" w:eastAsia="Times" w:hAnsi="Times" w:cs="Times"/>
               </w:rPr>
             </w:pPr>
+            <w:r>
+              <w:rPr>
+                <w:rFonts w:ascii="Times" w:eastAsia="Times" w:hAnsi="Times" w:cs="Times"/>
+              </w:rPr>
+              <w:t>4</w:t>
+            </w:r>
+            <w:r>
+              <w:rPr>
+                <w:rFonts w:ascii="Times" w:eastAsia="Times" w:hAnsi="Times" w:cs="Times"/>
+                <w:vertAlign w:val="superscript"/>
+              </w:rPr>
+              <w:t>th</w:t>
+            </w:r>
+            <w:r>
+              <w:rPr>
+                <w:rFonts w:ascii="Times" w:eastAsia="Times" w:hAnsi="Times" w:cs="Times"/>
+              </w:rPr>
+              <w:t xml:space="preserve"> beat, slur or tied staccato? </w:t>
+            </w:r>
           </w:p>
         </w:tc>
         <w:tc>
@@ -978,6 +1065,12 @@
                 <w:rFonts w:ascii="Times" w:eastAsia="Times" w:hAnsi="Times" w:cs="Times"/>
               </w:rPr>
             </w:pPr>
+            <w:r>
+              <w:rPr>
+                <w:rFonts w:ascii="Times" w:eastAsia="Times" w:hAnsi="Times" w:cs="Times"/>
+              </w:rPr>
+              <w:t>Violin II</w:t>
+            </w:r>
           </w:p>
         </w:tc>
         <w:tc>
@@ -997,6 +1090,12 @@
                 <w:rFonts w:ascii="Times" w:eastAsia="Times" w:hAnsi="Times" w:cs="Times"/>
               </w:rPr>
             </w:pPr>
+            <w:r>
+              <w:rPr>
+                <w:rFonts w:ascii="Times" w:eastAsia="Times" w:hAnsi="Times" w:cs="Times"/>
+              </w:rPr>
+              <w:t>52</w:t>
+            </w:r>
           </w:p>
         </w:tc>
         <w:tc>
@@ -1016,6 +1115,12 @@
                 <w:rFonts w:ascii="Times" w:eastAsia="Times" w:hAnsi="Times" w:cs="Times"/>
               </w:rPr>
             </w:pPr>
+            <w:r>
+              <w:rPr>
+                <w:rFonts w:ascii="Times" w:eastAsia="Times" w:hAnsi="Times" w:cs="Times"/>
+              </w:rPr>
+              <w:t>Open A string unintentional harmonic mark?</w:t>
+            </w:r>
           </w:p>
         </w:tc>
         <w:tc>
@@ -1059,6 +1164,12 @@
                 <w:rFonts w:ascii="Times" w:eastAsia="Times" w:hAnsi="Times" w:cs="Times"/>
               </w:rPr>
             </w:pPr>
+            <w:r>
+              <w:rPr>
+                <w:rFonts w:ascii="Times" w:eastAsia="Times" w:hAnsi="Times" w:cs="Times"/>
+              </w:rPr>
+              <w:t>Horns</w:t>
+            </w:r>
           </w:p>
         </w:tc>
         <w:tc>
@@ -1078,6 +1189,12 @@
                 <w:rFonts w:ascii="Times" w:eastAsia="Times" w:hAnsi="Times" w:cs="Times"/>
               </w:rPr>
             </w:pPr>
+            <w:r>
+              <w:rPr>
+                <w:rFonts w:ascii="Times" w:eastAsia="Times" w:hAnsi="Times" w:cs="Times"/>
+              </w:rPr>
+              <w:t>55</w:t>
+            </w:r>
           </w:p>
         </w:tc>
         <w:tc>
@@ -1091,6 +1208,582 @@
             </w:tcBorders>
             <w:vAlign w:val="center"/>
           </w:tcPr>
+          <w:p>
+            <w:pPr>
+              <w:rPr>
+                <w:rFonts w:ascii="Times" w:eastAsia="Times" w:hAnsi="Times" w:cs="Times"/>
+              </w:rPr>
+            </w:pPr>
+            <w:r>
+              <w:rPr>
+                <w:rFonts w:ascii="Times" w:eastAsia="Times" w:hAnsi="Times" w:cs="Times"/>
+              </w:rPr>
+              <w:t xml:space="preserve">Dynamic swell with staccato intentional? </w:t>
+            </w:r>
+          </w:p>
+        </w:tc>
+        <w:tc>
+          <w:tcPr>
+            <w:tcW w:w="1024" w:type="pct"/>
+            <w:tcBorders>
+              <w:top w:val="single" w:sz="4" w:space="0" w:color="000000"/>
+              <w:left w:val="single" w:sz="4" w:space="0" w:color="000000"/>
+              <w:bottom w:val="single" w:sz="4" w:space="0" w:color="000000"/>
+              <w:right w:val="single" w:sz="4" w:space="0" w:color="000000"/>
+            </w:tcBorders>
+            <w:vAlign w:val="center"/>
+          </w:tcPr>
+          <w:p>
+            <w:pPr>
+              <w:rPr>
+                <w:rFonts w:ascii="Times" w:eastAsia="Times" w:hAnsi="Times" w:cs="Times"/>
+              </w:rPr>
+            </w:pPr>
+          </w:p>
+        </w:tc>
+      </w:tr>
+      <w:tr>
+        <w:trPr>
+          <w:trHeight w:val="350"/>
+        </w:trPr>
+        <w:tc>
+          <w:tcPr>
+            <w:tcW w:w="756" w:type="pct"/>
+            <w:tcBorders>
+              <w:top w:val="single" w:sz="4" w:space="0" w:color="000000"/>
+              <w:left w:val="single" w:sz="4" w:space="0" w:color="000000"/>
+              <w:bottom w:val="single" w:sz="4" w:space="0" w:color="000000"/>
+              <w:right w:val="single" w:sz="4" w:space="0" w:color="000000"/>
+            </w:tcBorders>
+            <w:vAlign w:val="center"/>
+          </w:tcPr>
+          <w:p>
+            <w:pPr>
+              <w:rPr>
+                <w:rFonts w:ascii="Times" w:eastAsia="Times" w:hAnsi="Times" w:cs="Times"/>
+                <w:color w:val="E97132"/>
+              </w:rPr>
+            </w:pPr>
+            <w:r>
+              <w:rPr>
+                <w:rFonts w:ascii="Times" w:eastAsia="Times" w:hAnsi="Times" w:cs="Times"/>
+                <w:color w:val="E97132"/>
+              </w:rPr>
+              <w:t>Strings</w:t>
+            </w:r>
+          </w:p>
+        </w:tc>
+        <w:tc>
+          <w:tcPr>
+            <w:tcW w:w="727" w:type="pct"/>
+            <w:tcBorders>
+              <w:top w:val="single" w:sz="4" w:space="0" w:color="000000"/>
+              <w:left w:val="single" w:sz="4" w:space="0" w:color="000000"/>
+              <w:bottom w:val="single" w:sz="4" w:space="0" w:color="000000"/>
+              <w:right w:val="single" w:sz="4" w:space="0" w:color="000000"/>
+            </w:tcBorders>
+            <w:vAlign w:val="center"/>
+          </w:tcPr>
+          <w:p>
+            <w:pPr>
+              <w:rPr>
+                <w:rFonts w:ascii="Times" w:eastAsia="Times" w:hAnsi="Times" w:cs="Times"/>
+                <w:color w:val="E97132"/>
+              </w:rPr>
+            </w:pPr>
+            <w:r>
+              <w:rPr>
+                <w:rFonts w:ascii="Times" w:eastAsia="Times" w:hAnsi="Times" w:cs="Times"/>
+                <w:color w:val="E97132"/>
+              </w:rPr>
+              <w:t>58-60</w:t>
+            </w:r>
+          </w:p>
+        </w:tc>
+        <w:tc>
+          <w:tcPr>
+            <w:tcW w:w="2493" w:type="pct"/>
+            <w:tcBorders>
+              <w:top w:val="single" w:sz="4" w:space="0" w:color="000000"/>
+              <w:left w:val="single" w:sz="4" w:space="0" w:color="000000"/>
+              <w:bottom w:val="single" w:sz="4" w:space="0" w:color="000000"/>
+              <w:right w:val="single" w:sz="4" w:space="0" w:color="000000"/>
+            </w:tcBorders>
+            <w:vAlign w:val="center"/>
+          </w:tcPr>
+          <w:p>
+            <w:pPr>
+              <w:rPr>
+                <w:rFonts w:ascii="Times" w:eastAsia="Times" w:hAnsi="Times" w:cs="Times"/>
+                <w:color w:val="E97132"/>
+              </w:rPr>
+            </w:pPr>
+            <w:proofErr w:type="spellStart"/>
+            <w:r>
+              <w:rPr>
+                <w:rFonts w:ascii="Times" w:eastAsia="Times" w:hAnsi="Times" w:cs="Times"/>
+                <w:color w:val="E97132"/>
+              </w:rPr>
+              <w:t>Enharmonics</w:t>
+            </w:r>
+            <w:proofErr w:type="spellEnd"/>
+            <w:r>
+              <w:rPr>
+                <w:rFonts w:ascii="Times" w:eastAsia="Times" w:hAnsi="Times" w:cs="Times"/>
+                <w:color w:val="E97132"/>
+              </w:rPr>
+              <w:t>: turned flats to sharps for ease of voice leading</w:t>
+            </w:r>
+            <w:r>
+              <w:rPr>
+                <w:rFonts w:ascii="Times" w:eastAsia="Times" w:hAnsi="Times" w:cs="Times"/>
+                <w:color w:val="E97132"/>
+              </w:rPr>
+              <w:t>.</w:t>
+            </w:r>
+          </w:p>
+        </w:tc>
+        <w:tc>
+          <w:tcPr>
+            <w:tcW w:w="1024" w:type="pct"/>
+            <w:tcBorders>
+              <w:top w:val="single" w:sz="4" w:space="0" w:color="000000"/>
+              <w:left w:val="single" w:sz="4" w:space="0" w:color="000000"/>
+              <w:bottom w:val="single" w:sz="4" w:space="0" w:color="000000"/>
+              <w:right w:val="single" w:sz="4" w:space="0" w:color="000000"/>
+            </w:tcBorders>
+            <w:vAlign w:val="center"/>
+          </w:tcPr>
+          <w:p>
+            <w:pPr>
+              <w:rPr>
+                <w:rFonts w:ascii="Times" w:eastAsia="Times" w:hAnsi="Times" w:cs="Times"/>
+              </w:rPr>
+            </w:pPr>
+          </w:p>
+        </w:tc>
+      </w:tr>
+      <w:tr>
+        <w:trPr>
+          <w:trHeight w:val="350"/>
+        </w:trPr>
+        <w:tc>
+          <w:tcPr>
+            <w:tcW w:w="756" w:type="pct"/>
+            <w:tcBorders>
+              <w:top w:val="single" w:sz="4" w:space="0" w:color="000000"/>
+              <w:left w:val="single" w:sz="4" w:space="0" w:color="000000"/>
+              <w:bottom w:val="single" w:sz="4" w:space="0" w:color="000000"/>
+              <w:right w:val="single" w:sz="4" w:space="0" w:color="000000"/>
+            </w:tcBorders>
+            <w:vAlign w:val="center"/>
+          </w:tcPr>
+          <w:p>
+            <w:pPr>
+              <w:rPr>
+                <w:rFonts w:ascii="Times" w:eastAsia="Times" w:hAnsi="Times" w:cs="Times"/>
+              </w:rPr>
+            </w:pPr>
+            <w:r>
+              <w:rPr>
+                <w:rFonts w:ascii="Times" w:eastAsia="Times" w:hAnsi="Times" w:cs="Times"/>
+              </w:rPr>
+              <w:t xml:space="preserve">Horns </w:t>
+            </w:r>
+          </w:p>
+        </w:tc>
+        <w:tc>
+          <w:tcPr>
+            <w:tcW w:w="727" w:type="pct"/>
+            <w:tcBorders>
+              <w:top w:val="single" w:sz="4" w:space="0" w:color="000000"/>
+              <w:left w:val="single" w:sz="4" w:space="0" w:color="000000"/>
+              <w:bottom w:val="single" w:sz="4" w:space="0" w:color="000000"/>
+              <w:right w:val="single" w:sz="4" w:space="0" w:color="000000"/>
+            </w:tcBorders>
+            <w:vAlign w:val="center"/>
+          </w:tcPr>
+          <w:p>
+            <w:pPr>
+              <w:rPr>
+                <w:rFonts w:ascii="Times" w:eastAsia="Times" w:hAnsi="Times" w:cs="Times"/>
+              </w:rPr>
+            </w:pPr>
+            <w:r>
+              <w:rPr>
+                <w:rFonts w:ascii="Times" w:eastAsia="Times" w:hAnsi="Times" w:cs="Times"/>
+              </w:rPr>
+              <w:t>60</w:t>
+            </w:r>
+          </w:p>
+        </w:tc>
+        <w:tc>
+          <w:tcPr>
+            <w:tcW w:w="2493" w:type="pct"/>
+            <w:tcBorders>
+              <w:top w:val="single" w:sz="4" w:space="0" w:color="000000"/>
+              <w:left w:val="single" w:sz="4" w:space="0" w:color="000000"/>
+              <w:bottom w:val="single" w:sz="4" w:space="0" w:color="000000"/>
+              <w:right w:val="single" w:sz="4" w:space="0" w:color="000000"/>
+            </w:tcBorders>
+            <w:vAlign w:val="center"/>
+          </w:tcPr>
+          <w:p>
+            <w:pPr>
+              <w:rPr>
+                <w:rFonts w:ascii="Times" w:eastAsia="Times" w:hAnsi="Times" w:cs="Times"/>
+              </w:rPr>
+            </w:pPr>
+            <w:r>
+              <w:rPr>
+                <w:rFonts w:ascii="Times" w:eastAsia="Times" w:hAnsi="Times" w:cs="Times"/>
+              </w:rPr>
+              <w:t xml:space="preserve">Staccatissimo on long held notes? Recommend using </w:t>
+            </w:r>
+            <w:proofErr w:type="spellStart"/>
+            <w:r>
+              <w:rPr>
+                <w:rFonts w:ascii="Times" w:eastAsia="Times" w:hAnsi="Times" w:cs="Times"/>
+                <w:b/>
+                <w:bCs/>
+                <w:i/>
+                <w:iCs/>
+              </w:rPr>
+              <w:t>sfz</w:t>
+            </w:r>
+            <w:proofErr w:type="spellEnd"/>
+            <w:r>
+              <w:rPr>
+                <w:rFonts w:ascii="Times" w:eastAsia="Times" w:hAnsi="Times" w:cs="Times"/>
+              </w:rPr>
+              <w:t xml:space="preserve"> instead.  </w:t>
+            </w:r>
+          </w:p>
+        </w:tc>
+        <w:tc>
+          <w:tcPr>
+            <w:tcW w:w="1024" w:type="pct"/>
+            <w:tcBorders>
+              <w:top w:val="single" w:sz="4" w:space="0" w:color="000000"/>
+              <w:left w:val="single" w:sz="4" w:space="0" w:color="000000"/>
+              <w:bottom w:val="single" w:sz="4" w:space="0" w:color="000000"/>
+              <w:right w:val="single" w:sz="4" w:space="0" w:color="000000"/>
+            </w:tcBorders>
+            <w:vAlign w:val="center"/>
+          </w:tcPr>
+          <w:p>
+            <w:pPr>
+              <w:rPr>
+                <w:rFonts w:ascii="Times" w:eastAsia="Times" w:hAnsi="Times" w:cs="Times"/>
+              </w:rPr>
+            </w:pPr>
+          </w:p>
+        </w:tc>
+      </w:tr>
+      <w:tr>
+        <w:trPr>
+          <w:trHeight w:val="350"/>
+        </w:trPr>
+        <w:tc>
+          <w:tcPr>
+            <w:tcW w:w="756" w:type="pct"/>
+            <w:tcBorders>
+              <w:top w:val="single" w:sz="4" w:space="0" w:color="000000"/>
+              <w:left w:val="single" w:sz="4" w:space="0" w:color="000000"/>
+              <w:bottom w:val="single" w:sz="4" w:space="0" w:color="000000"/>
+              <w:right w:val="single" w:sz="4" w:space="0" w:color="000000"/>
+            </w:tcBorders>
+            <w:vAlign w:val="center"/>
+          </w:tcPr>
+          <w:p>
+            <w:pPr>
+              <w:rPr>
+                <w:rFonts w:ascii="Times" w:eastAsia="Times" w:hAnsi="Times" w:cs="Times"/>
+              </w:rPr>
+            </w:pPr>
+            <w:r>
+              <w:rPr>
+                <w:rFonts w:ascii="Times" w:eastAsia="Times" w:hAnsi="Times" w:cs="Times"/>
+              </w:rPr>
+              <w:t>Cello</w:t>
+            </w:r>
+          </w:p>
+        </w:tc>
+        <w:tc>
+          <w:tcPr>
+            <w:tcW w:w="727" w:type="pct"/>
+            <w:tcBorders>
+              <w:top w:val="single" w:sz="4" w:space="0" w:color="000000"/>
+              <w:left w:val="single" w:sz="4" w:space="0" w:color="000000"/>
+              <w:bottom w:val="single" w:sz="4" w:space="0" w:color="000000"/>
+              <w:right w:val="single" w:sz="4" w:space="0" w:color="000000"/>
+            </w:tcBorders>
+            <w:vAlign w:val="center"/>
+          </w:tcPr>
+          <w:p>
+            <w:pPr>
+              <w:rPr>
+                <w:rFonts w:ascii="Times" w:eastAsia="Times" w:hAnsi="Times" w:cs="Times"/>
+              </w:rPr>
+            </w:pPr>
+            <w:r>
+              <w:rPr>
+                <w:rFonts w:ascii="Times" w:eastAsia="Times" w:hAnsi="Times" w:cs="Times"/>
+              </w:rPr>
+              <w:t>61</w:t>
+            </w:r>
+          </w:p>
+        </w:tc>
+        <w:tc>
+          <w:tcPr>
+            <w:tcW w:w="2493" w:type="pct"/>
+            <w:tcBorders>
+              <w:top w:val="single" w:sz="4" w:space="0" w:color="000000"/>
+              <w:left w:val="single" w:sz="4" w:space="0" w:color="000000"/>
+              <w:bottom w:val="single" w:sz="4" w:space="0" w:color="000000"/>
+              <w:right w:val="single" w:sz="4" w:space="0" w:color="000000"/>
+            </w:tcBorders>
+            <w:vAlign w:val="center"/>
+          </w:tcPr>
+          <w:p>
+            <w:pPr>
+              <w:rPr>
+                <w:rFonts w:ascii="Times" w:eastAsia="Times" w:hAnsi="Times" w:cs="Times"/>
+              </w:rPr>
+            </w:pPr>
+          </w:p>
+          <w:p>
+            <w:pPr>
+              <w:rPr>
+                <w:rFonts w:ascii="Times" w:eastAsia="Times" w:hAnsi="Times" w:cs="Times"/>
+              </w:rPr>
+            </w:pPr>
+            <w:r>
+              <w:rPr>
+                <w:rFonts w:ascii="Times" w:eastAsia="Times" w:hAnsi="Times" w:cs="Times"/>
+              </w:rPr>
+              <w:drawing>
+                <wp:inline distT="0" distB="0" distL="0" distR="0" wp14:anchorId="0FF34F04" wp14:editId="6718EF40">
+                  <wp:extent cx="1858488" cy="748756"/>
+                  <wp:effectExtent l="19050" t="19050" r="27940" b="13335"/>
+                  <wp:docPr id="728580461" name="Picture 1"/>
+                  <wp:cNvGraphicFramePr>
+                    <a:graphicFrameLocks xmlns:a="http://schemas.openxmlformats.org/drawingml/2006/main" noChangeAspect="1"/>
+                  </wp:cNvGraphicFramePr>
+                  <a:graphic xmlns:a="http://schemas.openxmlformats.org/drawingml/2006/main">
+                    <a:graphicData uri="http://schemas.openxmlformats.org/drawingml/2006/picture">
+                      <pic:pic xmlns:pic="http://schemas.openxmlformats.org/drawingml/2006/picture">
+                        <pic:nvPicPr>
+                          <pic:cNvPr id="728580461" name=""/>
+                          <pic:cNvPicPr/>
+                        </pic:nvPicPr>
+                        <pic:blipFill>
+                          <a:blip r:embed="rId7"/>
+                          <a:stretch>
+                            <a:fillRect/>
+                          </a:stretch>
+                        </pic:blipFill>
+                        <pic:spPr>
+                          <a:xfrm>
+                            <a:off x="0" y="0"/>
+                            <a:ext cx="1866445" cy="751962"/>
+                          </a:xfrm>
+                          <a:prstGeom prst="rect">
+                            <a:avLst/>
+                          </a:prstGeom>
+                          <a:ln>
+                            <a:solidFill>
+                              <a:schemeClr val="bg1">
+                                <a:lumMod val="75000"/>
+                              </a:schemeClr>
+                            </a:solidFill>
+                          </a:ln>
+                        </pic:spPr>
+                      </pic:pic>
+                    </a:graphicData>
+                  </a:graphic>
+                </wp:inline>
+              </w:drawing>
+            </w:r>
+          </w:p>
+          <w:p>
+            <w:pPr>
+              <w:rPr>
+                <w:rFonts w:ascii="Times" w:eastAsia="Times" w:hAnsi="Times" w:cs="Times"/>
+              </w:rPr>
+            </w:pPr>
+            <w:r>
+              <w:rPr>
+                <w:rFonts w:ascii="Times" w:eastAsia="Times" w:hAnsi="Times" w:cs="Times"/>
+              </w:rPr>
+              <w:t xml:space="preserve">Should the beam grouping be: </w:t>
+            </w:r>
+          </w:p>
+          <w:p>
+            <w:pPr>
+              <w:rPr>
+                <w:rFonts w:ascii="Times" w:eastAsia="Times" w:hAnsi="Times" w:cs="Times"/>
+              </w:rPr>
+            </w:pPr>
+            <w:r>
+              <w:rPr>
+                <w:rFonts w:ascii="Times" w:eastAsia="Times" w:hAnsi="Times" w:cs="Times"/>
+              </w:rPr>
+              <w:t xml:space="preserve">A) </w:t>
+            </w:r>
+            <w:r>
+              <w:rPr>
+                <w:rFonts w:ascii="Times" w:eastAsia="Times" w:hAnsi="Times" w:cs="Times"/>
+              </w:rPr>
+              <w:drawing>
+                <wp:inline distT="0" distB="0" distL="0" distR="0" wp14:anchorId="6C44A96A" wp14:editId="4A9B145E">
+                  <wp:extent cx="1587912" cy="431800"/>
+                  <wp:effectExtent l="19050" t="19050" r="12700" b="25400"/>
+                  <wp:docPr id="821357746" name="Picture 1"/>
+                  <wp:cNvGraphicFramePr>
+                    <a:graphicFrameLocks xmlns:a="http://schemas.openxmlformats.org/drawingml/2006/main" noChangeAspect="1"/>
+                  </wp:cNvGraphicFramePr>
+                  <a:graphic xmlns:a="http://schemas.openxmlformats.org/drawingml/2006/main">
+                    <a:graphicData uri="http://schemas.openxmlformats.org/drawingml/2006/picture">
+                      <pic:pic xmlns:pic="http://schemas.openxmlformats.org/drawingml/2006/picture">
+                        <pic:nvPicPr>
+                          <pic:cNvPr id="821357746" name=""/>
+                          <pic:cNvPicPr/>
+                        </pic:nvPicPr>
+                        <pic:blipFill rotWithShape="1">
+                          <a:blip r:embed="rId8"/>
+                          <a:srcRect l="-1" r="4384" b="11631"/>
+                          <a:stretch/>
+                        </pic:blipFill>
+                        <pic:spPr bwMode="auto">
+                          <a:xfrm>
+                            <a:off x="0" y="0"/>
+                            <a:ext cx="1588647" cy="432000"/>
+                          </a:xfrm>
+                          <a:prstGeom prst="rect">
+                            <a:avLst/>
+                          </a:prstGeom>
+                          <a:ln w="9525" cap="flat" cmpd="sng" algn="ctr">
+                            <a:solidFill>
+                              <a:srgbClr val="00B050"/>
+                            </a:solidFill>
+                            <a:prstDash val="solid"/>
+                            <a:round/>
+                            <a:headEnd type="none" w="med" len="med"/>
+                            <a:tailEnd type="none" w="med" len="med"/>
+                            <a:extLst>
+                              <a:ext uri="{C807C97D-BFC1-408E-A445-0C87EB9F89A2}">
+                                <ask:lineSketchStyleProps xmlns:ask="http://schemas.microsoft.com/office/drawing/2018/sketchyshapes" sd="0">
+                                  <a:custGeom>
+                                    <a:avLst/>
+                                    <a:gdLst/>
+                                    <a:ahLst/>
+                                    <a:cxnLst/>
+                                    <a:rect l="0" t="0" r="0" b="0"/>
+                                    <a:pathLst/>
+                                  </a:custGeom>
+                                  <ask:type/>
+                                </ask:lineSketchStyleProps>
+                              </a:ext>
+                            </a:extLst>
+                          </a:ln>
+                          <a:extLst>
+                            <a:ext uri="{53640926-AAD7-44D8-BBD7-CCE9431645EC}">
+                              <a14:shadowObscured xmlns:a14="http://schemas.microsoft.com/office/drawing/2010/main"/>
+                            </a:ext>
+                          </a:extLst>
+                        </pic:spPr>
+                      </pic:pic>
+                    </a:graphicData>
+                  </a:graphic>
+                </wp:inline>
+              </w:drawing>
+            </w:r>
+            <w:r>
+              <w:rPr>
+                <w:rFonts w:ascii="Times" w:eastAsia="Times" w:hAnsi="Times" w:cs="Times"/>
+              </w:rPr>
+              <w:t xml:space="preserve"> or</w:t>
+            </w:r>
+          </w:p>
+          <w:p>
+            <w:pPr>
+              <w:rPr>
+                <w:rFonts w:ascii="Times" w:eastAsia="Times" w:hAnsi="Times" w:cs="Times"/>
+              </w:rPr>
+            </w:pPr>
+            <w:r>
+              <w:rPr>
+                <w:rFonts w:ascii="Times" w:eastAsia="Times" w:hAnsi="Times" w:cs="Times"/>
+              </w:rPr>
+              <w:lastRenderedPageBreak/>
+              <w:t xml:space="preserve">B) </w:t>
+            </w:r>
+            <w:r>
+              <w:rPr>
+                <w:rFonts w:ascii="Times" w:eastAsia="Times" w:hAnsi="Times" w:cs="Times"/>
+              </w:rPr>
+              <w:drawing>
+                <wp:inline distT="0" distB="0" distL="0" distR="0" wp14:anchorId="7CA21E89" wp14:editId="324815D9">
+                  <wp:extent cx="1594448" cy="432000"/>
+                  <wp:effectExtent l="19050" t="19050" r="25400" b="25400"/>
+                  <wp:docPr id="1780943041" name="Picture 1"/>
+                  <wp:cNvGraphicFramePr>
+                    <a:graphicFrameLocks xmlns:a="http://schemas.openxmlformats.org/drawingml/2006/main" noChangeAspect="1"/>
+                  </wp:cNvGraphicFramePr>
+                  <a:graphic xmlns:a="http://schemas.openxmlformats.org/drawingml/2006/main">
+                    <a:graphicData uri="http://schemas.openxmlformats.org/drawingml/2006/picture">
+                      <pic:pic xmlns:pic="http://schemas.openxmlformats.org/drawingml/2006/picture">
+                        <pic:nvPicPr>
+                          <pic:cNvPr id="1780943041" name=""/>
+                          <pic:cNvPicPr/>
+                        </pic:nvPicPr>
+                        <pic:blipFill>
+                          <a:blip r:embed="rId9"/>
+                          <a:stretch>
+                            <a:fillRect/>
+                          </a:stretch>
+                        </pic:blipFill>
+                        <pic:spPr>
+                          <a:xfrm>
+                            <a:off x="0" y="0"/>
+                            <a:ext cx="1594448" cy="432000"/>
+                          </a:xfrm>
+                          <a:prstGeom prst="rect">
+                            <a:avLst/>
+                          </a:prstGeom>
+                          <a:ln>
+                            <a:solidFill>
+                              <a:srgbClr val="0070C0"/>
+                            </a:solidFill>
+                          </a:ln>
+                        </pic:spPr>
+                      </pic:pic>
+                    </a:graphicData>
+                  </a:graphic>
+                </wp:inline>
+              </w:drawing>
+            </w:r>
+            <w:r>
+              <w:rPr>
+                <w:rFonts w:ascii="Times" w:eastAsia="Times" w:hAnsi="Times" w:cs="Times"/>
+              </w:rPr>
+              <w:t xml:space="preserve"> or</w:t>
+            </w:r>
+          </w:p>
+          <w:p>
+            <w:pPr>
+              <w:rPr>
+                <w:rFonts w:ascii="Times" w:eastAsia="Times" w:hAnsi="Times" w:cs="Times"/>
+              </w:rPr>
+            </w:pPr>
+            <w:r>
+              <w:rPr>
+                <w:rFonts w:ascii="Times" w:eastAsia="Times" w:hAnsi="Times" w:cs="Times"/>
+              </w:rPr>
+              <w:t xml:space="preserve">C) Follow original manuscript. </w:t>
+            </w:r>
+          </w:p>
           <w:p>
             <w:pPr>
               <w:rPr>

</xml_diff>

<commit_message>
v04: Engraved pg 5-6
</commit_message>
<xml_diff>
--- a/Proof Reading and Review/TCB Mvt for Vn and Orch - Errata_v1.docx
+++ b/Proof Reading and Review/TCB Mvt for Vn and Orch - Errata_v1.docx
@@ -291,17 +291,6 @@
     </w:p>
     <w:p>
       <w:pPr>
-        <w:jc w:val="center"/>
-        <w:rPr>
-          <w:rFonts w:ascii="Times" w:eastAsia="Times" w:hAnsi="Times" w:cs="Times"/>
-          <w:b/>
-          <w:bCs/>
-        </w:rPr>
-      </w:pPr>
-    </w:p>
-    <w:p>
-      <w:pPr>
-        <w:jc w:val="center"/>
         <w:rPr>
           <w:rFonts w:ascii="Times" w:eastAsia="Times" w:hAnsi="Times" w:cs="Times"/>
           <w:b/>
@@ -349,6 +338,8 @@
                 <w:rFonts w:ascii="Times" w:eastAsia="Times" w:hAnsi="Times" w:cs="Times"/>
                 <w:b/>
                 <w:bCs/>
+                <w:sz w:val="22"/>
+                <w:szCs w:val="22"/>
               </w:rPr>
             </w:pPr>
             <w:r>
@@ -356,6 +347,8 @@
                 <w:rFonts w:ascii="Times" w:eastAsia="Times" w:hAnsi="Times" w:cs="Times"/>
                 <w:b/>
                 <w:bCs/>
+                <w:sz w:val="22"/>
+                <w:szCs w:val="22"/>
               </w:rPr>
               <w:t>Instrument</w:t>
             </w:r>
@@ -378,6 +371,8 @@
                 <w:rFonts w:ascii="Times" w:eastAsia="Times" w:hAnsi="Times" w:cs="Times"/>
                 <w:b/>
                 <w:bCs/>
+                <w:sz w:val="22"/>
+                <w:szCs w:val="22"/>
               </w:rPr>
             </w:pPr>
             <w:r>
@@ -385,6 +380,8 @@
                 <w:rFonts w:ascii="Times" w:eastAsia="Times" w:hAnsi="Times" w:cs="Times"/>
                 <w:b/>
                 <w:bCs/>
+                <w:sz w:val="22"/>
+                <w:szCs w:val="22"/>
               </w:rPr>
               <w:t>Bar</w:t>
             </w:r>
@@ -407,6 +404,8 @@
                 <w:rFonts w:ascii="Times" w:eastAsia="Times" w:hAnsi="Times" w:cs="Times"/>
                 <w:b/>
                 <w:bCs/>
+                <w:sz w:val="22"/>
+                <w:szCs w:val="22"/>
               </w:rPr>
             </w:pPr>
             <w:r>
@@ -414,6 +413,8 @@
                 <w:rFonts w:ascii="Times" w:eastAsia="Times" w:hAnsi="Times" w:cs="Times"/>
                 <w:b/>
                 <w:bCs/>
+                <w:sz w:val="22"/>
+                <w:szCs w:val="22"/>
               </w:rPr>
               <w:t>Issue</w:t>
             </w:r>
@@ -436,6 +437,8 @@
                 <w:rFonts w:ascii="Times" w:eastAsia="Times" w:hAnsi="Times" w:cs="Times"/>
                 <w:b/>
                 <w:bCs/>
+                <w:sz w:val="22"/>
+                <w:szCs w:val="22"/>
               </w:rPr>
             </w:pPr>
             <w:r>
@@ -443,6 +446,8 @@
                 <w:rFonts w:ascii="Times" w:eastAsia="Times" w:hAnsi="Times" w:cs="Times"/>
                 <w:b/>
                 <w:bCs/>
+                <w:sz w:val="22"/>
+                <w:szCs w:val="22"/>
               </w:rPr>
               <w:t>Answer</w:t>
             </w:r>
@@ -468,11 +473,15 @@
             <w:pPr>
               <w:rPr>
                 <w:rFonts w:ascii="Times" w:eastAsia="Times" w:hAnsi="Times" w:cs="Times"/>
-              </w:rPr>
-            </w:pPr>
-            <w:r>
-              <w:rPr>
-                <w:rFonts w:ascii="Times" w:eastAsia="Times" w:hAnsi="Times" w:cs="Times"/>
+                <w:sz w:val="22"/>
+                <w:szCs w:val="22"/>
+              </w:rPr>
+            </w:pPr>
+            <w:r>
+              <w:rPr>
+                <w:rFonts w:ascii="Times" w:eastAsia="Times" w:hAnsi="Times" w:cs="Times"/>
+                <w:sz w:val="22"/>
+                <w:szCs w:val="22"/>
               </w:rPr>
               <w:t>All instruments</w:t>
             </w:r>
@@ -493,11 +502,15 @@
             <w:pPr>
               <w:rPr>
                 <w:rFonts w:ascii="Times" w:eastAsia="Times" w:hAnsi="Times" w:cs="Times"/>
-              </w:rPr>
-            </w:pPr>
-            <w:r>
-              <w:rPr>
-                <w:rFonts w:ascii="Times" w:eastAsia="Times" w:hAnsi="Times" w:cs="Times"/>
+                <w:sz w:val="22"/>
+                <w:szCs w:val="22"/>
+              </w:rPr>
+            </w:pPr>
+            <w:r>
+              <w:rPr>
+                <w:rFonts w:ascii="Times" w:eastAsia="Times" w:hAnsi="Times" w:cs="Times"/>
+                <w:sz w:val="22"/>
+                <w:szCs w:val="22"/>
               </w:rPr>
               <w:t>Whole score</w:t>
             </w:r>
@@ -518,53 +531,71 @@
             <w:pPr>
               <w:rPr>
                 <w:rFonts w:ascii="Times" w:eastAsia="Times" w:hAnsi="Times" w:cs="Times"/>
-              </w:rPr>
-            </w:pPr>
-            <w:r>
-              <w:rPr>
-                <w:rFonts w:ascii="Times" w:eastAsia="Times" w:hAnsi="Times" w:cs="Times"/>
+                <w:sz w:val="22"/>
+                <w:szCs w:val="22"/>
+              </w:rPr>
+            </w:pPr>
+            <w:r>
+              <w:rPr>
+                <w:rFonts w:ascii="Times" w:eastAsia="Times" w:hAnsi="Times" w:cs="Times"/>
+                <w:sz w:val="22"/>
+                <w:szCs w:val="22"/>
               </w:rPr>
               <w:t xml:space="preserve">There </w:t>
             </w:r>
             <w:r>
               <w:rPr>
                 <w:rFonts w:ascii="Times" w:eastAsia="Times" w:hAnsi="Times" w:cs="Times"/>
+                <w:sz w:val="22"/>
+                <w:szCs w:val="22"/>
               </w:rPr>
               <w:t xml:space="preserve">are </w:t>
             </w:r>
             <w:r>
               <w:rPr>
                 <w:rFonts w:ascii="Times" w:eastAsia="Times" w:hAnsi="Times" w:cs="Times"/>
+                <w:sz w:val="22"/>
+                <w:szCs w:val="22"/>
               </w:rPr>
               <w:t>many cautionary accidentals throughout the piece</w:t>
             </w:r>
             <w:r>
               <w:rPr>
                 <w:rFonts w:ascii="Times" w:eastAsia="Times" w:hAnsi="Times" w:cs="Times"/>
+                <w:sz w:val="22"/>
+                <w:szCs w:val="22"/>
               </w:rPr>
               <w:t xml:space="preserve"> that may be deleted since it may be obvious</w:t>
             </w:r>
             <w:r>
               <w:rPr>
                 <w:rFonts w:ascii="Times" w:eastAsia="Times" w:hAnsi="Times" w:cs="Times"/>
+                <w:sz w:val="22"/>
+                <w:szCs w:val="22"/>
               </w:rPr>
               <w:t xml:space="preserve">. E.g. Oboe </w:t>
             </w:r>
             <w:r>
               <w:rPr>
                 <w:rFonts w:ascii="Times" w:eastAsia="Times" w:hAnsi="Times" w:cs="Times"/>
+                <w:sz w:val="22"/>
+                <w:szCs w:val="22"/>
               </w:rPr>
               <w:t xml:space="preserve">Bar </w:t>
             </w:r>
             <w:r>
               <w:rPr>
                 <w:rFonts w:ascii="Times" w:eastAsia="Times" w:hAnsi="Times" w:cs="Times"/>
+                <w:sz w:val="22"/>
+                <w:szCs w:val="22"/>
               </w:rPr>
               <w:t>60, 4</w:t>
             </w:r>
             <w:r>
               <w:rPr>
                 <w:rFonts w:ascii="Times" w:eastAsia="Times" w:hAnsi="Times" w:cs="Times"/>
+                <w:sz w:val="22"/>
+                <w:szCs w:val="22"/>
                 <w:vertAlign w:val="superscript"/>
               </w:rPr>
               <w:t>th</w:t>
@@ -572,14 +603,26 @@
             <w:r>
               <w:rPr>
                 <w:rFonts w:ascii="Times" w:eastAsia="Times" w:hAnsi="Times" w:cs="Times"/>
+                <w:sz w:val="22"/>
+                <w:szCs w:val="22"/>
               </w:rPr>
               <w:t xml:space="preserve"> beat</w:t>
             </w:r>
             <w:r>
               <w:rPr>
                 <w:rFonts w:ascii="Times" w:eastAsia="Times" w:hAnsi="Times" w:cs="Times"/>
-              </w:rPr>
-              <w:t xml:space="preserve"> obvious C#. </w:t>
+                <w:sz w:val="22"/>
+                <w:szCs w:val="22"/>
+              </w:rPr>
+              <w:t xml:space="preserve"> obvious C#</w:t>
+            </w:r>
+            <w:r>
+              <w:rPr>
+                <w:rFonts w:ascii="Times" w:eastAsia="Times" w:hAnsi="Times" w:cs="Times"/>
+                <w:sz w:val="22"/>
+                <w:szCs w:val="22"/>
+              </w:rPr>
+              <w:t>.</w:t>
             </w:r>
           </w:p>
         </w:tc>
@@ -598,6 +641,8 @@
             <w:pPr>
               <w:rPr>
                 <w:rFonts w:ascii="Times" w:eastAsia="Times" w:hAnsi="Times" w:cs="Times"/>
+                <w:sz w:val="22"/>
+                <w:szCs w:val="22"/>
               </w:rPr>
             </w:pPr>
           </w:p>
@@ -622,19 +667,17 @@
             <w:pPr>
               <w:rPr>
                 <w:rFonts w:ascii="Times" w:eastAsia="Times" w:hAnsi="Times" w:cs="Times"/>
-              </w:rPr>
-            </w:pPr>
-            <w:r>
-              <w:rPr>
-                <w:rFonts w:ascii="Times" w:eastAsia="Times" w:hAnsi="Times" w:cs="Times"/>
-              </w:rPr>
-              <w:t xml:space="preserve">Violin </w:t>
-            </w:r>
-            <w:r>
-              <w:rPr>
-                <w:rFonts w:ascii="Times" w:eastAsia="Times" w:hAnsi="Times" w:cs="Times"/>
-              </w:rPr>
-              <w:t>II</w:t>
+                <w:sz w:val="22"/>
+                <w:szCs w:val="22"/>
+              </w:rPr>
+            </w:pPr>
+            <w:r>
+              <w:rPr>
+                <w:rFonts w:ascii="Times" w:eastAsia="Times" w:hAnsi="Times" w:cs="Times"/>
+                <w:sz w:val="22"/>
+                <w:szCs w:val="22"/>
+              </w:rPr>
+              <w:t>Violin II</w:t>
             </w:r>
           </w:p>
         </w:tc>
@@ -653,11 +696,15 @@
             <w:pPr>
               <w:rPr>
                 <w:rFonts w:ascii="Times" w:eastAsia="Times" w:hAnsi="Times" w:cs="Times"/>
-              </w:rPr>
-            </w:pPr>
-            <w:r>
-              <w:rPr>
-                <w:rFonts w:ascii="Times" w:eastAsia="Times" w:hAnsi="Times" w:cs="Times"/>
+                <w:sz w:val="22"/>
+                <w:szCs w:val="22"/>
+              </w:rPr>
+            </w:pPr>
+            <w:r>
+              <w:rPr>
+                <w:rFonts w:ascii="Times" w:eastAsia="Times" w:hAnsi="Times" w:cs="Times"/>
+                <w:sz w:val="22"/>
+                <w:szCs w:val="22"/>
               </w:rPr>
               <w:t>11</w:t>
             </w:r>
@@ -678,11 +725,15 @@
             <w:pPr>
               <w:rPr>
                 <w:rFonts w:ascii="Times" w:eastAsia="Times" w:hAnsi="Times" w:cs="Times"/>
-              </w:rPr>
-            </w:pPr>
-            <w:r>
-              <w:rPr>
-                <w:rFonts w:ascii="Times" w:eastAsia="Times" w:hAnsi="Times" w:cs="Times"/>
+                <w:sz w:val="22"/>
+                <w:szCs w:val="22"/>
+              </w:rPr>
+            </w:pPr>
+            <w:r>
+              <w:rPr>
+                <w:rFonts w:ascii="Times" w:eastAsia="Times" w:hAnsi="Times" w:cs="Times"/>
+                <w:sz w:val="22"/>
+                <w:szCs w:val="22"/>
               </w:rPr>
               <w:t xml:space="preserve">Is the slide meant to be glissando or portamento? </w:t>
             </w:r>
@@ -703,6 +754,8 @@
             <w:pPr>
               <w:rPr>
                 <w:rFonts w:ascii="Times" w:eastAsia="Times" w:hAnsi="Times" w:cs="Times"/>
+                <w:sz w:val="22"/>
+                <w:szCs w:val="22"/>
               </w:rPr>
             </w:pPr>
           </w:p>
@@ -727,11 +780,15 @@
             <w:pPr>
               <w:rPr>
                 <w:rFonts w:ascii="Times" w:eastAsia="Times" w:hAnsi="Times" w:cs="Times"/>
-              </w:rPr>
-            </w:pPr>
-            <w:r>
-              <w:rPr>
-                <w:rFonts w:ascii="Times" w:eastAsia="Times" w:hAnsi="Times" w:cs="Times"/>
+                <w:sz w:val="22"/>
+                <w:szCs w:val="22"/>
+              </w:rPr>
+            </w:pPr>
+            <w:r>
+              <w:rPr>
+                <w:rFonts w:ascii="Times" w:eastAsia="Times" w:hAnsi="Times" w:cs="Times"/>
+                <w:sz w:val="22"/>
+                <w:szCs w:val="22"/>
               </w:rPr>
               <w:t>Violin I</w:t>
             </w:r>
@@ -752,11 +809,15 @@
             <w:pPr>
               <w:rPr>
                 <w:rFonts w:ascii="Times" w:eastAsia="Times" w:hAnsi="Times" w:cs="Times"/>
-              </w:rPr>
-            </w:pPr>
-            <w:r>
-              <w:rPr>
-                <w:rFonts w:ascii="Times" w:eastAsia="Times" w:hAnsi="Times" w:cs="Times"/>
+                <w:sz w:val="22"/>
+                <w:szCs w:val="22"/>
+              </w:rPr>
+            </w:pPr>
+            <w:r>
+              <w:rPr>
+                <w:rFonts w:ascii="Times" w:eastAsia="Times" w:hAnsi="Times" w:cs="Times"/>
+                <w:sz w:val="22"/>
+                <w:szCs w:val="22"/>
               </w:rPr>
               <w:t>32</w:t>
             </w:r>
@@ -777,11 +838,15 @@
             <w:pPr>
               <w:rPr>
                 <w:rFonts w:ascii="Times" w:eastAsia="Times" w:hAnsi="Times" w:cs="Times"/>
-              </w:rPr>
-            </w:pPr>
-            <w:r>
-              <w:rPr>
-                <w:rFonts w:ascii="Times" w:eastAsia="Times" w:hAnsi="Times" w:cs="Times"/>
+                <w:sz w:val="22"/>
+                <w:szCs w:val="22"/>
+              </w:rPr>
+            </w:pPr>
+            <w:r>
+              <w:rPr>
+                <w:rFonts w:ascii="Times" w:eastAsia="Times" w:hAnsi="Times" w:cs="Times"/>
+                <w:sz w:val="22"/>
+                <w:szCs w:val="22"/>
               </w:rPr>
               <w:t xml:space="preserve">Beat 1, possible missing decrescendo? </w:t>
             </w:r>
@@ -802,6 +867,8 @@
             <w:pPr>
               <w:rPr>
                 <w:rFonts w:ascii="Times" w:eastAsia="Times" w:hAnsi="Times" w:cs="Times"/>
+                <w:sz w:val="22"/>
+                <w:szCs w:val="22"/>
               </w:rPr>
             </w:pPr>
           </w:p>
@@ -826,11 +893,15 @@
             <w:pPr>
               <w:rPr>
                 <w:rFonts w:ascii="Times" w:eastAsia="Times" w:hAnsi="Times" w:cs="Times"/>
-              </w:rPr>
-            </w:pPr>
-            <w:r>
-              <w:rPr>
-                <w:rFonts w:ascii="Times" w:eastAsia="Times" w:hAnsi="Times" w:cs="Times"/>
+                <w:sz w:val="22"/>
+                <w:szCs w:val="22"/>
+              </w:rPr>
+            </w:pPr>
+            <w:r>
+              <w:rPr>
+                <w:rFonts w:ascii="Times" w:eastAsia="Times" w:hAnsi="Times" w:cs="Times"/>
+                <w:sz w:val="22"/>
+                <w:szCs w:val="22"/>
               </w:rPr>
               <w:t>Harp 1</w:t>
             </w:r>
@@ -851,19 +922,17 @@
             <w:pPr>
               <w:rPr>
                 <w:rFonts w:ascii="Times" w:eastAsia="Times" w:hAnsi="Times" w:cs="Times"/>
-              </w:rPr>
-            </w:pPr>
-            <w:r>
-              <w:rPr>
-                <w:rFonts w:ascii="Times" w:eastAsia="Times" w:hAnsi="Times" w:cs="Times"/>
-              </w:rPr>
-              <w:t>40</w:t>
-            </w:r>
-            <w:r>
-              <w:rPr>
-                <w:rFonts w:ascii="Times" w:eastAsia="Times" w:hAnsi="Times" w:cs="Times"/>
-              </w:rPr>
-              <w:t>-43</w:t>
+                <w:sz w:val="22"/>
+                <w:szCs w:val="22"/>
+              </w:rPr>
+            </w:pPr>
+            <w:r>
+              <w:rPr>
+                <w:rFonts w:ascii="Times" w:eastAsia="Times" w:hAnsi="Times" w:cs="Times"/>
+                <w:sz w:val="22"/>
+                <w:szCs w:val="22"/>
+              </w:rPr>
+              <w:t>40-43</w:t>
             </w:r>
           </w:p>
         </w:tc>
@@ -882,33 +951,119 @@
             <w:pPr>
               <w:rPr>
                 <w:rFonts w:ascii="Times" w:eastAsia="Times" w:hAnsi="Times" w:cs="Times"/>
-              </w:rPr>
-            </w:pPr>
-            <w:r>
-              <w:rPr>
-                <w:rFonts w:ascii="Times" w:eastAsia="Times" w:hAnsi="Times" w:cs="Times"/>
-              </w:rPr>
-              <w:t xml:space="preserve">Some harp chords don’t have arpeggiation in them. This is intentional? </w:t>
-            </w:r>
-          </w:p>
-          <w:p>
-            <w:pPr>
-              <w:rPr>
-                <w:rFonts w:ascii="Times" w:eastAsia="Times" w:hAnsi="Times" w:cs="Times"/>
-              </w:rPr>
-            </w:pPr>
-          </w:p>
-          <w:p>
-            <w:pPr>
-              <w:rPr>
-                <w:rFonts w:ascii="Times" w:eastAsia="Times" w:hAnsi="Times" w:cs="Times"/>
-              </w:rPr>
-            </w:pPr>
-            <w:r>
-              <w:rPr>
-                <w:rFonts w:ascii="Times" w:eastAsia="Times" w:hAnsi="Times" w:cs="Times"/>
-              </w:rPr>
-              <w:t xml:space="preserve">Likewise, to save space, would you be okay if we use C-flat major instead of D major for the harp’s key signature? </w:t>
+                <w:sz w:val="22"/>
+                <w:szCs w:val="22"/>
+              </w:rPr>
+            </w:pPr>
+            <w:r>
+              <w:rPr>
+                <w:rFonts w:ascii="Times" w:eastAsia="Times" w:hAnsi="Times" w:cs="Times"/>
+                <w:sz w:val="22"/>
+                <w:szCs w:val="22"/>
+              </w:rPr>
+              <w:t xml:space="preserve">Some harp chords don’t have arpeggiation in them. </w:t>
+            </w:r>
+            <w:proofErr w:type="gramStart"/>
+            <w:r>
+              <w:rPr>
+                <w:rFonts w:ascii="Times" w:eastAsia="Times" w:hAnsi="Times" w:cs="Times"/>
+                <w:sz w:val="22"/>
+                <w:szCs w:val="22"/>
+              </w:rPr>
+              <w:t>This is</w:t>
+            </w:r>
+            <w:proofErr w:type="gramEnd"/>
+            <w:r>
+              <w:rPr>
+                <w:rFonts w:ascii="Times" w:eastAsia="Times" w:hAnsi="Times" w:cs="Times"/>
+                <w:sz w:val="22"/>
+                <w:szCs w:val="22"/>
+              </w:rPr>
+              <w:t xml:space="preserve"> </w:t>
+            </w:r>
+            <w:proofErr w:type="gramStart"/>
+            <w:r>
+              <w:rPr>
+                <w:rFonts w:ascii="Times" w:eastAsia="Times" w:hAnsi="Times" w:cs="Times"/>
+                <w:sz w:val="22"/>
+                <w:szCs w:val="22"/>
+              </w:rPr>
+              <w:t>intentional?</w:t>
+            </w:r>
+            <w:proofErr w:type="gramEnd"/>
+            <w:r>
+              <w:rPr>
+                <w:rFonts w:ascii="Times" w:eastAsia="Times" w:hAnsi="Times" w:cs="Times"/>
+                <w:sz w:val="22"/>
+                <w:szCs w:val="22"/>
+              </w:rPr>
+              <w:t xml:space="preserve"> </w:t>
+            </w:r>
+          </w:p>
+          <w:p>
+            <w:pPr>
+              <w:rPr>
+                <w:rFonts w:ascii="Times" w:eastAsia="Times" w:hAnsi="Times" w:cs="Times"/>
+                <w:sz w:val="22"/>
+                <w:szCs w:val="22"/>
+              </w:rPr>
+            </w:pPr>
+          </w:p>
+          <w:p>
+            <w:pPr>
+              <w:rPr>
+                <w:rFonts w:ascii="Times" w:eastAsia="Times" w:hAnsi="Times" w:cs="Times"/>
+                <w:sz w:val="22"/>
+                <w:szCs w:val="22"/>
+              </w:rPr>
+            </w:pPr>
+            <w:r>
+              <w:rPr>
+                <w:rFonts w:ascii="Times" w:eastAsia="Times" w:hAnsi="Times" w:cs="Times"/>
+                <w:sz w:val="22"/>
+                <w:szCs w:val="22"/>
+              </w:rPr>
+              <w:t>For saving space</w:t>
+            </w:r>
+            <w:r>
+              <w:rPr>
+                <w:rFonts w:ascii="Times" w:eastAsia="Times" w:hAnsi="Times" w:cs="Times"/>
+                <w:sz w:val="22"/>
+                <w:szCs w:val="22"/>
+              </w:rPr>
+              <w:t xml:space="preserve">, </w:t>
+            </w:r>
+            <w:r>
+              <w:rPr>
+                <w:rFonts w:ascii="Times" w:eastAsia="Times" w:hAnsi="Times" w:cs="Times"/>
+                <w:sz w:val="22"/>
+                <w:szCs w:val="22"/>
+              </w:rPr>
+              <w:t xml:space="preserve">could </w:t>
+            </w:r>
+            <w:r>
+              <w:rPr>
+                <w:rFonts w:ascii="Times" w:eastAsia="Times" w:hAnsi="Times" w:cs="Times"/>
+                <w:sz w:val="22"/>
+                <w:szCs w:val="22"/>
+              </w:rPr>
+              <w:t xml:space="preserve">C-flat major </w:t>
+            </w:r>
+            <w:r>
+              <w:rPr>
+                <w:rFonts w:ascii="Times" w:eastAsia="Times" w:hAnsi="Times" w:cs="Times"/>
+                <w:sz w:val="22"/>
+                <w:szCs w:val="22"/>
+              </w:rPr>
+              <w:t xml:space="preserve">be used </w:t>
+            </w:r>
+            <w:r>
+              <w:rPr>
+                <w:rFonts w:ascii="Times" w:eastAsia="Times" w:hAnsi="Times" w:cs="Times"/>
+                <w:sz w:val="22"/>
+                <w:szCs w:val="22"/>
+              </w:rPr>
+              <w:t xml:space="preserve">instead for the harp’s key signature? </w:t>
             </w:r>
           </w:p>
         </w:tc>
@@ -927,6 +1082,8 @@
             <w:pPr>
               <w:rPr>
                 <w:rFonts w:ascii="Times" w:eastAsia="Times" w:hAnsi="Times" w:cs="Times"/>
+                <w:sz w:val="22"/>
+                <w:szCs w:val="22"/>
               </w:rPr>
             </w:pPr>
           </w:p>
@@ -951,11 +1108,15 @@
             <w:pPr>
               <w:rPr>
                 <w:rFonts w:ascii="Times" w:eastAsia="Times" w:hAnsi="Times" w:cs="Times"/>
-              </w:rPr>
-            </w:pPr>
-            <w:r>
-              <w:rPr>
-                <w:rFonts w:ascii="Times" w:eastAsia="Times" w:hAnsi="Times" w:cs="Times"/>
+                <w:sz w:val="22"/>
+                <w:szCs w:val="22"/>
+              </w:rPr>
+            </w:pPr>
+            <w:r>
+              <w:rPr>
+                <w:rFonts w:ascii="Times" w:eastAsia="Times" w:hAnsi="Times" w:cs="Times"/>
+                <w:sz w:val="22"/>
+                <w:szCs w:val="22"/>
               </w:rPr>
               <w:t>Viola</w:t>
             </w:r>
@@ -976,11 +1137,15 @@
             <w:pPr>
               <w:rPr>
                 <w:rFonts w:ascii="Times" w:eastAsia="Times" w:hAnsi="Times" w:cs="Times"/>
-              </w:rPr>
-            </w:pPr>
-            <w:r>
-              <w:rPr>
-                <w:rFonts w:ascii="Times" w:eastAsia="Times" w:hAnsi="Times" w:cs="Times"/>
+                <w:sz w:val="22"/>
+                <w:szCs w:val="22"/>
+              </w:rPr>
+            </w:pPr>
+            <w:r>
+              <w:rPr>
+                <w:rFonts w:ascii="Times" w:eastAsia="Times" w:hAnsi="Times" w:cs="Times"/>
+                <w:sz w:val="22"/>
+                <w:szCs w:val="22"/>
               </w:rPr>
               <w:t>43</w:t>
             </w:r>
@@ -1001,17 +1166,23 @@
             <w:pPr>
               <w:rPr>
                 <w:rFonts w:ascii="Times" w:eastAsia="Times" w:hAnsi="Times" w:cs="Times"/>
-              </w:rPr>
-            </w:pPr>
-            <w:r>
-              <w:rPr>
-                <w:rFonts w:ascii="Times" w:eastAsia="Times" w:hAnsi="Times" w:cs="Times"/>
+                <w:sz w:val="22"/>
+                <w:szCs w:val="22"/>
+              </w:rPr>
+            </w:pPr>
+            <w:r>
+              <w:rPr>
+                <w:rFonts w:ascii="Times" w:eastAsia="Times" w:hAnsi="Times" w:cs="Times"/>
+                <w:sz w:val="22"/>
+                <w:szCs w:val="22"/>
               </w:rPr>
               <w:t>4</w:t>
             </w:r>
             <w:r>
               <w:rPr>
                 <w:rFonts w:ascii="Times" w:eastAsia="Times" w:hAnsi="Times" w:cs="Times"/>
+                <w:sz w:val="22"/>
+                <w:szCs w:val="22"/>
                 <w:vertAlign w:val="superscript"/>
               </w:rPr>
               <w:t>th</w:t>
@@ -1019,6 +1190,8 @@
             <w:r>
               <w:rPr>
                 <w:rFonts w:ascii="Times" w:eastAsia="Times" w:hAnsi="Times" w:cs="Times"/>
+                <w:sz w:val="22"/>
+                <w:szCs w:val="22"/>
               </w:rPr>
               <w:t xml:space="preserve"> beat, slur or tied staccato? </w:t>
             </w:r>
@@ -1039,6 +1212,8 @@
             <w:pPr>
               <w:rPr>
                 <w:rFonts w:ascii="Times" w:eastAsia="Times" w:hAnsi="Times" w:cs="Times"/>
+                <w:sz w:val="22"/>
+                <w:szCs w:val="22"/>
               </w:rPr>
             </w:pPr>
           </w:p>
@@ -1063,11 +1238,15 @@
             <w:pPr>
               <w:rPr>
                 <w:rFonts w:ascii="Times" w:eastAsia="Times" w:hAnsi="Times" w:cs="Times"/>
-              </w:rPr>
-            </w:pPr>
-            <w:r>
-              <w:rPr>
-                <w:rFonts w:ascii="Times" w:eastAsia="Times" w:hAnsi="Times" w:cs="Times"/>
+                <w:sz w:val="22"/>
+                <w:szCs w:val="22"/>
+              </w:rPr>
+            </w:pPr>
+            <w:r>
+              <w:rPr>
+                <w:rFonts w:ascii="Times" w:eastAsia="Times" w:hAnsi="Times" w:cs="Times"/>
+                <w:sz w:val="22"/>
+                <w:szCs w:val="22"/>
               </w:rPr>
               <w:t>Violin II</w:t>
             </w:r>
@@ -1088,11 +1267,15 @@
             <w:pPr>
               <w:rPr>
                 <w:rFonts w:ascii="Times" w:eastAsia="Times" w:hAnsi="Times" w:cs="Times"/>
-              </w:rPr>
-            </w:pPr>
-            <w:r>
-              <w:rPr>
-                <w:rFonts w:ascii="Times" w:eastAsia="Times" w:hAnsi="Times" w:cs="Times"/>
+                <w:sz w:val="22"/>
+                <w:szCs w:val="22"/>
+              </w:rPr>
+            </w:pPr>
+            <w:r>
+              <w:rPr>
+                <w:rFonts w:ascii="Times" w:eastAsia="Times" w:hAnsi="Times" w:cs="Times"/>
+                <w:sz w:val="22"/>
+                <w:szCs w:val="22"/>
               </w:rPr>
               <w:t>52</w:t>
             </w:r>
@@ -1113,11 +1296,15 @@
             <w:pPr>
               <w:rPr>
                 <w:rFonts w:ascii="Times" w:eastAsia="Times" w:hAnsi="Times" w:cs="Times"/>
-              </w:rPr>
-            </w:pPr>
-            <w:r>
-              <w:rPr>
-                <w:rFonts w:ascii="Times" w:eastAsia="Times" w:hAnsi="Times" w:cs="Times"/>
+                <w:sz w:val="22"/>
+                <w:szCs w:val="22"/>
+              </w:rPr>
+            </w:pPr>
+            <w:r>
+              <w:rPr>
+                <w:rFonts w:ascii="Times" w:eastAsia="Times" w:hAnsi="Times" w:cs="Times"/>
+                <w:sz w:val="22"/>
+                <w:szCs w:val="22"/>
               </w:rPr>
               <w:t>Open A string unintentional harmonic mark?</w:t>
             </w:r>
@@ -1138,6 +1325,8 @@
             <w:pPr>
               <w:rPr>
                 <w:rFonts w:ascii="Times" w:eastAsia="Times" w:hAnsi="Times" w:cs="Times"/>
+                <w:sz w:val="22"/>
+                <w:szCs w:val="22"/>
               </w:rPr>
             </w:pPr>
           </w:p>
@@ -1162,11 +1351,15 @@
             <w:pPr>
               <w:rPr>
                 <w:rFonts w:ascii="Times" w:eastAsia="Times" w:hAnsi="Times" w:cs="Times"/>
-              </w:rPr>
-            </w:pPr>
-            <w:r>
-              <w:rPr>
-                <w:rFonts w:ascii="Times" w:eastAsia="Times" w:hAnsi="Times" w:cs="Times"/>
+                <w:sz w:val="22"/>
+                <w:szCs w:val="22"/>
+              </w:rPr>
+            </w:pPr>
+            <w:r>
+              <w:rPr>
+                <w:rFonts w:ascii="Times" w:eastAsia="Times" w:hAnsi="Times" w:cs="Times"/>
+                <w:sz w:val="22"/>
+                <w:szCs w:val="22"/>
               </w:rPr>
               <w:t>Horns</w:t>
             </w:r>
@@ -1187,11 +1380,15 @@
             <w:pPr>
               <w:rPr>
                 <w:rFonts w:ascii="Times" w:eastAsia="Times" w:hAnsi="Times" w:cs="Times"/>
-              </w:rPr>
-            </w:pPr>
-            <w:r>
-              <w:rPr>
-                <w:rFonts w:ascii="Times" w:eastAsia="Times" w:hAnsi="Times" w:cs="Times"/>
+                <w:sz w:val="22"/>
+                <w:szCs w:val="22"/>
+              </w:rPr>
+            </w:pPr>
+            <w:r>
+              <w:rPr>
+                <w:rFonts w:ascii="Times" w:eastAsia="Times" w:hAnsi="Times" w:cs="Times"/>
+                <w:sz w:val="22"/>
+                <w:szCs w:val="22"/>
               </w:rPr>
               <w:t>55</w:t>
             </w:r>
@@ -1212,11 +1409,15 @@
             <w:pPr>
               <w:rPr>
                 <w:rFonts w:ascii="Times" w:eastAsia="Times" w:hAnsi="Times" w:cs="Times"/>
-              </w:rPr>
-            </w:pPr>
-            <w:r>
-              <w:rPr>
-                <w:rFonts w:ascii="Times" w:eastAsia="Times" w:hAnsi="Times" w:cs="Times"/>
+                <w:sz w:val="22"/>
+                <w:szCs w:val="22"/>
+              </w:rPr>
+            </w:pPr>
+            <w:r>
+              <w:rPr>
+                <w:rFonts w:ascii="Times" w:eastAsia="Times" w:hAnsi="Times" w:cs="Times"/>
+                <w:sz w:val="22"/>
+                <w:szCs w:val="22"/>
               </w:rPr>
               <w:t xml:space="preserve">Dynamic swell with staccato intentional? </w:t>
             </w:r>
@@ -1237,6 +1438,8 @@
             <w:pPr>
               <w:rPr>
                 <w:rFonts w:ascii="Times" w:eastAsia="Times" w:hAnsi="Times" w:cs="Times"/>
+                <w:sz w:val="22"/>
+                <w:szCs w:val="22"/>
               </w:rPr>
             </w:pPr>
           </w:p>
@@ -1262,12 +1465,16 @@
               <w:rPr>
                 <w:rFonts w:ascii="Times" w:eastAsia="Times" w:hAnsi="Times" w:cs="Times"/>
                 <w:color w:val="E97132"/>
+                <w:sz w:val="22"/>
+                <w:szCs w:val="22"/>
               </w:rPr>
             </w:pPr>
             <w:r>
               <w:rPr>
                 <w:rFonts w:ascii="Times" w:eastAsia="Times" w:hAnsi="Times" w:cs="Times"/>
                 <w:color w:val="E97132"/>
+                <w:sz w:val="22"/>
+                <w:szCs w:val="22"/>
               </w:rPr>
               <w:t>Strings</w:t>
             </w:r>
@@ -1289,12 +1496,16 @@
               <w:rPr>
                 <w:rFonts w:ascii="Times" w:eastAsia="Times" w:hAnsi="Times" w:cs="Times"/>
                 <w:color w:val="E97132"/>
+                <w:sz w:val="22"/>
+                <w:szCs w:val="22"/>
               </w:rPr>
             </w:pPr>
             <w:r>
               <w:rPr>
                 <w:rFonts w:ascii="Times" w:eastAsia="Times" w:hAnsi="Times" w:cs="Times"/>
                 <w:color w:val="E97132"/>
+                <w:sz w:val="22"/>
+                <w:szCs w:val="22"/>
               </w:rPr>
               <w:t>58-60</w:t>
             </w:r>
@@ -1316,6 +1527,8 @@
               <w:rPr>
                 <w:rFonts w:ascii="Times" w:eastAsia="Times" w:hAnsi="Times" w:cs="Times"/>
                 <w:color w:val="E97132"/>
+                <w:sz w:val="22"/>
+                <w:szCs w:val="22"/>
               </w:rPr>
             </w:pPr>
             <w:proofErr w:type="spellStart"/>
@@ -1323,21 +1536,45 @@
               <w:rPr>
                 <w:rFonts w:ascii="Times" w:eastAsia="Times" w:hAnsi="Times" w:cs="Times"/>
                 <w:color w:val="E97132"/>
-              </w:rPr>
-              <w:t>Enharmonics</w:t>
+                <w:sz w:val="22"/>
+                <w:szCs w:val="22"/>
+              </w:rPr>
+              <w:t>Enharmo</w:t>
+            </w:r>
+            <w:r>
+              <w:rPr>
+                <w:rFonts w:ascii="Times" w:eastAsia="Times" w:hAnsi="Times" w:cs="Times"/>
+                <w:color w:val="E97132"/>
+                <w:sz w:val="22"/>
+                <w:szCs w:val="22"/>
+              </w:rPr>
+              <w:t>nics</w:t>
             </w:r>
             <w:proofErr w:type="spellEnd"/>
             <w:r>
               <w:rPr>
                 <w:rFonts w:ascii="Times" w:eastAsia="Times" w:hAnsi="Times" w:cs="Times"/>
                 <w:color w:val="E97132"/>
-              </w:rPr>
-              <w:t>: turned flats to sharps for ease of voice leading</w:t>
+                <w:sz w:val="22"/>
+                <w:szCs w:val="22"/>
+              </w:rPr>
+              <w:t>: turned flats to sharps for voice leading</w:t>
             </w:r>
             <w:r>
               <w:rPr>
                 <w:rFonts w:ascii="Times" w:eastAsia="Times" w:hAnsi="Times" w:cs="Times"/>
                 <w:color w:val="E97132"/>
+                <w:sz w:val="22"/>
+                <w:szCs w:val="22"/>
+              </w:rPr>
+              <w:t xml:space="preserve"> purposes</w:t>
+            </w:r>
+            <w:r>
+              <w:rPr>
+                <w:rFonts w:ascii="Times" w:eastAsia="Times" w:hAnsi="Times" w:cs="Times"/>
+                <w:color w:val="E97132"/>
+                <w:sz w:val="22"/>
+                <w:szCs w:val="22"/>
               </w:rPr>
               <w:t>.</w:t>
             </w:r>
@@ -1358,6 +1595,8 @@
             <w:pPr>
               <w:rPr>
                 <w:rFonts w:ascii="Times" w:eastAsia="Times" w:hAnsi="Times" w:cs="Times"/>
+                <w:sz w:val="22"/>
+                <w:szCs w:val="22"/>
               </w:rPr>
             </w:pPr>
           </w:p>
@@ -1382,11 +1621,15 @@
             <w:pPr>
               <w:rPr>
                 <w:rFonts w:ascii="Times" w:eastAsia="Times" w:hAnsi="Times" w:cs="Times"/>
-              </w:rPr>
-            </w:pPr>
-            <w:r>
-              <w:rPr>
-                <w:rFonts w:ascii="Times" w:eastAsia="Times" w:hAnsi="Times" w:cs="Times"/>
+                <w:sz w:val="22"/>
+                <w:szCs w:val="22"/>
+              </w:rPr>
+            </w:pPr>
+            <w:r>
+              <w:rPr>
+                <w:rFonts w:ascii="Times" w:eastAsia="Times" w:hAnsi="Times" w:cs="Times"/>
+                <w:sz w:val="22"/>
+                <w:szCs w:val="22"/>
               </w:rPr>
               <w:t xml:space="preserve">Horns </w:t>
             </w:r>
@@ -1407,11 +1650,15 @@
             <w:pPr>
               <w:rPr>
                 <w:rFonts w:ascii="Times" w:eastAsia="Times" w:hAnsi="Times" w:cs="Times"/>
-              </w:rPr>
-            </w:pPr>
-            <w:r>
-              <w:rPr>
-                <w:rFonts w:ascii="Times" w:eastAsia="Times" w:hAnsi="Times" w:cs="Times"/>
+                <w:sz w:val="22"/>
+                <w:szCs w:val="22"/>
+              </w:rPr>
+            </w:pPr>
+            <w:r>
+              <w:rPr>
+                <w:rFonts w:ascii="Times" w:eastAsia="Times" w:hAnsi="Times" w:cs="Times"/>
+                <w:sz w:val="22"/>
+                <w:szCs w:val="22"/>
               </w:rPr>
               <w:t>60</w:t>
             </w:r>
@@ -1432,11 +1679,15 @@
             <w:pPr>
               <w:rPr>
                 <w:rFonts w:ascii="Times" w:eastAsia="Times" w:hAnsi="Times" w:cs="Times"/>
-              </w:rPr>
-            </w:pPr>
-            <w:r>
-              <w:rPr>
-                <w:rFonts w:ascii="Times" w:eastAsia="Times" w:hAnsi="Times" w:cs="Times"/>
+                <w:sz w:val="22"/>
+                <w:szCs w:val="22"/>
+              </w:rPr>
+            </w:pPr>
+            <w:r>
+              <w:rPr>
+                <w:rFonts w:ascii="Times" w:eastAsia="Times" w:hAnsi="Times" w:cs="Times"/>
+                <w:sz w:val="22"/>
+                <w:szCs w:val="22"/>
               </w:rPr>
               <w:t xml:space="preserve">Staccatissimo on long held notes? Recommend using </w:t>
             </w:r>
@@ -1448,6 +1699,8 @@
                 <w:bCs/>
                 <w:i/>
                 <w:iCs/>
+                <w:sz w:val="22"/>
+                <w:szCs w:val="22"/>
               </w:rPr>
               <w:t>sfz</w:t>
             </w:r>
@@ -1455,6 +1708,8 @@
             <w:r>
               <w:rPr>
                 <w:rFonts w:ascii="Times" w:eastAsia="Times" w:hAnsi="Times" w:cs="Times"/>
+                <w:sz w:val="22"/>
+                <w:szCs w:val="22"/>
               </w:rPr>
               <w:t xml:space="preserve"> instead.  </w:t>
             </w:r>
@@ -1475,6 +1730,8 @@
             <w:pPr>
               <w:rPr>
                 <w:rFonts w:ascii="Times" w:eastAsia="Times" w:hAnsi="Times" w:cs="Times"/>
+                <w:sz w:val="22"/>
+                <w:szCs w:val="22"/>
               </w:rPr>
             </w:pPr>
           </w:p>
@@ -1499,11 +1756,15 @@
             <w:pPr>
               <w:rPr>
                 <w:rFonts w:ascii="Times" w:eastAsia="Times" w:hAnsi="Times" w:cs="Times"/>
-              </w:rPr>
-            </w:pPr>
-            <w:r>
-              <w:rPr>
-                <w:rFonts w:ascii="Times" w:eastAsia="Times" w:hAnsi="Times" w:cs="Times"/>
+                <w:sz w:val="22"/>
+                <w:szCs w:val="22"/>
+              </w:rPr>
+            </w:pPr>
+            <w:r>
+              <w:rPr>
+                <w:rFonts w:ascii="Times" w:eastAsia="Times" w:hAnsi="Times" w:cs="Times"/>
+                <w:sz w:val="22"/>
+                <w:szCs w:val="22"/>
               </w:rPr>
               <w:t>Cello</w:t>
             </w:r>
@@ -1524,11 +1785,15 @@
             <w:pPr>
               <w:rPr>
                 <w:rFonts w:ascii="Times" w:eastAsia="Times" w:hAnsi="Times" w:cs="Times"/>
-              </w:rPr>
-            </w:pPr>
-            <w:r>
-              <w:rPr>
-                <w:rFonts w:ascii="Times" w:eastAsia="Times" w:hAnsi="Times" w:cs="Times"/>
+                <w:sz w:val="22"/>
+                <w:szCs w:val="22"/>
+              </w:rPr>
+            </w:pPr>
+            <w:r>
+              <w:rPr>
+                <w:rFonts w:ascii="Times" w:eastAsia="Times" w:hAnsi="Times" w:cs="Times"/>
+                <w:sz w:val="22"/>
+                <w:szCs w:val="22"/>
               </w:rPr>
               <w:t>61</w:t>
             </w:r>
@@ -1549,18 +1814,25 @@
             <w:pPr>
               <w:rPr>
                 <w:rFonts w:ascii="Times" w:eastAsia="Times" w:hAnsi="Times" w:cs="Times"/>
-              </w:rPr>
-            </w:pPr>
-          </w:p>
-          <w:p>
-            <w:pPr>
-              <w:rPr>
-                <w:rFonts w:ascii="Times" w:eastAsia="Times" w:hAnsi="Times" w:cs="Times"/>
-              </w:rPr>
-            </w:pPr>
-            <w:r>
-              <w:rPr>
-                <w:rFonts w:ascii="Times" w:eastAsia="Times" w:hAnsi="Times" w:cs="Times"/>
+                <w:sz w:val="22"/>
+                <w:szCs w:val="22"/>
+              </w:rPr>
+            </w:pPr>
+          </w:p>
+          <w:p>
+            <w:pPr>
+              <w:rPr>
+                <w:rFonts w:ascii="Times" w:eastAsia="Times" w:hAnsi="Times" w:cs="Times"/>
+                <w:sz w:val="22"/>
+                <w:szCs w:val="22"/>
+              </w:rPr>
+            </w:pPr>
+            <w:r>
+              <w:rPr>
+                <w:rFonts w:ascii="Times" w:eastAsia="Times" w:hAnsi="Times" w:cs="Times"/>
+                <w:noProof/>
+                <w:sz w:val="22"/>
+                <w:szCs w:val="22"/>
               </w:rPr>
               <w:drawing>
                 <wp:inline distT="0" distB="0" distL="0" distR="0" wp14:anchorId="0FF34F04" wp14:editId="6718EF40">
@@ -1610,11 +1882,15 @@
             <w:pPr>
               <w:rPr>
                 <w:rFonts w:ascii="Times" w:eastAsia="Times" w:hAnsi="Times" w:cs="Times"/>
-              </w:rPr>
-            </w:pPr>
-            <w:r>
-              <w:rPr>
-                <w:rFonts w:ascii="Times" w:eastAsia="Times" w:hAnsi="Times" w:cs="Times"/>
+                <w:sz w:val="22"/>
+                <w:szCs w:val="22"/>
+              </w:rPr>
+            </w:pPr>
+            <w:r>
+              <w:rPr>
+                <w:rFonts w:ascii="Times" w:eastAsia="Times" w:hAnsi="Times" w:cs="Times"/>
+                <w:sz w:val="22"/>
+                <w:szCs w:val="22"/>
               </w:rPr>
               <w:t xml:space="preserve">Should the beam grouping be: </w:t>
             </w:r>
@@ -1623,17 +1899,24 @@
             <w:pPr>
               <w:rPr>
                 <w:rFonts w:ascii="Times" w:eastAsia="Times" w:hAnsi="Times" w:cs="Times"/>
-              </w:rPr>
-            </w:pPr>
-            <w:r>
-              <w:rPr>
-                <w:rFonts w:ascii="Times" w:eastAsia="Times" w:hAnsi="Times" w:cs="Times"/>
+                <w:sz w:val="22"/>
+                <w:szCs w:val="22"/>
+              </w:rPr>
+            </w:pPr>
+            <w:r>
+              <w:rPr>
+                <w:rFonts w:ascii="Times" w:eastAsia="Times" w:hAnsi="Times" w:cs="Times"/>
+                <w:sz w:val="22"/>
+                <w:szCs w:val="22"/>
               </w:rPr>
               <w:t xml:space="preserve">A) </w:t>
             </w:r>
             <w:r>
               <w:rPr>
                 <w:rFonts w:ascii="Times" w:eastAsia="Times" w:hAnsi="Times" w:cs="Times"/>
+                <w:noProof/>
+                <w:sz w:val="22"/>
+                <w:szCs w:val="22"/>
               </w:rPr>
               <w:drawing>
                 <wp:inline distT="0" distB="0" distL="0" distR="0" wp14:anchorId="6C44A96A" wp14:editId="4A9B145E">
@@ -1702,6 +1985,8 @@
             <w:r>
               <w:rPr>
                 <w:rFonts w:ascii="Times" w:eastAsia="Times" w:hAnsi="Times" w:cs="Times"/>
+                <w:sz w:val="22"/>
+                <w:szCs w:val="22"/>
               </w:rPr>
               <w:t xml:space="preserve"> or</w:t>
             </w:r>
@@ -1710,18 +1995,24 @@
             <w:pPr>
               <w:rPr>
                 <w:rFonts w:ascii="Times" w:eastAsia="Times" w:hAnsi="Times" w:cs="Times"/>
-              </w:rPr>
-            </w:pPr>
-            <w:r>
-              <w:rPr>
-                <w:rFonts w:ascii="Times" w:eastAsia="Times" w:hAnsi="Times" w:cs="Times"/>
-              </w:rPr>
-              <w:lastRenderedPageBreak/>
+                <w:sz w:val="22"/>
+                <w:szCs w:val="22"/>
+              </w:rPr>
+            </w:pPr>
+            <w:r>
+              <w:rPr>
+                <w:rFonts w:ascii="Times" w:eastAsia="Times" w:hAnsi="Times" w:cs="Times"/>
+                <w:sz w:val="22"/>
+                <w:szCs w:val="22"/>
+              </w:rPr>
               <w:t xml:space="preserve">B) </w:t>
             </w:r>
             <w:r>
               <w:rPr>
                 <w:rFonts w:ascii="Times" w:eastAsia="Times" w:hAnsi="Times" w:cs="Times"/>
+                <w:noProof/>
+                <w:sz w:val="22"/>
+                <w:szCs w:val="22"/>
               </w:rPr>
               <w:drawing>
                 <wp:inline distT="0" distB="0" distL="0" distR="0" wp14:anchorId="7CA21E89" wp14:editId="324815D9">
@@ -1767,6 +2058,8 @@
             <w:r>
               <w:rPr>
                 <w:rFonts w:ascii="Times" w:eastAsia="Times" w:hAnsi="Times" w:cs="Times"/>
+                <w:sz w:val="22"/>
+                <w:szCs w:val="22"/>
               </w:rPr>
               <w:t xml:space="preserve"> or</w:t>
             </w:r>
@@ -1775,11 +2068,15 @@
             <w:pPr>
               <w:rPr>
                 <w:rFonts w:ascii="Times" w:eastAsia="Times" w:hAnsi="Times" w:cs="Times"/>
-              </w:rPr>
-            </w:pPr>
-            <w:r>
-              <w:rPr>
-                <w:rFonts w:ascii="Times" w:eastAsia="Times" w:hAnsi="Times" w:cs="Times"/>
+                <w:sz w:val="22"/>
+                <w:szCs w:val="22"/>
+              </w:rPr>
+            </w:pPr>
+            <w:r>
+              <w:rPr>
+                <w:rFonts w:ascii="Times" w:eastAsia="Times" w:hAnsi="Times" w:cs="Times"/>
+                <w:sz w:val="22"/>
+                <w:szCs w:val="22"/>
               </w:rPr>
               <w:t xml:space="preserve">C) Follow original manuscript. </w:t>
             </w:r>
@@ -1788,6 +2085,8 @@
             <w:pPr>
               <w:rPr>
                 <w:rFonts w:ascii="Times" w:eastAsia="Times" w:hAnsi="Times" w:cs="Times"/>
+                <w:sz w:val="22"/>
+                <w:szCs w:val="22"/>
               </w:rPr>
             </w:pPr>
           </w:p>
@@ -1807,6 +2106,8 @@
             <w:pPr>
               <w:rPr>
                 <w:rFonts w:ascii="Times" w:eastAsia="Times" w:hAnsi="Times" w:cs="Times"/>
+                <w:sz w:val="22"/>
+                <w:szCs w:val="22"/>
               </w:rPr>
             </w:pPr>
           </w:p>
@@ -1831,8 +2132,19 @@
             <w:pPr>
               <w:rPr>
                 <w:rFonts w:ascii="Times" w:eastAsia="Times" w:hAnsi="Times" w:cs="Times"/>
-              </w:rPr>
-            </w:pPr>
+                <w:sz w:val="22"/>
+                <w:szCs w:val="22"/>
+              </w:rPr>
+            </w:pPr>
+            <w:r>
+              <w:rPr>
+                <w:rFonts w:ascii="Times" w:eastAsia="Times" w:hAnsi="Times" w:cs="Times"/>
+                <w:sz w:val="22"/>
+                <w:szCs w:val="22"/>
+              </w:rPr>
+              <w:lastRenderedPageBreak/>
+              <w:t>Double bass</w:t>
+            </w:r>
           </w:p>
         </w:tc>
         <w:tc>
@@ -1850,8 +2162,18 @@
             <w:pPr>
               <w:rPr>
                 <w:rFonts w:ascii="Times" w:eastAsia="Times" w:hAnsi="Times" w:cs="Times"/>
-              </w:rPr>
-            </w:pPr>
+                <w:sz w:val="22"/>
+                <w:szCs w:val="22"/>
+              </w:rPr>
+            </w:pPr>
+            <w:r>
+              <w:rPr>
+                <w:rFonts w:ascii="Times" w:eastAsia="Times" w:hAnsi="Times" w:cs="Times"/>
+                <w:sz w:val="22"/>
+                <w:szCs w:val="22"/>
+              </w:rPr>
+              <w:t>68</w:t>
+            </w:r>
           </w:p>
         </w:tc>
         <w:tc>
@@ -1869,6 +2191,178 @@
             <w:pPr>
               <w:rPr>
                 <w:rFonts w:ascii="Times" w:eastAsia="Times" w:hAnsi="Times" w:cs="Times"/>
+                <w:sz w:val="22"/>
+                <w:szCs w:val="22"/>
+              </w:rPr>
+            </w:pPr>
+            <w:r>
+              <w:rPr>
+                <w:rFonts w:ascii="Times" w:eastAsia="Times" w:hAnsi="Times" w:cs="Times"/>
+                <w:sz w:val="22"/>
+                <w:szCs w:val="22"/>
+              </w:rPr>
+              <w:t xml:space="preserve">Is this DB in </w:t>
+            </w:r>
+            <w:r>
+              <w:rPr>
+                <w:rFonts w:ascii="Times" w:eastAsia="Times" w:hAnsi="Times" w:cs="Times"/>
+                <w:b/>
+                <w:bCs/>
+                <w:sz w:val="22"/>
+                <w:szCs w:val="22"/>
+              </w:rPr>
+              <w:t xml:space="preserve">written </w:t>
+            </w:r>
+            <w:r>
+              <w:rPr>
+                <w:rFonts w:ascii="Times" w:eastAsia="Times" w:hAnsi="Times" w:cs="Times"/>
+                <w:sz w:val="22"/>
+                <w:szCs w:val="22"/>
+              </w:rPr>
+              <w:t xml:space="preserve">or </w:t>
+            </w:r>
+            <w:r>
+              <w:rPr>
+                <w:rFonts w:ascii="Times" w:eastAsia="Times" w:hAnsi="Times" w:cs="Times"/>
+                <w:b/>
+                <w:bCs/>
+                <w:sz w:val="22"/>
+                <w:szCs w:val="22"/>
+              </w:rPr>
+              <w:t>sounding pitch</w:t>
+            </w:r>
+            <w:r>
+              <w:rPr>
+                <w:rFonts w:ascii="Times" w:eastAsia="Times" w:hAnsi="Times" w:cs="Times"/>
+                <w:sz w:val="22"/>
+                <w:szCs w:val="22"/>
+              </w:rPr>
+              <w:t xml:space="preserve">? </w:t>
+            </w:r>
+          </w:p>
+          <w:p>
+            <w:pPr>
+              <w:rPr>
+                <w:rFonts w:ascii="Times" w:eastAsia="Times" w:hAnsi="Times" w:cs="Times"/>
+                <w:sz w:val="22"/>
+                <w:szCs w:val="22"/>
+              </w:rPr>
+            </w:pPr>
+            <w:r>
+              <w:rPr>
+                <w:rFonts w:ascii="Times" w:eastAsia="Times" w:hAnsi="Times" w:cs="Times"/>
+                <w:sz w:val="16"/>
+                <w:szCs w:val="16"/>
+              </w:rPr>
+              <w:t>If written pitch, all DBs are expected to have 5</w:t>
+            </w:r>
+            <w:r>
+              <w:rPr>
+                <w:rFonts w:ascii="Times" w:eastAsia="Times" w:hAnsi="Times" w:cs="Times"/>
+                <w:sz w:val="16"/>
+                <w:szCs w:val="16"/>
+                <w:vertAlign w:val="superscript"/>
+              </w:rPr>
+              <w:t>th</w:t>
+            </w:r>
+            <w:r>
+              <w:rPr>
+                <w:rFonts w:ascii="Times" w:eastAsia="Times" w:hAnsi="Times" w:cs="Times"/>
+                <w:sz w:val="16"/>
+                <w:szCs w:val="16"/>
+              </w:rPr>
+              <w:t xml:space="preserve"> </w:t>
+            </w:r>
+            <w:r>
+              <w:rPr>
+                <w:rFonts w:ascii="Times" w:eastAsia="Times" w:hAnsi="Times" w:cs="Times"/>
+                <w:sz w:val="16"/>
+                <w:szCs w:val="16"/>
+              </w:rPr>
+              <w:t xml:space="preserve">C </w:t>
+            </w:r>
+            <w:r>
+              <w:rPr>
+                <w:rFonts w:ascii="Times" w:eastAsia="Times" w:hAnsi="Times" w:cs="Times"/>
+                <w:sz w:val="16"/>
+                <w:szCs w:val="16"/>
+              </w:rPr>
+              <w:t>string or E-string extension.</w:t>
+            </w:r>
+          </w:p>
+          <w:p>
+            <w:pPr>
+              <w:rPr>
+                <w:rFonts w:ascii="Times" w:eastAsia="Times" w:hAnsi="Times" w:cs="Times"/>
+                <w:sz w:val="22"/>
+                <w:szCs w:val="22"/>
+              </w:rPr>
+            </w:pPr>
+          </w:p>
+          <w:p>
+            <w:pPr>
+              <w:rPr>
+                <w:rFonts w:ascii="Times" w:eastAsia="Times" w:hAnsi="Times" w:cs="Times"/>
+                <w:sz w:val="22"/>
+                <w:szCs w:val="22"/>
+              </w:rPr>
+            </w:pPr>
+            <w:r>
+              <w:rPr>
+                <w:rFonts w:ascii="Times" w:eastAsia="Times" w:hAnsi="Times" w:cs="Times"/>
+                <w:sz w:val="22"/>
+                <w:szCs w:val="22"/>
+              </w:rPr>
+              <w:drawing>
+                <wp:inline distT="0" distB="0" distL="0" distR="0" wp14:anchorId="4A05DAFC" wp14:editId="295A2DF1">
+                  <wp:extent cx="1912948" cy="731253"/>
+                  <wp:effectExtent l="19050" t="19050" r="11430" b="12065"/>
+                  <wp:docPr id="982834362" name="Picture 1"/>
+                  <wp:cNvGraphicFramePr>
+                    <a:graphicFrameLocks xmlns:a="http://schemas.openxmlformats.org/drawingml/2006/main" noChangeAspect="1"/>
+                  </wp:cNvGraphicFramePr>
+                  <a:graphic xmlns:a="http://schemas.openxmlformats.org/drawingml/2006/main">
+                    <a:graphicData uri="http://schemas.openxmlformats.org/drawingml/2006/picture">
+                      <pic:pic xmlns:pic="http://schemas.openxmlformats.org/drawingml/2006/picture">
+                        <pic:nvPicPr>
+                          <pic:cNvPr id="982834362" name=""/>
+                          <pic:cNvPicPr/>
+                        </pic:nvPicPr>
+                        <pic:blipFill>
+                          <a:blip r:embed="rId10"/>
+                          <a:stretch>
+                            <a:fillRect/>
+                          </a:stretch>
+                        </pic:blipFill>
+                        <pic:spPr>
+                          <a:xfrm>
+                            <a:off x="0" y="0"/>
+                            <a:ext cx="1932965" cy="738905"/>
+                          </a:xfrm>
+                          <a:prstGeom prst="rect">
+                            <a:avLst/>
+                          </a:prstGeom>
+                          <a:ln>
+                            <a:solidFill>
+                              <a:schemeClr val="bg1">
+                                <a:lumMod val="75000"/>
+                              </a:schemeClr>
+                            </a:solidFill>
+                          </a:ln>
+                        </pic:spPr>
+                      </pic:pic>
+                    </a:graphicData>
+                  </a:graphic>
+                </wp:inline>
+              </w:drawing>
+            </w:r>
+          </w:p>
+          <w:p>
+            <w:pPr>
+              <w:rPr>
+                <w:rFonts w:ascii="Times" w:eastAsia="Times" w:hAnsi="Times" w:cs="Times"/>
+                <w:sz w:val="22"/>
+                <w:szCs w:val="22"/>
               </w:rPr>
             </w:pPr>
           </w:p>
@@ -1888,6 +2382,8 @@
             <w:pPr>
               <w:rPr>
                 <w:rFonts w:ascii="Times" w:eastAsia="Times" w:hAnsi="Times" w:cs="Times"/>
+                <w:sz w:val="22"/>
+                <w:szCs w:val="22"/>
               </w:rPr>
             </w:pPr>
           </w:p>
@@ -1912,8 +2408,20 @@
             <w:pPr>
               <w:rPr>
                 <w:rFonts w:ascii="Times" w:eastAsia="Times" w:hAnsi="Times" w:cs="Times"/>
-              </w:rPr>
-            </w:pPr>
+                <w:sz w:val="22"/>
+                <w:szCs w:val="22"/>
+              </w:rPr>
+            </w:pPr>
+            <w:proofErr w:type="spellStart"/>
+            <w:r>
+              <w:rPr>
+                <w:rFonts w:ascii="Times" w:eastAsia="Times" w:hAnsi="Times" w:cs="Times"/>
+                <w:sz w:val="22"/>
+                <w:szCs w:val="22"/>
+              </w:rPr>
+              <w:t>Cbsn</w:t>
+            </w:r>
+            <w:proofErr w:type="spellEnd"/>
           </w:p>
         </w:tc>
         <w:tc>
@@ -1931,8 +2439,18 @@
             <w:pPr>
               <w:rPr>
                 <w:rFonts w:ascii="Times" w:eastAsia="Times" w:hAnsi="Times" w:cs="Times"/>
-              </w:rPr>
-            </w:pPr>
+                <w:sz w:val="22"/>
+                <w:szCs w:val="22"/>
+              </w:rPr>
+            </w:pPr>
+            <w:r>
+              <w:rPr>
+                <w:rFonts w:ascii="Times" w:eastAsia="Times" w:hAnsi="Times" w:cs="Times"/>
+                <w:sz w:val="22"/>
+                <w:szCs w:val="22"/>
+              </w:rPr>
+              <w:t>73</w:t>
+            </w:r>
           </w:p>
         </w:tc>
         <w:tc>
@@ -1950,6 +2468,128 @@
             <w:pPr>
               <w:rPr>
                 <w:rFonts w:ascii="Times" w:eastAsia="Times" w:hAnsi="Times" w:cs="Times"/>
+                <w:sz w:val="22"/>
+                <w:szCs w:val="22"/>
+              </w:rPr>
+            </w:pPr>
+            <w:r>
+              <w:rPr>
+                <w:rFonts w:ascii="Times" w:eastAsia="Times" w:hAnsi="Times" w:cs="Times"/>
+                <w:sz w:val="22"/>
+                <w:szCs w:val="22"/>
+              </w:rPr>
+              <w:t xml:space="preserve">Is Contrabassoon here in </w:t>
+            </w:r>
+            <w:r>
+              <w:rPr>
+                <w:rFonts w:ascii="Times" w:eastAsia="Times" w:hAnsi="Times" w:cs="Times"/>
+                <w:b/>
+                <w:bCs/>
+                <w:sz w:val="22"/>
+                <w:szCs w:val="22"/>
+              </w:rPr>
+              <w:t>written</w:t>
+            </w:r>
+            <w:r>
+              <w:rPr>
+                <w:rFonts w:ascii="Times" w:eastAsia="Times" w:hAnsi="Times" w:cs="Times"/>
+                <w:sz w:val="22"/>
+                <w:szCs w:val="22"/>
+              </w:rPr>
+              <w:t xml:space="preserve"> or </w:t>
+            </w:r>
+            <w:r>
+              <w:rPr>
+                <w:rFonts w:ascii="Times" w:eastAsia="Times" w:hAnsi="Times" w:cs="Times"/>
+                <w:b/>
+                <w:bCs/>
+                <w:sz w:val="22"/>
+                <w:szCs w:val="22"/>
+              </w:rPr>
+              <w:t>sounding pitch</w:t>
+            </w:r>
+            <w:r>
+              <w:rPr>
+                <w:rFonts w:ascii="Times" w:eastAsia="Times" w:hAnsi="Times" w:cs="Times"/>
+                <w:sz w:val="22"/>
+                <w:szCs w:val="22"/>
+              </w:rPr>
+              <w:t xml:space="preserve">? </w:t>
+            </w:r>
+          </w:p>
+          <w:p>
+            <w:pPr>
+              <w:rPr>
+                <w:rFonts w:ascii="Times" w:eastAsia="Times" w:hAnsi="Times" w:cs="Times"/>
+                <w:sz w:val="22"/>
+                <w:szCs w:val="22"/>
+              </w:rPr>
+            </w:pPr>
+          </w:p>
+          <w:p>
+            <w:pPr>
+              <w:rPr>
+                <w:rFonts w:ascii="Times" w:eastAsia="Times" w:hAnsi="Times" w:cs="Times"/>
+                <w:sz w:val="22"/>
+                <w:szCs w:val="22"/>
+              </w:rPr>
+            </w:pPr>
+            <w:r>
+              <w:rPr>
+                <w:rFonts w:ascii="Times" w:eastAsia="Times" w:hAnsi="Times" w:cs="Times"/>
+                <w:sz w:val="22"/>
+                <w:szCs w:val="22"/>
+              </w:rPr>
+              <w:drawing>
+                <wp:inline distT="0" distB="0" distL="0" distR="0" wp14:anchorId="708A2E49" wp14:editId="324524F3">
+                  <wp:extent cx="2179998" cy="622790"/>
+                  <wp:effectExtent l="19050" t="19050" r="10795" b="25400"/>
+                  <wp:docPr id="1001355647" name="Picture 1"/>
+                  <wp:cNvGraphicFramePr>
+                    <a:graphicFrameLocks xmlns:a="http://schemas.openxmlformats.org/drawingml/2006/main" noChangeAspect="1"/>
+                  </wp:cNvGraphicFramePr>
+                  <a:graphic xmlns:a="http://schemas.openxmlformats.org/drawingml/2006/main">
+                    <a:graphicData uri="http://schemas.openxmlformats.org/drawingml/2006/picture">
+                      <pic:pic xmlns:pic="http://schemas.openxmlformats.org/drawingml/2006/picture">
+                        <pic:nvPicPr>
+                          <pic:cNvPr id="1001355647" name=""/>
+                          <pic:cNvPicPr/>
+                        </pic:nvPicPr>
+                        <pic:blipFill>
+                          <a:blip r:embed="rId11"/>
+                          <a:stretch>
+                            <a:fillRect/>
+                          </a:stretch>
+                        </pic:blipFill>
+                        <pic:spPr>
+                          <a:xfrm>
+                            <a:off x="0" y="0"/>
+                            <a:ext cx="2191499" cy="626076"/>
+                          </a:xfrm>
+                          <a:prstGeom prst="rect">
+                            <a:avLst/>
+                          </a:prstGeom>
+                          <a:ln>
+                            <a:solidFill>
+                              <a:schemeClr val="bg1">
+                                <a:lumMod val="75000"/>
+                              </a:schemeClr>
+                            </a:solidFill>
+                          </a:ln>
+                        </pic:spPr>
+                      </pic:pic>
+                    </a:graphicData>
+                  </a:graphic>
+                </wp:inline>
+              </w:drawing>
+            </w:r>
+          </w:p>
+          <w:p>
+            <w:pPr>
+              <w:rPr>
+                <w:rFonts w:ascii="Times" w:eastAsia="Times" w:hAnsi="Times" w:cs="Times"/>
+                <w:sz w:val="22"/>
+                <w:szCs w:val="22"/>
               </w:rPr>
             </w:pPr>
           </w:p>
@@ -1969,6 +2609,8 @@
             <w:pPr>
               <w:rPr>
                 <w:rFonts w:ascii="Times" w:eastAsia="Times" w:hAnsi="Times" w:cs="Times"/>
+                <w:sz w:val="22"/>
+                <w:szCs w:val="22"/>
               </w:rPr>
             </w:pPr>
           </w:p>
@@ -1993,8 +2635,18 @@
             <w:pPr>
               <w:rPr>
                 <w:rFonts w:ascii="Times" w:eastAsia="Times" w:hAnsi="Times" w:cs="Times"/>
-              </w:rPr>
-            </w:pPr>
+                <w:sz w:val="22"/>
+                <w:szCs w:val="22"/>
+              </w:rPr>
+            </w:pPr>
+            <w:r>
+              <w:rPr>
+                <w:rFonts w:ascii="Times" w:eastAsia="Times" w:hAnsi="Times" w:cs="Times"/>
+                <w:sz w:val="22"/>
+                <w:szCs w:val="22"/>
+              </w:rPr>
+              <w:t>Violas</w:t>
+            </w:r>
           </w:p>
         </w:tc>
         <w:tc>
@@ -2012,8 +2664,18 @@
             <w:pPr>
               <w:rPr>
                 <w:rFonts w:ascii="Times" w:eastAsia="Times" w:hAnsi="Times" w:cs="Times"/>
-              </w:rPr>
-            </w:pPr>
+                <w:sz w:val="22"/>
+                <w:szCs w:val="22"/>
+              </w:rPr>
+            </w:pPr>
+            <w:r>
+              <w:rPr>
+                <w:rFonts w:ascii="Times" w:eastAsia="Times" w:hAnsi="Times" w:cs="Times"/>
+                <w:sz w:val="22"/>
+                <w:szCs w:val="22"/>
+              </w:rPr>
+              <w:t>76</w:t>
+            </w:r>
           </w:p>
         </w:tc>
         <w:tc>
@@ -2031,8 +2693,83 @@
             <w:pPr>
               <w:rPr>
                 <w:rFonts w:ascii="Times" w:eastAsia="Times" w:hAnsi="Times" w:cs="Times"/>
-              </w:rPr>
-            </w:pPr>
+                <w:sz w:val="22"/>
+                <w:szCs w:val="22"/>
+              </w:rPr>
+            </w:pPr>
+            <w:r>
+              <w:rPr>
+                <w:rFonts w:ascii="Times" w:eastAsia="Times" w:hAnsi="Times" w:cs="Times"/>
+                <w:sz w:val="22"/>
+                <w:szCs w:val="22"/>
+              </w:rPr>
+              <w:t>3</w:t>
+            </w:r>
+            <w:r>
+              <w:rPr>
+                <w:rFonts w:ascii="Times" w:eastAsia="Times" w:hAnsi="Times" w:cs="Times"/>
+                <w:sz w:val="22"/>
+                <w:szCs w:val="22"/>
+                <w:vertAlign w:val="superscript"/>
+              </w:rPr>
+              <w:t>rd</w:t>
+            </w:r>
+            <w:r>
+              <w:rPr>
+                <w:rFonts w:ascii="Times" w:eastAsia="Times" w:hAnsi="Times" w:cs="Times"/>
+                <w:sz w:val="22"/>
+                <w:szCs w:val="22"/>
+              </w:rPr>
+              <w:t xml:space="preserve"> beat E#</w:t>
+            </w:r>
+            <w:r>
+              <w:rPr>
+                <w:rFonts w:ascii="Times" w:eastAsia="Times" w:hAnsi="Times" w:cs="Times"/>
+                <w:sz w:val="22"/>
+                <w:szCs w:val="22"/>
+              </w:rPr>
+              <w:t xml:space="preserve"> </w:t>
+            </w:r>
+            <w:r>
+              <w:rPr>
+                <w:rFonts w:ascii="Times" w:eastAsia="Times" w:hAnsi="Times" w:cs="Times"/>
+                <w:sz w:val="22"/>
+                <w:szCs w:val="22"/>
+              </w:rPr>
+              <w:t>or</w:t>
+            </w:r>
+            <w:r>
+              <w:rPr>
+                <w:rFonts w:ascii="Times" w:eastAsia="Times" w:hAnsi="Times" w:cs="Times"/>
+                <w:sz w:val="22"/>
+                <w:szCs w:val="22"/>
+              </w:rPr>
+              <w:t xml:space="preserve"> meant to be</w:t>
+            </w:r>
+            <w:r>
+              <w:rPr>
+                <w:rFonts w:ascii="Times" w:eastAsia="Times" w:hAnsi="Times" w:cs="Times"/>
+                <w:sz w:val="22"/>
+                <w:szCs w:val="22"/>
+              </w:rPr>
+              <w:t xml:space="preserve"> E</w:t>
+            </w:r>
+            <w:r>
+              <w:rPr>
+                <w:rFonts w:ascii="Segoe UI Symbol" w:eastAsia="Times" w:hAnsi="Segoe UI Symbol" w:cs="Segoe UI Symbol"/>
+                <w:sz w:val="22"/>
+                <w:szCs w:val="22"/>
+              </w:rPr>
+              <w:t>♮</w:t>
+            </w:r>
+            <w:r>
+              <w:rPr>
+                <w:rFonts w:ascii="Times" w:eastAsia="Times" w:hAnsi="Times" w:cs="Times"/>
+                <w:sz w:val="22"/>
+                <w:szCs w:val="22"/>
+              </w:rPr>
+              <w:t>?</w:t>
+            </w:r>
           </w:p>
         </w:tc>
         <w:tc>
@@ -2050,6 +2787,471 @@
             <w:pPr>
               <w:rPr>
                 <w:rFonts w:ascii="Times" w:eastAsia="Times" w:hAnsi="Times" w:cs="Times"/>
+                <w:sz w:val="22"/>
+                <w:szCs w:val="22"/>
+              </w:rPr>
+            </w:pPr>
+          </w:p>
+        </w:tc>
+      </w:tr>
+      <w:tr>
+        <w:trPr>
+          <w:trHeight w:val="350"/>
+        </w:trPr>
+        <w:tc>
+          <w:tcPr>
+            <w:tcW w:w="756" w:type="pct"/>
+            <w:tcBorders>
+              <w:top w:val="single" w:sz="4" w:space="0" w:color="000000"/>
+              <w:left w:val="single" w:sz="4" w:space="0" w:color="000000"/>
+              <w:bottom w:val="single" w:sz="4" w:space="0" w:color="000000"/>
+              <w:right w:val="single" w:sz="4" w:space="0" w:color="000000"/>
+            </w:tcBorders>
+            <w:vAlign w:val="center"/>
+          </w:tcPr>
+          <w:p>
+            <w:pPr>
+              <w:rPr>
+                <w:rFonts w:ascii="Times" w:eastAsia="Times" w:hAnsi="Times" w:cs="Times"/>
+                <w:color w:val="E97132"/>
+                <w:sz w:val="22"/>
+                <w:szCs w:val="22"/>
+              </w:rPr>
+            </w:pPr>
+            <w:r>
+              <w:rPr>
+                <w:rFonts w:ascii="Times" w:eastAsia="Times" w:hAnsi="Times" w:cs="Times"/>
+                <w:color w:val="E97132"/>
+                <w:sz w:val="22"/>
+                <w:szCs w:val="22"/>
+              </w:rPr>
+              <w:t>Horns</w:t>
+            </w:r>
+          </w:p>
+        </w:tc>
+        <w:tc>
+          <w:tcPr>
+            <w:tcW w:w="727" w:type="pct"/>
+            <w:tcBorders>
+              <w:top w:val="single" w:sz="4" w:space="0" w:color="000000"/>
+              <w:left w:val="single" w:sz="4" w:space="0" w:color="000000"/>
+              <w:bottom w:val="single" w:sz="4" w:space="0" w:color="000000"/>
+              <w:right w:val="single" w:sz="4" w:space="0" w:color="000000"/>
+            </w:tcBorders>
+            <w:vAlign w:val="center"/>
+          </w:tcPr>
+          <w:p>
+            <w:pPr>
+              <w:rPr>
+                <w:rFonts w:ascii="Times" w:eastAsia="Times" w:hAnsi="Times" w:cs="Times"/>
+                <w:color w:val="E97132"/>
+                <w:sz w:val="22"/>
+                <w:szCs w:val="22"/>
+              </w:rPr>
+            </w:pPr>
+            <w:r>
+              <w:rPr>
+                <w:rFonts w:ascii="Times" w:eastAsia="Times" w:hAnsi="Times" w:cs="Times"/>
+                <w:color w:val="E97132"/>
+                <w:sz w:val="22"/>
+                <w:szCs w:val="22"/>
+              </w:rPr>
+              <w:t>78</w:t>
+            </w:r>
+          </w:p>
+        </w:tc>
+        <w:tc>
+          <w:tcPr>
+            <w:tcW w:w="2493" w:type="pct"/>
+            <w:tcBorders>
+              <w:top w:val="single" w:sz="4" w:space="0" w:color="000000"/>
+              <w:left w:val="single" w:sz="4" w:space="0" w:color="000000"/>
+              <w:bottom w:val="single" w:sz="4" w:space="0" w:color="000000"/>
+              <w:right w:val="single" w:sz="4" w:space="0" w:color="000000"/>
+            </w:tcBorders>
+            <w:vAlign w:val="center"/>
+          </w:tcPr>
+          <w:p>
+            <w:pPr>
+              <w:rPr>
+                <w:rFonts w:ascii="Times" w:eastAsia="Times" w:hAnsi="Times" w:cs="Times"/>
+                <w:color w:val="E97132"/>
+                <w:sz w:val="22"/>
+                <w:szCs w:val="22"/>
+              </w:rPr>
+            </w:pPr>
+            <w:r>
+              <w:rPr>
+                <w:rFonts w:ascii="Times" w:eastAsia="Times" w:hAnsi="Times" w:cs="Times"/>
+                <w:color w:val="E97132"/>
+                <w:sz w:val="22"/>
+                <w:szCs w:val="22"/>
+              </w:rPr>
+              <w:t>Assigned 2</w:t>
+            </w:r>
+            <w:r>
+              <w:rPr>
+                <w:rFonts w:ascii="Times" w:eastAsia="Times" w:hAnsi="Times" w:cs="Times"/>
+                <w:color w:val="E97132"/>
+                <w:sz w:val="22"/>
+                <w:szCs w:val="22"/>
+                <w:vertAlign w:val="superscript"/>
+              </w:rPr>
+              <w:t>nd</w:t>
+            </w:r>
+            <w:r>
+              <w:rPr>
+                <w:rFonts w:ascii="Times" w:eastAsia="Times" w:hAnsi="Times" w:cs="Times"/>
+                <w:color w:val="E97132"/>
+                <w:sz w:val="22"/>
+                <w:szCs w:val="22"/>
+              </w:rPr>
+              <w:t xml:space="preserve"> horn to lower stave. </w:t>
+            </w:r>
+          </w:p>
+        </w:tc>
+        <w:tc>
+          <w:tcPr>
+            <w:tcW w:w="1024" w:type="pct"/>
+            <w:tcBorders>
+              <w:top w:val="single" w:sz="4" w:space="0" w:color="000000"/>
+              <w:left w:val="single" w:sz="4" w:space="0" w:color="000000"/>
+              <w:bottom w:val="single" w:sz="4" w:space="0" w:color="000000"/>
+              <w:right w:val="single" w:sz="4" w:space="0" w:color="000000"/>
+            </w:tcBorders>
+            <w:vAlign w:val="center"/>
+          </w:tcPr>
+          <w:p>
+            <w:pPr>
+              <w:rPr>
+                <w:rFonts w:ascii="Times" w:eastAsia="Times" w:hAnsi="Times" w:cs="Times"/>
+                <w:sz w:val="22"/>
+                <w:szCs w:val="22"/>
+              </w:rPr>
+            </w:pPr>
+          </w:p>
+        </w:tc>
+      </w:tr>
+      <w:tr>
+        <w:trPr>
+          <w:trHeight w:val="350"/>
+        </w:trPr>
+        <w:tc>
+          <w:tcPr>
+            <w:tcW w:w="756" w:type="pct"/>
+            <w:tcBorders>
+              <w:top w:val="single" w:sz="4" w:space="0" w:color="000000"/>
+              <w:left w:val="single" w:sz="4" w:space="0" w:color="000000"/>
+              <w:bottom w:val="single" w:sz="4" w:space="0" w:color="000000"/>
+              <w:right w:val="single" w:sz="4" w:space="0" w:color="000000"/>
+            </w:tcBorders>
+            <w:vAlign w:val="center"/>
+          </w:tcPr>
+          <w:p>
+            <w:pPr>
+              <w:rPr>
+                <w:rFonts w:ascii="Times" w:eastAsia="Times" w:hAnsi="Times" w:cs="Times"/>
+                <w:sz w:val="22"/>
+                <w:szCs w:val="22"/>
+              </w:rPr>
+            </w:pPr>
+            <w:r>
+              <w:rPr>
+                <w:rFonts w:ascii="Times" w:eastAsia="Times" w:hAnsi="Times" w:cs="Times"/>
+                <w:sz w:val="22"/>
+                <w:szCs w:val="22"/>
+              </w:rPr>
+              <w:t>Horns</w:t>
+            </w:r>
+          </w:p>
+        </w:tc>
+        <w:tc>
+          <w:tcPr>
+            <w:tcW w:w="727" w:type="pct"/>
+            <w:tcBorders>
+              <w:top w:val="single" w:sz="4" w:space="0" w:color="000000"/>
+              <w:left w:val="single" w:sz="4" w:space="0" w:color="000000"/>
+              <w:bottom w:val="single" w:sz="4" w:space="0" w:color="000000"/>
+              <w:right w:val="single" w:sz="4" w:space="0" w:color="000000"/>
+            </w:tcBorders>
+            <w:vAlign w:val="center"/>
+          </w:tcPr>
+          <w:p>
+            <w:pPr>
+              <w:rPr>
+                <w:rFonts w:ascii="Times" w:eastAsia="Times" w:hAnsi="Times" w:cs="Times"/>
+                <w:sz w:val="22"/>
+                <w:szCs w:val="22"/>
+              </w:rPr>
+            </w:pPr>
+            <w:r>
+              <w:rPr>
+                <w:rFonts w:ascii="Times" w:eastAsia="Times" w:hAnsi="Times" w:cs="Times"/>
+                <w:sz w:val="22"/>
+                <w:szCs w:val="22"/>
+              </w:rPr>
+              <w:t>92</w:t>
+            </w:r>
+          </w:p>
+        </w:tc>
+        <w:tc>
+          <w:tcPr>
+            <w:tcW w:w="2493" w:type="pct"/>
+            <w:tcBorders>
+              <w:top w:val="single" w:sz="4" w:space="0" w:color="000000"/>
+              <w:left w:val="single" w:sz="4" w:space="0" w:color="000000"/>
+              <w:bottom w:val="single" w:sz="4" w:space="0" w:color="000000"/>
+              <w:right w:val="single" w:sz="4" w:space="0" w:color="000000"/>
+            </w:tcBorders>
+            <w:vAlign w:val="center"/>
+          </w:tcPr>
+          <w:p>
+            <w:pPr>
+              <w:rPr>
+                <w:rFonts w:ascii="Times" w:eastAsia="Times" w:hAnsi="Times" w:cs="Times"/>
+                <w:sz w:val="22"/>
+                <w:szCs w:val="22"/>
+              </w:rPr>
+            </w:pPr>
+            <w:proofErr w:type="gramStart"/>
+            <w:r>
+              <w:rPr>
+                <w:rFonts w:ascii="Times" w:eastAsia="Times" w:hAnsi="Times" w:cs="Times"/>
+                <w:sz w:val="22"/>
+                <w:szCs w:val="22"/>
+              </w:rPr>
+              <w:t>Is</w:t>
+            </w:r>
+            <w:proofErr w:type="gramEnd"/>
+            <w:r>
+              <w:rPr>
+                <w:rFonts w:ascii="Times" w:eastAsia="Times" w:hAnsi="Times" w:cs="Times"/>
+                <w:sz w:val="22"/>
+                <w:szCs w:val="22"/>
+              </w:rPr>
+              <w:t xml:space="preserve"> the 1, 3, 2, 4 </w:t>
+            </w:r>
+            <w:r>
+              <w:rPr>
+                <w:rFonts w:ascii="Times" w:eastAsia="Times" w:hAnsi="Times" w:cs="Times"/>
+                <w:sz w:val="22"/>
+                <w:szCs w:val="22"/>
+              </w:rPr>
+              <w:t>arrangements</w:t>
+            </w:r>
+            <w:r>
+              <w:rPr>
+                <w:rFonts w:ascii="Times" w:eastAsia="Times" w:hAnsi="Times" w:cs="Times"/>
+                <w:sz w:val="22"/>
+                <w:szCs w:val="22"/>
+              </w:rPr>
+              <w:t xml:space="preserve"> still relevant here? Or have they swapped 1, 2, 3, 4 </w:t>
+            </w:r>
+            <w:r>
+              <w:rPr>
+                <w:rFonts w:ascii="Times" w:eastAsia="Times" w:hAnsi="Times" w:cs="Times"/>
+                <w:sz w:val="22"/>
+                <w:szCs w:val="22"/>
+              </w:rPr>
+              <w:t xml:space="preserve"> </w:t>
+            </w:r>
+          </w:p>
+        </w:tc>
+        <w:tc>
+          <w:tcPr>
+            <w:tcW w:w="1024" w:type="pct"/>
+            <w:tcBorders>
+              <w:top w:val="single" w:sz="4" w:space="0" w:color="000000"/>
+              <w:left w:val="single" w:sz="4" w:space="0" w:color="000000"/>
+              <w:bottom w:val="single" w:sz="4" w:space="0" w:color="000000"/>
+              <w:right w:val="single" w:sz="4" w:space="0" w:color="000000"/>
+            </w:tcBorders>
+            <w:vAlign w:val="center"/>
+          </w:tcPr>
+          <w:p>
+            <w:pPr>
+              <w:rPr>
+                <w:rFonts w:ascii="Times" w:eastAsia="Times" w:hAnsi="Times" w:cs="Times"/>
+                <w:sz w:val="22"/>
+                <w:szCs w:val="22"/>
+              </w:rPr>
+            </w:pPr>
+          </w:p>
+        </w:tc>
+      </w:tr>
+      <w:tr>
+        <w:trPr>
+          <w:trHeight w:val="350"/>
+        </w:trPr>
+        <w:tc>
+          <w:tcPr>
+            <w:tcW w:w="756" w:type="pct"/>
+            <w:tcBorders>
+              <w:top w:val="single" w:sz="4" w:space="0" w:color="000000"/>
+              <w:left w:val="single" w:sz="4" w:space="0" w:color="000000"/>
+              <w:bottom w:val="single" w:sz="4" w:space="0" w:color="000000"/>
+              <w:right w:val="single" w:sz="4" w:space="0" w:color="000000"/>
+            </w:tcBorders>
+            <w:vAlign w:val="center"/>
+          </w:tcPr>
+          <w:p>
+            <w:pPr>
+              <w:rPr>
+                <w:rFonts w:ascii="Times" w:eastAsia="Times" w:hAnsi="Times" w:cs="Times"/>
+                <w:sz w:val="22"/>
+                <w:szCs w:val="22"/>
+              </w:rPr>
+            </w:pPr>
+          </w:p>
+        </w:tc>
+        <w:tc>
+          <w:tcPr>
+            <w:tcW w:w="727" w:type="pct"/>
+            <w:tcBorders>
+              <w:top w:val="single" w:sz="4" w:space="0" w:color="000000"/>
+              <w:left w:val="single" w:sz="4" w:space="0" w:color="000000"/>
+              <w:bottom w:val="single" w:sz="4" w:space="0" w:color="000000"/>
+              <w:right w:val="single" w:sz="4" w:space="0" w:color="000000"/>
+            </w:tcBorders>
+            <w:vAlign w:val="center"/>
+          </w:tcPr>
+          <w:p>
+            <w:pPr>
+              <w:rPr>
+                <w:rFonts w:ascii="Times" w:eastAsia="Times" w:hAnsi="Times" w:cs="Times"/>
+                <w:sz w:val="22"/>
+                <w:szCs w:val="22"/>
+              </w:rPr>
+            </w:pPr>
+          </w:p>
+        </w:tc>
+        <w:tc>
+          <w:tcPr>
+            <w:tcW w:w="2493" w:type="pct"/>
+            <w:tcBorders>
+              <w:top w:val="single" w:sz="4" w:space="0" w:color="000000"/>
+              <w:left w:val="single" w:sz="4" w:space="0" w:color="000000"/>
+              <w:bottom w:val="single" w:sz="4" w:space="0" w:color="000000"/>
+              <w:right w:val="single" w:sz="4" w:space="0" w:color="000000"/>
+            </w:tcBorders>
+            <w:vAlign w:val="center"/>
+          </w:tcPr>
+          <w:p>
+            <w:pPr>
+              <w:rPr>
+                <w:rFonts w:ascii="Times" w:eastAsia="Times" w:hAnsi="Times" w:cs="Times"/>
+                <w:sz w:val="22"/>
+                <w:szCs w:val="22"/>
+              </w:rPr>
+            </w:pPr>
+          </w:p>
+        </w:tc>
+        <w:tc>
+          <w:tcPr>
+            <w:tcW w:w="1024" w:type="pct"/>
+            <w:tcBorders>
+              <w:top w:val="single" w:sz="4" w:space="0" w:color="000000"/>
+              <w:left w:val="single" w:sz="4" w:space="0" w:color="000000"/>
+              <w:bottom w:val="single" w:sz="4" w:space="0" w:color="000000"/>
+              <w:right w:val="single" w:sz="4" w:space="0" w:color="000000"/>
+            </w:tcBorders>
+            <w:vAlign w:val="center"/>
+          </w:tcPr>
+          <w:p>
+            <w:pPr>
+              <w:rPr>
+                <w:rFonts w:ascii="Times" w:eastAsia="Times" w:hAnsi="Times" w:cs="Times"/>
+                <w:sz w:val="22"/>
+                <w:szCs w:val="22"/>
+              </w:rPr>
+            </w:pPr>
+          </w:p>
+        </w:tc>
+      </w:tr>
+      <w:tr>
+        <w:trPr>
+          <w:trHeight w:val="350"/>
+        </w:trPr>
+        <w:tc>
+          <w:tcPr>
+            <w:tcW w:w="756" w:type="pct"/>
+            <w:tcBorders>
+              <w:top w:val="single" w:sz="4" w:space="0" w:color="000000"/>
+              <w:left w:val="single" w:sz="4" w:space="0" w:color="000000"/>
+              <w:bottom w:val="single" w:sz="4" w:space="0" w:color="000000"/>
+              <w:right w:val="single" w:sz="4" w:space="0" w:color="000000"/>
+            </w:tcBorders>
+            <w:vAlign w:val="center"/>
+          </w:tcPr>
+          <w:p>
+            <w:pPr>
+              <w:rPr>
+                <w:rFonts w:ascii="Times" w:eastAsia="Times" w:hAnsi="Times" w:cs="Times"/>
+                <w:sz w:val="22"/>
+                <w:szCs w:val="22"/>
+              </w:rPr>
+            </w:pPr>
+          </w:p>
+        </w:tc>
+        <w:tc>
+          <w:tcPr>
+            <w:tcW w:w="727" w:type="pct"/>
+            <w:tcBorders>
+              <w:top w:val="single" w:sz="4" w:space="0" w:color="000000"/>
+              <w:left w:val="single" w:sz="4" w:space="0" w:color="000000"/>
+              <w:bottom w:val="single" w:sz="4" w:space="0" w:color="000000"/>
+              <w:right w:val="single" w:sz="4" w:space="0" w:color="000000"/>
+            </w:tcBorders>
+            <w:vAlign w:val="center"/>
+          </w:tcPr>
+          <w:p>
+            <w:pPr>
+              <w:rPr>
+                <w:rFonts w:ascii="Times" w:eastAsia="Times" w:hAnsi="Times" w:cs="Times"/>
+                <w:sz w:val="22"/>
+                <w:szCs w:val="22"/>
+              </w:rPr>
+            </w:pPr>
+          </w:p>
+        </w:tc>
+        <w:tc>
+          <w:tcPr>
+            <w:tcW w:w="2493" w:type="pct"/>
+            <w:tcBorders>
+              <w:top w:val="single" w:sz="4" w:space="0" w:color="000000"/>
+              <w:left w:val="single" w:sz="4" w:space="0" w:color="000000"/>
+              <w:bottom w:val="single" w:sz="4" w:space="0" w:color="000000"/>
+              <w:right w:val="single" w:sz="4" w:space="0" w:color="000000"/>
+            </w:tcBorders>
+            <w:vAlign w:val="center"/>
+          </w:tcPr>
+          <w:p>
+            <w:pPr>
+              <w:rPr>
+                <w:rFonts w:ascii="Times" w:eastAsia="Times" w:hAnsi="Times" w:cs="Times"/>
+                <w:sz w:val="22"/>
+                <w:szCs w:val="22"/>
+              </w:rPr>
+            </w:pPr>
+          </w:p>
+        </w:tc>
+        <w:tc>
+          <w:tcPr>
+            <w:tcW w:w="1024" w:type="pct"/>
+            <w:tcBorders>
+              <w:top w:val="single" w:sz="4" w:space="0" w:color="000000"/>
+              <w:left w:val="single" w:sz="4" w:space="0" w:color="000000"/>
+              <w:bottom w:val="single" w:sz="4" w:space="0" w:color="000000"/>
+              <w:right w:val="single" w:sz="4" w:space="0" w:color="000000"/>
+            </w:tcBorders>
+            <w:vAlign w:val="center"/>
+          </w:tcPr>
+          <w:p>
+            <w:pPr>
+              <w:rPr>
+                <w:rFonts w:ascii="Times" w:eastAsia="Times" w:hAnsi="Times" w:cs="Times"/>
+                <w:sz w:val="22"/>
+                <w:szCs w:val="22"/>
               </w:rPr>
             </w:pPr>
           </w:p>
@@ -2378,7 +3580,28 @@
               <w:rPr>
                 <w:rFonts w:ascii="Times" w:eastAsia="Times" w:hAnsi="Times" w:cs="Times"/>
               </w:rPr>
-              <w:t xml:space="preserve">s are redundant given the tenuto symbols. However, if it is a preference or the intention is for a more pronounced tenuto, let me know. If no preference, we could potentially remove them, except at key moments, and just ensure a tenuto symbol is present. </w:t>
+              <w:t xml:space="preserve">s are redundant given the tenuto symbols. However, if it is a preference or the intention is for a more </w:t>
+            </w:r>
+            <w:r>
+              <w:rPr>
+                <w:rFonts w:ascii="Times" w:eastAsia="Times" w:hAnsi="Times" w:cs="Times"/>
+              </w:rPr>
+              <w:lastRenderedPageBreak/>
+              <w:t xml:space="preserve">pronounced tenuto, let me know. If </w:t>
+            </w:r>
+            <w:proofErr w:type="gramStart"/>
+            <w:r>
+              <w:rPr>
+                <w:rFonts w:ascii="Times" w:eastAsia="Times" w:hAnsi="Times" w:cs="Times"/>
+              </w:rPr>
+              <w:t>no</w:t>
+            </w:r>
+            <w:proofErr w:type="gramEnd"/>
+            <w:r>
+              <w:rPr>
+                <w:rFonts w:ascii="Times" w:eastAsia="Times" w:hAnsi="Times" w:cs="Times"/>
+              </w:rPr>
+              <w:t xml:space="preserve"> preference, we could potentially remove them, except at key moments, and just ensure a tenuto symbol is present. </w:t>
             </w:r>
           </w:p>
         </w:tc>
@@ -2397,6 +3620,7 @@
               <w:rPr>
                 <w:rFonts w:ascii="Times" w:eastAsia="Times" w:hAnsi="Times" w:cs="Times"/>
               </w:rPr>
+              <w:lastRenderedPageBreak/>
               <w:t>Leave as is</w:t>
             </w:r>
             <w:r>
@@ -2470,7 +3694,21 @@
               <w:rPr>
                 <w:rFonts w:ascii="Times" w:eastAsia="Times" w:hAnsi="Times" w:cs="Times"/>
               </w:rPr>
-              <w:t>Technically does the sul G continue from m. 19 till the F in m. 27? Will format accordingly</w:t>
+              <w:t xml:space="preserve">Technically does the sul G continue from m. 19 till the F </w:t>
+            </w:r>
+            <w:proofErr w:type="gramStart"/>
+            <w:r>
+              <w:rPr>
+                <w:rFonts w:ascii="Times" w:eastAsia="Times" w:hAnsi="Times" w:cs="Times"/>
+              </w:rPr>
+              <w:t>in</w:t>
+            </w:r>
+            <w:proofErr w:type="gramEnd"/>
+            <w:r>
+              <w:rPr>
+                <w:rFonts w:ascii="Times" w:eastAsia="Times" w:hAnsi="Times" w:cs="Times"/>
+              </w:rPr>
+              <w:t xml:space="preserve"> m. 27? Will format accordingly</w:t>
             </w:r>
           </w:p>
         </w:tc>
@@ -2588,7 +3826,21 @@
               <w:rPr>
                 <w:rFonts w:ascii="Times" w:eastAsia="Times" w:hAnsi="Times" w:cs="Times"/>
               </w:rPr>
-              <w:t xml:space="preserve">. Should it dim. to a different dynamic, with a sub. </w:t>
+              <w:t xml:space="preserve">. Should it </w:t>
+            </w:r>
+            <w:proofErr w:type="gramStart"/>
+            <w:r>
+              <w:rPr>
+                <w:rFonts w:ascii="Times" w:eastAsia="Times" w:hAnsi="Times" w:cs="Times"/>
+              </w:rPr>
+              <w:t>dim.</w:t>
+            </w:r>
+            <w:proofErr w:type="gramEnd"/>
+            <w:r>
+              <w:rPr>
+                <w:rFonts w:ascii="Times" w:eastAsia="Times" w:hAnsi="Times" w:cs="Times"/>
+              </w:rPr>
+              <w:t xml:space="preserve"> to a different dynamic, with a sub. </w:t>
             </w:r>
             <w:r>
               <w:rPr>
@@ -4722,7 +5974,6 @@
   <w:style w:type="character" w:default="1" w:styleId="DefaultParagraphFont">
     <w:name w:val="Default Paragraph Font"/>
     <w:uiPriority w:val="1"/>
-    <w:semiHidden/>
     <w:unhideWhenUsed/>
   </w:style>
   <w:style w:type="table" w:default="1" w:styleId="TableNormal">

</xml_diff>

<commit_message>
V05: Engraved up to Pg. 8
</commit_message>
<xml_diff>
--- a/Proof Reading and Review/TCB Mvt for Vn and Orch - Errata_v1.docx
+++ b/Proof Reading and Review/TCB Mvt for Vn and Orch - Errata_v1.docx
@@ -2310,6 +2310,7 @@
             <w:r>
               <w:rPr>
                 <w:rFonts w:ascii="Times" w:eastAsia="Times" w:hAnsi="Times" w:cs="Times"/>
+                <w:noProof/>
                 <w:sz w:val="22"/>
                 <w:szCs w:val="22"/>
               </w:rPr>
@@ -2537,6 +2538,7 @@
             <w:r>
               <w:rPr>
                 <w:rFonts w:ascii="Times" w:eastAsia="Times" w:hAnsi="Times" w:cs="Times"/>
+                <w:noProof/>
                 <w:sz w:val="22"/>
                 <w:szCs w:val="22"/>
               </w:rPr>
@@ -2907,6 +2909,119 @@
                 <w:szCs w:val="22"/>
               </w:rPr>
               <w:t xml:space="preserve"> horn to lower stave. </w:t>
+            </w:r>
+          </w:p>
+        </w:tc>
+        <w:tc>
+          <w:tcPr>
+            <w:tcW w:w="1024" w:type="pct"/>
+            <w:tcBorders>
+              <w:top w:val="single" w:sz="4" w:space="0" w:color="000000"/>
+              <w:left w:val="single" w:sz="4" w:space="0" w:color="000000"/>
+              <w:bottom w:val="single" w:sz="4" w:space="0" w:color="000000"/>
+              <w:right w:val="single" w:sz="4" w:space="0" w:color="000000"/>
+            </w:tcBorders>
+            <w:vAlign w:val="center"/>
+          </w:tcPr>
+          <w:p>
+            <w:pPr>
+              <w:rPr>
+                <w:rFonts w:ascii="Times" w:eastAsia="Times" w:hAnsi="Times" w:cs="Times"/>
+                <w:sz w:val="22"/>
+                <w:szCs w:val="22"/>
+              </w:rPr>
+            </w:pPr>
+          </w:p>
+        </w:tc>
+      </w:tr>
+      <w:tr>
+        <w:trPr>
+          <w:trHeight w:val="350"/>
+        </w:trPr>
+        <w:tc>
+          <w:tcPr>
+            <w:tcW w:w="756" w:type="pct"/>
+            <w:tcBorders>
+              <w:top w:val="single" w:sz="4" w:space="0" w:color="000000"/>
+              <w:left w:val="single" w:sz="4" w:space="0" w:color="000000"/>
+              <w:bottom w:val="single" w:sz="4" w:space="0" w:color="000000"/>
+              <w:right w:val="single" w:sz="4" w:space="0" w:color="000000"/>
+            </w:tcBorders>
+            <w:vAlign w:val="center"/>
+          </w:tcPr>
+          <w:p>
+            <w:pPr>
+              <w:rPr>
+                <w:rFonts w:ascii="Times" w:eastAsia="Times" w:hAnsi="Times" w:cs="Times"/>
+                <w:sz w:val="22"/>
+                <w:szCs w:val="22"/>
+              </w:rPr>
+            </w:pPr>
+            <w:r>
+              <w:rPr>
+                <w:rFonts w:ascii="Times" w:eastAsia="Times" w:hAnsi="Times" w:cs="Times"/>
+                <w:sz w:val="22"/>
+                <w:szCs w:val="22"/>
+              </w:rPr>
+              <w:t>Clarinet</w:t>
+            </w:r>
+          </w:p>
+        </w:tc>
+        <w:tc>
+          <w:tcPr>
+            <w:tcW w:w="727" w:type="pct"/>
+            <w:tcBorders>
+              <w:top w:val="single" w:sz="4" w:space="0" w:color="000000"/>
+              <w:left w:val="single" w:sz="4" w:space="0" w:color="000000"/>
+              <w:bottom w:val="single" w:sz="4" w:space="0" w:color="000000"/>
+              <w:right w:val="single" w:sz="4" w:space="0" w:color="000000"/>
+            </w:tcBorders>
+            <w:vAlign w:val="center"/>
+          </w:tcPr>
+          <w:p>
+            <w:pPr>
+              <w:rPr>
+                <w:rFonts w:ascii="Times" w:eastAsia="Times" w:hAnsi="Times" w:cs="Times"/>
+                <w:sz w:val="22"/>
+                <w:szCs w:val="22"/>
+              </w:rPr>
+            </w:pPr>
+            <w:r>
+              <w:rPr>
+                <w:rFonts w:ascii="Times" w:eastAsia="Times" w:hAnsi="Times" w:cs="Times"/>
+                <w:sz w:val="22"/>
+                <w:szCs w:val="22"/>
+              </w:rPr>
+              <w:t>79</w:t>
+            </w:r>
+          </w:p>
+        </w:tc>
+        <w:tc>
+          <w:tcPr>
+            <w:tcW w:w="2493" w:type="pct"/>
+            <w:tcBorders>
+              <w:top w:val="single" w:sz="4" w:space="0" w:color="000000"/>
+              <w:left w:val="single" w:sz="4" w:space="0" w:color="000000"/>
+              <w:bottom w:val="single" w:sz="4" w:space="0" w:color="000000"/>
+              <w:right w:val="single" w:sz="4" w:space="0" w:color="000000"/>
+            </w:tcBorders>
+            <w:vAlign w:val="center"/>
+          </w:tcPr>
+          <w:p>
+            <w:pPr>
+              <w:rPr>
+                <w:rFonts w:ascii="Times" w:eastAsia="Times" w:hAnsi="Times" w:cs="Times"/>
+                <w:sz w:val="22"/>
+                <w:szCs w:val="22"/>
+              </w:rPr>
+            </w:pPr>
+            <w:r>
+              <w:rPr>
+                <w:rFonts w:ascii="Times" w:eastAsia="Times" w:hAnsi="Times" w:cs="Times"/>
+                <w:sz w:val="22"/>
+                <w:szCs w:val="22"/>
+              </w:rPr>
+              <w:t xml:space="preserve">Clarinet 2 is tied to 1. Should it remain assigned to Clarinet 2? </w:t>
             </w:r>
           </w:p>
         </w:tc>
@@ -3580,14 +3695,7 @@
               <w:rPr>
                 <w:rFonts w:ascii="Times" w:eastAsia="Times" w:hAnsi="Times" w:cs="Times"/>
               </w:rPr>
-              <w:t xml:space="preserve">s are redundant given the tenuto symbols. However, if it is a preference or the intention is for a more </w:t>
-            </w:r>
-            <w:r>
-              <w:rPr>
-                <w:rFonts w:ascii="Times" w:eastAsia="Times" w:hAnsi="Times" w:cs="Times"/>
-              </w:rPr>
-              <w:lastRenderedPageBreak/>
-              <w:t xml:space="preserve">pronounced tenuto, let me know. If </w:t>
+              <w:t xml:space="preserve">s are redundant given the tenuto symbols. However, if it is a preference or the intention is for a more pronounced tenuto, let me know. If </w:t>
             </w:r>
             <w:proofErr w:type="gramStart"/>
             <w:r>
@@ -3620,7 +3728,6 @@
               <w:rPr>
                 <w:rFonts w:ascii="Times" w:eastAsia="Times" w:hAnsi="Times" w:cs="Times"/>
               </w:rPr>
-              <w:lastRenderedPageBreak/>
               <w:t>Leave as is</w:t>
             </w:r>
             <w:r>
@@ -5974,6 +6081,7 @@
   <w:style w:type="character" w:default="1" w:styleId="DefaultParagraphFont">
     <w:name w:val="Default Paragraph Font"/>
     <w:uiPriority w:val="1"/>
+    <w:semiHidden/>
     <w:unhideWhenUsed/>
   </w:style>
   <w:style w:type="table" w:default="1" w:styleId="TableNormal">

</xml_diff>

<commit_message>
v07: Engraved up pg. 12 and 13+
</commit_message>
<xml_diff>
--- a/Proof Reading and Review/TCB Mvt for Vn and Orch - Errata_v1.docx
+++ b/Proof Reading and Review/TCB Mvt for Vn and Orch - Errata_v1.docx
@@ -961,43 +961,7 @@
                 <w:sz w:val="22"/>
                 <w:szCs w:val="22"/>
               </w:rPr>
-              <w:t xml:space="preserve">Some harp chords don’t have arpeggiation in them. </w:t>
-            </w:r>
-            <w:proofErr w:type="gramStart"/>
-            <w:r>
-              <w:rPr>
-                <w:rFonts w:ascii="Times" w:eastAsia="Times" w:hAnsi="Times" w:cs="Times"/>
-                <w:sz w:val="22"/>
-                <w:szCs w:val="22"/>
-              </w:rPr>
-              <w:t>This is</w:t>
-            </w:r>
-            <w:proofErr w:type="gramEnd"/>
-            <w:r>
-              <w:rPr>
-                <w:rFonts w:ascii="Times" w:eastAsia="Times" w:hAnsi="Times" w:cs="Times"/>
-                <w:sz w:val="22"/>
-                <w:szCs w:val="22"/>
-              </w:rPr>
-              <w:t xml:space="preserve"> </w:t>
-            </w:r>
-            <w:proofErr w:type="gramStart"/>
-            <w:r>
-              <w:rPr>
-                <w:rFonts w:ascii="Times" w:eastAsia="Times" w:hAnsi="Times" w:cs="Times"/>
-                <w:sz w:val="22"/>
-                <w:szCs w:val="22"/>
-              </w:rPr>
-              <w:t>intentional?</w:t>
-            </w:r>
-            <w:proofErr w:type="gramEnd"/>
-            <w:r>
-              <w:rPr>
-                <w:rFonts w:ascii="Times" w:eastAsia="Times" w:hAnsi="Times" w:cs="Times"/>
-                <w:sz w:val="22"/>
-                <w:szCs w:val="22"/>
-              </w:rPr>
-              <w:t xml:space="preserve"> </w:t>
+              <w:t xml:space="preserve">Some harp chords don’t have arpeggiation in them. This is intentional? </w:t>
             </w:r>
           </w:p>
           <w:p>
@@ -2908,7 +2872,25 @@
                 <w:sz w:val="22"/>
                 <w:szCs w:val="22"/>
               </w:rPr>
-              <w:t xml:space="preserve"> horn to lower stave. </w:t>
+              <w:t xml:space="preserve"> horn to </w:t>
+            </w:r>
+            <w:r>
+              <w:rPr>
+                <w:rFonts w:ascii="Times" w:eastAsia="Times" w:hAnsi="Times" w:cs="Times"/>
+                <w:color w:val="E97132"/>
+                <w:sz w:val="22"/>
+                <w:szCs w:val="22"/>
+              </w:rPr>
+              <w:t>lower</w:t>
+            </w:r>
+            <w:r>
+              <w:rPr>
+                <w:rFonts w:ascii="Times" w:eastAsia="Times" w:hAnsi="Times" w:cs="Times"/>
+                <w:color w:val="E97132"/>
+                <w:sz w:val="22"/>
+                <w:szCs w:val="22"/>
+              </w:rPr>
+              <w:t xml:space="preserve"> stave. </w:t>
             </w:r>
           </w:p>
         </w:tc>
@@ -3128,16 +3110,14 @@
                 <w:szCs w:val="22"/>
               </w:rPr>
             </w:pPr>
-            <w:proofErr w:type="gramStart"/>
-            <w:r>
-              <w:rPr>
-                <w:rFonts w:ascii="Times" w:eastAsia="Times" w:hAnsi="Times" w:cs="Times"/>
-                <w:sz w:val="22"/>
-                <w:szCs w:val="22"/>
-              </w:rPr>
-              <w:t>Is</w:t>
-            </w:r>
-            <w:proofErr w:type="gramEnd"/>
+            <w:r>
+              <w:rPr>
+                <w:rFonts w:ascii="Times" w:eastAsia="Times" w:hAnsi="Times" w:cs="Times"/>
+                <w:sz w:val="22"/>
+                <w:szCs w:val="22"/>
+              </w:rPr>
+              <w:t>Are</w:t>
+            </w:r>
             <w:r>
               <w:rPr>
                 <w:rFonts w:ascii="Times" w:eastAsia="Times" w:hAnsi="Times" w:cs="Times"/>
@@ -3160,7 +3140,23 @@
                 <w:sz w:val="22"/>
                 <w:szCs w:val="22"/>
               </w:rPr>
-              <w:t xml:space="preserve"> still relevant here? Or have they swapped 1, 2, 3, 4 </w:t>
+              <w:t xml:space="preserve"> still relevant here? Or have they swapped </w:t>
+            </w:r>
+            <w:r>
+              <w:rPr>
+                <w:rFonts w:ascii="Times" w:eastAsia="Times" w:hAnsi="Times" w:cs="Times"/>
+                <w:sz w:val="22"/>
+                <w:szCs w:val="22"/>
+              </w:rPr>
+              <w:t xml:space="preserve">to </w:t>
+            </w:r>
+            <w:r>
+              <w:rPr>
+                <w:rFonts w:ascii="Times" w:eastAsia="Times" w:hAnsi="Times" w:cs="Times"/>
+                <w:sz w:val="22"/>
+                <w:szCs w:val="22"/>
+              </w:rPr>
+              <w:t xml:space="preserve">1, 2, 3, 4 </w:t>
             </w:r>
             <w:r>
               <w:rPr>
@@ -3213,10 +3209,20 @@
             <w:pPr>
               <w:rPr>
                 <w:rFonts w:ascii="Times" w:eastAsia="Times" w:hAnsi="Times" w:cs="Times"/>
-                <w:sz w:val="22"/>
-                <w:szCs w:val="22"/>
-              </w:rPr>
-            </w:pPr>
+                <w:color w:val="E97132"/>
+                <w:sz w:val="22"/>
+                <w:szCs w:val="22"/>
+              </w:rPr>
+            </w:pPr>
+            <w:r>
+              <w:rPr>
+                <w:rFonts w:ascii="Times" w:eastAsia="Times" w:hAnsi="Times" w:cs="Times"/>
+                <w:color w:val="E97132"/>
+                <w:sz w:val="22"/>
+                <w:szCs w:val="22"/>
+              </w:rPr>
+              <w:t>VC, CB</w:t>
+            </w:r>
           </w:p>
         </w:tc>
         <w:tc>
@@ -3234,10 +3240,29 @@
             <w:pPr>
               <w:rPr>
                 <w:rFonts w:ascii="Times" w:eastAsia="Times" w:hAnsi="Times" w:cs="Times"/>
-                <w:sz w:val="22"/>
-                <w:szCs w:val="22"/>
-              </w:rPr>
-            </w:pPr>
+                <w:color w:val="E97132"/>
+                <w:sz w:val="22"/>
+                <w:szCs w:val="22"/>
+              </w:rPr>
+            </w:pPr>
+            <w:r>
+              <w:rPr>
+                <w:rFonts w:ascii="Times" w:eastAsia="Times" w:hAnsi="Times" w:cs="Times"/>
+                <w:color w:val="E97132"/>
+                <w:sz w:val="22"/>
+                <w:szCs w:val="22"/>
+              </w:rPr>
+              <w:t>101</w:t>
+            </w:r>
+            <w:r>
+              <w:rPr>
+                <w:rFonts w:ascii="Times" w:eastAsia="Times" w:hAnsi="Times" w:cs="Times"/>
+                <w:color w:val="E97132"/>
+                <w:sz w:val="22"/>
+                <w:szCs w:val="22"/>
+              </w:rPr>
+              <w:t>, 103, 105</w:t>
+            </w:r>
           </w:p>
         </w:tc>
         <w:tc>
@@ -3255,10 +3280,29 @@
             <w:pPr>
               <w:rPr>
                 <w:rFonts w:ascii="Times" w:eastAsia="Times" w:hAnsi="Times" w:cs="Times"/>
-                <w:sz w:val="22"/>
-                <w:szCs w:val="22"/>
-              </w:rPr>
-            </w:pPr>
+                <w:color w:val="E97132"/>
+                <w:sz w:val="22"/>
+                <w:szCs w:val="22"/>
+              </w:rPr>
+            </w:pPr>
+            <w:r>
+              <w:rPr>
+                <w:rFonts w:ascii="Times" w:eastAsia="Times" w:hAnsi="Times" w:cs="Times"/>
+                <w:color w:val="E97132"/>
+                <w:sz w:val="22"/>
+                <w:szCs w:val="22"/>
+              </w:rPr>
+              <w:t xml:space="preserve">Removed harmonic articulation marks. </w:t>
+            </w:r>
+            <w:r>
+              <w:rPr>
+                <w:rFonts w:ascii="Times" w:eastAsia="Times" w:hAnsi="Times" w:cs="Times"/>
+                <w:color w:val="E97132"/>
+                <w:sz w:val="22"/>
+                <w:szCs w:val="22"/>
+              </w:rPr>
+              <w:t xml:space="preserve"> </w:t>
+            </w:r>
           </w:p>
         </w:tc>
         <w:tc>
@@ -3276,6 +3320,7 @@
             <w:pPr>
               <w:rPr>
                 <w:rFonts w:ascii="Times" w:eastAsia="Times" w:hAnsi="Times" w:cs="Times"/>
+                <w:color w:val="E97132"/>
                 <w:sz w:val="22"/>
                 <w:szCs w:val="22"/>
               </w:rPr>
@@ -3306,6 +3351,14 @@
                 <w:szCs w:val="22"/>
               </w:rPr>
             </w:pPr>
+            <w:r>
+              <w:rPr>
+                <w:rFonts w:ascii="Times" w:eastAsia="Times" w:hAnsi="Times" w:cs="Times"/>
+                <w:sz w:val="22"/>
+                <w:szCs w:val="22"/>
+              </w:rPr>
+              <w:t>Violin I</w:t>
+            </w:r>
           </w:p>
         </w:tc>
         <w:tc>
@@ -3327,6 +3380,14 @@
                 <w:szCs w:val="22"/>
               </w:rPr>
             </w:pPr>
+            <w:r>
+              <w:rPr>
+                <w:rFonts w:ascii="Times" w:eastAsia="Times" w:hAnsi="Times" w:cs="Times"/>
+                <w:sz w:val="22"/>
+                <w:szCs w:val="22"/>
+              </w:rPr>
+              <w:t>108</w:t>
+            </w:r>
           </w:p>
         </w:tc>
         <w:tc>
@@ -3348,6 +3409,31 @@
                 <w:szCs w:val="22"/>
               </w:rPr>
             </w:pPr>
+            <w:r>
+              <w:rPr>
+                <w:rFonts w:ascii="Times" w:eastAsia="Times" w:hAnsi="Times" w:cs="Times"/>
+                <w:sz w:val="22"/>
+                <w:szCs w:val="22"/>
+              </w:rPr>
+              <w:t>3</w:t>
+            </w:r>
+            <w:r>
+              <w:rPr>
+                <w:rFonts w:ascii="Times" w:eastAsia="Times" w:hAnsi="Times" w:cs="Times"/>
+                <w:sz w:val="22"/>
+                <w:szCs w:val="22"/>
+                <w:vertAlign w:val="superscript"/>
+              </w:rPr>
+              <w:t>rd</w:t>
+            </w:r>
+            <w:r>
+              <w:rPr>
+                <w:rFonts w:ascii="Times" w:eastAsia="Times" w:hAnsi="Times" w:cs="Times"/>
+                <w:sz w:val="22"/>
+                <w:szCs w:val="22"/>
+              </w:rPr>
+              <w:t xml:space="preserve"> beat, is this meant to be a tied A or slurred G? </w:t>
+            </w:r>
           </w:p>
         </w:tc>
         <w:tc>
@@ -3695,21 +3781,7 @@
               <w:rPr>
                 <w:rFonts w:ascii="Times" w:eastAsia="Times" w:hAnsi="Times" w:cs="Times"/>
               </w:rPr>
-              <w:t xml:space="preserve">s are redundant given the tenuto symbols. However, if it is a preference or the intention is for a more pronounced tenuto, let me know. If </w:t>
-            </w:r>
-            <w:proofErr w:type="gramStart"/>
-            <w:r>
-              <w:rPr>
-                <w:rFonts w:ascii="Times" w:eastAsia="Times" w:hAnsi="Times" w:cs="Times"/>
-              </w:rPr>
-              <w:t>no</w:t>
-            </w:r>
-            <w:proofErr w:type="gramEnd"/>
-            <w:r>
-              <w:rPr>
-                <w:rFonts w:ascii="Times" w:eastAsia="Times" w:hAnsi="Times" w:cs="Times"/>
-              </w:rPr>
-              <w:t xml:space="preserve"> preference, we could potentially remove them, except at key moments, and just ensure a tenuto symbol is present. </w:t>
+              <w:t xml:space="preserve">s are redundant given the tenuto symbols. However, if it is a preference or the intention is for a more pronounced tenuto, let me know. If no preference, we could potentially remove them, except at key moments, and just ensure a tenuto symbol is present. </w:t>
             </w:r>
           </w:p>
         </w:tc>
@@ -3801,21 +3873,7 @@
               <w:rPr>
                 <w:rFonts w:ascii="Times" w:eastAsia="Times" w:hAnsi="Times" w:cs="Times"/>
               </w:rPr>
-              <w:t xml:space="preserve">Technically does the sul G continue from m. 19 till the F </w:t>
-            </w:r>
-            <w:proofErr w:type="gramStart"/>
-            <w:r>
-              <w:rPr>
-                <w:rFonts w:ascii="Times" w:eastAsia="Times" w:hAnsi="Times" w:cs="Times"/>
-              </w:rPr>
-              <w:t>in</w:t>
-            </w:r>
-            <w:proofErr w:type="gramEnd"/>
-            <w:r>
-              <w:rPr>
-                <w:rFonts w:ascii="Times" w:eastAsia="Times" w:hAnsi="Times" w:cs="Times"/>
-              </w:rPr>
-              <w:t xml:space="preserve"> m. 27? Will format accordingly</w:t>
+              <w:t>Technically does the sul G continue from m. 19 till the F in m. 27? Will format accordingly</w:t>
             </w:r>
           </w:p>
         </w:tc>
@@ -3933,21 +3991,7 @@
               <w:rPr>
                 <w:rFonts w:ascii="Times" w:eastAsia="Times" w:hAnsi="Times" w:cs="Times"/>
               </w:rPr>
-              <w:t xml:space="preserve">. Should it </w:t>
-            </w:r>
-            <w:proofErr w:type="gramStart"/>
-            <w:r>
-              <w:rPr>
-                <w:rFonts w:ascii="Times" w:eastAsia="Times" w:hAnsi="Times" w:cs="Times"/>
-              </w:rPr>
-              <w:t>dim.</w:t>
-            </w:r>
-            <w:proofErr w:type="gramEnd"/>
-            <w:r>
-              <w:rPr>
-                <w:rFonts w:ascii="Times" w:eastAsia="Times" w:hAnsi="Times" w:cs="Times"/>
-              </w:rPr>
-              <w:t xml:space="preserve"> to a different dynamic, with a sub. </w:t>
+              <w:t xml:space="preserve">. Should it dim. to a different dynamic, with a sub. </w:t>
             </w:r>
             <w:r>
               <w:rPr>

</xml_diff>

<commit_message>
V11: Engraved to pg 26. To start 27 soon.
</commit_message>
<xml_diff>
--- a/Proof Reading and Review/TCB Mvt for Vn and Orch - Errata_v1.docx
+++ b/Proof Reading and Review/TCB Mvt for Vn and Orch - Errata_v1.docx
@@ -1495,7 +1495,6 @@
                 <w:szCs w:val="22"/>
               </w:rPr>
             </w:pPr>
-            <w:proofErr w:type="spellStart"/>
             <w:r>
               <w:rPr>
                 <w:rFonts w:ascii="Times" w:eastAsia="Times" w:hAnsi="Times" w:cs="Times"/>
@@ -1512,17 +1511,7 @@
                 <w:sz w:val="22"/>
                 <w:szCs w:val="22"/>
               </w:rPr>
-              <w:t>nics</w:t>
-            </w:r>
-            <w:proofErr w:type="spellEnd"/>
-            <w:r>
-              <w:rPr>
-                <w:rFonts w:ascii="Times" w:eastAsia="Times" w:hAnsi="Times" w:cs="Times"/>
-                <w:color w:val="E97132"/>
-                <w:sz w:val="22"/>
-                <w:szCs w:val="22"/>
-              </w:rPr>
-              <w:t>: turned flats to sharps for voice leading</w:t>
+              <w:t>nics: turned flats to sharps for voice leading</w:t>
             </w:r>
             <w:r>
               <w:rPr>
@@ -1655,7 +1644,6 @@
               </w:rPr>
               <w:t xml:space="preserve">Staccatissimo on long held notes? Recommend using </w:t>
             </w:r>
-            <w:proofErr w:type="spellStart"/>
             <w:r>
               <w:rPr>
                 <w:rFonts w:ascii="Times" w:eastAsia="Times" w:hAnsi="Times" w:cs="Times"/>
@@ -1668,7 +1656,6 @@
               </w:rPr>
               <w:t>sfz</w:t>
             </w:r>
-            <w:proofErr w:type="spellEnd"/>
             <w:r>
               <w:rPr>
                 <w:rFonts w:ascii="Times" w:eastAsia="Times" w:hAnsi="Times" w:cs="Times"/>
@@ -2377,7 +2364,6 @@
                 <w:szCs w:val="22"/>
               </w:rPr>
             </w:pPr>
-            <w:proofErr w:type="spellStart"/>
             <w:r>
               <w:rPr>
                 <w:rFonts w:ascii="Times" w:eastAsia="Times" w:hAnsi="Times" w:cs="Times"/>
@@ -2386,7 +2372,6 @@
               </w:rPr>
               <w:t>Cbsn</w:t>
             </w:r>
-            <w:proofErr w:type="spellEnd"/>
           </w:p>
         </w:tc>
         <w:tc>
@@ -3292,7 +3277,7 @@
                 <w:sz w:val="22"/>
                 <w:szCs w:val="22"/>
               </w:rPr>
-              <w:t xml:space="preserve">Removed harmonic articulation marks. </w:t>
+              <w:t>Removed harmonic a</w:t>
             </w:r>
             <w:r>
               <w:rPr>
@@ -3301,7 +3286,16 @@
                 <w:sz w:val="22"/>
                 <w:szCs w:val="22"/>
               </w:rPr>
-              <w:t xml:space="preserve"> </w:t>
+              <w:t>rticulation marks</w:t>
+            </w:r>
+            <w:r>
+              <w:rPr>
+                <w:rFonts w:ascii="Times" w:eastAsia="Times" w:hAnsi="Times" w:cs="Times"/>
+                <w:color w:val="E97132"/>
+                <w:sz w:val="22"/>
+                <w:szCs w:val="22"/>
+              </w:rPr>
+              <w:t xml:space="preserve">. </w:t>
             </w:r>
           </w:p>
         </w:tc>
@@ -3458,6 +3452,364 @@
           </w:p>
         </w:tc>
       </w:tr>
+      <w:tr>
+        <w:trPr>
+          <w:trHeight w:val="350"/>
+        </w:trPr>
+        <w:tc>
+          <w:tcPr>
+            <w:tcW w:w="756" w:type="pct"/>
+            <w:tcBorders>
+              <w:top w:val="single" w:sz="4" w:space="0" w:color="000000"/>
+              <w:left w:val="single" w:sz="4" w:space="0" w:color="000000"/>
+              <w:bottom w:val="single" w:sz="4" w:space="0" w:color="000000"/>
+              <w:right w:val="single" w:sz="4" w:space="0" w:color="000000"/>
+            </w:tcBorders>
+            <w:vAlign w:val="center"/>
+          </w:tcPr>
+          <w:p>
+            <w:pPr>
+              <w:rPr>
+                <w:rFonts w:ascii="Times" w:eastAsia="Times" w:hAnsi="Times" w:cs="Times"/>
+                <w:sz w:val="22"/>
+                <w:szCs w:val="22"/>
+              </w:rPr>
+            </w:pPr>
+            <w:r>
+              <w:rPr>
+                <w:rFonts w:ascii="Times" w:eastAsia="Times" w:hAnsi="Times" w:cs="Times"/>
+                <w:color w:val="E97132"/>
+                <w:sz w:val="22"/>
+                <w:szCs w:val="22"/>
+              </w:rPr>
+              <w:t>VC</w:t>
+            </w:r>
+          </w:p>
+        </w:tc>
+        <w:tc>
+          <w:tcPr>
+            <w:tcW w:w="727" w:type="pct"/>
+            <w:tcBorders>
+              <w:top w:val="single" w:sz="4" w:space="0" w:color="000000"/>
+              <w:left w:val="single" w:sz="4" w:space="0" w:color="000000"/>
+              <w:bottom w:val="single" w:sz="4" w:space="0" w:color="000000"/>
+              <w:right w:val="single" w:sz="4" w:space="0" w:color="000000"/>
+            </w:tcBorders>
+            <w:vAlign w:val="center"/>
+          </w:tcPr>
+          <w:p>
+            <w:pPr>
+              <w:rPr>
+                <w:rFonts w:ascii="Times" w:eastAsia="Times" w:hAnsi="Times" w:cs="Times"/>
+                <w:sz w:val="22"/>
+                <w:szCs w:val="22"/>
+              </w:rPr>
+            </w:pPr>
+            <w:r>
+              <w:rPr>
+                <w:rFonts w:ascii="Times" w:eastAsia="Times" w:hAnsi="Times" w:cs="Times"/>
+                <w:color w:val="E97132"/>
+                <w:sz w:val="22"/>
+                <w:szCs w:val="22"/>
+              </w:rPr>
+              <w:t>183</w:t>
+            </w:r>
+          </w:p>
+        </w:tc>
+        <w:tc>
+          <w:tcPr>
+            <w:tcW w:w="2493" w:type="pct"/>
+            <w:tcBorders>
+              <w:top w:val="single" w:sz="4" w:space="0" w:color="000000"/>
+              <w:left w:val="single" w:sz="4" w:space="0" w:color="000000"/>
+              <w:bottom w:val="single" w:sz="4" w:space="0" w:color="000000"/>
+              <w:right w:val="single" w:sz="4" w:space="0" w:color="000000"/>
+            </w:tcBorders>
+            <w:vAlign w:val="center"/>
+          </w:tcPr>
+          <w:p>
+            <w:pPr>
+              <w:rPr>
+                <w:rFonts w:ascii="Times" w:eastAsia="Times" w:hAnsi="Times" w:cs="Times"/>
+                <w:sz w:val="22"/>
+                <w:szCs w:val="22"/>
+              </w:rPr>
+            </w:pPr>
+            <w:r>
+              <w:rPr>
+                <w:rFonts w:ascii="Times" w:eastAsia="Times" w:hAnsi="Times" w:cs="Times"/>
+                <w:color w:val="E97132"/>
+                <w:sz w:val="22"/>
+                <w:szCs w:val="22"/>
+              </w:rPr>
+              <w:t xml:space="preserve">Tuplet within tuplet. </w:t>
+            </w:r>
+          </w:p>
+        </w:tc>
+        <w:tc>
+          <w:tcPr>
+            <w:tcW w:w="1024" w:type="pct"/>
+            <w:tcBorders>
+              <w:top w:val="single" w:sz="4" w:space="0" w:color="000000"/>
+              <w:left w:val="single" w:sz="4" w:space="0" w:color="000000"/>
+              <w:bottom w:val="single" w:sz="4" w:space="0" w:color="000000"/>
+              <w:right w:val="single" w:sz="4" w:space="0" w:color="000000"/>
+            </w:tcBorders>
+            <w:vAlign w:val="center"/>
+          </w:tcPr>
+          <w:p>
+            <w:pPr>
+              <w:rPr>
+                <w:rFonts w:ascii="Times" w:eastAsia="Times" w:hAnsi="Times" w:cs="Times"/>
+                <w:sz w:val="22"/>
+                <w:szCs w:val="22"/>
+              </w:rPr>
+            </w:pPr>
+          </w:p>
+        </w:tc>
+      </w:tr>
+      <w:tr>
+        <w:trPr>
+          <w:trHeight w:val="350"/>
+        </w:trPr>
+        <w:tc>
+          <w:tcPr>
+            <w:tcW w:w="756" w:type="pct"/>
+            <w:tcBorders>
+              <w:top w:val="single" w:sz="4" w:space="0" w:color="000000"/>
+              <w:left w:val="single" w:sz="4" w:space="0" w:color="000000"/>
+              <w:bottom w:val="single" w:sz="4" w:space="0" w:color="000000"/>
+              <w:right w:val="single" w:sz="4" w:space="0" w:color="000000"/>
+            </w:tcBorders>
+            <w:vAlign w:val="center"/>
+          </w:tcPr>
+          <w:p>
+            <w:pPr>
+              <w:rPr>
+                <w:rFonts w:ascii="Times" w:eastAsia="Times" w:hAnsi="Times" w:cs="Times"/>
+                <w:sz w:val="22"/>
+                <w:szCs w:val="22"/>
+              </w:rPr>
+            </w:pPr>
+            <w:r>
+              <w:rPr>
+                <w:rFonts w:ascii="Times" w:eastAsia="Times" w:hAnsi="Times" w:cs="Times"/>
+                <w:sz w:val="22"/>
+                <w:szCs w:val="22"/>
+              </w:rPr>
+              <w:t>Violas</w:t>
+            </w:r>
+          </w:p>
+        </w:tc>
+        <w:tc>
+          <w:tcPr>
+            <w:tcW w:w="727" w:type="pct"/>
+            <w:tcBorders>
+              <w:top w:val="single" w:sz="4" w:space="0" w:color="000000"/>
+              <w:left w:val="single" w:sz="4" w:space="0" w:color="000000"/>
+              <w:bottom w:val="single" w:sz="4" w:space="0" w:color="000000"/>
+              <w:right w:val="single" w:sz="4" w:space="0" w:color="000000"/>
+            </w:tcBorders>
+            <w:vAlign w:val="center"/>
+          </w:tcPr>
+          <w:p>
+            <w:pPr>
+              <w:rPr>
+                <w:rFonts w:ascii="Times" w:eastAsia="Times" w:hAnsi="Times" w:cs="Times"/>
+                <w:sz w:val="22"/>
+                <w:szCs w:val="22"/>
+              </w:rPr>
+            </w:pPr>
+            <w:r>
+              <w:rPr>
+                <w:rFonts w:ascii="Times" w:eastAsia="Times" w:hAnsi="Times" w:cs="Times"/>
+                <w:sz w:val="22"/>
+                <w:szCs w:val="22"/>
+              </w:rPr>
+              <w:t>196</w:t>
+            </w:r>
+          </w:p>
+        </w:tc>
+        <w:tc>
+          <w:tcPr>
+            <w:tcW w:w="2493" w:type="pct"/>
+            <w:tcBorders>
+              <w:top w:val="single" w:sz="4" w:space="0" w:color="000000"/>
+              <w:left w:val="single" w:sz="4" w:space="0" w:color="000000"/>
+              <w:bottom w:val="single" w:sz="4" w:space="0" w:color="000000"/>
+              <w:right w:val="single" w:sz="4" w:space="0" w:color="000000"/>
+            </w:tcBorders>
+            <w:vAlign w:val="center"/>
+          </w:tcPr>
+          <w:p>
+            <w:pPr>
+              <w:rPr>
+                <w:rFonts w:ascii="Times" w:eastAsia="Times" w:hAnsi="Times" w:cs="Times"/>
+                <w:sz w:val="22"/>
+                <w:szCs w:val="22"/>
+              </w:rPr>
+            </w:pPr>
+            <w:r>
+              <w:rPr>
+                <w:rFonts w:ascii="Times" w:eastAsia="Times" w:hAnsi="Times" w:cs="Times"/>
+                <w:sz w:val="22"/>
+                <w:szCs w:val="22"/>
+              </w:rPr>
+              <w:t xml:space="preserve">Potentially </w:t>
+            </w:r>
+            <w:r>
+              <w:rPr>
+                <w:rFonts w:ascii="Times" w:eastAsia="Times" w:hAnsi="Times" w:cs="Times"/>
+                <w:sz w:val="22"/>
+                <w:szCs w:val="22"/>
+              </w:rPr>
+              <w:t>inconvenient legato</w:t>
+            </w:r>
+            <w:r>
+              <w:rPr>
+                <w:rFonts w:ascii="Times" w:eastAsia="Times" w:hAnsi="Times" w:cs="Times"/>
+                <w:sz w:val="22"/>
+                <w:szCs w:val="22"/>
+              </w:rPr>
+              <w:t>.</w:t>
+            </w:r>
+          </w:p>
+        </w:tc>
+        <w:tc>
+          <w:tcPr>
+            <w:tcW w:w="1024" w:type="pct"/>
+            <w:tcBorders>
+              <w:top w:val="single" w:sz="4" w:space="0" w:color="000000"/>
+              <w:left w:val="single" w:sz="4" w:space="0" w:color="000000"/>
+              <w:bottom w:val="single" w:sz="4" w:space="0" w:color="000000"/>
+              <w:right w:val="single" w:sz="4" w:space="0" w:color="000000"/>
+            </w:tcBorders>
+            <w:vAlign w:val="center"/>
+          </w:tcPr>
+          <w:p>
+            <w:pPr>
+              <w:rPr>
+                <w:rFonts w:ascii="Times" w:eastAsia="Times" w:hAnsi="Times" w:cs="Times"/>
+                <w:sz w:val="22"/>
+                <w:szCs w:val="22"/>
+              </w:rPr>
+            </w:pPr>
+          </w:p>
+        </w:tc>
+      </w:tr>
+      <w:tr>
+        <w:trPr>
+          <w:trHeight w:val="350"/>
+        </w:trPr>
+        <w:tc>
+          <w:tcPr>
+            <w:tcW w:w="756" w:type="pct"/>
+            <w:tcBorders>
+              <w:top w:val="single" w:sz="4" w:space="0" w:color="000000"/>
+              <w:left w:val="single" w:sz="4" w:space="0" w:color="000000"/>
+              <w:bottom w:val="single" w:sz="4" w:space="0" w:color="000000"/>
+              <w:right w:val="single" w:sz="4" w:space="0" w:color="000000"/>
+            </w:tcBorders>
+            <w:vAlign w:val="center"/>
+          </w:tcPr>
+          <w:p>
+            <w:pPr>
+              <w:rPr>
+                <w:rFonts w:ascii="Times" w:eastAsia="Times" w:hAnsi="Times" w:cs="Times"/>
+                <w:sz w:val="22"/>
+                <w:szCs w:val="22"/>
+              </w:rPr>
+            </w:pPr>
+            <w:r>
+              <w:rPr>
+                <w:rFonts w:ascii="Times" w:eastAsia="Times" w:hAnsi="Times" w:cs="Times"/>
+                <w:sz w:val="22"/>
+                <w:szCs w:val="22"/>
+              </w:rPr>
+              <w:t>Cymbal</w:t>
+            </w:r>
+          </w:p>
+        </w:tc>
+        <w:tc>
+          <w:tcPr>
+            <w:tcW w:w="727" w:type="pct"/>
+            <w:tcBorders>
+              <w:top w:val="single" w:sz="4" w:space="0" w:color="000000"/>
+              <w:left w:val="single" w:sz="4" w:space="0" w:color="000000"/>
+              <w:bottom w:val="single" w:sz="4" w:space="0" w:color="000000"/>
+              <w:right w:val="single" w:sz="4" w:space="0" w:color="000000"/>
+            </w:tcBorders>
+            <w:vAlign w:val="center"/>
+          </w:tcPr>
+          <w:p>
+            <w:pPr>
+              <w:rPr>
+                <w:rFonts w:ascii="Times" w:eastAsia="Times" w:hAnsi="Times" w:cs="Times"/>
+                <w:sz w:val="22"/>
+                <w:szCs w:val="22"/>
+              </w:rPr>
+            </w:pPr>
+            <w:r>
+              <w:rPr>
+                <w:rFonts w:ascii="Times" w:eastAsia="Times" w:hAnsi="Times" w:cs="Times"/>
+                <w:sz w:val="22"/>
+                <w:szCs w:val="22"/>
+              </w:rPr>
+              <w:t>197</w:t>
+            </w:r>
+          </w:p>
+        </w:tc>
+        <w:tc>
+          <w:tcPr>
+            <w:tcW w:w="2493" w:type="pct"/>
+            <w:tcBorders>
+              <w:top w:val="single" w:sz="4" w:space="0" w:color="000000"/>
+              <w:left w:val="single" w:sz="4" w:space="0" w:color="000000"/>
+              <w:bottom w:val="single" w:sz="4" w:space="0" w:color="000000"/>
+              <w:right w:val="single" w:sz="4" w:space="0" w:color="000000"/>
+            </w:tcBorders>
+            <w:vAlign w:val="center"/>
+          </w:tcPr>
+          <w:p>
+            <w:pPr>
+              <w:rPr>
+                <w:rFonts w:ascii="Times" w:eastAsia="Times" w:hAnsi="Times" w:cs="Times"/>
+                <w:sz w:val="22"/>
+                <w:szCs w:val="22"/>
+              </w:rPr>
+            </w:pPr>
+            <w:r>
+              <w:rPr>
+                <w:rFonts w:ascii="Times" w:eastAsia="Times" w:hAnsi="Times" w:cs="Times"/>
+                <w:sz w:val="22"/>
+                <w:szCs w:val="22"/>
+              </w:rPr>
+              <w:t>Is this a suspended cymbal or crash cymbal?</w:t>
+            </w:r>
+          </w:p>
+        </w:tc>
+        <w:tc>
+          <w:tcPr>
+            <w:tcW w:w="1024" w:type="pct"/>
+            <w:tcBorders>
+              <w:top w:val="single" w:sz="4" w:space="0" w:color="000000"/>
+              <w:left w:val="single" w:sz="4" w:space="0" w:color="000000"/>
+              <w:bottom w:val="single" w:sz="4" w:space="0" w:color="000000"/>
+              <w:right w:val="single" w:sz="4" w:space="0" w:color="000000"/>
+            </w:tcBorders>
+            <w:vAlign w:val="center"/>
+          </w:tcPr>
+          <w:p>
+            <w:pPr>
+              <w:rPr>
+                <w:rFonts w:ascii="Times" w:eastAsia="Times" w:hAnsi="Times" w:cs="Times"/>
+                <w:sz w:val="22"/>
+                <w:szCs w:val="22"/>
+              </w:rPr>
+            </w:pPr>
+          </w:p>
+        </w:tc>
+      </w:tr>
     </w:tbl>
     <w:p/>
     <w:p>
@@ -3467,126 +3819,13 @@
           <w:bCs/>
         </w:rPr>
       </w:pPr>
-    </w:p>
-    <w:p>
-      <w:pPr>
+      <w:r>
         <w:rPr>
           <w:b/>
           <w:bCs/>
         </w:rPr>
-      </w:pPr>
-    </w:p>
-    <w:p>
-      <w:pPr>
-        <w:rPr>
-          <w:b/>
-          <w:bCs/>
-        </w:rPr>
-      </w:pPr>
-    </w:p>
-    <w:p>
-      <w:pPr>
-        <w:rPr>
-          <w:b/>
-          <w:bCs/>
-        </w:rPr>
-      </w:pPr>
-    </w:p>
-    <w:p>
-      <w:pPr>
-        <w:rPr>
-          <w:b/>
-          <w:bCs/>
-        </w:rPr>
-      </w:pPr>
-    </w:p>
-    <w:p>
-      <w:pPr>
-        <w:rPr>
-          <w:b/>
-          <w:bCs/>
-        </w:rPr>
-      </w:pPr>
-    </w:p>
-    <w:p>
-      <w:pPr>
-        <w:rPr>
-          <w:b/>
-          <w:bCs/>
-        </w:rPr>
-      </w:pPr>
-    </w:p>
-    <w:p>
-      <w:pPr>
-        <w:rPr>
-          <w:b/>
-          <w:bCs/>
-        </w:rPr>
-      </w:pPr>
-    </w:p>
-    <w:p>
-      <w:pPr>
-        <w:rPr>
-          <w:b/>
-          <w:bCs/>
-        </w:rPr>
-      </w:pPr>
-    </w:p>
-    <w:p>
-      <w:pPr>
-        <w:rPr>
-          <w:b/>
-          <w:bCs/>
-        </w:rPr>
-      </w:pPr>
-    </w:p>
-    <w:p>
-      <w:pPr>
-        <w:rPr>
-          <w:b/>
-          <w:bCs/>
-        </w:rPr>
-      </w:pPr>
-    </w:p>
-    <w:p>
-      <w:pPr>
-        <w:rPr>
-          <w:b/>
-          <w:bCs/>
-        </w:rPr>
-      </w:pPr>
-    </w:p>
-    <w:p>
-      <w:pPr>
-        <w:rPr>
-          <w:b/>
-          <w:bCs/>
-        </w:rPr>
-      </w:pPr>
-    </w:p>
-    <w:p>
-      <w:pPr>
-        <w:rPr>
-          <w:b/>
-          <w:bCs/>
-        </w:rPr>
-      </w:pPr>
-    </w:p>
-    <w:p>
-      <w:pPr>
-        <w:rPr>
-          <w:b/>
-          <w:bCs/>
-        </w:rPr>
-      </w:pPr>
-    </w:p>
-    <w:p>
-      <w:pPr>
-        <w:rPr>
-          <w:b/>
-          <w:bCs/>
-        </w:rPr>
-      </w:pPr>
+        <w:br w:type="page"/>
+      </w:r>
     </w:p>
     <w:p>
       <w:r>
@@ -3594,23 +3833,8 @@
           <w:b/>
           <w:bCs/>
         </w:rPr>
-        <w:t xml:space="preserve">Prevous Errata (version 0 - solo </w:t>
-      </w:r>
-      <w:proofErr w:type="spellStart"/>
-      <w:r>
-        <w:rPr>
-          <w:b/>
-          <w:bCs/>
-        </w:rPr>
-        <w:t>vn</w:t>
-      </w:r>
-      <w:proofErr w:type="spellEnd"/>
-      <w:r>
-        <w:rPr>
-          <w:b/>
-          <w:bCs/>
-        </w:rPr>
-        <w:t xml:space="preserve"> only)</w:t>
+        <w:lastRenderedPageBreak/>
+        <w:t>Prevous Errata (version 0 - solo vn only)</w:t>
       </w:r>
     </w:p>
     <w:tbl>
@@ -3634,21 +3858,32 @@
       </w:tblGrid>
       <w:tr>
         <w:trPr>
-          <w:trHeight w:val="350"/>
+          <w:trHeight w:val="552"/>
         </w:trPr>
         <w:tc>
           <w:tcPr>
             <w:tcW w:w="756" w:type="pct"/>
-            <w:vAlign w:val="center"/>
-          </w:tcPr>
-          <w:p>
-            <w:pPr>
-              <w:rPr>
-                <w:rFonts w:ascii="Times" w:eastAsia="Times" w:hAnsi="Times" w:cs="Times"/>
-                <w:b/>
-                <w:bCs/>
-              </w:rPr>
-            </w:pPr>
+            <w:vMerge w:val="restart"/>
+          </w:tcPr>
+          <w:p>
+            <w:pPr>
+              <w:rPr>
+                <w:rFonts w:ascii="Times" w:eastAsia="Times" w:hAnsi="Times" w:cs="Times"/>
+              </w:rPr>
+            </w:pPr>
+          </w:p>
+          <w:p>
+            <w:pPr>
+              <w:rPr>
+                <w:rFonts w:ascii="Times" w:eastAsia="Times" w:hAnsi="Times" w:cs="Times"/>
+              </w:rPr>
+            </w:pPr>
+            <w:r>
+              <w:rPr>
+                <w:rFonts w:ascii="Times" w:eastAsia="Times" w:hAnsi="Times" w:cs="Times"/>
+              </w:rPr>
+              <w:t>Solo Vn</w:t>
+            </w:r>
           </w:p>
         </w:tc>
         <w:tc>
@@ -3660,10 +3895,14 @@
             <w:pPr>
               <w:rPr>
                 <w:rFonts w:ascii="Times" w:eastAsia="Times" w:hAnsi="Times" w:cs="Times"/>
-                <w:b/>
-                <w:bCs/>
-              </w:rPr>
-            </w:pPr>
+              </w:rPr>
+            </w:pPr>
+            <w:r>
+              <w:rPr>
+                <w:rFonts w:ascii="Times" w:eastAsia="Times" w:hAnsi="Times" w:cs="Times"/>
+              </w:rPr>
+              <w:t>All</w:t>
+            </w:r>
           </w:p>
         </w:tc>
         <w:tc>
@@ -3675,10 +3914,26 @@
             <w:pPr>
               <w:rPr>
                 <w:rFonts w:ascii="Times" w:eastAsia="Times" w:hAnsi="Times" w:cs="Times"/>
-                <w:b/>
-                <w:bCs/>
-              </w:rPr>
-            </w:pPr>
+              </w:rPr>
+            </w:pPr>
+            <w:r>
+              <w:rPr>
+                <w:rFonts w:ascii="Times" w:eastAsia="Times" w:hAnsi="Times" w:cs="Times"/>
+              </w:rPr>
+              <w:t>Wondering if the 'ten.' marki</w:t>
+            </w:r>
+            <w:r>
+              <w:rPr>
+                <w:rFonts w:ascii="Times" w:eastAsia="Times" w:hAnsi="Times" w:cs="Times"/>
+              </w:rPr>
+              <w:t>ng</w:t>
+            </w:r>
+            <w:r>
+              <w:rPr>
+                <w:rFonts w:ascii="Times" w:eastAsia="Times" w:hAnsi="Times" w:cs="Times"/>
+              </w:rPr>
+              <w:t xml:space="preserve">s are redundant given the tenuto symbols. However, if it is a preference or the intention is for a more pronounced tenuto, let me know. If no preference, we could potentially remove them, except at key moments, and just ensure a tenuto symbol is present. </w:t>
+            </w:r>
           </w:p>
         </w:tc>
         <w:tc>
@@ -3690,10 +3945,30 @@
             <w:pPr>
               <w:rPr>
                 <w:rFonts w:ascii="Times" w:eastAsia="Times" w:hAnsi="Times" w:cs="Times"/>
-                <w:b/>
-                <w:bCs/>
-              </w:rPr>
-            </w:pPr>
+              </w:rPr>
+            </w:pPr>
+            <w:r>
+              <w:rPr>
+                <w:rFonts w:ascii="Times" w:eastAsia="Times" w:hAnsi="Times" w:cs="Times"/>
+              </w:rPr>
+              <w:t>Leave as is</w:t>
+            </w:r>
+            <w:r>
+              <w:rPr>
+                <w:rFonts w:ascii="Times" w:eastAsia="Times" w:hAnsi="Times" w:cs="Times"/>
+              </w:rPr>
+              <w:t xml:space="preserve"> </w:t>
+            </w:r>
+            <w:r>
+              <w:rPr>
+                <w:rFonts w:ascii="Segoe UI Symbol" w:hAnsi="Segoe UI Symbol" w:cs="Segoe UI Symbol"/>
+                <w:color w:val="474747"/>
+                <w:sz w:val="21"/>
+                <w:szCs w:val="21"/>
+                <w:shd w:val="clear" w:color="auto" w:fill="FFFFFF"/>
+              </w:rPr>
+              <w:t>✓</w:t>
+            </w:r>
           </w:p>
         </w:tc>
       </w:tr>
@@ -3704,35 +3979,15 @@
         <w:tc>
           <w:tcPr>
             <w:tcW w:w="756" w:type="pct"/>
-            <w:vMerge w:val="restart"/>
-          </w:tcPr>
-          <w:p>
-            <w:pPr>
-              <w:rPr>
-                <w:rFonts w:ascii="Times" w:eastAsia="Times" w:hAnsi="Times" w:cs="Times"/>
-              </w:rPr>
-            </w:pPr>
-          </w:p>
-          <w:p>
-            <w:pPr>
-              <w:rPr>
-                <w:rFonts w:ascii="Times" w:eastAsia="Times" w:hAnsi="Times" w:cs="Times"/>
-              </w:rPr>
-            </w:pPr>
-            <w:r>
-              <w:rPr>
-                <w:rFonts w:ascii="Times" w:eastAsia="Times" w:hAnsi="Times" w:cs="Times"/>
-              </w:rPr>
-              <w:t xml:space="preserve">Solo </w:t>
-            </w:r>
-            <w:proofErr w:type="spellStart"/>
-            <w:r>
-              <w:rPr>
-                <w:rFonts w:ascii="Times" w:eastAsia="Times" w:hAnsi="Times" w:cs="Times"/>
-              </w:rPr>
-              <w:t>Vn</w:t>
-            </w:r>
-            <w:proofErr w:type="spellEnd"/>
+            <w:vMerge/>
+            <w:vAlign w:val="center"/>
+          </w:tcPr>
+          <w:p>
+            <w:pPr>
+              <w:rPr>
+                <w:rFonts w:ascii="Times" w:eastAsia="Times" w:hAnsi="Times" w:cs="Times"/>
+              </w:rPr>
+            </w:pPr>
           </w:p>
         </w:tc>
         <w:tc>
@@ -3750,7 +4005,7 @@
               <w:rPr>
                 <w:rFonts w:ascii="Times" w:eastAsia="Times" w:hAnsi="Times" w:cs="Times"/>
               </w:rPr>
-              <w:t>All</w:t>
+              <w:t>19</w:t>
             </w:r>
           </w:p>
         </w:tc>
@@ -3769,19 +4024,7 @@
               <w:rPr>
                 <w:rFonts w:ascii="Times" w:eastAsia="Times" w:hAnsi="Times" w:cs="Times"/>
               </w:rPr>
-              <w:t>Wondering if the 'ten.' marki</w:t>
-            </w:r>
-            <w:r>
-              <w:rPr>
-                <w:rFonts w:ascii="Times" w:eastAsia="Times" w:hAnsi="Times" w:cs="Times"/>
-              </w:rPr>
-              <w:t>ng</w:t>
-            </w:r>
-            <w:r>
-              <w:rPr>
-                <w:rFonts w:ascii="Times" w:eastAsia="Times" w:hAnsi="Times" w:cs="Times"/>
-              </w:rPr>
-              <w:t xml:space="preserve">s are redundant given the tenuto symbols. However, if it is a preference or the intention is for a more pronounced tenuto, let me know. If no preference, we could potentially remove them, except at key moments, and just ensure a tenuto symbol is present. </w:t>
+              <w:t>Technically does the sul G continue from m. 19 till the F in m. 27? Will format accordingly</w:t>
             </w:r>
           </w:p>
         </w:tc>
@@ -3800,13 +4043,7 @@
               <w:rPr>
                 <w:rFonts w:ascii="Times" w:eastAsia="Times" w:hAnsi="Times" w:cs="Times"/>
               </w:rPr>
-              <w:t>Leave as is</w:t>
-            </w:r>
-            <w:r>
-              <w:rPr>
-                <w:rFonts w:ascii="Times" w:eastAsia="Times" w:hAnsi="Times" w:cs="Times"/>
-              </w:rPr>
-              <w:t xml:space="preserve"> </w:t>
+              <w:t>Yes</w:t>
             </w:r>
             <w:r>
               <w:rPr>
@@ -3816,7 +4053,7 @@
                 <w:szCs w:val="21"/>
                 <w:shd w:val="clear" w:color="auto" w:fill="FFFFFF"/>
               </w:rPr>
-              <w:t>✓</w:t>
+              <w:t xml:space="preserve"> ✓</w:t>
             </w:r>
           </w:p>
         </w:tc>
@@ -3854,7 +4091,7 @@
               <w:rPr>
                 <w:rFonts w:ascii="Times" w:eastAsia="Times" w:hAnsi="Times" w:cs="Times"/>
               </w:rPr>
-              <w:t>19</w:t>
+              <w:t>98-99</w:t>
             </w:r>
           </w:p>
         </w:tc>
@@ -3873,7 +4110,55 @@
               <w:rPr>
                 <w:rFonts w:ascii="Times" w:eastAsia="Times" w:hAnsi="Times" w:cs="Times"/>
               </w:rPr>
-              <w:t>Technically does the sul G continue from m. 19 till the F in m. 27? Will format accordingly</w:t>
+              <w:t xml:space="preserve">Piece diminuendos back to </w:t>
+            </w:r>
+            <w:r>
+              <w:rPr>
+                <w:rFonts w:ascii="Times" w:eastAsia="Times" w:hAnsi="Times" w:cs="Times"/>
+                <w:b/>
+                <w:bCs/>
+                <w:i/>
+                <w:iCs/>
+              </w:rPr>
+              <w:t>f</w:t>
+            </w:r>
+            <w:r>
+              <w:rPr>
+                <w:rFonts w:ascii="Times" w:eastAsia="Times" w:hAnsi="Times" w:cs="Times"/>
+              </w:rPr>
+              <w:t xml:space="preserve"> from a </w:t>
+            </w:r>
+            <w:r>
+              <w:rPr>
+                <w:rFonts w:ascii="Times" w:eastAsia="Times" w:hAnsi="Times" w:cs="Times"/>
+                <w:b/>
+                <w:bCs/>
+                <w:i/>
+                <w:iCs/>
+              </w:rPr>
+              <w:t>f</w:t>
+            </w:r>
+            <w:r>
+              <w:rPr>
+                <w:rFonts w:ascii="Times" w:eastAsia="Times" w:hAnsi="Times" w:cs="Times"/>
+              </w:rPr>
+              <w:t xml:space="preserve">. Should it dim. to a different dynamic, with a sub. </w:t>
+            </w:r>
+            <w:r>
+              <w:rPr>
+                <w:rFonts w:ascii="Times" w:eastAsia="Times" w:hAnsi="Times" w:cs="Times"/>
+                <w:b/>
+                <w:bCs/>
+                <w:i/>
+                <w:iCs/>
+              </w:rPr>
+              <w:t>f</w:t>
+            </w:r>
+            <w:r>
+              <w:rPr>
+                <w:rFonts w:ascii="Times" w:eastAsia="Times" w:hAnsi="Times" w:cs="Times"/>
+              </w:rPr>
+              <w:t xml:space="preserve"> after?</w:t>
             </w:r>
           </w:p>
         </w:tc>
@@ -3892,7 +4177,7 @@
               <w:rPr>
                 <w:rFonts w:ascii="Times" w:eastAsia="Times" w:hAnsi="Times" w:cs="Times"/>
               </w:rPr>
-              <w:t>Yes</w:t>
+              <w:t>Keep as is</w:t>
             </w:r>
             <w:r>
               <w:rPr>
@@ -3940,7 +4225,7 @@
               <w:rPr>
                 <w:rFonts w:ascii="Times" w:eastAsia="Times" w:hAnsi="Times" w:cs="Times"/>
               </w:rPr>
-              <w:t>98-99</w:t>
+              <w:t>110</w:t>
             </w:r>
           </w:p>
         </w:tc>
@@ -3959,55 +4244,7 @@
               <w:rPr>
                 <w:rFonts w:ascii="Times" w:eastAsia="Times" w:hAnsi="Times" w:cs="Times"/>
               </w:rPr>
-              <w:t xml:space="preserve">Piece diminuendos back to </w:t>
-            </w:r>
-            <w:r>
-              <w:rPr>
-                <w:rFonts w:ascii="Times" w:eastAsia="Times" w:hAnsi="Times" w:cs="Times"/>
-                <w:b/>
-                <w:bCs/>
-                <w:i/>
-                <w:iCs/>
-              </w:rPr>
-              <w:t>f</w:t>
-            </w:r>
-            <w:r>
-              <w:rPr>
-                <w:rFonts w:ascii="Times" w:eastAsia="Times" w:hAnsi="Times" w:cs="Times"/>
-              </w:rPr>
-              <w:t xml:space="preserve"> from a </w:t>
-            </w:r>
-            <w:r>
-              <w:rPr>
-                <w:rFonts w:ascii="Times" w:eastAsia="Times" w:hAnsi="Times" w:cs="Times"/>
-                <w:b/>
-                <w:bCs/>
-                <w:i/>
-                <w:iCs/>
-              </w:rPr>
-              <w:t>f</w:t>
-            </w:r>
-            <w:r>
-              <w:rPr>
-                <w:rFonts w:ascii="Times" w:eastAsia="Times" w:hAnsi="Times" w:cs="Times"/>
-              </w:rPr>
-              <w:t xml:space="preserve">. Should it dim. to a different dynamic, with a sub. </w:t>
-            </w:r>
-            <w:r>
-              <w:rPr>
-                <w:rFonts w:ascii="Times" w:eastAsia="Times" w:hAnsi="Times" w:cs="Times"/>
-                <w:b/>
-                <w:bCs/>
-                <w:i/>
-                <w:iCs/>
-              </w:rPr>
-              <w:t>f</w:t>
-            </w:r>
-            <w:r>
-              <w:rPr>
-                <w:rFonts w:ascii="Times" w:eastAsia="Times" w:hAnsi="Times" w:cs="Times"/>
-              </w:rPr>
-              <w:t xml:space="preserve"> after?</w:t>
+              <w:t>I extended the crescendo line - let me know if okay?</w:t>
             </w:r>
           </w:p>
         </w:tc>
@@ -4026,7 +4263,7 @@
               <w:rPr>
                 <w:rFonts w:ascii="Times" w:eastAsia="Times" w:hAnsi="Times" w:cs="Times"/>
               </w:rPr>
-              <w:t>Keep as is</w:t>
+              <w:t>Works!</w:t>
             </w:r>
             <w:r>
               <w:rPr>
@@ -4074,7 +4311,7 @@
               <w:rPr>
                 <w:rFonts w:ascii="Times" w:eastAsia="Times" w:hAnsi="Times" w:cs="Times"/>
               </w:rPr>
-              <w:t>110</w:t>
+              <w:t>111</w:t>
             </w:r>
           </w:p>
         </w:tc>
@@ -4093,107 +4330,7 @@
               <w:rPr>
                 <w:rFonts w:ascii="Times" w:eastAsia="Times" w:hAnsi="Times" w:cs="Times"/>
               </w:rPr>
-              <w:t>I extended the crescendo line - let me know if okay?</w:t>
-            </w:r>
-          </w:p>
-        </w:tc>
-        <w:tc>
-          <w:tcPr>
-            <w:tcW w:w="1024" w:type="pct"/>
-            <w:vAlign w:val="center"/>
-          </w:tcPr>
-          <w:p>
-            <w:pPr>
-              <w:rPr>
-                <w:rFonts w:ascii="Times" w:eastAsia="Times" w:hAnsi="Times" w:cs="Times"/>
-              </w:rPr>
-            </w:pPr>
-            <w:r>
-              <w:rPr>
-                <w:rFonts w:ascii="Times" w:eastAsia="Times" w:hAnsi="Times" w:cs="Times"/>
-              </w:rPr>
-              <w:t>Works!</w:t>
-            </w:r>
-            <w:r>
-              <w:rPr>
-                <w:rFonts w:ascii="Segoe UI Symbol" w:hAnsi="Segoe UI Symbol" w:cs="Segoe UI Symbol"/>
-                <w:color w:val="474747"/>
-                <w:sz w:val="21"/>
-                <w:szCs w:val="21"/>
-                <w:shd w:val="clear" w:color="auto" w:fill="FFFFFF"/>
-              </w:rPr>
-              <w:t xml:space="preserve"> ✓</w:t>
-            </w:r>
-          </w:p>
-        </w:tc>
-      </w:tr>
-      <w:tr>
-        <w:trPr>
-          <w:trHeight w:val="552"/>
-        </w:trPr>
-        <w:tc>
-          <w:tcPr>
-            <w:tcW w:w="756" w:type="pct"/>
-            <w:vMerge/>
-            <w:vAlign w:val="center"/>
-          </w:tcPr>
-          <w:p>
-            <w:pPr>
-              <w:rPr>
-                <w:rFonts w:ascii="Times" w:eastAsia="Times" w:hAnsi="Times" w:cs="Times"/>
-              </w:rPr>
-            </w:pPr>
-          </w:p>
-        </w:tc>
-        <w:tc>
-          <w:tcPr>
-            <w:tcW w:w="727" w:type="pct"/>
-            <w:vAlign w:val="center"/>
-          </w:tcPr>
-          <w:p>
-            <w:pPr>
-              <w:rPr>
-                <w:rFonts w:ascii="Times" w:eastAsia="Times" w:hAnsi="Times" w:cs="Times"/>
-              </w:rPr>
-            </w:pPr>
-            <w:r>
-              <w:rPr>
-                <w:rFonts w:ascii="Times" w:eastAsia="Times" w:hAnsi="Times" w:cs="Times"/>
-              </w:rPr>
-              <w:t>111</w:t>
-            </w:r>
-          </w:p>
-        </w:tc>
-        <w:tc>
-          <w:tcPr>
-            <w:tcW w:w="2493" w:type="pct"/>
-            <w:vAlign w:val="center"/>
-          </w:tcPr>
-          <w:p>
-            <w:pPr>
-              <w:rPr>
-                <w:rFonts w:ascii="Times" w:eastAsia="Times" w:hAnsi="Times" w:cs="Times"/>
-              </w:rPr>
-            </w:pPr>
-            <w:r>
-              <w:rPr>
-                <w:rFonts w:ascii="Times" w:eastAsia="Times" w:hAnsi="Times" w:cs="Times"/>
-              </w:rPr>
-              <w:t xml:space="preserve">Does </w:t>
-            </w:r>
-            <w:proofErr w:type="spellStart"/>
-            <w:r>
-              <w:rPr>
-                <w:rFonts w:ascii="Times" w:eastAsia="Times" w:hAnsi="Times" w:cs="Times"/>
-              </w:rPr>
-              <w:t>meno</w:t>
-            </w:r>
-            <w:proofErr w:type="spellEnd"/>
-            <w:r>
-              <w:rPr>
-                <w:rFonts w:ascii="Times" w:eastAsia="Times" w:hAnsi="Times" w:cs="Times"/>
-              </w:rPr>
-              <w:t xml:space="preserve"> mosso start at beat 1 of this bar or another beat?</w:t>
+              <w:t>Does meno mosso start at beat 1 of this bar or another beat?</w:t>
             </w:r>
           </w:p>
         </w:tc>

</xml_diff>

<commit_message>
V13: All pages completed, to clean up
</commit_message>
<xml_diff>
--- a/Proof Reading and Review/TCB Mvt for Vn and Orch - Errata_v1.docx
+++ b/Proof Reading and Review/TCB Mvt for Vn and Orch - Errata_v1.docx
@@ -677,7 +677,7 @@
                 <w:sz w:val="22"/>
                 <w:szCs w:val="22"/>
               </w:rPr>
-              <w:t>Violin II</w:t>
+              <w:t>GBD Acronym</w:t>
             </w:r>
           </w:p>
         </w:tc>
@@ -706,7 +706,7 @@
                 <w:sz w:val="22"/>
                 <w:szCs w:val="22"/>
               </w:rPr>
-              <w:t>11</w:t>
+              <w:t>Whole</w:t>
             </w:r>
           </w:p>
         </w:tc>
@@ -735,7 +735,7 @@
                 <w:sz w:val="22"/>
                 <w:szCs w:val="22"/>
               </w:rPr>
-              <w:t xml:space="preserve">Is the slide meant to be glissando or portamento? </w:t>
+              <w:t xml:space="preserve">Percussion lists GBD. What does GBD stand for? </w:t>
             </w:r>
           </w:p>
         </w:tc>
@@ -790,7 +790,7 @@
                 <w:sz w:val="22"/>
                 <w:szCs w:val="22"/>
               </w:rPr>
-              <w:t>Violin I</w:t>
+              <w:t>Violin II</w:t>
             </w:r>
           </w:p>
         </w:tc>
@@ -819,7 +819,7 @@
                 <w:sz w:val="22"/>
                 <w:szCs w:val="22"/>
               </w:rPr>
-              <w:t>32</w:t>
+              <w:t>11</w:t>
             </w:r>
           </w:p>
         </w:tc>
@@ -848,7 +848,7 @@
                 <w:sz w:val="22"/>
                 <w:szCs w:val="22"/>
               </w:rPr>
-              <w:t xml:space="preserve">Beat 1, possible missing decrescendo? </w:t>
+              <w:t xml:space="preserve">Is the slide meant to be glissando or portamento? </w:t>
             </w:r>
           </w:p>
         </w:tc>
@@ -903,7 +903,7 @@
                 <w:sz w:val="22"/>
                 <w:szCs w:val="22"/>
               </w:rPr>
-              <w:t>Harp 1</w:t>
+              <w:t>Violin I</w:t>
             </w:r>
           </w:p>
         </w:tc>
@@ -932,7 +932,7 @@
                 <w:sz w:val="22"/>
                 <w:szCs w:val="22"/>
               </w:rPr>
-              <w:t>40-43</w:t>
+              <w:t>32</w:t>
             </w:r>
           </w:p>
         </w:tc>
@@ -961,73 +961,7 @@
                 <w:sz w:val="22"/>
                 <w:szCs w:val="22"/>
               </w:rPr>
-              <w:t xml:space="preserve">Some harp chords don’t have arpeggiation in them. This is intentional? </w:t>
-            </w:r>
-          </w:p>
-          <w:p>
-            <w:pPr>
-              <w:rPr>
-                <w:rFonts w:ascii="Times" w:eastAsia="Times" w:hAnsi="Times" w:cs="Times"/>
-                <w:sz w:val="22"/>
-                <w:szCs w:val="22"/>
-              </w:rPr>
-            </w:pPr>
-          </w:p>
-          <w:p>
-            <w:pPr>
-              <w:rPr>
-                <w:rFonts w:ascii="Times" w:eastAsia="Times" w:hAnsi="Times" w:cs="Times"/>
-                <w:sz w:val="22"/>
-                <w:szCs w:val="22"/>
-              </w:rPr>
-            </w:pPr>
-            <w:r>
-              <w:rPr>
-                <w:rFonts w:ascii="Times" w:eastAsia="Times" w:hAnsi="Times" w:cs="Times"/>
-                <w:sz w:val="22"/>
-                <w:szCs w:val="22"/>
-              </w:rPr>
-              <w:t>For saving space</w:t>
-            </w:r>
-            <w:r>
-              <w:rPr>
-                <w:rFonts w:ascii="Times" w:eastAsia="Times" w:hAnsi="Times" w:cs="Times"/>
-                <w:sz w:val="22"/>
-                <w:szCs w:val="22"/>
-              </w:rPr>
-              <w:t xml:space="preserve">, </w:t>
-            </w:r>
-            <w:r>
-              <w:rPr>
-                <w:rFonts w:ascii="Times" w:eastAsia="Times" w:hAnsi="Times" w:cs="Times"/>
-                <w:sz w:val="22"/>
-                <w:szCs w:val="22"/>
-              </w:rPr>
-              <w:t xml:space="preserve">could </w:t>
-            </w:r>
-            <w:r>
-              <w:rPr>
-                <w:rFonts w:ascii="Times" w:eastAsia="Times" w:hAnsi="Times" w:cs="Times"/>
-                <w:sz w:val="22"/>
-                <w:szCs w:val="22"/>
-              </w:rPr>
-              <w:t xml:space="preserve">C-flat major </w:t>
-            </w:r>
-            <w:r>
-              <w:rPr>
-                <w:rFonts w:ascii="Times" w:eastAsia="Times" w:hAnsi="Times" w:cs="Times"/>
-                <w:sz w:val="22"/>
-                <w:szCs w:val="22"/>
-              </w:rPr>
-              <w:t xml:space="preserve">be used </w:t>
-            </w:r>
-            <w:r>
-              <w:rPr>
-                <w:rFonts w:ascii="Times" w:eastAsia="Times" w:hAnsi="Times" w:cs="Times"/>
-                <w:sz w:val="22"/>
-                <w:szCs w:val="22"/>
-              </w:rPr>
-              <w:t xml:space="preserve">instead for the harp’s key signature? </w:t>
+              <w:t xml:space="preserve">Beat 1, possible missing decrescendo? </w:t>
             </w:r>
           </w:p>
         </w:tc>
@@ -1082,7 +1016,7 @@
                 <w:sz w:val="22"/>
                 <w:szCs w:val="22"/>
               </w:rPr>
-              <w:t>Viola</w:t>
+              <w:t>Harp 1</w:t>
             </w:r>
           </w:p>
         </w:tc>
@@ -1111,7 +1045,7 @@
                 <w:sz w:val="22"/>
                 <w:szCs w:val="22"/>
               </w:rPr>
-              <w:t>43</w:t>
+              <w:t>40-43</w:t>
             </w:r>
           </w:p>
         </w:tc>
@@ -1140,24 +1074,109 @@
                 <w:sz w:val="22"/>
                 <w:szCs w:val="22"/>
               </w:rPr>
-              <w:t>4</w:t>
-            </w:r>
-            <w:r>
-              <w:rPr>
-                <w:rFonts w:ascii="Times" w:eastAsia="Times" w:hAnsi="Times" w:cs="Times"/>
-                <w:sz w:val="22"/>
-                <w:szCs w:val="22"/>
-                <w:vertAlign w:val="superscript"/>
-              </w:rPr>
-              <w:t>th</w:t>
-            </w:r>
-            <w:r>
-              <w:rPr>
-                <w:rFonts w:ascii="Times" w:eastAsia="Times" w:hAnsi="Times" w:cs="Times"/>
-                <w:sz w:val="22"/>
-                <w:szCs w:val="22"/>
-              </w:rPr>
-              <w:t xml:space="preserve"> beat, slur or tied staccato? </w:t>
+              <w:t xml:space="preserve">Some harp chords don’t have arpeggiation in them. </w:t>
+            </w:r>
+            <w:proofErr w:type="gramStart"/>
+            <w:r>
+              <w:rPr>
+                <w:rFonts w:ascii="Times" w:eastAsia="Times" w:hAnsi="Times" w:cs="Times"/>
+                <w:sz w:val="22"/>
+                <w:szCs w:val="22"/>
+              </w:rPr>
+              <w:t>This is</w:t>
+            </w:r>
+            <w:proofErr w:type="gramEnd"/>
+            <w:r>
+              <w:rPr>
+                <w:rFonts w:ascii="Times" w:eastAsia="Times" w:hAnsi="Times" w:cs="Times"/>
+                <w:sz w:val="22"/>
+                <w:szCs w:val="22"/>
+              </w:rPr>
+              <w:t xml:space="preserve"> </w:t>
+            </w:r>
+            <w:proofErr w:type="gramStart"/>
+            <w:r>
+              <w:rPr>
+                <w:rFonts w:ascii="Times" w:eastAsia="Times" w:hAnsi="Times" w:cs="Times"/>
+                <w:sz w:val="22"/>
+                <w:szCs w:val="22"/>
+              </w:rPr>
+              <w:t>intentional?</w:t>
+            </w:r>
+            <w:proofErr w:type="gramEnd"/>
+            <w:r>
+              <w:rPr>
+                <w:rFonts w:ascii="Times" w:eastAsia="Times" w:hAnsi="Times" w:cs="Times"/>
+                <w:sz w:val="22"/>
+                <w:szCs w:val="22"/>
+              </w:rPr>
+              <w:t xml:space="preserve"> </w:t>
+            </w:r>
+          </w:p>
+          <w:p>
+            <w:pPr>
+              <w:rPr>
+                <w:rFonts w:ascii="Times" w:eastAsia="Times" w:hAnsi="Times" w:cs="Times"/>
+                <w:sz w:val="22"/>
+                <w:szCs w:val="22"/>
+              </w:rPr>
+            </w:pPr>
+          </w:p>
+          <w:p>
+            <w:pPr>
+              <w:rPr>
+                <w:rFonts w:ascii="Times" w:eastAsia="Times" w:hAnsi="Times" w:cs="Times"/>
+                <w:sz w:val="22"/>
+                <w:szCs w:val="22"/>
+              </w:rPr>
+            </w:pPr>
+            <w:r>
+              <w:rPr>
+                <w:rFonts w:ascii="Times" w:eastAsia="Times" w:hAnsi="Times" w:cs="Times"/>
+                <w:sz w:val="22"/>
+                <w:szCs w:val="22"/>
+              </w:rPr>
+              <w:t>For saving space</w:t>
+            </w:r>
+            <w:r>
+              <w:rPr>
+                <w:rFonts w:ascii="Times" w:eastAsia="Times" w:hAnsi="Times" w:cs="Times"/>
+                <w:sz w:val="22"/>
+                <w:szCs w:val="22"/>
+              </w:rPr>
+              <w:t xml:space="preserve">, </w:t>
+            </w:r>
+            <w:r>
+              <w:rPr>
+                <w:rFonts w:ascii="Times" w:eastAsia="Times" w:hAnsi="Times" w:cs="Times"/>
+                <w:sz w:val="22"/>
+                <w:szCs w:val="22"/>
+              </w:rPr>
+              <w:t xml:space="preserve">could </w:t>
+            </w:r>
+            <w:r>
+              <w:rPr>
+                <w:rFonts w:ascii="Times" w:eastAsia="Times" w:hAnsi="Times" w:cs="Times"/>
+                <w:sz w:val="22"/>
+                <w:szCs w:val="22"/>
+              </w:rPr>
+              <w:t xml:space="preserve">C-flat major </w:t>
+            </w:r>
+            <w:r>
+              <w:rPr>
+                <w:rFonts w:ascii="Times" w:eastAsia="Times" w:hAnsi="Times" w:cs="Times"/>
+                <w:sz w:val="22"/>
+                <w:szCs w:val="22"/>
+              </w:rPr>
+              <w:t xml:space="preserve">be used </w:t>
+            </w:r>
+            <w:r>
+              <w:rPr>
+                <w:rFonts w:ascii="Times" w:eastAsia="Times" w:hAnsi="Times" w:cs="Times"/>
+                <w:sz w:val="22"/>
+                <w:szCs w:val="22"/>
+              </w:rPr>
+              <w:t xml:space="preserve">instead for the harp’s key signature? </w:t>
             </w:r>
           </w:p>
         </w:tc>
@@ -1212,7 +1231,7 @@
                 <w:sz w:val="22"/>
                 <w:szCs w:val="22"/>
               </w:rPr>
-              <w:t>Violin II</w:t>
+              <w:t>Viola</w:t>
             </w:r>
           </w:p>
         </w:tc>
@@ -1241,7 +1260,7 @@
                 <w:sz w:val="22"/>
                 <w:szCs w:val="22"/>
               </w:rPr>
-              <w:t>52</w:t>
+              <w:t>43</w:t>
             </w:r>
           </w:p>
         </w:tc>
@@ -1270,7 +1289,24 @@
                 <w:sz w:val="22"/>
                 <w:szCs w:val="22"/>
               </w:rPr>
-              <w:t>Open A string unintentional harmonic mark?</w:t>
+              <w:t>4</w:t>
+            </w:r>
+            <w:r>
+              <w:rPr>
+                <w:rFonts w:ascii="Times" w:eastAsia="Times" w:hAnsi="Times" w:cs="Times"/>
+                <w:sz w:val="22"/>
+                <w:szCs w:val="22"/>
+                <w:vertAlign w:val="superscript"/>
+              </w:rPr>
+              <w:t>th</w:t>
+            </w:r>
+            <w:r>
+              <w:rPr>
+                <w:rFonts w:ascii="Times" w:eastAsia="Times" w:hAnsi="Times" w:cs="Times"/>
+                <w:sz w:val="22"/>
+                <w:szCs w:val="22"/>
+              </w:rPr>
+              <w:t xml:space="preserve"> beat, slur or tied staccato? </w:t>
             </w:r>
           </w:p>
         </w:tc>
@@ -1325,7 +1361,7 @@
                 <w:sz w:val="22"/>
                 <w:szCs w:val="22"/>
               </w:rPr>
-              <w:t>Horns</w:t>
+              <w:t>Violin II</w:t>
             </w:r>
           </w:p>
         </w:tc>
@@ -1354,7 +1390,7 @@
                 <w:sz w:val="22"/>
                 <w:szCs w:val="22"/>
               </w:rPr>
-              <w:t>55</w:t>
+              <w:t>52</w:t>
             </w:r>
           </w:p>
         </w:tc>
@@ -1383,7 +1419,7 @@
                 <w:sz w:val="22"/>
                 <w:szCs w:val="22"/>
               </w:rPr>
-              <w:t xml:space="preserve">Dynamic swell with staccato intentional? </w:t>
+              <w:t>Open A string unintentional harmonic mark?</w:t>
             </w:r>
           </w:p>
         </w:tc>
@@ -1428,19 +1464,17 @@
             <w:pPr>
               <w:rPr>
                 <w:rFonts w:ascii="Times" w:eastAsia="Times" w:hAnsi="Times" w:cs="Times"/>
-                <w:color w:val="E97132"/>
-                <w:sz w:val="22"/>
-                <w:szCs w:val="22"/>
-              </w:rPr>
-            </w:pPr>
-            <w:r>
-              <w:rPr>
-                <w:rFonts w:ascii="Times" w:eastAsia="Times" w:hAnsi="Times" w:cs="Times"/>
-                <w:color w:val="E97132"/>
-                <w:sz w:val="22"/>
-                <w:szCs w:val="22"/>
-              </w:rPr>
-              <w:t>Strings</w:t>
+                <w:sz w:val="22"/>
+                <w:szCs w:val="22"/>
+              </w:rPr>
+            </w:pPr>
+            <w:r>
+              <w:rPr>
+                <w:rFonts w:ascii="Times" w:eastAsia="Times" w:hAnsi="Times" w:cs="Times"/>
+                <w:sz w:val="22"/>
+                <w:szCs w:val="22"/>
+              </w:rPr>
+              <w:t>Horns</w:t>
             </w:r>
           </w:p>
         </w:tc>
@@ -1459,19 +1493,17 @@
             <w:pPr>
               <w:rPr>
                 <w:rFonts w:ascii="Times" w:eastAsia="Times" w:hAnsi="Times" w:cs="Times"/>
-                <w:color w:val="E97132"/>
-                <w:sz w:val="22"/>
-                <w:szCs w:val="22"/>
-              </w:rPr>
-            </w:pPr>
-            <w:r>
-              <w:rPr>
-                <w:rFonts w:ascii="Times" w:eastAsia="Times" w:hAnsi="Times" w:cs="Times"/>
-                <w:color w:val="E97132"/>
-                <w:sz w:val="22"/>
-                <w:szCs w:val="22"/>
-              </w:rPr>
-              <w:t>58-60</w:t>
+                <w:sz w:val="22"/>
+                <w:szCs w:val="22"/>
+              </w:rPr>
+            </w:pPr>
+            <w:r>
+              <w:rPr>
+                <w:rFonts w:ascii="Times" w:eastAsia="Times" w:hAnsi="Times" w:cs="Times"/>
+                <w:sz w:val="22"/>
+                <w:szCs w:val="22"/>
+              </w:rPr>
+              <w:t>55</w:t>
             </w:r>
           </w:p>
         </w:tc>
@@ -1490,46 +1522,17 @@
             <w:pPr>
               <w:rPr>
                 <w:rFonts w:ascii="Times" w:eastAsia="Times" w:hAnsi="Times" w:cs="Times"/>
-                <w:color w:val="E97132"/>
-                <w:sz w:val="22"/>
-                <w:szCs w:val="22"/>
-              </w:rPr>
-            </w:pPr>
-            <w:r>
-              <w:rPr>
-                <w:rFonts w:ascii="Times" w:eastAsia="Times" w:hAnsi="Times" w:cs="Times"/>
-                <w:color w:val="E97132"/>
-                <w:sz w:val="22"/>
-                <w:szCs w:val="22"/>
-              </w:rPr>
-              <w:t>Enharmo</w:t>
-            </w:r>
-            <w:r>
-              <w:rPr>
-                <w:rFonts w:ascii="Times" w:eastAsia="Times" w:hAnsi="Times" w:cs="Times"/>
-                <w:color w:val="E97132"/>
-                <w:sz w:val="22"/>
-                <w:szCs w:val="22"/>
-              </w:rPr>
-              <w:t>nics: turned flats to sharps for voice leading</w:t>
-            </w:r>
-            <w:r>
-              <w:rPr>
-                <w:rFonts w:ascii="Times" w:eastAsia="Times" w:hAnsi="Times" w:cs="Times"/>
-                <w:color w:val="E97132"/>
-                <w:sz w:val="22"/>
-                <w:szCs w:val="22"/>
-              </w:rPr>
-              <w:t xml:space="preserve"> purposes</w:t>
-            </w:r>
-            <w:r>
-              <w:rPr>
-                <w:rFonts w:ascii="Times" w:eastAsia="Times" w:hAnsi="Times" w:cs="Times"/>
-                <w:color w:val="E97132"/>
-                <w:sz w:val="22"/>
-                <w:szCs w:val="22"/>
-              </w:rPr>
-              <w:t>.</w:t>
+                <w:sz w:val="22"/>
+                <w:szCs w:val="22"/>
+              </w:rPr>
+            </w:pPr>
+            <w:r>
+              <w:rPr>
+                <w:rFonts w:ascii="Times" w:eastAsia="Times" w:hAnsi="Times" w:cs="Times"/>
+                <w:sz w:val="22"/>
+                <w:szCs w:val="22"/>
+              </w:rPr>
+              <w:t xml:space="preserve">Dynamic swell with staccato intentional? </w:t>
             </w:r>
           </w:p>
         </w:tc>
@@ -1574,6 +1577,163 @@
             <w:pPr>
               <w:rPr>
                 <w:rFonts w:ascii="Times" w:eastAsia="Times" w:hAnsi="Times" w:cs="Times"/>
+                <w:color w:val="E97132"/>
+                <w:sz w:val="22"/>
+                <w:szCs w:val="22"/>
+              </w:rPr>
+            </w:pPr>
+            <w:r>
+              <w:rPr>
+                <w:rFonts w:ascii="Times" w:eastAsia="Times" w:hAnsi="Times" w:cs="Times"/>
+                <w:color w:val="E97132"/>
+                <w:sz w:val="22"/>
+                <w:szCs w:val="22"/>
+              </w:rPr>
+              <w:t>Strings</w:t>
+            </w:r>
+          </w:p>
+        </w:tc>
+        <w:tc>
+          <w:tcPr>
+            <w:tcW w:w="727" w:type="pct"/>
+            <w:tcBorders>
+              <w:top w:val="single" w:sz="4" w:space="0" w:color="000000"/>
+              <w:left w:val="single" w:sz="4" w:space="0" w:color="000000"/>
+              <w:bottom w:val="single" w:sz="4" w:space="0" w:color="000000"/>
+              <w:right w:val="single" w:sz="4" w:space="0" w:color="000000"/>
+            </w:tcBorders>
+            <w:vAlign w:val="center"/>
+          </w:tcPr>
+          <w:p>
+            <w:pPr>
+              <w:rPr>
+                <w:rFonts w:ascii="Times" w:eastAsia="Times" w:hAnsi="Times" w:cs="Times"/>
+                <w:color w:val="E97132"/>
+                <w:sz w:val="22"/>
+                <w:szCs w:val="22"/>
+              </w:rPr>
+            </w:pPr>
+            <w:r>
+              <w:rPr>
+                <w:rFonts w:ascii="Times" w:eastAsia="Times" w:hAnsi="Times" w:cs="Times"/>
+                <w:color w:val="E97132"/>
+                <w:sz w:val="22"/>
+                <w:szCs w:val="22"/>
+              </w:rPr>
+              <w:t>58-60</w:t>
+            </w:r>
+          </w:p>
+        </w:tc>
+        <w:tc>
+          <w:tcPr>
+            <w:tcW w:w="2493" w:type="pct"/>
+            <w:tcBorders>
+              <w:top w:val="single" w:sz="4" w:space="0" w:color="000000"/>
+              <w:left w:val="single" w:sz="4" w:space="0" w:color="000000"/>
+              <w:bottom w:val="single" w:sz="4" w:space="0" w:color="000000"/>
+              <w:right w:val="single" w:sz="4" w:space="0" w:color="000000"/>
+            </w:tcBorders>
+            <w:vAlign w:val="center"/>
+          </w:tcPr>
+          <w:p>
+            <w:pPr>
+              <w:rPr>
+                <w:rFonts w:ascii="Times" w:eastAsia="Times" w:hAnsi="Times" w:cs="Times"/>
+                <w:color w:val="E97132"/>
+                <w:sz w:val="22"/>
+                <w:szCs w:val="22"/>
+              </w:rPr>
+            </w:pPr>
+            <w:proofErr w:type="spellStart"/>
+            <w:r>
+              <w:rPr>
+                <w:rFonts w:ascii="Times" w:eastAsia="Times" w:hAnsi="Times" w:cs="Times"/>
+                <w:color w:val="E97132"/>
+                <w:sz w:val="22"/>
+                <w:szCs w:val="22"/>
+              </w:rPr>
+              <w:t>Enharmo</w:t>
+            </w:r>
+            <w:r>
+              <w:rPr>
+                <w:rFonts w:ascii="Times" w:eastAsia="Times" w:hAnsi="Times" w:cs="Times"/>
+                <w:color w:val="E97132"/>
+                <w:sz w:val="22"/>
+                <w:szCs w:val="22"/>
+              </w:rPr>
+              <w:t>nics</w:t>
+            </w:r>
+            <w:proofErr w:type="spellEnd"/>
+            <w:r>
+              <w:rPr>
+                <w:rFonts w:ascii="Times" w:eastAsia="Times" w:hAnsi="Times" w:cs="Times"/>
+                <w:color w:val="E97132"/>
+                <w:sz w:val="22"/>
+                <w:szCs w:val="22"/>
+              </w:rPr>
+              <w:t>: turned flats to sharps for voice leading</w:t>
+            </w:r>
+            <w:r>
+              <w:rPr>
+                <w:rFonts w:ascii="Times" w:eastAsia="Times" w:hAnsi="Times" w:cs="Times"/>
+                <w:color w:val="E97132"/>
+                <w:sz w:val="22"/>
+                <w:szCs w:val="22"/>
+              </w:rPr>
+              <w:t xml:space="preserve"> purposes</w:t>
+            </w:r>
+            <w:r>
+              <w:rPr>
+                <w:rFonts w:ascii="Times" w:eastAsia="Times" w:hAnsi="Times" w:cs="Times"/>
+                <w:color w:val="E97132"/>
+                <w:sz w:val="22"/>
+                <w:szCs w:val="22"/>
+              </w:rPr>
+              <w:t>.</w:t>
+            </w:r>
+          </w:p>
+        </w:tc>
+        <w:tc>
+          <w:tcPr>
+            <w:tcW w:w="1024" w:type="pct"/>
+            <w:tcBorders>
+              <w:top w:val="single" w:sz="4" w:space="0" w:color="000000"/>
+              <w:left w:val="single" w:sz="4" w:space="0" w:color="000000"/>
+              <w:bottom w:val="single" w:sz="4" w:space="0" w:color="000000"/>
+              <w:right w:val="single" w:sz="4" w:space="0" w:color="000000"/>
+            </w:tcBorders>
+            <w:vAlign w:val="center"/>
+          </w:tcPr>
+          <w:p>
+            <w:pPr>
+              <w:rPr>
+                <w:rFonts w:ascii="Times" w:eastAsia="Times" w:hAnsi="Times" w:cs="Times"/>
+                <w:sz w:val="22"/>
+                <w:szCs w:val="22"/>
+              </w:rPr>
+            </w:pPr>
+          </w:p>
+        </w:tc>
+      </w:tr>
+      <w:tr>
+        <w:trPr>
+          <w:trHeight w:val="350"/>
+        </w:trPr>
+        <w:tc>
+          <w:tcPr>
+            <w:tcW w:w="756" w:type="pct"/>
+            <w:tcBorders>
+              <w:top w:val="single" w:sz="4" w:space="0" w:color="000000"/>
+              <w:left w:val="single" w:sz="4" w:space="0" w:color="000000"/>
+              <w:bottom w:val="single" w:sz="4" w:space="0" w:color="000000"/>
+              <w:right w:val="single" w:sz="4" w:space="0" w:color="000000"/>
+            </w:tcBorders>
+            <w:vAlign w:val="center"/>
+          </w:tcPr>
+          <w:p>
+            <w:pPr>
+              <w:rPr>
+                <w:rFonts w:ascii="Times" w:eastAsia="Times" w:hAnsi="Times" w:cs="Times"/>
                 <w:sz w:val="22"/>
                 <w:szCs w:val="22"/>
               </w:rPr>
@@ -1644,6 +1804,7 @@
               </w:rPr>
               <w:t xml:space="preserve">Staccatissimo on long held notes? Recommend using </w:t>
             </w:r>
+            <w:proofErr w:type="spellStart"/>
             <w:r>
               <w:rPr>
                 <w:rFonts w:ascii="Times" w:eastAsia="Times" w:hAnsi="Times" w:cs="Times"/>
@@ -1656,6 +1817,7 @@
               </w:rPr>
               <w:t>sfz</w:t>
             </w:r>
+            <w:proofErr w:type="spellEnd"/>
             <w:r>
               <w:rPr>
                 <w:rFonts w:ascii="Times" w:eastAsia="Times" w:hAnsi="Times" w:cs="Times"/>
@@ -2093,7 +2255,6 @@
                 <w:sz w:val="22"/>
                 <w:szCs w:val="22"/>
               </w:rPr>
-              <w:lastRenderedPageBreak/>
               <w:t>Double bass</w:t>
             </w:r>
           </w:p>
@@ -2364,6 +2525,7 @@
                 <w:szCs w:val="22"/>
               </w:rPr>
             </w:pPr>
+            <w:proofErr w:type="spellStart"/>
             <w:r>
               <w:rPr>
                 <w:rFonts w:ascii="Times" w:eastAsia="Times" w:hAnsi="Times" w:cs="Times"/>
@@ -2372,6 +2534,7 @@
               </w:rPr>
               <w:t>Cbsn</w:t>
             </w:r>
+            <w:proofErr w:type="spellEnd"/>
           </w:p>
         </w:tc>
         <w:tc>
@@ -3535,6 +3698,7 @@
                 <w:szCs w:val="22"/>
               </w:rPr>
             </w:pPr>
+            <w:proofErr w:type="spellStart"/>
             <w:r>
               <w:rPr>
                 <w:rFonts w:ascii="Times" w:eastAsia="Times" w:hAnsi="Times" w:cs="Times"/>
@@ -3542,7 +3706,37 @@
                 <w:sz w:val="22"/>
                 <w:szCs w:val="22"/>
               </w:rPr>
-              <w:t xml:space="preserve">Tuplet within tuplet. </w:t>
+              <w:t>Tuplet</w:t>
+            </w:r>
+            <w:proofErr w:type="spellEnd"/>
+            <w:r>
+              <w:rPr>
+                <w:rFonts w:ascii="Times" w:eastAsia="Times" w:hAnsi="Times" w:cs="Times"/>
+                <w:color w:val="E97132"/>
+                <w:sz w:val="22"/>
+                <w:szCs w:val="22"/>
+              </w:rPr>
+              <w:t xml:space="preserve"> within </w:t>
+            </w:r>
+            <w:proofErr w:type="spellStart"/>
+            <w:r>
+              <w:rPr>
+                <w:rFonts w:ascii="Times" w:eastAsia="Times" w:hAnsi="Times" w:cs="Times"/>
+                <w:color w:val="E97132"/>
+                <w:sz w:val="22"/>
+                <w:szCs w:val="22"/>
+              </w:rPr>
+              <w:t>tuplet</w:t>
+            </w:r>
+            <w:proofErr w:type="spellEnd"/>
+            <w:r>
+              <w:rPr>
+                <w:rFonts w:ascii="Times" w:eastAsia="Times" w:hAnsi="Times" w:cs="Times"/>
+                <w:color w:val="E97132"/>
+                <w:sz w:val="22"/>
+                <w:szCs w:val="22"/>
+              </w:rPr>
+              <w:t xml:space="preserve">. </w:t>
             </w:r>
           </w:p>
         </w:tc>
@@ -3785,6 +3979,119 @@
                 <w:szCs w:val="22"/>
               </w:rPr>
               <w:t>Is this a suspended cymbal or crash cymbal?</w:t>
+            </w:r>
+          </w:p>
+        </w:tc>
+        <w:tc>
+          <w:tcPr>
+            <w:tcW w:w="1024" w:type="pct"/>
+            <w:tcBorders>
+              <w:top w:val="single" w:sz="4" w:space="0" w:color="000000"/>
+              <w:left w:val="single" w:sz="4" w:space="0" w:color="000000"/>
+              <w:bottom w:val="single" w:sz="4" w:space="0" w:color="000000"/>
+              <w:right w:val="single" w:sz="4" w:space="0" w:color="000000"/>
+            </w:tcBorders>
+            <w:vAlign w:val="center"/>
+          </w:tcPr>
+          <w:p>
+            <w:pPr>
+              <w:rPr>
+                <w:rFonts w:ascii="Times" w:eastAsia="Times" w:hAnsi="Times" w:cs="Times"/>
+                <w:sz w:val="22"/>
+                <w:szCs w:val="22"/>
+              </w:rPr>
+            </w:pPr>
+          </w:p>
+        </w:tc>
+      </w:tr>
+      <w:tr>
+        <w:trPr>
+          <w:trHeight w:val="350"/>
+        </w:trPr>
+        <w:tc>
+          <w:tcPr>
+            <w:tcW w:w="756" w:type="pct"/>
+            <w:tcBorders>
+              <w:top w:val="single" w:sz="4" w:space="0" w:color="000000"/>
+              <w:left w:val="single" w:sz="4" w:space="0" w:color="000000"/>
+              <w:bottom w:val="single" w:sz="4" w:space="0" w:color="000000"/>
+              <w:right w:val="single" w:sz="4" w:space="0" w:color="000000"/>
+            </w:tcBorders>
+            <w:vAlign w:val="center"/>
+          </w:tcPr>
+          <w:p>
+            <w:pPr>
+              <w:rPr>
+                <w:rFonts w:ascii="Times" w:eastAsia="Times" w:hAnsi="Times" w:cs="Times"/>
+                <w:sz w:val="22"/>
+                <w:szCs w:val="22"/>
+              </w:rPr>
+            </w:pPr>
+            <w:r>
+              <w:rPr>
+                <w:rFonts w:ascii="Times" w:eastAsia="Times" w:hAnsi="Times" w:cs="Times"/>
+                <w:sz w:val="22"/>
+                <w:szCs w:val="22"/>
+              </w:rPr>
+              <w:t>Trumpets</w:t>
+            </w:r>
+          </w:p>
+        </w:tc>
+        <w:tc>
+          <w:tcPr>
+            <w:tcW w:w="727" w:type="pct"/>
+            <w:tcBorders>
+              <w:top w:val="single" w:sz="4" w:space="0" w:color="000000"/>
+              <w:left w:val="single" w:sz="4" w:space="0" w:color="000000"/>
+              <w:bottom w:val="single" w:sz="4" w:space="0" w:color="000000"/>
+              <w:right w:val="single" w:sz="4" w:space="0" w:color="000000"/>
+            </w:tcBorders>
+            <w:vAlign w:val="center"/>
+          </w:tcPr>
+          <w:p>
+            <w:pPr>
+              <w:rPr>
+                <w:rFonts w:ascii="Times" w:eastAsia="Times" w:hAnsi="Times" w:cs="Times"/>
+                <w:sz w:val="22"/>
+                <w:szCs w:val="22"/>
+              </w:rPr>
+            </w:pPr>
+            <w:r>
+              <w:rPr>
+                <w:rFonts w:ascii="Times" w:eastAsia="Times" w:hAnsi="Times" w:cs="Times"/>
+                <w:sz w:val="22"/>
+                <w:szCs w:val="22"/>
+              </w:rPr>
+              <w:t>229-230</w:t>
+            </w:r>
+          </w:p>
+        </w:tc>
+        <w:tc>
+          <w:tcPr>
+            <w:tcW w:w="2493" w:type="pct"/>
+            <w:tcBorders>
+              <w:top w:val="single" w:sz="4" w:space="0" w:color="000000"/>
+              <w:left w:val="single" w:sz="4" w:space="0" w:color="000000"/>
+              <w:bottom w:val="single" w:sz="4" w:space="0" w:color="000000"/>
+              <w:right w:val="single" w:sz="4" w:space="0" w:color="000000"/>
+            </w:tcBorders>
+            <w:vAlign w:val="center"/>
+          </w:tcPr>
+          <w:p>
+            <w:pPr>
+              <w:rPr>
+                <w:rFonts w:ascii="Times" w:eastAsia="Times" w:hAnsi="Times" w:cs="Times"/>
+                <w:sz w:val="22"/>
+                <w:szCs w:val="22"/>
+              </w:rPr>
+            </w:pPr>
+            <w:r>
+              <w:rPr>
+                <w:rFonts w:ascii="Times" w:eastAsia="Times" w:hAnsi="Times" w:cs="Times"/>
+                <w:sz w:val="22"/>
+                <w:szCs w:val="22"/>
+              </w:rPr>
+              <w:t xml:space="preserve">Should trumpets 2 and 3 swap to save space? </w:t>
             </w:r>
           </w:p>
         </w:tc>
@@ -3828,13 +4135,38 @@
       </w:r>
     </w:p>
     <w:p>
+      <w:proofErr w:type="spellStart"/>
       <w:r>
         <w:rPr>
           <w:b/>
           <w:bCs/>
         </w:rPr>
         <w:lastRenderedPageBreak/>
-        <w:t>Prevous Errata (version 0 - solo vn only)</w:t>
+        <w:t>Prevous</w:t>
+      </w:r>
+      <w:proofErr w:type="spellEnd"/>
+      <w:r>
+        <w:rPr>
+          <w:b/>
+          <w:bCs/>
+        </w:rPr>
+        <w:t xml:space="preserve"> Errata (version 0 - solo </w:t>
+      </w:r>
+      <w:proofErr w:type="spellStart"/>
+      <w:r>
+        <w:rPr>
+          <w:b/>
+          <w:bCs/>
+        </w:rPr>
+        <w:t>vn</w:t>
+      </w:r>
+      <w:proofErr w:type="spellEnd"/>
+      <w:r>
+        <w:rPr>
+          <w:b/>
+          <w:bCs/>
+        </w:rPr>
+        <w:t xml:space="preserve"> only)</w:t>
       </w:r>
     </w:p>
     <w:tbl>
@@ -3882,8 +4214,16 @@
               <w:rPr>
                 <w:rFonts w:ascii="Times" w:eastAsia="Times" w:hAnsi="Times" w:cs="Times"/>
               </w:rPr>
-              <w:t>Solo Vn</w:t>
-            </w:r>
+              <w:t xml:space="preserve">Solo </w:t>
+            </w:r>
+            <w:proofErr w:type="spellStart"/>
+            <w:r>
+              <w:rPr>
+                <w:rFonts w:ascii="Times" w:eastAsia="Times" w:hAnsi="Times" w:cs="Times"/>
+              </w:rPr>
+              <w:t>Vn</w:t>
+            </w:r>
+            <w:proofErr w:type="spellEnd"/>
           </w:p>
         </w:tc>
         <w:tc>
@@ -3932,7 +4272,21 @@
               <w:rPr>
                 <w:rFonts w:ascii="Times" w:eastAsia="Times" w:hAnsi="Times" w:cs="Times"/>
               </w:rPr>
-              <w:t xml:space="preserve">s are redundant given the tenuto symbols. However, if it is a preference or the intention is for a more pronounced tenuto, let me know. If no preference, we could potentially remove them, except at key moments, and just ensure a tenuto symbol is present. </w:t>
+              <w:t xml:space="preserve">s are redundant given the tenuto symbols. However, if it is a preference or the intention is for a more pronounced tenuto, let me know. If </w:t>
+            </w:r>
+            <w:proofErr w:type="gramStart"/>
+            <w:r>
+              <w:rPr>
+                <w:rFonts w:ascii="Times" w:eastAsia="Times" w:hAnsi="Times" w:cs="Times"/>
+              </w:rPr>
+              <w:t>no</w:t>
+            </w:r>
+            <w:proofErr w:type="gramEnd"/>
+            <w:r>
+              <w:rPr>
+                <w:rFonts w:ascii="Times" w:eastAsia="Times" w:hAnsi="Times" w:cs="Times"/>
+              </w:rPr>
+              <w:t xml:space="preserve"> preference, we could potentially remove them, except at key moments, and just ensure a tenuto symbol is present. </w:t>
             </w:r>
           </w:p>
         </w:tc>
@@ -4024,7 +4378,21 @@
               <w:rPr>
                 <w:rFonts w:ascii="Times" w:eastAsia="Times" w:hAnsi="Times" w:cs="Times"/>
               </w:rPr>
-              <w:t>Technically does the sul G continue from m. 19 till the F in m. 27? Will format accordingly</w:t>
+              <w:t xml:space="preserve">Technically does the sul G continue from m. 19 till the F </w:t>
+            </w:r>
+            <w:proofErr w:type="gramStart"/>
+            <w:r>
+              <w:rPr>
+                <w:rFonts w:ascii="Times" w:eastAsia="Times" w:hAnsi="Times" w:cs="Times"/>
+              </w:rPr>
+              <w:t>in</w:t>
+            </w:r>
+            <w:proofErr w:type="gramEnd"/>
+            <w:r>
+              <w:rPr>
+                <w:rFonts w:ascii="Times" w:eastAsia="Times" w:hAnsi="Times" w:cs="Times"/>
+              </w:rPr>
+              <w:t xml:space="preserve"> m. 27? Will format accordingly</w:t>
             </w:r>
           </w:p>
         </w:tc>
@@ -4142,7 +4510,21 @@
               <w:rPr>
                 <w:rFonts w:ascii="Times" w:eastAsia="Times" w:hAnsi="Times" w:cs="Times"/>
               </w:rPr>
-              <w:t xml:space="preserve">. Should it dim. to a different dynamic, with a sub. </w:t>
+              <w:t xml:space="preserve">. Should it </w:t>
+            </w:r>
+            <w:proofErr w:type="gramStart"/>
+            <w:r>
+              <w:rPr>
+                <w:rFonts w:ascii="Times" w:eastAsia="Times" w:hAnsi="Times" w:cs="Times"/>
+              </w:rPr>
+              <w:t>dim.</w:t>
+            </w:r>
+            <w:proofErr w:type="gramEnd"/>
+            <w:r>
+              <w:rPr>
+                <w:rFonts w:ascii="Times" w:eastAsia="Times" w:hAnsi="Times" w:cs="Times"/>
+              </w:rPr>
+              <w:t xml:space="preserve"> to a different dynamic, with a sub. </w:t>
             </w:r>
             <w:r>
               <w:rPr>
@@ -4330,7 +4712,21 @@
               <w:rPr>
                 <w:rFonts w:ascii="Times" w:eastAsia="Times" w:hAnsi="Times" w:cs="Times"/>
               </w:rPr>
-              <w:t>Does meno mosso start at beat 1 of this bar or another beat?</w:t>
+              <w:t xml:space="preserve">Does </w:t>
+            </w:r>
+            <w:proofErr w:type="spellStart"/>
+            <w:r>
+              <w:rPr>
+                <w:rFonts w:ascii="Times" w:eastAsia="Times" w:hAnsi="Times" w:cs="Times"/>
+              </w:rPr>
+              <w:t>meno</w:t>
+            </w:r>
+            <w:proofErr w:type="spellEnd"/>
+            <w:r>
+              <w:rPr>
+                <w:rFonts w:ascii="Times" w:eastAsia="Times" w:hAnsi="Times" w:cs="Times"/>
+              </w:rPr>
+              <w:t xml:space="preserve"> mosso start at beat 1 of this bar or another beat?</w:t>
             </w:r>
           </w:p>
         </w:tc>

</xml_diff>

<commit_message>
v16 - Minor edits to score
</commit_message>
<xml_diff>
--- a/Proof Reading and Review/TCB Mvt for Vn and Orch - Errata_v1.docx
+++ b/Proof Reading and Review/TCB Mvt for Vn and Orch - Errata_v1.docx
@@ -1194,7 +1194,15 @@
                 <w:sz w:val="22"/>
                 <w:szCs w:val="22"/>
               </w:rPr>
-              <w:t>Violin I</w:t>
+              <w:t>Vio</w:t>
+            </w:r>
+            <w:r>
+              <w:rPr>
+                <w:rFonts w:ascii="Times" w:eastAsia="Times" w:hAnsi="Times" w:cs="Times"/>
+                <w:sz w:val="22"/>
+                <w:szCs w:val="22"/>
+              </w:rPr>
+              <w:t>la</w:t>
             </w:r>
           </w:p>
         </w:tc>
@@ -1223,7 +1231,7 @@
                 <w:sz w:val="22"/>
                 <w:szCs w:val="22"/>
               </w:rPr>
-              <w:t>32</w:t>
+              <w:t>15</w:t>
             </w:r>
           </w:p>
         </w:tc>
@@ -1252,7 +1260,7 @@
                 <w:sz w:val="22"/>
                 <w:szCs w:val="22"/>
               </w:rPr>
-              <w:t xml:space="preserve">Beat 1, possible missing decrescendo? </w:t>
+              <w:t>Are the dynamics intended more like how we have written it?</w:t>
             </w:r>
           </w:p>
         </w:tc>
@@ -1307,7 +1315,7 @@
                 <w:sz w:val="22"/>
                 <w:szCs w:val="22"/>
               </w:rPr>
-              <w:t>Strings</w:t>
+              <w:t>Viola</w:t>
             </w:r>
           </w:p>
         </w:tc>
@@ -1336,7 +1344,7 @@
                 <w:sz w:val="22"/>
                 <w:szCs w:val="22"/>
               </w:rPr>
-              <w:t>34-35</w:t>
+              <w:t>28</w:t>
             </w:r>
           </w:p>
         </w:tc>
@@ -1365,7 +1373,7 @@
                 <w:sz w:val="22"/>
                 <w:szCs w:val="22"/>
               </w:rPr>
-              <w:t xml:space="preserve">Should the staccatos be removed from these held notes? </w:t>
+              <w:t>Do you want non div for the entire bar as we have written?</w:t>
             </w:r>
           </w:p>
         </w:tc>
@@ -1420,7 +1428,7 @@
                 <w:sz w:val="22"/>
                 <w:szCs w:val="22"/>
               </w:rPr>
-              <w:t>Harp 1</w:t>
+              <w:t>Viola</w:t>
             </w:r>
           </w:p>
         </w:tc>
@@ -1449,7 +1457,7 @@
                 <w:sz w:val="22"/>
                 <w:szCs w:val="22"/>
               </w:rPr>
-              <w:t>40-43</w:t>
+              <w:t>30</w:t>
             </w:r>
           </w:p>
         </w:tc>
@@ -1478,23 +1486,7 @@
                 <w:sz w:val="22"/>
                 <w:szCs w:val="22"/>
               </w:rPr>
-              <w:t xml:space="preserve">Some harp chords don’t have arpeggiation in them. </w:t>
-            </w:r>
-            <w:r>
-              <w:rPr>
-                <w:rFonts w:ascii="Times" w:eastAsia="Times" w:hAnsi="Times" w:cs="Times"/>
-                <w:sz w:val="22"/>
-                <w:szCs w:val="22"/>
-              </w:rPr>
-              <w:t>Is this</w:t>
-            </w:r>
-            <w:r>
-              <w:rPr>
-                <w:rFonts w:ascii="Times" w:eastAsia="Times" w:hAnsi="Times" w:cs="Times"/>
-                <w:sz w:val="22"/>
-                <w:szCs w:val="22"/>
-              </w:rPr>
-              <w:t xml:space="preserve"> intentional? </w:t>
+              <w:t>Should there be a dim. before this?</w:t>
             </w:r>
           </w:p>
         </w:tc>
@@ -1549,7 +1541,7 @@
                 <w:sz w:val="22"/>
                 <w:szCs w:val="22"/>
               </w:rPr>
-              <w:t>Viola</w:t>
+              <w:t>Violin I</w:t>
             </w:r>
           </w:p>
         </w:tc>
@@ -1578,7 +1570,7 @@
                 <w:sz w:val="22"/>
                 <w:szCs w:val="22"/>
               </w:rPr>
-              <w:t>43</w:t>
+              <w:t>32</w:t>
             </w:r>
           </w:p>
         </w:tc>
@@ -1607,24 +1599,7 @@
                 <w:sz w:val="22"/>
                 <w:szCs w:val="22"/>
               </w:rPr>
-              <w:t>4</w:t>
-            </w:r>
-            <w:r>
-              <w:rPr>
-                <w:rFonts w:ascii="Times" w:eastAsia="Times" w:hAnsi="Times" w:cs="Times"/>
-                <w:sz w:val="22"/>
-                <w:szCs w:val="22"/>
-                <w:vertAlign w:val="superscript"/>
-              </w:rPr>
-              <w:t>th</w:t>
-            </w:r>
-            <w:r>
-              <w:rPr>
-                <w:rFonts w:ascii="Times" w:eastAsia="Times" w:hAnsi="Times" w:cs="Times"/>
-                <w:sz w:val="22"/>
-                <w:szCs w:val="22"/>
-              </w:rPr>
-              <w:t xml:space="preserve"> beat, slur or tied staccato? </w:t>
+              <w:t xml:space="preserve">Beat 1, possible missing decrescendo? </w:t>
             </w:r>
           </w:p>
         </w:tc>
@@ -1679,7 +1654,51 @@
                 <w:sz w:val="22"/>
                 <w:szCs w:val="22"/>
               </w:rPr>
-              <w:t>Bassoon</w:t>
+              <w:t xml:space="preserve">Violin </w:t>
+            </w:r>
+            <w:r>
+              <w:rPr>
+                <w:rFonts w:ascii="Times" w:eastAsia="Times" w:hAnsi="Times" w:cs="Times"/>
+                <w:sz w:val="22"/>
+                <w:szCs w:val="22"/>
+              </w:rPr>
+              <w:t xml:space="preserve">II, </w:t>
+            </w:r>
+            <w:proofErr w:type="spellStart"/>
+            <w:r>
+              <w:rPr>
+                <w:rFonts w:ascii="Times" w:eastAsia="Times" w:hAnsi="Times" w:cs="Times"/>
+                <w:sz w:val="22"/>
+                <w:szCs w:val="22"/>
+              </w:rPr>
+              <w:t>Vla</w:t>
+            </w:r>
+            <w:proofErr w:type="spellEnd"/>
+            <w:r>
+              <w:rPr>
+                <w:rFonts w:ascii="Times" w:eastAsia="Times" w:hAnsi="Times" w:cs="Times"/>
+                <w:sz w:val="22"/>
+                <w:szCs w:val="22"/>
+              </w:rPr>
+              <w:t xml:space="preserve">, </w:t>
+            </w:r>
+            <w:proofErr w:type="spellStart"/>
+            <w:r>
+              <w:rPr>
+                <w:rFonts w:ascii="Times" w:eastAsia="Times" w:hAnsi="Times" w:cs="Times"/>
+                <w:sz w:val="22"/>
+                <w:szCs w:val="22"/>
+              </w:rPr>
+              <w:t>Vc</w:t>
+            </w:r>
+            <w:proofErr w:type="spellEnd"/>
+            <w:r>
+              <w:rPr>
+                <w:rFonts w:ascii="Times" w:eastAsia="Times" w:hAnsi="Times" w:cs="Times"/>
+                <w:sz w:val="22"/>
+                <w:szCs w:val="22"/>
+              </w:rPr>
+              <w:t>.</w:t>
             </w:r>
           </w:p>
         </w:tc>
@@ -1708,7 +1727,7 @@
                 <w:sz w:val="22"/>
                 <w:szCs w:val="22"/>
               </w:rPr>
-              <w:t>50</w:t>
+              <w:t>33</w:t>
             </w:r>
           </w:p>
         </w:tc>
@@ -1737,25 +1756,7 @@
                 <w:sz w:val="22"/>
                 <w:szCs w:val="22"/>
               </w:rPr>
-              <w:t xml:space="preserve">Should there be a </w:t>
-            </w:r>
-            <w:r>
-              <w:rPr>
-                <w:rFonts w:ascii="Times" w:eastAsia="Times" w:hAnsi="Times" w:cs="Times"/>
-                <w:i/>
-                <w:iCs/>
-                <w:sz w:val="22"/>
-                <w:szCs w:val="22"/>
-              </w:rPr>
-              <w:t>p</w:t>
-            </w:r>
-            <w:r>
-              <w:rPr>
-                <w:rFonts w:ascii="Times" w:eastAsia="Times" w:hAnsi="Times" w:cs="Times"/>
-                <w:sz w:val="22"/>
-                <w:szCs w:val="22"/>
-              </w:rPr>
-              <w:t xml:space="preserve"> in the clarinets? </w:t>
+              <w:t>Staccato on a whole note. Understand the intention but this will cause confusion.</w:t>
             </w:r>
           </w:p>
         </w:tc>
@@ -1810,7 +1811,7 @@
                 <w:sz w:val="22"/>
                 <w:szCs w:val="22"/>
               </w:rPr>
-              <w:t>Horns</w:t>
+              <w:t>Strings</w:t>
             </w:r>
           </w:p>
         </w:tc>
@@ -1839,7 +1840,7 @@
                 <w:sz w:val="22"/>
                 <w:szCs w:val="22"/>
               </w:rPr>
-              <w:t>55</w:t>
+              <w:t>34-35</w:t>
             </w:r>
           </w:p>
         </w:tc>
@@ -1868,15 +1869,7 @@
                 <w:sz w:val="22"/>
                 <w:szCs w:val="22"/>
               </w:rPr>
-              <w:t xml:space="preserve">Should the staccato be removed here? </w:t>
-            </w:r>
-            <w:r>
-              <w:rPr>
-                <w:rFonts w:ascii="Times" w:eastAsia="Times" w:hAnsi="Times" w:cs="Times"/>
-                <w:sz w:val="22"/>
-                <w:szCs w:val="22"/>
-              </w:rPr>
-              <w:t xml:space="preserve"> </w:t>
+              <w:t xml:space="preserve">Should the staccatos be removed from these held notes? </w:t>
             </w:r>
           </w:p>
         </w:tc>
@@ -1921,6 +1914,517 @@
             <w:pPr>
               <w:rPr>
                 <w:rFonts w:ascii="Times" w:eastAsia="Times" w:hAnsi="Times" w:cs="Times"/>
+                <w:sz w:val="22"/>
+                <w:szCs w:val="22"/>
+              </w:rPr>
+            </w:pPr>
+            <w:r>
+              <w:rPr>
+                <w:rFonts w:ascii="Times" w:eastAsia="Times" w:hAnsi="Times" w:cs="Times"/>
+                <w:sz w:val="22"/>
+                <w:szCs w:val="22"/>
+              </w:rPr>
+              <w:t>Harp 1</w:t>
+            </w:r>
+          </w:p>
+        </w:tc>
+        <w:tc>
+          <w:tcPr>
+            <w:tcW w:w="727" w:type="pct"/>
+            <w:tcBorders>
+              <w:top w:val="single" w:sz="4" w:space="0" w:color="000000"/>
+              <w:left w:val="single" w:sz="4" w:space="0" w:color="000000"/>
+              <w:bottom w:val="single" w:sz="4" w:space="0" w:color="000000"/>
+              <w:right w:val="single" w:sz="4" w:space="0" w:color="000000"/>
+            </w:tcBorders>
+            <w:vAlign w:val="center"/>
+          </w:tcPr>
+          <w:p>
+            <w:pPr>
+              <w:rPr>
+                <w:rFonts w:ascii="Times" w:eastAsia="Times" w:hAnsi="Times" w:cs="Times"/>
+                <w:sz w:val="22"/>
+                <w:szCs w:val="22"/>
+              </w:rPr>
+            </w:pPr>
+            <w:r>
+              <w:rPr>
+                <w:rFonts w:ascii="Times" w:eastAsia="Times" w:hAnsi="Times" w:cs="Times"/>
+                <w:sz w:val="22"/>
+                <w:szCs w:val="22"/>
+              </w:rPr>
+              <w:t>40-43</w:t>
+            </w:r>
+          </w:p>
+        </w:tc>
+        <w:tc>
+          <w:tcPr>
+            <w:tcW w:w="2493" w:type="pct"/>
+            <w:tcBorders>
+              <w:top w:val="single" w:sz="4" w:space="0" w:color="000000"/>
+              <w:left w:val="single" w:sz="4" w:space="0" w:color="000000"/>
+              <w:bottom w:val="single" w:sz="4" w:space="0" w:color="000000"/>
+              <w:right w:val="single" w:sz="4" w:space="0" w:color="000000"/>
+            </w:tcBorders>
+            <w:vAlign w:val="center"/>
+          </w:tcPr>
+          <w:p>
+            <w:pPr>
+              <w:rPr>
+                <w:rFonts w:ascii="Times" w:eastAsia="Times" w:hAnsi="Times" w:cs="Times"/>
+                <w:sz w:val="22"/>
+                <w:szCs w:val="22"/>
+              </w:rPr>
+            </w:pPr>
+            <w:r>
+              <w:rPr>
+                <w:rFonts w:ascii="Times" w:eastAsia="Times" w:hAnsi="Times" w:cs="Times"/>
+                <w:sz w:val="22"/>
+                <w:szCs w:val="22"/>
+              </w:rPr>
+              <w:t xml:space="preserve">Some harp chords don’t have arpeggiation in them. </w:t>
+            </w:r>
+            <w:r>
+              <w:rPr>
+                <w:rFonts w:ascii="Times" w:eastAsia="Times" w:hAnsi="Times" w:cs="Times"/>
+                <w:sz w:val="22"/>
+                <w:szCs w:val="22"/>
+              </w:rPr>
+              <w:t>Is this</w:t>
+            </w:r>
+            <w:r>
+              <w:rPr>
+                <w:rFonts w:ascii="Times" w:eastAsia="Times" w:hAnsi="Times" w:cs="Times"/>
+                <w:sz w:val="22"/>
+                <w:szCs w:val="22"/>
+              </w:rPr>
+              <w:t xml:space="preserve"> intentional? </w:t>
+            </w:r>
+          </w:p>
+        </w:tc>
+        <w:tc>
+          <w:tcPr>
+            <w:tcW w:w="1024" w:type="pct"/>
+            <w:tcBorders>
+              <w:top w:val="single" w:sz="4" w:space="0" w:color="000000"/>
+              <w:left w:val="single" w:sz="4" w:space="0" w:color="000000"/>
+              <w:bottom w:val="single" w:sz="4" w:space="0" w:color="000000"/>
+              <w:right w:val="single" w:sz="4" w:space="0" w:color="000000"/>
+            </w:tcBorders>
+            <w:vAlign w:val="center"/>
+          </w:tcPr>
+          <w:p>
+            <w:pPr>
+              <w:rPr>
+                <w:rFonts w:ascii="Times" w:eastAsia="Times" w:hAnsi="Times" w:cs="Times"/>
+                <w:sz w:val="22"/>
+                <w:szCs w:val="22"/>
+              </w:rPr>
+            </w:pPr>
+          </w:p>
+        </w:tc>
+      </w:tr>
+      <w:tr>
+        <w:trPr>
+          <w:trHeight w:val="350"/>
+        </w:trPr>
+        <w:tc>
+          <w:tcPr>
+            <w:tcW w:w="756" w:type="pct"/>
+            <w:tcBorders>
+              <w:top w:val="single" w:sz="4" w:space="0" w:color="000000"/>
+              <w:left w:val="single" w:sz="4" w:space="0" w:color="000000"/>
+              <w:bottom w:val="single" w:sz="4" w:space="0" w:color="000000"/>
+              <w:right w:val="single" w:sz="4" w:space="0" w:color="000000"/>
+            </w:tcBorders>
+            <w:vAlign w:val="center"/>
+          </w:tcPr>
+          <w:p>
+            <w:pPr>
+              <w:rPr>
+                <w:rFonts w:ascii="Times" w:eastAsia="Times" w:hAnsi="Times" w:cs="Times"/>
+                <w:sz w:val="22"/>
+                <w:szCs w:val="22"/>
+              </w:rPr>
+            </w:pPr>
+            <w:r>
+              <w:rPr>
+                <w:rFonts w:ascii="Times" w:eastAsia="Times" w:hAnsi="Times" w:cs="Times"/>
+                <w:sz w:val="22"/>
+                <w:szCs w:val="22"/>
+              </w:rPr>
+              <w:t>Viola</w:t>
+            </w:r>
+          </w:p>
+        </w:tc>
+        <w:tc>
+          <w:tcPr>
+            <w:tcW w:w="727" w:type="pct"/>
+            <w:tcBorders>
+              <w:top w:val="single" w:sz="4" w:space="0" w:color="000000"/>
+              <w:left w:val="single" w:sz="4" w:space="0" w:color="000000"/>
+              <w:bottom w:val="single" w:sz="4" w:space="0" w:color="000000"/>
+              <w:right w:val="single" w:sz="4" w:space="0" w:color="000000"/>
+            </w:tcBorders>
+            <w:vAlign w:val="center"/>
+          </w:tcPr>
+          <w:p>
+            <w:pPr>
+              <w:rPr>
+                <w:rFonts w:ascii="Times" w:eastAsia="Times" w:hAnsi="Times" w:cs="Times"/>
+                <w:sz w:val="22"/>
+                <w:szCs w:val="22"/>
+              </w:rPr>
+            </w:pPr>
+            <w:r>
+              <w:rPr>
+                <w:rFonts w:ascii="Times" w:eastAsia="Times" w:hAnsi="Times" w:cs="Times"/>
+                <w:sz w:val="22"/>
+                <w:szCs w:val="22"/>
+              </w:rPr>
+              <w:t>43</w:t>
+            </w:r>
+          </w:p>
+        </w:tc>
+        <w:tc>
+          <w:tcPr>
+            <w:tcW w:w="2493" w:type="pct"/>
+            <w:tcBorders>
+              <w:top w:val="single" w:sz="4" w:space="0" w:color="000000"/>
+              <w:left w:val="single" w:sz="4" w:space="0" w:color="000000"/>
+              <w:bottom w:val="single" w:sz="4" w:space="0" w:color="000000"/>
+              <w:right w:val="single" w:sz="4" w:space="0" w:color="000000"/>
+            </w:tcBorders>
+            <w:vAlign w:val="center"/>
+          </w:tcPr>
+          <w:p>
+            <w:pPr>
+              <w:rPr>
+                <w:rFonts w:ascii="Times" w:eastAsia="Times" w:hAnsi="Times" w:cs="Times"/>
+                <w:sz w:val="22"/>
+                <w:szCs w:val="22"/>
+              </w:rPr>
+            </w:pPr>
+            <w:r>
+              <w:rPr>
+                <w:rFonts w:ascii="Times" w:eastAsia="Times" w:hAnsi="Times" w:cs="Times"/>
+                <w:sz w:val="22"/>
+                <w:szCs w:val="22"/>
+              </w:rPr>
+              <w:t>4</w:t>
+            </w:r>
+            <w:r>
+              <w:rPr>
+                <w:rFonts w:ascii="Times" w:eastAsia="Times" w:hAnsi="Times" w:cs="Times"/>
+                <w:sz w:val="22"/>
+                <w:szCs w:val="22"/>
+                <w:vertAlign w:val="superscript"/>
+              </w:rPr>
+              <w:t>th</w:t>
+            </w:r>
+            <w:r>
+              <w:rPr>
+                <w:rFonts w:ascii="Times" w:eastAsia="Times" w:hAnsi="Times" w:cs="Times"/>
+                <w:sz w:val="22"/>
+                <w:szCs w:val="22"/>
+              </w:rPr>
+              <w:t xml:space="preserve"> beat, slur or tied staccato? </w:t>
+            </w:r>
+          </w:p>
+        </w:tc>
+        <w:tc>
+          <w:tcPr>
+            <w:tcW w:w="1024" w:type="pct"/>
+            <w:tcBorders>
+              <w:top w:val="single" w:sz="4" w:space="0" w:color="000000"/>
+              <w:left w:val="single" w:sz="4" w:space="0" w:color="000000"/>
+              <w:bottom w:val="single" w:sz="4" w:space="0" w:color="000000"/>
+              <w:right w:val="single" w:sz="4" w:space="0" w:color="000000"/>
+            </w:tcBorders>
+            <w:vAlign w:val="center"/>
+          </w:tcPr>
+          <w:p>
+            <w:pPr>
+              <w:rPr>
+                <w:rFonts w:ascii="Times" w:eastAsia="Times" w:hAnsi="Times" w:cs="Times"/>
+                <w:sz w:val="22"/>
+                <w:szCs w:val="22"/>
+              </w:rPr>
+            </w:pPr>
+          </w:p>
+        </w:tc>
+      </w:tr>
+      <w:tr>
+        <w:trPr>
+          <w:trHeight w:val="350"/>
+        </w:trPr>
+        <w:tc>
+          <w:tcPr>
+            <w:tcW w:w="756" w:type="pct"/>
+            <w:tcBorders>
+              <w:top w:val="single" w:sz="4" w:space="0" w:color="000000"/>
+              <w:left w:val="single" w:sz="4" w:space="0" w:color="000000"/>
+              <w:bottom w:val="single" w:sz="4" w:space="0" w:color="000000"/>
+              <w:right w:val="single" w:sz="4" w:space="0" w:color="000000"/>
+            </w:tcBorders>
+            <w:vAlign w:val="center"/>
+          </w:tcPr>
+          <w:p>
+            <w:pPr>
+              <w:rPr>
+                <w:rFonts w:ascii="Times" w:eastAsia="Times" w:hAnsi="Times" w:cs="Times"/>
+                <w:sz w:val="22"/>
+                <w:szCs w:val="22"/>
+              </w:rPr>
+            </w:pPr>
+            <w:r>
+              <w:rPr>
+                <w:rFonts w:ascii="Times" w:eastAsia="Times" w:hAnsi="Times" w:cs="Times"/>
+                <w:sz w:val="22"/>
+                <w:szCs w:val="22"/>
+              </w:rPr>
+              <w:t>Bassoon</w:t>
+            </w:r>
+          </w:p>
+        </w:tc>
+        <w:tc>
+          <w:tcPr>
+            <w:tcW w:w="727" w:type="pct"/>
+            <w:tcBorders>
+              <w:top w:val="single" w:sz="4" w:space="0" w:color="000000"/>
+              <w:left w:val="single" w:sz="4" w:space="0" w:color="000000"/>
+              <w:bottom w:val="single" w:sz="4" w:space="0" w:color="000000"/>
+              <w:right w:val="single" w:sz="4" w:space="0" w:color="000000"/>
+            </w:tcBorders>
+            <w:vAlign w:val="center"/>
+          </w:tcPr>
+          <w:p>
+            <w:pPr>
+              <w:rPr>
+                <w:rFonts w:ascii="Times" w:eastAsia="Times" w:hAnsi="Times" w:cs="Times"/>
+                <w:sz w:val="22"/>
+                <w:szCs w:val="22"/>
+              </w:rPr>
+            </w:pPr>
+            <w:r>
+              <w:rPr>
+                <w:rFonts w:ascii="Times" w:eastAsia="Times" w:hAnsi="Times" w:cs="Times"/>
+                <w:sz w:val="22"/>
+                <w:szCs w:val="22"/>
+              </w:rPr>
+              <w:t>50</w:t>
+            </w:r>
+          </w:p>
+        </w:tc>
+        <w:tc>
+          <w:tcPr>
+            <w:tcW w:w="2493" w:type="pct"/>
+            <w:tcBorders>
+              <w:top w:val="single" w:sz="4" w:space="0" w:color="000000"/>
+              <w:left w:val="single" w:sz="4" w:space="0" w:color="000000"/>
+              <w:bottom w:val="single" w:sz="4" w:space="0" w:color="000000"/>
+              <w:right w:val="single" w:sz="4" w:space="0" w:color="000000"/>
+            </w:tcBorders>
+            <w:vAlign w:val="center"/>
+          </w:tcPr>
+          <w:p>
+            <w:pPr>
+              <w:rPr>
+                <w:rFonts w:ascii="Times" w:eastAsia="Times" w:hAnsi="Times" w:cs="Times"/>
+                <w:sz w:val="22"/>
+                <w:szCs w:val="22"/>
+              </w:rPr>
+            </w:pPr>
+            <w:r>
+              <w:rPr>
+                <w:rFonts w:ascii="Times" w:eastAsia="Times" w:hAnsi="Times" w:cs="Times"/>
+                <w:sz w:val="22"/>
+                <w:szCs w:val="22"/>
+              </w:rPr>
+              <w:t xml:space="preserve">Should there be a </w:t>
+            </w:r>
+            <w:r>
+              <w:rPr>
+                <w:rFonts w:ascii="Times" w:eastAsia="Times" w:hAnsi="Times" w:cs="Times"/>
+                <w:i/>
+                <w:iCs/>
+                <w:sz w:val="22"/>
+                <w:szCs w:val="22"/>
+              </w:rPr>
+              <w:t>p</w:t>
+            </w:r>
+            <w:r>
+              <w:rPr>
+                <w:rFonts w:ascii="Times" w:eastAsia="Times" w:hAnsi="Times" w:cs="Times"/>
+                <w:sz w:val="22"/>
+                <w:szCs w:val="22"/>
+              </w:rPr>
+              <w:t xml:space="preserve"> in the clarinets? </w:t>
+            </w:r>
+          </w:p>
+        </w:tc>
+        <w:tc>
+          <w:tcPr>
+            <w:tcW w:w="1024" w:type="pct"/>
+            <w:tcBorders>
+              <w:top w:val="single" w:sz="4" w:space="0" w:color="000000"/>
+              <w:left w:val="single" w:sz="4" w:space="0" w:color="000000"/>
+              <w:bottom w:val="single" w:sz="4" w:space="0" w:color="000000"/>
+              <w:right w:val="single" w:sz="4" w:space="0" w:color="000000"/>
+            </w:tcBorders>
+            <w:vAlign w:val="center"/>
+          </w:tcPr>
+          <w:p>
+            <w:pPr>
+              <w:rPr>
+                <w:rFonts w:ascii="Times" w:eastAsia="Times" w:hAnsi="Times" w:cs="Times"/>
+                <w:sz w:val="22"/>
+                <w:szCs w:val="22"/>
+              </w:rPr>
+            </w:pPr>
+          </w:p>
+        </w:tc>
+      </w:tr>
+      <w:tr>
+        <w:trPr>
+          <w:trHeight w:val="350"/>
+        </w:trPr>
+        <w:tc>
+          <w:tcPr>
+            <w:tcW w:w="756" w:type="pct"/>
+            <w:tcBorders>
+              <w:top w:val="single" w:sz="4" w:space="0" w:color="000000"/>
+              <w:left w:val="single" w:sz="4" w:space="0" w:color="000000"/>
+              <w:bottom w:val="single" w:sz="4" w:space="0" w:color="000000"/>
+              <w:right w:val="single" w:sz="4" w:space="0" w:color="000000"/>
+            </w:tcBorders>
+            <w:vAlign w:val="center"/>
+          </w:tcPr>
+          <w:p>
+            <w:pPr>
+              <w:rPr>
+                <w:rFonts w:ascii="Times" w:eastAsia="Times" w:hAnsi="Times" w:cs="Times"/>
+                <w:sz w:val="22"/>
+                <w:szCs w:val="22"/>
+              </w:rPr>
+            </w:pPr>
+            <w:r>
+              <w:rPr>
+                <w:rFonts w:ascii="Times" w:eastAsia="Times" w:hAnsi="Times" w:cs="Times"/>
+                <w:sz w:val="22"/>
+                <w:szCs w:val="22"/>
+              </w:rPr>
+              <w:t>Horns</w:t>
+            </w:r>
+          </w:p>
+        </w:tc>
+        <w:tc>
+          <w:tcPr>
+            <w:tcW w:w="727" w:type="pct"/>
+            <w:tcBorders>
+              <w:top w:val="single" w:sz="4" w:space="0" w:color="000000"/>
+              <w:left w:val="single" w:sz="4" w:space="0" w:color="000000"/>
+              <w:bottom w:val="single" w:sz="4" w:space="0" w:color="000000"/>
+              <w:right w:val="single" w:sz="4" w:space="0" w:color="000000"/>
+            </w:tcBorders>
+            <w:vAlign w:val="center"/>
+          </w:tcPr>
+          <w:p>
+            <w:pPr>
+              <w:rPr>
+                <w:rFonts w:ascii="Times" w:eastAsia="Times" w:hAnsi="Times" w:cs="Times"/>
+                <w:sz w:val="22"/>
+                <w:szCs w:val="22"/>
+              </w:rPr>
+            </w:pPr>
+            <w:r>
+              <w:rPr>
+                <w:rFonts w:ascii="Times" w:eastAsia="Times" w:hAnsi="Times" w:cs="Times"/>
+                <w:sz w:val="22"/>
+                <w:szCs w:val="22"/>
+              </w:rPr>
+              <w:t>55</w:t>
+            </w:r>
+          </w:p>
+        </w:tc>
+        <w:tc>
+          <w:tcPr>
+            <w:tcW w:w="2493" w:type="pct"/>
+            <w:tcBorders>
+              <w:top w:val="single" w:sz="4" w:space="0" w:color="000000"/>
+              <w:left w:val="single" w:sz="4" w:space="0" w:color="000000"/>
+              <w:bottom w:val="single" w:sz="4" w:space="0" w:color="000000"/>
+              <w:right w:val="single" w:sz="4" w:space="0" w:color="000000"/>
+            </w:tcBorders>
+            <w:vAlign w:val="center"/>
+          </w:tcPr>
+          <w:p>
+            <w:pPr>
+              <w:rPr>
+                <w:rFonts w:ascii="Times" w:eastAsia="Times" w:hAnsi="Times" w:cs="Times"/>
+                <w:sz w:val="22"/>
+                <w:szCs w:val="22"/>
+              </w:rPr>
+            </w:pPr>
+            <w:r>
+              <w:rPr>
+                <w:rFonts w:ascii="Times" w:eastAsia="Times" w:hAnsi="Times" w:cs="Times"/>
+                <w:sz w:val="22"/>
+                <w:szCs w:val="22"/>
+              </w:rPr>
+              <w:t xml:space="preserve">Should the staccato be removed here? </w:t>
+            </w:r>
+            <w:r>
+              <w:rPr>
+                <w:rFonts w:ascii="Times" w:eastAsia="Times" w:hAnsi="Times" w:cs="Times"/>
+                <w:sz w:val="22"/>
+                <w:szCs w:val="22"/>
+              </w:rPr>
+              <w:t xml:space="preserve"> </w:t>
+            </w:r>
+          </w:p>
+        </w:tc>
+        <w:tc>
+          <w:tcPr>
+            <w:tcW w:w="1024" w:type="pct"/>
+            <w:tcBorders>
+              <w:top w:val="single" w:sz="4" w:space="0" w:color="000000"/>
+              <w:left w:val="single" w:sz="4" w:space="0" w:color="000000"/>
+              <w:bottom w:val="single" w:sz="4" w:space="0" w:color="000000"/>
+              <w:right w:val="single" w:sz="4" w:space="0" w:color="000000"/>
+            </w:tcBorders>
+            <w:vAlign w:val="center"/>
+          </w:tcPr>
+          <w:p>
+            <w:pPr>
+              <w:rPr>
+                <w:rFonts w:ascii="Times" w:eastAsia="Times" w:hAnsi="Times" w:cs="Times"/>
+                <w:sz w:val="22"/>
+                <w:szCs w:val="22"/>
+              </w:rPr>
+            </w:pPr>
+          </w:p>
+        </w:tc>
+      </w:tr>
+      <w:tr>
+        <w:trPr>
+          <w:trHeight w:val="350"/>
+        </w:trPr>
+        <w:tc>
+          <w:tcPr>
+            <w:tcW w:w="756" w:type="pct"/>
+            <w:tcBorders>
+              <w:top w:val="single" w:sz="4" w:space="0" w:color="000000"/>
+              <w:left w:val="single" w:sz="4" w:space="0" w:color="000000"/>
+              <w:bottom w:val="single" w:sz="4" w:space="0" w:color="000000"/>
+              <w:right w:val="single" w:sz="4" w:space="0" w:color="000000"/>
+            </w:tcBorders>
+            <w:vAlign w:val="center"/>
+          </w:tcPr>
+          <w:p>
+            <w:pPr>
+              <w:rPr>
+                <w:rFonts w:ascii="Times" w:eastAsia="Times" w:hAnsi="Times" w:cs="Times"/>
                 <w:color w:val="E97132"/>
                 <w:sz w:val="22"/>
                 <w:szCs w:val="22"/>
@@ -2044,7 +2548,6 @@
               </w:rPr>
               <w:t xml:space="preserve">be </w:t>
             </w:r>
-            <w:proofErr w:type="gramStart"/>
             <w:r>
               <w:rPr>
                 <w:rFonts w:ascii="Times" w:eastAsia="Times" w:hAnsi="Times" w:cs="Times"/>
@@ -2052,17 +2555,7 @@
                 <w:sz w:val="22"/>
                 <w:szCs w:val="22"/>
               </w:rPr>
-              <w:t>sharps</w:t>
-            </w:r>
-            <w:proofErr w:type="gramEnd"/>
-            <w:r>
-              <w:rPr>
-                <w:rFonts w:ascii="Times" w:eastAsia="Times" w:hAnsi="Times" w:cs="Times"/>
-                <w:color w:val="E97132"/>
-                <w:sz w:val="22"/>
-                <w:szCs w:val="22"/>
-              </w:rPr>
-              <w:t xml:space="preserve"> for voice leading</w:t>
+              <w:t>sharps for voice leading</w:t>
             </w:r>
             <w:r>
               <w:rPr>
@@ -2687,7 +3180,6 @@
                 <w:sz w:val="22"/>
                 <w:szCs w:val="22"/>
               </w:rPr>
-              <w:lastRenderedPageBreak/>
               <w:t>Viola</w:t>
             </w:r>
           </w:p>
@@ -4502,21 +4994,7 @@
               <w:rPr>
                 <w:rFonts w:ascii="Times" w:eastAsia="Times" w:hAnsi="Times" w:cs="Times"/>
               </w:rPr>
-              <w:t xml:space="preserve">s are redundant given the tenuto symbols. However, if it is a preference or the intention is for a more pronounced tenuto, let me know. If </w:t>
-            </w:r>
-            <w:proofErr w:type="gramStart"/>
-            <w:r>
-              <w:rPr>
-                <w:rFonts w:ascii="Times" w:eastAsia="Times" w:hAnsi="Times" w:cs="Times"/>
-              </w:rPr>
-              <w:t>no</w:t>
-            </w:r>
-            <w:proofErr w:type="gramEnd"/>
-            <w:r>
-              <w:rPr>
-                <w:rFonts w:ascii="Times" w:eastAsia="Times" w:hAnsi="Times" w:cs="Times"/>
-              </w:rPr>
-              <w:t xml:space="preserve"> preference, we could potentially remove them, except at key moments, and just ensure a tenuto symbol is present. </w:t>
+              <w:t xml:space="preserve">s are redundant given the tenuto symbols. However, if it is a preference or the intention is for a more pronounced tenuto, let me know. If no preference, we could potentially remove them, except at key moments, and just ensure a tenuto symbol is present. </w:t>
             </w:r>
           </w:p>
         </w:tc>
@@ -4608,21 +5086,7 @@
               <w:rPr>
                 <w:rFonts w:ascii="Times" w:eastAsia="Times" w:hAnsi="Times" w:cs="Times"/>
               </w:rPr>
-              <w:t xml:space="preserve">Technically does the sul G continue from m. 19 till the F </w:t>
-            </w:r>
-            <w:proofErr w:type="gramStart"/>
-            <w:r>
-              <w:rPr>
-                <w:rFonts w:ascii="Times" w:eastAsia="Times" w:hAnsi="Times" w:cs="Times"/>
-              </w:rPr>
-              <w:t>in</w:t>
-            </w:r>
-            <w:proofErr w:type="gramEnd"/>
-            <w:r>
-              <w:rPr>
-                <w:rFonts w:ascii="Times" w:eastAsia="Times" w:hAnsi="Times" w:cs="Times"/>
-              </w:rPr>
-              <w:t xml:space="preserve"> m. 27? Will format accordingly</w:t>
+              <w:t>Technically does the sul G continue from m. 19 till the F in m. 27? Will format accordingly</w:t>
             </w:r>
           </w:p>
         </w:tc>
@@ -4740,21 +5204,7 @@
               <w:rPr>
                 <w:rFonts w:ascii="Times" w:eastAsia="Times" w:hAnsi="Times" w:cs="Times"/>
               </w:rPr>
-              <w:t xml:space="preserve">. Should it </w:t>
-            </w:r>
-            <w:proofErr w:type="gramStart"/>
-            <w:r>
-              <w:rPr>
-                <w:rFonts w:ascii="Times" w:eastAsia="Times" w:hAnsi="Times" w:cs="Times"/>
-              </w:rPr>
-              <w:t>dim.</w:t>
-            </w:r>
-            <w:proofErr w:type="gramEnd"/>
-            <w:r>
-              <w:rPr>
-                <w:rFonts w:ascii="Times" w:eastAsia="Times" w:hAnsi="Times" w:cs="Times"/>
-              </w:rPr>
-              <w:t xml:space="preserve"> to a different dynamic, with a sub. </w:t>
+              <w:t xml:space="preserve">. Should it dim. to a different dynamic, with a sub. </w:t>
             </w:r>
             <w:r>
               <w:rPr>

</xml_diff>

<commit_message>
v17: Correct major typos and wrong accidentals (or other wrong notes). To continue
</commit_message>
<xml_diff>
--- a/Proof Reading and Review/TCB Mvt for Vn and Orch - Errata_v1.docx
+++ b/Proof Reading and Review/TCB Mvt for Vn and Orch - Errata_v1.docx
@@ -2492,7 +2492,6 @@
                 <w:szCs w:val="22"/>
               </w:rPr>
             </w:pPr>
-            <w:proofErr w:type="spellStart"/>
             <w:r>
               <w:rPr>
                 <w:rFonts w:ascii="Times" w:eastAsia="Times" w:hAnsi="Times" w:cs="Times"/>
@@ -2509,17 +2508,7 @@
                 <w:sz w:val="22"/>
                 <w:szCs w:val="22"/>
               </w:rPr>
-              <w:t>nics</w:t>
-            </w:r>
-            <w:proofErr w:type="spellEnd"/>
-            <w:r>
-              <w:rPr>
-                <w:rFonts w:ascii="Times" w:eastAsia="Times" w:hAnsi="Times" w:cs="Times"/>
-                <w:color w:val="E97132"/>
-                <w:sz w:val="22"/>
-                <w:szCs w:val="22"/>
-              </w:rPr>
-              <w:t xml:space="preserve">: </w:t>
+              <w:t xml:space="preserve">nics: </w:t>
             </w:r>
             <w:r>
               <w:rPr>
@@ -3852,7 +3841,7 @@
                 <w:sz w:val="22"/>
                 <w:szCs w:val="22"/>
               </w:rPr>
-              <w:t>Violin I</w:t>
+              <w:t>Winds</w:t>
             </w:r>
           </w:p>
         </w:tc>
@@ -3881,7 +3870,7 @@
                 <w:sz w:val="22"/>
                 <w:szCs w:val="22"/>
               </w:rPr>
-              <w:t>148</w:t>
+              <w:t>125</w:t>
             </w:r>
           </w:p>
         </w:tc>
@@ -3910,7 +3899,72 @@
                 <w:sz w:val="22"/>
                 <w:szCs w:val="22"/>
               </w:rPr>
-              <w:t xml:space="preserve">G-flat or G natural? </w:t>
+              <w:t>2</w:t>
+            </w:r>
+            <w:r>
+              <w:rPr>
+                <w:rFonts w:ascii="Times" w:eastAsia="Times" w:hAnsi="Times" w:cs="Times"/>
+                <w:sz w:val="22"/>
+                <w:szCs w:val="22"/>
+                <w:vertAlign w:val="superscript"/>
+              </w:rPr>
+              <w:t>nd</w:t>
+            </w:r>
+            <w:r>
+              <w:rPr>
+                <w:rFonts w:ascii="Times" w:eastAsia="Times" w:hAnsi="Times" w:cs="Times"/>
+                <w:sz w:val="22"/>
+                <w:szCs w:val="22"/>
+              </w:rPr>
+              <w:t xml:space="preserve"> beat, h</w:t>
+            </w:r>
+            <w:r>
+              <w:rPr>
+                <w:rFonts w:ascii="Times" w:eastAsia="Times" w:hAnsi="Times" w:cs="Times"/>
+                <w:sz w:val="22"/>
+                <w:szCs w:val="22"/>
+              </w:rPr>
+              <w:t xml:space="preserve">ighly dissonant </w:t>
+            </w:r>
+            <w:r>
+              <w:rPr>
+                <w:rFonts w:ascii="Times" w:eastAsia="Times" w:hAnsi="Times" w:cs="Times"/>
+                <w:sz w:val="22"/>
+                <w:szCs w:val="22"/>
+              </w:rPr>
+              <w:t>chord.</w:t>
+            </w:r>
+            <w:r>
+              <w:rPr>
+                <w:rFonts w:ascii="Times" w:eastAsia="Times" w:hAnsi="Times" w:cs="Times"/>
+                <w:sz w:val="22"/>
+                <w:szCs w:val="22"/>
+              </w:rPr>
+              <w:t xml:space="preserve"> E-flat in flute, E natural on oboe, F natural </w:t>
+            </w:r>
+            <w:r>
+              <w:rPr>
+                <w:rFonts w:ascii="Times" w:eastAsia="Times" w:hAnsi="Times" w:cs="Times"/>
+                <w:sz w:val="22"/>
+                <w:szCs w:val="22"/>
+              </w:rPr>
+              <w:t xml:space="preserve">in </w:t>
+            </w:r>
+            <w:r>
+              <w:rPr>
+                <w:rFonts w:ascii="Times" w:eastAsia="Times" w:hAnsi="Times" w:cs="Times"/>
+                <w:sz w:val="22"/>
+                <w:szCs w:val="22"/>
+              </w:rPr>
+              <w:t>bassoon.</w:t>
+            </w:r>
+            <w:r>
+              <w:rPr>
+                <w:rFonts w:ascii="Times" w:eastAsia="Times" w:hAnsi="Times" w:cs="Times"/>
+                <w:sz w:val="22"/>
+                <w:szCs w:val="22"/>
+              </w:rPr>
+              <w:t xml:space="preserve"> Is this intentional? </w:t>
             </w:r>
           </w:p>
         </w:tc>
@@ -3994,7 +4048,7 @@
                 <w:sz w:val="22"/>
                 <w:szCs w:val="22"/>
               </w:rPr>
-              <w:t>152</w:t>
+              <w:t>148</w:t>
             </w:r>
           </w:p>
         </w:tc>
@@ -4023,33 +4077,7 @@
                 <w:sz w:val="22"/>
                 <w:szCs w:val="22"/>
               </w:rPr>
-              <w:t xml:space="preserve">Divisi or unis? </w:t>
-            </w:r>
-          </w:p>
-          <w:p>
-            <w:pPr>
-              <w:rPr>
-                <w:rFonts w:ascii="Times" w:eastAsia="Times" w:hAnsi="Times" w:cs="Times"/>
-                <w:sz w:val="22"/>
-                <w:szCs w:val="22"/>
-              </w:rPr>
-            </w:pPr>
-          </w:p>
-          <w:p>
-            <w:pPr>
-              <w:rPr>
-                <w:rFonts w:ascii="Times" w:eastAsia="Times" w:hAnsi="Times" w:cs="Times"/>
-                <w:sz w:val="22"/>
-                <w:szCs w:val="22"/>
-              </w:rPr>
-            </w:pPr>
-            <w:r>
-              <w:rPr>
-                <w:rFonts w:ascii="Times" w:eastAsia="Times" w:hAnsi="Times" w:cs="Times"/>
-                <w:sz w:val="22"/>
-                <w:szCs w:val="22"/>
-              </w:rPr>
-              <w:t xml:space="preserve">Slur is also very long, is it more gestural than technical? </w:t>
+              <w:t xml:space="preserve">G-flat or G natural? </w:t>
             </w:r>
           </w:p>
         </w:tc>
@@ -4104,7 +4132,7 @@
                 <w:sz w:val="22"/>
                 <w:szCs w:val="22"/>
               </w:rPr>
-              <w:t>Harp 2</w:t>
+              <w:t>Violin I</w:t>
             </w:r>
           </w:p>
         </w:tc>
@@ -4133,7 +4161,7 @@
                 <w:sz w:val="22"/>
                 <w:szCs w:val="22"/>
               </w:rPr>
-              <w:t>160</w:t>
+              <w:t>152</w:t>
             </w:r>
           </w:p>
         </w:tc>
@@ -4162,23 +4190,33 @@
                 <w:sz w:val="22"/>
                 <w:szCs w:val="22"/>
               </w:rPr>
-              <w:t>What are the pitches for this harp glissand</w:t>
-            </w:r>
-            <w:r>
-              <w:rPr>
-                <w:rFonts w:ascii="Times" w:eastAsia="Times" w:hAnsi="Times" w:cs="Times"/>
-                <w:sz w:val="22"/>
-                <w:szCs w:val="22"/>
-              </w:rPr>
-              <w:t>o</w:t>
-            </w:r>
-            <w:r>
-              <w:rPr>
-                <w:rFonts w:ascii="Times" w:eastAsia="Times" w:hAnsi="Times" w:cs="Times"/>
-                <w:sz w:val="22"/>
-                <w:szCs w:val="22"/>
-              </w:rPr>
-              <w:t xml:space="preserve">? Is it still in G-flat major?  </w:t>
+              <w:t xml:space="preserve">Divisi or unis? </w:t>
+            </w:r>
+          </w:p>
+          <w:p>
+            <w:pPr>
+              <w:rPr>
+                <w:rFonts w:ascii="Times" w:eastAsia="Times" w:hAnsi="Times" w:cs="Times"/>
+                <w:sz w:val="22"/>
+                <w:szCs w:val="22"/>
+              </w:rPr>
+            </w:pPr>
+          </w:p>
+          <w:p>
+            <w:pPr>
+              <w:rPr>
+                <w:rFonts w:ascii="Times" w:eastAsia="Times" w:hAnsi="Times" w:cs="Times"/>
+                <w:sz w:val="22"/>
+                <w:szCs w:val="22"/>
+              </w:rPr>
+            </w:pPr>
+            <w:r>
+              <w:rPr>
+                <w:rFonts w:ascii="Times" w:eastAsia="Times" w:hAnsi="Times" w:cs="Times"/>
+                <w:sz w:val="22"/>
+                <w:szCs w:val="22"/>
+              </w:rPr>
+              <w:t xml:space="preserve">Slur is also very long, is it more gestural than technical? </w:t>
             </w:r>
           </w:p>
         </w:tc>
@@ -4233,7 +4271,7 @@
                 <w:sz w:val="22"/>
                 <w:szCs w:val="22"/>
               </w:rPr>
-              <w:t>VC</w:t>
+              <w:t>Harp 2</w:t>
             </w:r>
           </w:p>
         </w:tc>
@@ -4262,7 +4300,7 @@
                 <w:sz w:val="22"/>
                 <w:szCs w:val="22"/>
               </w:rPr>
-              <w:t>183</w:t>
+              <w:t>160</w:t>
             </w:r>
           </w:p>
         </w:tc>
@@ -4285,41 +4323,29 @@
                 <w:szCs w:val="22"/>
               </w:rPr>
             </w:pPr>
-            <w:proofErr w:type="spellStart"/>
-            <w:r>
-              <w:rPr>
-                <w:rFonts w:ascii="Times" w:eastAsia="Times" w:hAnsi="Times" w:cs="Times"/>
-                <w:sz w:val="22"/>
-                <w:szCs w:val="22"/>
-              </w:rPr>
-              <w:t>Tuplet</w:t>
-            </w:r>
-            <w:proofErr w:type="spellEnd"/>
-            <w:r>
-              <w:rPr>
-                <w:rFonts w:ascii="Times" w:eastAsia="Times" w:hAnsi="Times" w:cs="Times"/>
-                <w:sz w:val="22"/>
-                <w:szCs w:val="22"/>
-              </w:rPr>
-              <w:t xml:space="preserve"> within </w:t>
-            </w:r>
-            <w:proofErr w:type="spellStart"/>
-            <w:r>
-              <w:rPr>
-                <w:rFonts w:ascii="Times" w:eastAsia="Times" w:hAnsi="Times" w:cs="Times"/>
-                <w:sz w:val="22"/>
-                <w:szCs w:val="22"/>
-              </w:rPr>
-              <w:t>tuplet</w:t>
-            </w:r>
-            <w:proofErr w:type="spellEnd"/>
-            <w:r>
-              <w:rPr>
-                <w:rFonts w:ascii="Times" w:eastAsia="Times" w:hAnsi="Times" w:cs="Times"/>
-                <w:sz w:val="22"/>
-                <w:szCs w:val="22"/>
-              </w:rPr>
-              <w:t xml:space="preserve">. </w:t>
+            <w:r>
+              <w:rPr>
+                <w:rFonts w:ascii="Times" w:eastAsia="Times" w:hAnsi="Times" w:cs="Times"/>
+                <w:sz w:val="22"/>
+                <w:szCs w:val="22"/>
+              </w:rPr>
+              <w:t>What are the pitches for this harp glissand</w:t>
+            </w:r>
+            <w:r>
+              <w:rPr>
+                <w:rFonts w:ascii="Times" w:eastAsia="Times" w:hAnsi="Times" w:cs="Times"/>
+                <w:sz w:val="22"/>
+                <w:szCs w:val="22"/>
+              </w:rPr>
+              <w:t>o</w:t>
+            </w:r>
+            <w:r>
+              <w:rPr>
+                <w:rFonts w:ascii="Times" w:eastAsia="Times" w:hAnsi="Times" w:cs="Times"/>
+                <w:sz w:val="22"/>
+                <w:szCs w:val="22"/>
+              </w:rPr>
+              <w:t xml:space="preserve">? Is it still in G-flat major?  </w:t>
             </w:r>
           </w:p>
         </w:tc>
@@ -4374,7 +4400,7 @@
                 <w:sz w:val="22"/>
                 <w:szCs w:val="22"/>
               </w:rPr>
-              <w:t>Violas</w:t>
+              <w:t>VC</w:t>
             </w:r>
           </w:p>
         </w:tc>
@@ -4403,7 +4429,7 @@
                 <w:sz w:val="22"/>
                 <w:szCs w:val="22"/>
               </w:rPr>
-              <w:t>196</w:t>
+              <w:t>183</w:t>
             </w:r>
           </w:p>
         </w:tc>
@@ -4426,13 +4452,41 @@
                 <w:szCs w:val="22"/>
               </w:rPr>
             </w:pPr>
-            <w:r>
-              <w:rPr>
-                <w:rFonts w:ascii="Times" w:eastAsia="Times" w:hAnsi="Times" w:cs="Times"/>
-                <w:sz w:val="22"/>
-                <w:szCs w:val="22"/>
-              </w:rPr>
-              <w:t xml:space="preserve">Double stop string skipping in first beat, is it okay? </w:t>
+            <w:proofErr w:type="spellStart"/>
+            <w:r>
+              <w:rPr>
+                <w:rFonts w:ascii="Times" w:eastAsia="Times" w:hAnsi="Times" w:cs="Times"/>
+                <w:sz w:val="22"/>
+                <w:szCs w:val="22"/>
+              </w:rPr>
+              <w:t>Tuplet</w:t>
+            </w:r>
+            <w:proofErr w:type="spellEnd"/>
+            <w:r>
+              <w:rPr>
+                <w:rFonts w:ascii="Times" w:eastAsia="Times" w:hAnsi="Times" w:cs="Times"/>
+                <w:sz w:val="22"/>
+                <w:szCs w:val="22"/>
+              </w:rPr>
+              <w:t xml:space="preserve"> within </w:t>
+            </w:r>
+            <w:proofErr w:type="spellStart"/>
+            <w:r>
+              <w:rPr>
+                <w:rFonts w:ascii="Times" w:eastAsia="Times" w:hAnsi="Times" w:cs="Times"/>
+                <w:sz w:val="22"/>
+                <w:szCs w:val="22"/>
+              </w:rPr>
+              <w:t>tuplet</w:t>
+            </w:r>
+            <w:proofErr w:type="spellEnd"/>
+            <w:r>
+              <w:rPr>
+                <w:rFonts w:ascii="Times" w:eastAsia="Times" w:hAnsi="Times" w:cs="Times"/>
+                <w:sz w:val="22"/>
+                <w:szCs w:val="22"/>
+              </w:rPr>
+              <w:t xml:space="preserve">. </w:t>
             </w:r>
           </w:p>
         </w:tc>
@@ -4487,7 +4541,7 @@
                 <w:sz w:val="22"/>
                 <w:szCs w:val="22"/>
               </w:rPr>
-              <w:t>Cymbal</w:t>
+              <w:t>Violas</w:t>
             </w:r>
           </w:p>
         </w:tc>
@@ -4516,7 +4570,7 @@
                 <w:sz w:val="22"/>
                 <w:szCs w:val="22"/>
               </w:rPr>
-              <w:t>197</w:t>
+              <w:t>193</w:t>
             </w:r>
           </w:p>
         </w:tc>
@@ -4545,15 +4599,7 @@
                 <w:sz w:val="22"/>
                 <w:szCs w:val="22"/>
               </w:rPr>
-              <w:t>Is this a suspended cymbal or crash cymbal?</w:t>
-            </w:r>
-            <w:r>
-              <w:rPr>
-                <w:rFonts w:ascii="Times" w:eastAsia="Times" w:hAnsi="Times" w:cs="Times"/>
-                <w:sz w:val="22"/>
-                <w:szCs w:val="22"/>
-              </w:rPr>
-              <w:t xml:space="preserve"> Seems like the notation has a sizzling effect.</w:t>
+              <w:t>Possible F-natural clash with F#?</w:t>
             </w:r>
           </w:p>
         </w:tc>
@@ -4608,7 +4654,7 @@
                 <w:sz w:val="22"/>
                 <w:szCs w:val="22"/>
               </w:rPr>
-              <w:t>Trumpets</w:t>
+              <w:t>Violas</w:t>
             </w:r>
           </w:p>
         </w:tc>
@@ -4637,15 +4683,7 @@
                 <w:sz w:val="22"/>
                 <w:szCs w:val="22"/>
               </w:rPr>
-              <w:t>229-23</w:t>
-            </w:r>
-            <w:r>
-              <w:rPr>
-                <w:rFonts w:ascii="Times" w:eastAsia="Times" w:hAnsi="Times" w:cs="Times"/>
-                <w:sz w:val="22"/>
-                <w:szCs w:val="22"/>
-              </w:rPr>
-              <w:t>1</w:t>
+              <w:t>196</w:t>
             </w:r>
           </w:p>
         </w:tc>
@@ -4674,7 +4712,7 @@
                 <w:sz w:val="22"/>
                 <w:szCs w:val="22"/>
               </w:rPr>
-              <w:t xml:space="preserve">Just to confirm, is bar 231 trumpet order 1, 2, 3? </w:t>
+              <w:t xml:space="preserve">Double stop string skipping in first beat, is it okay? </w:t>
             </w:r>
           </w:p>
         </w:tc>
@@ -4729,6 +4767,248 @@
                 <w:sz w:val="22"/>
                 <w:szCs w:val="22"/>
               </w:rPr>
+              <w:t>Cymbal</w:t>
+            </w:r>
+          </w:p>
+        </w:tc>
+        <w:tc>
+          <w:tcPr>
+            <w:tcW w:w="727" w:type="pct"/>
+            <w:tcBorders>
+              <w:top w:val="single" w:sz="4" w:space="0" w:color="000000"/>
+              <w:left w:val="single" w:sz="4" w:space="0" w:color="000000"/>
+              <w:bottom w:val="single" w:sz="4" w:space="0" w:color="000000"/>
+              <w:right w:val="single" w:sz="4" w:space="0" w:color="000000"/>
+            </w:tcBorders>
+            <w:vAlign w:val="center"/>
+          </w:tcPr>
+          <w:p>
+            <w:pPr>
+              <w:rPr>
+                <w:rFonts w:ascii="Times" w:eastAsia="Times" w:hAnsi="Times" w:cs="Times"/>
+                <w:sz w:val="22"/>
+                <w:szCs w:val="22"/>
+              </w:rPr>
+            </w:pPr>
+            <w:r>
+              <w:rPr>
+                <w:rFonts w:ascii="Times" w:eastAsia="Times" w:hAnsi="Times" w:cs="Times"/>
+                <w:sz w:val="22"/>
+                <w:szCs w:val="22"/>
+              </w:rPr>
+              <w:t>197</w:t>
+            </w:r>
+          </w:p>
+        </w:tc>
+        <w:tc>
+          <w:tcPr>
+            <w:tcW w:w="2493" w:type="pct"/>
+            <w:tcBorders>
+              <w:top w:val="single" w:sz="4" w:space="0" w:color="000000"/>
+              <w:left w:val="single" w:sz="4" w:space="0" w:color="000000"/>
+              <w:bottom w:val="single" w:sz="4" w:space="0" w:color="000000"/>
+              <w:right w:val="single" w:sz="4" w:space="0" w:color="000000"/>
+            </w:tcBorders>
+            <w:vAlign w:val="center"/>
+          </w:tcPr>
+          <w:p>
+            <w:pPr>
+              <w:rPr>
+                <w:rFonts w:ascii="Times" w:eastAsia="Times" w:hAnsi="Times" w:cs="Times"/>
+                <w:sz w:val="22"/>
+                <w:szCs w:val="22"/>
+              </w:rPr>
+            </w:pPr>
+            <w:r>
+              <w:rPr>
+                <w:rFonts w:ascii="Times" w:eastAsia="Times" w:hAnsi="Times" w:cs="Times"/>
+                <w:sz w:val="22"/>
+                <w:szCs w:val="22"/>
+              </w:rPr>
+              <w:t>Is this a suspended cymbal or crash cymbal?</w:t>
+            </w:r>
+            <w:r>
+              <w:rPr>
+                <w:rFonts w:ascii="Times" w:eastAsia="Times" w:hAnsi="Times" w:cs="Times"/>
+                <w:sz w:val="22"/>
+                <w:szCs w:val="22"/>
+              </w:rPr>
+              <w:t xml:space="preserve"> Seems like the notation has a sizzling effect.</w:t>
+            </w:r>
+          </w:p>
+        </w:tc>
+        <w:tc>
+          <w:tcPr>
+            <w:tcW w:w="1024" w:type="pct"/>
+            <w:tcBorders>
+              <w:top w:val="single" w:sz="4" w:space="0" w:color="000000"/>
+              <w:left w:val="single" w:sz="4" w:space="0" w:color="000000"/>
+              <w:bottom w:val="single" w:sz="4" w:space="0" w:color="000000"/>
+              <w:right w:val="single" w:sz="4" w:space="0" w:color="000000"/>
+            </w:tcBorders>
+            <w:vAlign w:val="center"/>
+          </w:tcPr>
+          <w:p>
+            <w:pPr>
+              <w:rPr>
+                <w:rFonts w:ascii="Times" w:eastAsia="Times" w:hAnsi="Times" w:cs="Times"/>
+                <w:sz w:val="22"/>
+                <w:szCs w:val="22"/>
+              </w:rPr>
+            </w:pPr>
+          </w:p>
+        </w:tc>
+      </w:tr>
+      <w:tr>
+        <w:trPr>
+          <w:trHeight w:val="350"/>
+        </w:trPr>
+        <w:tc>
+          <w:tcPr>
+            <w:tcW w:w="756" w:type="pct"/>
+            <w:tcBorders>
+              <w:top w:val="single" w:sz="4" w:space="0" w:color="000000"/>
+              <w:left w:val="single" w:sz="4" w:space="0" w:color="000000"/>
+              <w:bottom w:val="single" w:sz="4" w:space="0" w:color="000000"/>
+              <w:right w:val="single" w:sz="4" w:space="0" w:color="000000"/>
+            </w:tcBorders>
+            <w:vAlign w:val="center"/>
+          </w:tcPr>
+          <w:p>
+            <w:pPr>
+              <w:rPr>
+                <w:rFonts w:ascii="Times" w:eastAsia="Times" w:hAnsi="Times" w:cs="Times"/>
+                <w:sz w:val="22"/>
+                <w:szCs w:val="22"/>
+              </w:rPr>
+            </w:pPr>
+            <w:r>
+              <w:rPr>
+                <w:rFonts w:ascii="Times" w:eastAsia="Times" w:hAnsi="Times" w:cs="Times"/>
+                <w:sz w:val="22"/>
+                <w:szCs w:val="22"/>
+              </w:rPr>
+              <w:t>Trumpets</w:t>
+            </w:r>
+          </w:p>
+        </w:tc>
+        <w:tc>
+          <w:tcPr>
+            <w:tcW w:w="727" w:type="pct"/>
+            <w:tcBorders>
+              <w:top w:val="single" w:sz="4" w:space="0" w:color="000000"/>
+              <w:left w:val="single" w:sz="4" w:space="0" w:color="000000"/>
+              <w:bottom w:val="single" w:sz="4" w:space="0" w:color="000000"/>
+              <w:right w:val="single" w:sz="4" w:space="0" w:color="000000"/>
+            </w:tcBorders>
+            <w:vAlign w:val="center"/>
+          </w:tcPr>
+          <w:p>
+            <w:pPr>
+              <w:rPr>
+                <w:rFonts w:ascii="Times" w:eastAsia="Times" w:hAnsi="Times" w:cs="Times"/>
+                <w:sz w:val="22"/>
+                <w:szCs w:val="22"/>
+              </w:rPr>
+            </w:pPr>
+            <w:r>
+              <w:rPr>
+                <w:rFonts w:ascii="Times" w:eastAsia="Times" w:hAnsi="Times" w:cs="Times"/>
+                <w:sz w:val="22"/>
+                <w:szCs w:val="22"/>
+              </w:rPr>
+              <w:t>229-23</w:t>
+            </w:r>
+            <w:r>
+              <w:rPr>
+                <w:rFonts w:ascii="Times" w:eastAsia="Times" w:hAnsi="Times" w:cs="Times"/>
+                <w:sz w:val="22"/>
+                <w:szCs w:val="22"/>
+              </w:rPr>
+              <w:t>1</w:t>
+            </w:r>
+          </w:p>
+        </w:tc>
+        <w:tc>
+          <w:tcPr>
+            <w:tcW w:w="2493" w:type="pct"/>
+            <w:tcBorders>
+              <w:top w:val="single" w:sz="4" w:space="0" w:color="000000"/>
+              <w:left w:val="single" w:sz="4" w:space="0" w:color="000000"/>
+              <w:bottom w:val="single" w:sz="4" w:space="0" w:color="000000"/>
+              <w:right w:val="single" w:sz="4" w:space="0" w:color="000000"/>
+            </w:tcBorders>
+            <w:vAlign w:val="center"/>
+          </w:tcPr>
+          <w:p>
+            <w:pPr>
+              <w:rPr>
+                <w:rFonts w:ascii="Times" w:eastAsia="Times" w:hAnsi="Times" w:cs="Times"/>
+                <w:sz w:val="22"/>
+                <w:szCs w:val="22"/>
+              </w:rPr>
+            </w:pPr>
+            <w:r>
+              <w:rPr>
+                <w:rFonts w:ascii="Times" w:eastAsia="Times" w:hAnsi="Times" w:cs="Times"/>
+                <w:sz w:val="22"/>
+                <w:szCs w:val="22"/>
+              </w:rPr>
+              <w:t xml:space="preserve">Just to confirm, is bar 231 trumpet order 1, 2, 3? </w:t>
+            </w:r>
+          </w:p>
+        </w:tc>
+        <w:tc>
+          <w:tcPr>
+            <w:tcW w:w="1024" w:type="pct"/>
+            <w:tcBorders>
+              <w:top w:val="single" w:sz="4" w:space="0" w:color="000000"/>
+              <w:left w:val="single" w:sz="4" w:space="0" w:color="000000"/>
+              <w:bottom w:val="single" w:sz="4" w:space="0" w:color="000000"/>
+              <w:right w:val="single" w:sz="4" w:space="0" w:color="000000"/>
+            </w:tcBorders>
+            <w:vAlign w:val="center"/>
+          </w:tcPr>
+          <w:p>
+            <w:pPr>
+              <w:rPr>
+                <w:rFonts w:ascii="Times" w:eastAsia="Times" w:hAnsi="Times" w:cs="Times"/>
+                <w:sz w:val="22"/>
+                <w:szCs w:val="22"/>
+              </w:rPr>
+            </w:pPr>
+          </w:p>
+        </w:tc>
+      </w:tr>
+      <w:tr>
+        <w:trPr>
+          <w:trHeight w:val="350"/>
+        </w:trPr>
+        <w:tc>
+          <w:tcPr>
+            <w:tcW w:w="756" w:type="pct"/>
+            <w:tcBorders>
+              <w:top w:val="single" w:sz="4" w:space="0" w:color="000000"/>
+              <w:left w:val="single" w:sz="4" w:space="0" w:color="000000"/>
+              <w:bottom w:val="single" w:sz="4" w:space="0" w:color="000000"/>
+              <w:right w:val="single" w:sz="4" w:space="0" w:color="000000"/>
+            </w:tcBorders>
+            <w:vAlign w:val="center"/>
+          </w:tcPr>
+          <w:p>
+            <w:pPr>
+              <w:rPr>
+                <w:rFonts w:ascii="Times" w:eastAsia="Times" w:hAnsi="Times" w:cs="Times"/>
+                <w:sz w:val="22"/>
+                <w:szCs w:val="22"/>
+              </w:rPr>
+            </w:pPr>
+            <w:r>
+              <w:rPr>
+                <w:rFonts w:ascii="Times" w:eastAsia="Times" w:hAnsi="Times" w:cs="Times"/>
+                <w:sz w:val="22"/>
+                <w:szCs w:val="22"/>
+              </w:rPr>
               <w:t>Percussion</w:t>
             </w:r>
           </w:p>
@@ -4796,6 +5076,7 @@
                 <w:rFonts w:ascii="Times" w:eastAsia="Times" w:hAnsi="Times" w:cs="Times"/>
                 <w:sz w:val="22"/>
                 <w:szCs w:val="22"/>
+                <w:lang w:val="en-GB"/>
               </w:rPr>
             </w:pPr>
           </w:p>

</xml_diff>

<commit_message>
Errata override (small edit)
</commit_message>
<xml_diff>
--- a/Proof Reading and Review/TCB Mvt for Vn and Orch - Errata_v1.docx
+++ b/Proof Reading and Review/TCB Mvt for Vn and Orch - Errata_v1.docx
@@ -1007,6 +1007,7 @@
               </w:rPr>
               <w:t xml:space="preserve">Dynamics. Do you want them to crescendo before the </w:t>
             </w:r>
+            <w:proofErr w:type="spellStart"/>
             <w:r>
               <w:rPr>
                 <w:rFonts w:ascii="Times New Roman" w:eastAsia="Times" w:hAnsi="Times New Roman" w:cs="Times New Roman"/>
@@ -1019,6 +1020,7 @@
               </w:rPr>
               <w:t>mp</w:t>
             </w:r>
+            <w:proofErr w:type="spellEnd"/>
             <w:r>
               <w:rPr>
                 <w:rFonts w:ascii="Times New Roman" w:eastAsia="Times" w:hAnsi="Times New Roman" w:cs="Times New Roman"/>
@@ -1711,7 +1713,43 @@
                 <w:sz w:val="22"/>
                 <w:szCs w:val="22"/>
               </w:rPr>
-              <w:t>II, Vla, Vc.</w:t>
+              <w:t xml:space="preserve">II, </w:t>
+            </w:r>
+            <w:proofErr w:type="spellStart"/>
+            <w:r>
+              <w:rPr>
+                <w:rFonts w:ascii="Times New Roman" w:eastAsia="Times" w:hAnsi="Times New Roman" w:cs="Times New Roman"/>
+                <w:sz w:val="22"/>
+                <w:szCs w:val="22"/>
+              </w:rPr>
+              <w:t>Vla</w:t>
+            </w:r>
+            <w:proofErr w:type="spellEnd"/>
+            <w:r>
+              <w:rPr>
+                <w:rFonts w:ascii="Times New Roman" w:eastAsia="Times" w:hAnsi="Times New Roman" w:cs="Times New Roman"/>
+                <w:sz w:val="22"/>
+                <w:szCs w:val="22"/>
+              </w:rPr>
+              <w:t xml:space="preserve">, </w:t>
+            </w:r>
+            <w:proofErr w:type="spellStart"/>
+            <w:r>
+              <w:rPr>
+                <w:rFonts w:ascii="Times New Roman" w:eastAsia="Times" w:hAnsi="Times New Roman" w:cs="Times New Roman"/>
+                <w:sz w:val="22"/>
+                <w:szCs w:val="22"/>
+              </w:rPr>
+              <w:t>Vc</w:t>
+            </w:r>
+            <w:proofErr w:type="spellEnd"/>
+            <w:r>
+              <w:rPr>
+                <w:rFonts w:ascii="Times New Roman" w:eastAsia="Times" w:hAnsi="Times New Roman" w:cs="Times New Roman"/>
+                <w:sz w:val="22"/>
+                <w:szCs w:val="22"/>
+              </w:rPr>
+              <w:t>.</w:t>
             </w:r>
           </w:p>
         </w:tc>
@@ -2637,6 +2675,7 @@
                 <w:szCs w:val="22"/>
               </w:rPr>
             </w:pPr>
+            <w:proofErr w:type="spellStart"/>
             <w:r>
               <w:rPr>
                 <w:rFonts w:ascii="Times New Roman" w:eastAsia="Times" w:hAnsi="Times New Roman" w:cs="Times New Roman"/>
@@ -2644,7 +2683,17 @@
                 <w:sz w:val="22"/>
                 <w:szCs w:val="22"/>
               </w:rPr>
-              <w:t xml:space="preserve">Enharmonics: </w:t>
+              <w:t>Enharmonics</w:t>
+            </w:r>
+            <w:proofErr w:type="spellEnd"/>
+            <w:r>
+              <w:rPr>
+                <w:rFonts w:ascii="Times New Roman" w:eastAsia="Times" w:hAnsi="Times New Roman" w:cs="Times New Roman"/>
+                <w:color w:val="000000" w:themeColor="text1"/>
+                <w:sz w:val="22"/>
+                <w:szCs w:val="22"/>
+              </w:rPr>
+              <w:t xml:space="preserve">: </w:t>
             </w:r>
             <w:r>
               <w:rPr>
@@ -2828,6 +2877,7 @@
               </w:rPr>
               <w:t xml:space="preserve">Staccatissimo on long held notes? Recommend using </w:t>
             </w:r>
+            <w:proofErr w:type="spellStart"/>
             <w:r>
               <w:rPr>
                 <w:rFonts w:ascii="Times New Roman" w:eastAsia="Times" w:hAnsi="Times New Roman" w:cs="Times New Roman"/>
@@ -2840,6 +2890,7 @@
               </w:rPr>
               <w:t>sfz</w:t>
             </w:r>
+            <w:proofErr w:type="spellEnd"/>
             <w:r>
               <w:rPr>
                 <w:rFonts w:ascii="Times New Roman" w:eastAsia="Times" w:hAnsi="Times New Roman" w:cs="Times New Roman"/>
@@ -3139,6 +3190,7 @@
                 <w:szCs w:val="22"/>
               </w:rPr>
             </w:pPr>
+            <w:proofErr w:type="spellStart"/>
             <w:r>
               <w:rPr>
                 <w:rFonts w:ascii="Times New Roman" w:eastAsia="Times" w:hAnsi="Times New Roman" w:cs="Times New Roman"/>
@@ -3147,6 +3199,7 @@
               </w:rPr>
               <w:t>Cbsn</w:t>
             </w:r>
+            <w:proofErr w:type="spellEnd"/>
           </w:p>
         </w:tc>
         <w:tc>
@@ -4067,7 +4120,27 @@
                 <w:sz w:val="22"/>
                 <w:szCs w:val="22"/>
               </w:rPr>
-              <w:t xml:space="preserve">Suggest swapping Tpt. 2 and 3 voices around for easier score reading. </w:t>
+              <w:t xml:space="preserve">Suggest swapping </w:t>
+            </w:r>
+            <w:proofErr w:type="spellStart"/>
+            <w:r>
+              <w:rPr>
+                <w:rFonts w:ascii="Times New Roman" w:eastAsia="Times" w:hAnsi="Times New Roman" w:cs="Times New Roman"/>
+                <w:color w:val="000000" w:themeColor="text1"/>
+                <w:sz w:val="22"/>
+                <w:szCs w:val="22"/>
+              </w:rPr>
+              <w:t>Tpt</w:t>
+            </w:r>
+            <w:proofErr w:type="spellEnd"/>
+            <w:r>
+              <w:rPr>
+                <w:rFonts w:ascii="Times New Roman" w:eastAsia="Times" w:hAnsi="Times New Roman" w:cs="Times New Roman"/>
+                <w:color w:val="000000" w:themeColor="text1"/>
+                <w:sz w:val="22"/>
+                <w:szCs w:val="22"/>
+              </w:rPr>
+              <w:t xml:space="preserve">. 2 and 3 voices around for easier score reading. </w:t>
             </w:r>
           </w:p>
         </w:tc>
@@ -4243,13 +4316,23 @@
                 <w:szCs w:val="22"/>
               </w:rPr>
             </w:pPr>
-            <w:r>
-              <w:rPr>
-                <w:rFonts w:ascii="Times New Roman" w:eastAsia="Times" w:hAnsi="Times New Roman" w:cs="Times New Roman"/>
-                <w:sz w:val="22"/>
-                <w:szCs w:val="22"/>
-              </w:rPr>
-              <w:t>Picc.</w:t>
+            <w:proofErr w:type="spellStart"/>
+            <w:r>
+              <w:rPr>
+                <w:rFonts w:ascii="Times New Roman" w:eastAsia="Times" w:hAnsi="Times New Roman" w:cs="Times New Roman"/>
+                <w:sz w:val="22"/>
+                <w:szCs w:val="22"/>
+              </w:rPr>
+              <w:t>Picc</w:t>
+            </w:r>
+            <w:proofErr w:type="spellEnd"/>
+            <w:r>
+              <w:rPr>
+                <w:rFonts w:ascii="Times New Roman" w:eastAsia="Times" w:hAnsi="Times New Roman" w:cs="Times New Roman"/>
+                <w:sz w:val="22"/>
+                <w:szCs w:val="22"/>
+              </w:rPr>
+              <w:t>.</w:t>
             </w:r>
           </w:p>
         </w:tc>
@@ -4360,13 +4443,23 @@
                 <w:szCs w:val="22"/>
               </w:rPr>
             </w:pPr>
-            <w:r>
-              <w:rPr>
-                <w:rFonts w:ascii="Times New Roman" w:eastAsia="Times" w:hAnsi="Times New Roman" w:cs="Times New Roman"/>
-                <w:sz w:val="22"/>
-                <w:szCs w:val="22"/>
-              </w:rPr>
-              <w:t>Picc.</w:t>
+            <w:proofErr w:type="spellStart"/>
+            <w:r>
+              <w:rPr>
+                <w:rFonts w:ascii="Times New Roman" w:eastAsia="Times" w:hAnsi="Times New Roman" w:cs="Times New Roman"/>
+                <w:sz w:val="22"/>
+                <w:szCs w:val="22"/>
+              </w:rPr>
+              <w:t>Picc</w:t>
+            </w:r>
+            <w:proofErr w:type="spellEnd"/>
+            <w:r>
+              <w:rPr>
+                <w:rFonts w:ascii="Times New Roman" w:eastAsia="Times" w:hAnsi="Times New Roman" w:cs="Times New Roman"/>
+                <w:sz w:val="22"/>
+                <w:szCs w:val="22"/>
+              </w:rPr>
+              <w:t>.</w:t>
             </w:r>
           </w:p>
         </w:tc>
@@ -5145,7 +5238,15 @@
                 <w:sz w:val="22"/>
                 <w:szCs w:val="22"/>
               </w:rPr>
-              <w:t xml:space="preserve">Slur is also very long, is it more gestural than technical? </w:t>
+              <w:t>Slur is also very long, is it more gestural than technical?</w:t>
+            </w:r>
+            <w:r>
+              <w:rPr>
+                <w:rFonts w:ascii="Times New Roman" w:eastAsia="Times" w:hAnsi="Times New Roman" w:cs="Times New Roman"/>
+                <w:sz w:val="22"/>
+                <w:szCs w:val="22"/>
+              </w:rPr>
+              <w:t xml:space="preserve"> </w:t>
             </w:r>
           </w:p>
         </w:tc>
@@ -5522,13 +5623,41 @@
                 <w:szCs w:val="22"/>
               </w:rPr>
             </w:pPr>
-            <w:r>
-              <w:rPr>
-                <w:rFonts w:ascii="Times New Roman" w:eastAsia="Times" w:hAnsi="Times New Roman" w:cs="Times New Roman"/>
-                <w:sz w:val="22"/>
-                <w:szCs w:val="22"/>
-              </w:rPr>
-              <w:t xml:space="preserve">Tuplet within tuplet. </w:t>
+            <w:proofErr w:type="spellStart"/>
+            <w:r>
+              <w:rPr>
+                <w:rFonts w:ascii="Times New Roman" w:eastAsia="Times" w:hAnsi="Times New Roman" w:cs="Times New Roman"/>
+                <w:sz w:val="22"/>
+                <w:szCs w:val="22"/>
+              </w:rPr>
+              <w:t>Tuplet</w:t>
+            </w:r>
+            <w:proofErr w:type="spellEnd"/>
+            <w:r>
+              <w:rPr>
+                <w:rFonts w:ascii="Times New Roman" w:eastAsia="Times" w:hAnsi="Times New Roman" w:cs="Times New Roman"/>
+                <w:sz w:val="22"/>
+                <w:szCs w:val="22"/>
+              </w:rPr>
+              <w:t xml:space="preserve"> within </w:t>
+            </w:r>
+            <w:proofErr w:type="spellStart"/>
+            <w:r>
+              <w:rPr>
+                <w:rFonts w:ascii="Times New Roman" w:eastAsia="Times" w:hAnsi="Times New Roman" w:cs="Times New Roman"/>
+                <w:sz w:val="22"/>
+                <w:szCs w:val="22"/>
+              </w:rPr>
+              <w:t>tuplet</w:t>
+            </w:r>
+            <w:proofErr w:type="spellEnd"/>
+            <w:r>
+              <w:rPr>
+                <w:rFonts w:ascii="Times New Roman" w:eastAsia="Times" w:hAnsi="Times New Roman" w:cs="Times New Roman"/>
+                <w:sz w:val="22"/>
+                <w:szCs w:val="22"/>
+              </w:rPr>
+              <w:t xml:space="preserve">. </w:t>
             </w:r>
           </w:p>
         </w:tc>
@@ -6249,6 +6378,7 @@
           <w:rFonts w:ascii="Times New Roman" w:hAnsi="Times New Roman" w:cs="Times New Roman"/>
         </w:rPr>
       </w:pPr>
+      <w:proofErr w:type="spellStart"/>
       <w:r>
         <w:rPr>
           <w:rFonts w:ascii="Times New Roman" w:hAnsi="Times New Roman" w:cs="Times New Roman"/>
@@ -6256,7 +6386,34 @@
           <w:bCs/>
         </w:rPr>
         <w:lastRenderedPageBreak/>
-        <w:t>Prevous Errata (version 0 - solo vn only)</w:t>
+        <w:t>Prevous</w:t>
+      </w:r>
+      <w:proofErr w:type="spellEnd"/>
+      <w:r>
+        <w:rPr>
+          <w:rFonts w:ascii="Times New Roman" w:hAnsi="Times New Roman" w:cs="Times New Roman"/>
+          <w:b/>
+          <w:bCs/>
+        </w:rPr>
+        <w:t xml:space="preserve"> Errata (version 0 - solo </w:t>
+      </w:r>
+      <w:proofErr w:type="spellStart"/>
+      <w:r>
+        <w:rPr>
+          <w:rFonts w:ascii="Times New Roman" w:hAnsi="Times New Roman" w:cs="Times New Roman"/>
+          <w:b/>
+          <w:bCs/>
+        </w:rPr>
+        <w:t>vn</w:t>
+      </w:r>
+      <w:proofErr w:type="spellEnd"/>
+      <w:r>
+        <w:rPr>
+          <w:rFonts w:ascii="Times New Roman" w:hAnsi="Times New Roman" w:cs="Times New Roman"/>
+          <w:b/>
+          <w:bCs/>
+        </w:rPr>
+        <w:t xml:space="preserve"> only)</w:t>
       </w:r>
     </w:p>
     <w:tbl>
@@ -6304,8 +6461,16 @@
               <w:rPr>
                 <w:rFonts w:ascii="Times New Roman" w:eastAsia="Times" w:hAnsi="Times New Roman" w:cs="Times New Roman"/>
               </w:rPr>
-              <w:t>Solo Vn</w:t>
-            </w:r>
+              <w:t xml:space="preserve">Solo </w:t>
+            </w:r>
+            <w:proofErr w:type="spellStart"/>
+            <w:r>
+              <w:rPr>
+                <w:rFonts w:ascii="Times New Roman" w:eastAsia="Times" w:hAnsi="Times New Roman" w:cs="Times New Roman"/>
+              </w:rPr>
+              <w:t>Vn</w:t>
+            </w:r>
+            <w:proofErr w:type="spellEnd"/>
           </w:p>
         </w:tc>
         <w:tc>
@@ -6776,7 +6941,21 @@
               <w:rPr>
                 <w:rFonts w:ascii="Times New Roman" w:eastAsia="Times" w:hAnsi="Times New Roman" w:cs="Times New Roman"/>
               </w:rPr>
-              <w:t>Does meno mosso start at beat 1 of this bar or another beat?</w:t>
+              <w:t xml:space="preserve">Does </w:t>
+            </w:r>
+            <w:proofErr w:type="spellStart"/>
+            <w:r>
+              <w:rPr>
+                <w:rFonts w:ascii="Times New Roman" w:eastAsia="Times" w:hAnsi="Times New Roman" w:cs="Times New Roman"/>
+              </w:rPr>
+              <w:t>meno</w:t>
+            </w:r>
+            <w:proofErr w:type="spellEnd"/>
+            <w:r>
+              <w:rPr>
+                <w:rFonts w:ascii="Times New Roman" w:eastAsia="Times" w:hAnsi="Times New Roman" w:cs="Times New Roman"/>
+              </w:rPr>
+              <w:t xml:space="preserve"> mosso start at beat 1 of this bar or another beat?</w:t>
             </w:r>
           </w:p>
         </w:tc>

</xml_diff>

<commit_message>
V20 - Edits from TCB Meeting
</commit_message>
<xml_diff>
--- a/Proof Reading and Review/TCB Mvt for Vn and Orch - Errata_v1.docx
+++ b/Proof Reading and Review/TCB Mvt for Vn and Orch - Errata_v1.docx
@@ -288,6 +288,36 @@
         </w:rPr>
         <w:t xml:space="preserve">Score fonts are still TBD - this is just an early draft for review. </w:t>
       </w:r>
+      <w:r>
+        <w:rPr>
+          <w:rFonts w:ascii="Times New Roman" w:eastAsia="Times" w:hAnsi="Times New Roman" w:cs="Times New Roman"/>
+          <w:sz w:val="20"/>
+          <w:szCs w:val="20"/>
+        </w:rPr>
+        <w:br/>
+      </w:r>
+    </w:p>
+    <w:p>
+      <w:pPr>
+        <w:pStyle w:val="ListParagraph"/>
+        <w:numPr>
+          <w:ilvl w:val="0"/>
+          <w:numId w:val="7"/>
+        </w:numPr>
+        <w:rPr>
+          <w:rFonts w:ascii="Times New Roman" w:eastAsia="Times" w:hAnsi="Times New Roman" w:cs="Times New Roman"/>
+          <w:sz w:val="20"/>
+          <w:szCs w:val="20"/>
+        </w:rPr>
+      </w:pPr>
+      <w:r>
+        <w:rPr>
+          <w:rFonts w:ascii="Times New Roman" w:eastAsia="Times" w:hAnsi="Times New Roman" w:cs="Times New Roman"/>
+          <w:sz w:val="20"/>
+          <w:szCs w:val="20"/>
+        </w:rPr>
+        <w:t>Check acciaccatura positions!</w:t>
+      </w:r>
     </w:p>
     <w:p>
       <w:pPr>
@@ -912,6 +942,14 @@
                 <w:szCs w:val="22"/>
               </w:rPr>
             </w:pPr>
+            <w:r>
+              <w:rPr>
+                <w:rFonts w:ascii="Times New Roman" w:eastAsia="Times" w:hAnsi="Times New Roman" w:cs="Times New Roman"/>
+                <w:sz w:val="22"/>
+                <w:szCs w:val="22"/>
+              </w:rPr>
+              <w:t>Yes</w:t>
+            </w:r>
           </w:p>
         </w:tc>
       </w:tr>
@@ -1051,6 +1089,14 @@
                 <w:szCs w:val="22"/>
               </w:rPr>
             </w:pPr>
+            <w:r>
+              <w:rPr>
+                <w:rFonts w:ascii="Times New Roman" w:eastAsia="Times" w:hAnsi="Times New Roman" w:cs="Times New Roman"/>
+                <w:sz w:val="22"/>
+                <w:szCs w:val="22"/>
+              </w:rPr>
+              <w:t>No</w:t>
+            </w:r>
           </w:p>
         </w:tc>
       </w:tr>
@@ -1196,6 +1242,14 @@
                 <w:szCs w:val="22"/>
               </w:rPr>
             </w:pPr>
+            <w:r>
+              <w:rPr>
+                <w:rFonts w:ascii="Times New Roman" w:eastAsia="Times" w:hAnsi="Times New Roman" w:cs="Times New Roman"/>
+                <w:sz w:val="22"/>
+                <w:szCs w:val="22"/>
+              </w:rPr>
+              <w:t>Portamento, no slur</w:t>
+            </w:r>
           </w:p>
         </w:tc>
       </w:tr>
@@ -1321,6 +1375,14 @@
                 <w:szCs w:val="22"/>
               </w:rPr>
             </w:pPr>
+            <w:r>
+              <w:rPr>
+                <w:rFonts w:ascii="Times New Roman" w:eastAsia="Times" w:hAnsi="Times New Roman" w:cs="Times New Roman"/>
+                <w:sz w:val="22"/>
+                <w:szCs w:val="22"/>
+              </w:rPr>
+              <w:t>Yes</w:t>
+            </w:r>
           </w:p>
         </w:tc>
       </w:tr>
@@ -1438,6 +1500,14 @@
                 <w:szCs w:val="22"/>
               </w:rPr>
             </w:pPr>
+            <w:r>
+              <w:rPr>
+                <w:rFonts w:ascii="Times New Roman" w:eastAsia="Times" w:hAnsi="Times New Roman" w:cs="Times New Roman"/>
+                <w:sz w:val="22"/>
+                <w:szCs w:val="22"/>
+              </w:rPr>
+              <w:t>Yes</w:t>
+            </w:r>
           </w:p>
         </w:tc>
       </w:tr>
@@ -1555,6 +1625,14 @@
                 <w:szCs w:val="22"/>
               </w:rPr>
             </w:pPr>
+            <w:r>
+              <w:rPr>
+                <w:rFonts w:ascii="Times New Roman" w:eastAsia="Times" w:hAnsi="Times New Roman" w:cs="Times New Roman"/>
+                <w:sz w:val="22"/>
+                <w:szCs w:val="22"/>
+              </w:rPr>
+              <w:t>No</w:t>
+            </w:r>
           </w:p>
         </w:tc>
       </w:tr>
@@ -1672,6 +1750,14 @@
                 <w:szCs w:val="22"/>
               </w:rPr>
             </w:pPr>
+            <w:r>
+              <w:rPr>
+                <w:rFonts w:ascii="Times New Roman" w:eastAsia="Times" w:hAnsi="Times New Roman" w:cs="Times New Roman"/>
+                <w:sz w:val="22"/>
+                <w:szCs w:val="22"/>
+              </w:rPr>
+              <w:t>Yes, add to violin 1</w:t>
+            </w:r>
           </w:p>
         </w:tc>
       </w:tr>
@@ -1937,6 +2023,14 @@
                 <w:szCs w:val="22"/>
               </w:rPr>
             </w:pPr>
+            <w:r>
+              <w:rPr>
+                <w:rFonts w:ascii="Times New Roman" w:eastAsia="Times" w:hAnsi="Times New Roman" w:cs="Times New Roman"/>
+                <w:sz w:val="22"/>
+                <w:szCs w:val="22"/>
+              </w:rPr>
+              <w:t>Leave as is</w:t>
+            </w:r>
           </w:p>
         </w:tc>
       </w:tr>
@@ -2054,6 +2148,14 @@
                 <w:szCs w:val="22"/>
               </w:rPr>
             </w:pPr>
+            <w:r>
+              <w:rPr>
+                <w:rFonts w:ascii="Times New Roman" w:eastAsia="Times" w:hAnsi="Times New Roman" w:cs="Times New Roman"/>
+                <w:sz w:val="22"/>
+                <w:szCs w:val="22"/>
+              </w:rPr>
+              <w:t>Leave as is</w:t>
+            </w:r>
           </w:p>
         </w:tc>
       </w:tr>
@@ -2187,6 +2289,14 @@
                 <w:szCs w:val="22"/>
               </w:rPr>
             </w:pPr>
+            <w:r>
+              <w:rPr>
+                <w:rFonts w:ascii="Times New Roman" w:eastAsia="Times" w:hAnsi="Times New Roman" w:cs="Times New Roman"/>
+                <w:sz w:val="22"/>
+                <w:szCs w:val="22"/>
+              </w:rPr>
+              <w:t>Intentional</w:t>
+            </w:r>
           </w:p>
         </w:tc>
       </w:tr>
@@ -2321,6 +2431,14 @@
                 <w:szCs w:val="22"/>
               </w:rPr>
             </w:pPr>
+            <w:r>
+              <w:rPr>
+                <w:rFonts w:ascii="Times New Roman" w:eastAsia="Times" w:hAnsi="Times New Roman" w:cs="Times New Roman"/>
+                <w:sz w:val="22"/>
+                <w:szCs w:val="22"/>
+              </w:rPr>
+              <w:t>Tied</w:t>
+            </w:r>
           </w:p>
         </w:tc>
       </w:tr>
@@ -2434,7 +2552,23 @@
                 <w:sz w:val="22"/>
                 <w:szCs w:val="22"/>
               </w:rPr>
-              <w:t xml:space="preserve"> in the clarinets? </w:t>
+              <w:t xml:space="preserve"> in the </w:t>
+            </w:r>
+            <w:r>
+              <w:rPr>
+                <w:rFonts w:ascii="Times New Roman" w:eastAsia="Times" w:hAnsi="Times New Roman" w:cs="Times New Roman"/>
+                <w:sz w:val="22"/>
+                <w:szCs w:val="22"/>
+              </w:rPr>
+              <w:t>bassoon</w:t>
+            </w:r>
+            <w:r>
+              <w:rPr>
+                <w:rFonts w:ascii="Times New Roman" w:eastAsia="Times" w:hAnsi="Times New Roman" w:cs="Times New Roman"/>
+                <w:sz w:val="22"/>
+                <w:szCs w:val="22"/>
+              </w:rPr>
+              <w:t xml:space="preserve"> </w:t>
             </w:r>
           </w:p>
         </w:tc>
@@ -2458,6 +2592,14 @@
                 <w:szCs w:val="22"/>
               </w:rPr>
             </w:pPr>
+            <w:r>
+              <w:rPr>
+                <w:rFonts w:ascii="Times New Roman" w:eastAsia="Times" w:hAnsi="Times New Roman" w:cs="Times New Roman"/>
+                <w:sz w:val="22"/>
+                <w:szCs w:val="22"/>
+              </w:rPr>
+              <w:t>Yes</w:t>
+            </w:r>
           </w:p>
         </w:tc>
       </w:tr>
@@ -2491,6 +2633,7 @@
                 <w:sz w:val="22"/>
                 <w:szCs w:val="22"/>
               </w:rPr>
+              <w:lastRenderedPageBreak/>
               <w:t>Horns</w:t>
             </w:r>
           </w:p>
@@ -2551,15 +2694,7 @@
                 <w:sz w:val="22"/>
                 <w:szCs w:val="22"/>
               </w:rPr>
-              <w:t xml:space="preserve">Should the staccato be removed here? </w:t>
-            </w:r>
-            <w:r>
-              <w:rPr>
-                <w:rFonts w:ascii="Times New Roman" w:eastAsia="Times" w:hAnsi="Times New Roman" w:cs="Times New Roman"/>
-                <w:sz w:val="22"/>
-                <w:szCs w:val="22"/>
-              </w:rPr>
-              <w:t xml:space="preserve"> </w:t>
+              <w:t xml:space="preserve">Should the staccato be removed here?  </w:t>
             </w:r>
           </w:p>
         </w:tc>
@@ -2583,6 +2718,14 @@
                 <w:szCs w:val="22"/>
               </w:rPr>
             </w:pPr>
+            <w:r>
+              <w:rPr>
+                <w:rFonts w:ascii="Times New Roman" w:eastAsia="Times" w:hAnsi="Times New Roman" w:cs="Times New Roman"/>
+                <w:sz w:val="22"/>
+                <w:szCs w:val="22"/>
+              </w:rPr>
+              <w:t>Leave as is</w:t>
+            </w:r>
           </w:p>
         </w:tc>
       </w:tr>
@@ -2693,17 +2836,31 @@
                 <w:sz w:val="22"/>
                 <w:szCs w:val="22"/>
               </w:rPr>
-              <w:t xml:space="preserve">: </w:t>
-            </w:r>
-            <w:r>
+              <w:t xml:space="preserve">: should flats be sharp for voice leading purposes here instead? </w:t>
+            </w:r>
+          </w:p>
+        </w:tc>
+        <w:tc>
+          <w:tcPr>
+            <w:tcW w:w="1024" w:type="pct"/>
+            <w:tcBorders>
+              <w:top w:val="single" w:sz="4" w:space="0" w:color="000000"/>
+              <w:left w:val="single" w:sz="4" w:space="0" w:color="000000"/>
+              <w:bottom w:val="single" w:sz="4" w:space="0" w:color="000000"/>
+              <w:right w:val="single" w:sz="4" w:space="0" w:color="000000"/>
+            </w:tcBorders>
+            <w:vAlign w:val="center"/>
+          </w:tcPr>
+          <w:p>
+            <w:pPr>
+              <w:spacing w:line="276" w:lineRule="auto"/>
               <w:rPr>
                 <w:rFonts w:ascii="Times New Roman" w:eastAsia="Times" w:hAnsi="Times New Roman" w:cs="Times New Roman"/>
                 <w:color w:val="000000" w:themeColor="text1"/>
                 <w:sz w:val="22"/>
                 <w:szCs w:val="22"/>
               </w:rPr>
-              <w:t>should</w:t>
-            </w:r>
+            </w:pPr>
             <w:r>
               <w:rPr>
                 <w:rFonts w:ascii="Times New Roman" w:eastAsia="Times" w:hAnsi="Times New Roman" w:cs="Times New Roman"/>
@@ -2711,76 +2868,8 @@
                 <w:sz w:val="22"/>
                 <w:szCs w:val="22"/>
               </w:rPr>
-              <w:t xml:space="preserve"> flats </w:t>
-            </w:r>
-            <w:r>
-              <w:rPr>
-                <w:rFonts w:ascii="Times New Roman" w:eastAsia="Times" w:hAnsi="Times New Roman" w:cs="Times New Roman"/>
-                <w:color w:val="000000" w:themeColor="text1"/>
-                <w:sz w:val="22"/>
-                <w:szCs w:val="22"/>
-              </w:rPr>
-              <w:t>b</w:t>
-            </w:r>
-            <w:r>
-              <w:rPr>
-                <w:rFonts w:ascii="Times New Roman" w:eastAsia="Times" w:hAnsi="Times New Roman" w:cs="Times New Roman"/>
-                <w:color w:val="000000" w:themeColor="text1"/>
-                <w:sz w:val="22"/>
-                <w:szCs w:val="22"/>
-              </w:rPr>
-              <w:t xml:space="preserve">e sharp </w:t>
-            </w:r>
-            <w:r>
-              <w:rPr>
-                <w:rFonts w:ascii="Times New Roman" w:eastAsia="Times" w:hAnsi="Times New Roman" w:cs="Times New Roman"/>
-                <w:color w:val="000000" w:themeColor="text1"/>
-                <w:sz w:val="22"/>
-                <w:szCs w:val="22"/>
-              </w:rPr>
-              <w:t>for voice leading</w:t>
-            </w:r>
-            <w:r>
-              <w:rPr>
-                <w:rFonts w:ascii="Times New Roman" w:eastAsia="Times" w:hAnsi="Times New Roman" w:cs="Times New Roman"/>
-                <w:color w:val="000000" w:themeColor="text1"/>
-                <w:sz w:val="22"/>
-                <w:szCs w:val="22"/>
-              </w:rPr>
-              <w:t xml:space="preserve"> purposes</w:t>
-            </w:r>
-            <w:r>
-              <w:rPr>
-                <w:rFonts w:ascii="Times New Roman" w:eastAsia="Times" w:hAnsi="Times New Roman" w:cs="Times New Roman"/>
-                <w:color w:val="000000" w:themeColor="text1"/>
-                <w:sz w:val="22"/>
-                <w:szCs w:val="22"/>
-              </w:rPr>
-              <w:t xml:space="preserve"> here instead? </w:t>
-            </w:r>
-          </w:p>
-        </w:tc>
-        <w:tc>
-          <w:tcPr>
-            <w:tcW w:w="1024" w:type="pct"/>
-            <w:tcBorders>
-              <w:top w:val="single" w:sz="4" w:space="0" w:color="000000"/>
-              <w:left w:val="single" w:sz="4" w:space="0" w:color="000000"/>
-              <w:bottom w:val="single" w:sz="4" w:space="0" w:color="000000"/>
-              <w:right w:val="single" w:sz="4" w:space="0" w:color="000000"/>
-            </w:tcBorders>
-            <w:vAlign w:val="center"/>
-          </w:tcPr>
-          <w:p>
-            <w:pPr>
-              <w:spacing w:line="276" w:lineRule="auto"/>
-              <w:rPr>
-                <w:rFonts w:ascii="Times New Roman" w:eastAsia="Times" w:hAnsi="Times New Roman" w:cs="Times New Roman"/>
-                <w:color w:val="000000" w:themeColor="text1"/>
-                <w:sz w:val="22"/>
-                <w:szCs w:val="22"/>
-              </w:rPr>
-            </w:pPr>
+              <w:t>No</w:t>
+            </w:r>
           </w:p>
         </w:tc>
       </w:tr>
@@ -2814,7 +2903,6 @@
                 <w:sz w:val="22"/>
                 <w:szCs w:val="22"/>
               </w:rPr>
-              <w:lastRenderedPageBreak/>
               <w:t xml:space="preserve">Horns </w:t>
             </w:r>
           </w:p>
@@ -2921,6 +3009,14 @@
                 <w:szCs w:val="22"/>
               </w:rPr>
             </w:pPr>
+            <w:r>
+              <w:rPr>
+                <w:rFonts w:ascii="Times New Roman" w:eastAsia="Times" w:hAnsi="Times New Roman" w:cs="Times New Roman"/>
+                <w:sz w:val="22"/>
+                <w:szCs w:val="22"/>
+              </w:rPr>
+              <w:t>Leave as is</w:t>
+            </w:r>
           </w:p>
         </w:tc>
       </w:tr>
@@ -3058,25 +3154,7 @@
                 <w:sz w:val="22"/>
                 <w:szCs w:val="22"/>
               </w:rPr>
-              <w:t xml:space="preserve"> clarinet </w:t>
-            </w:r>
-            <w:r>
-              <w:rPr>
-                <w:rFonts w:ascii="Times New Roman" w:eastAsia="Times" w:hAnsi="Times New Roman" w:cs="Times New Roman"/>
-                <w:color w:val="E97132"/>
-                <w:sz w:val="22"/>
-                <w:szCs w:val="22"/>
-              </w:rPr>
-              <w:t xml:space="preserve">written </w:t>
-            </w:r>
-            <w:r>
-              <w:rPr>
-                <w:rFonts w:ascii="Times New Roman" w:eastAsia="Times" w:hAnsi="Times New Roman" w:cs="Times New Roman"/>
-                <w:color w:val="E97132"/>
-                <w:sz w:val="22"/>
-                <w:szCs w:val="22"/>
-              </w:rPr>
-              <w:t>C</w:t>
+              <w:t xml:space="preserve"> clarinet written C</w:t>
             </w:r>
             <w:r>
               <w:rPr>
@@ -3094,34 +3172,7 @@
                 <w:sz w:val="22"/>
                 <w:szCs w:val="22"/>
               </w:rPr>
-              <w:t xml:space="preserve"> corrected to C</w:t>
-            </w:r>
-            <w:r>
-              <w:rPr>
-                <w:rFonts w:ascii="Times New Roman" w:eastAsia="Times" w:hAnsi="Times New Roman" w:cs="Times New Roman"/>
-                <w:color w:val="E97132"/>
-                <w:sz w:val="22"/>
-                <w:szCs w:val="22"/>
-              </w:rPr>
-              <w:t>♯</w:t>
-            </w:r>
-            <w:r>
-              <w:rPr>
-                <w:rFonts w:ascii="Times New Roman" w:eastAsia="Times" w:hAnsi="Times New Roman" w:cs="Times New Roman"/>
-                <w:color w:val="E97132"/>
-                <w:sz w:val="22"/>
-                <w:szCs w:val="22"/>
-              </w:rPr>
-              <w:t xml:space="preserve"> (sounding </w:t>
-            </w:r>
-            <w:r>
-              <w:rPr>
-                <w:rFonts w:ascii="Times New Roman" w:eastAsia="Times" w:hAnsi="Times New Roman" w:cs="Times New Roman"/>
-                <w:color w:val="E97132"/>
-                <w:sz w:val="22"/>
-                <w:szCs w:val="22"/>
-              </w:rPr>
-              <w:t>B</w:t>
+              <w:t xml:space="preserve"> corrected to C♯ (sounding B</w:t>
             </w:r>
             <w:r>
               <w:rPr>
@@ -3163,6 +3214,14 @@
                 <w:szCs w:val="22"/>
               </w:rPr>
             </w:pPr>
+            <w:r>
+              <w:rPr>
+                <w:rFonts w:ascii="Times New Roman" w:eastAsia="Times" w:hAnsi="Times New Roman" w:cs="Times New Roman"/>
+                <w:sz w:val="22"/>
+                <w:szCs w:val="22"/>
+              </w:rPr>
+              <w:t>Use C#</w:t>
+            </w:r>
           </w:p>
         </w:tc>
       </w:tr>
@@ -3398,6 +3457,14 @@
                 <w:szCs w:val="22"/>
               </w:rPr>
             </w:pPr>
+            <w:r>
+              <w:rPr>
+                <w:rFonts w:ascii="Times New Roman" w:eastAsia="Times" w:hAnsi="Times New Roman" w:cs="Times New Roman"/>
+                <w:sz w:val="22"/>
+                <w:szCs w:val="22"/>
+              </w:rPr>
+              <w:t>Written!</w:t>
+            </w:r>
           </w:p>
         </w:tc>
       </w:tr>
@@ -3508,47 +3575,7 @@
                 <w:sz w:val="22"/>
                 <w:szCs w:val="22"/>
               </w:rPr>
-              <w:t xml:space="preserve"> beat E</w:t>
-            </w:r>
-            <w:r>
-              <w:rPr>
-                <w:rFonts w:ascii="Times New Roman" w:eastAsia="Times" w:hAnsi="Times New Roman" w:cs="Times New Roman"/>
-                <w:sz w:val="22"/>
-                <w:szCs w:val="22"/>
-              </w:rPr>
-              <w:t>♯</w:t>
-            </w:r>
-            <w:r>
-              <w:rPr>
-                <w:rFonts w:ascii="Times New Roman" w:eastAsia="Times" w:hAnsi="Times New Roman" w:cs="Times New Roman"/>
-                <w:sz w:val="22"/>
-                <w:szCs w:val="22"/>
-              </w:rPr>
-              <w:t xml:space="preserve"> </w:t>
-            </w:r>
-            <w:r>
-              <w:rPr>
-                <w:rFonts w:ascii="Times New Roman" w:eastAsia="Times" w:hAnsi="Times New Roman" w:cs="Times New Roman"/>
-                <w:sz w:val="22"/>
-                <w:szCs w:val="22"/>
-              </w:rPr>
-              <w:t>or</w:t>
-            </w:r>
-            <w:r>
-              <w:rPr>
-                <w:rFonts w:ascii="Times New Roman" w:eastAsia="Times" w:hAnsi="Times New Roman" w:cs="Times New Roman"/>
-                <w:sz w:val="22"/>
-                <w:szCs w:val="22"/>
-              </w:rPr>
-              <w:t xml:space="preserve"> meant to be</w:t>
-            </w:r>
-            <w:r>
-              <w:rPr>
-                <w:rFonts w:ascii="Times New Roman" w:eastAsia="Times" w:hAnsi="Times New Roman" w:cs="Times New Roman"/>
-                <w:sz w:val="22"/>
-                <w:szCs w:val="22"/>
-              </w:rPr>
-              <w:t xml:space="preserve"> E</w:t>
+              <w:t xml:space="preserve"> beat E♯ or meant to be E</w:t>
             </w:r>
             <w:r>
               <w:rPr>
@@ -3588,6 +3615,14 @@
                 <w:szCs w:val="22"/>
               </w:rPr>
             </w:pPr>
+            <w:r>
+              <w:rPr>
+                <w:rFonts w:ascii="Times New Roman" w:eastAsia="Times" w:hAnsi="Times New Roman" w:cs="Times New Roman"/>
+                <w:sz w:val="22"/>
+                <w:szCs w:val="22"/>
+              </w:rPr>
+              <w:t>E#</w:t>
+            </w:r>
           </w:p>
         </w:tc>
       </w:tr>
@@ -3687,7 +3722,25 @@
                 <w:sz w:val="22"/>
                 <w:szCs w:val="22"/>
               </w:rPr>
-              <w:t xml:space="preserve">Bears 2 and 4, enharmonic instead? </w:t>
+              <w:t>Bea</w:t>
+            </w:r>
+            <w:r>
+              <w:rPr>
+                <w:rFonts w:ascii="Times New Roman" w:eastAsia="Times" w:hAnsi="Times New Roman" w:cs="Times New Roman"/>
+                <w:color w:val="000000" w:themeColor="text1"/>
+                <w:sz w:val="22"/>
+                <w:szCs w:val="22"/>
+              </w:rPr>
+              <w:t>t</w:t>
+            </w:r>
+            <w:r>
+              <w:rPr>
+                <w:rFonts w:ascii="Times New Roman" w:eastAsia="Times" w:hAnsi="Times New Roman" w:cs="Times New Roman"/>
+                <w:color w:val="000000" w:themeColor="text1"/>
+                <w:sz w:val="22"/>
+                <w:szCs w:val="22"/>
+              </w:rPr>
+              <w:t xml:space="preserve">s 2 and 4, enharmonic instead? </w:t>
             </w:r>
           </w:p>
         </w:tc>
@@ -3712,6 +3765,15 @@
                 <w:szCs w:val="22"/>
               </w:rPr>
             </w:pPr>
+            <w:r>
+              <w:rPr>
+                <w:rFonts w:ascii="Times New Roman" w:eastAsia="Times" w:hAnsi="Times New Roman" w:cs="Times New Roman"/>
+                <w:color w:val="000000" w:themeColor="text1"/>
+                <w:sz w:val="22"/>
+                <w:szCs w:val="22"/>
+              </w:rPr>
+              <w:t>No</w:t>
+            </w:r>
           </w:p>
         </w:tc>
       </w:tr>
@@ -3863,6 +3925,15 @@
                 <w:szCs w:val="22"/>
               </w:rPr>
             </w:pPr>
+            <w:r>
+              <w:rPr>
+                <w:rFonts w:ascii="Times New Roman" w:eastAsia="Times" w:hAnsi="Times New Roman" w:cs="Times New Roman"/>
+                <w:color w:val="E97132"/>
+                <w:sz w:val="22"/>
+                <w:szCs w:val="22"/>
+              </w:rPr>
+              <w:t>Correct</w:t>
+            </w:r>
           </w:p>
         </w:tc>
       </w:tr>
@@ -3973,31 +4044,7 @@
                 <w:sz w:val="22"/>
                 <w:szCs w:val="22"/>
               </w:rPr>
-              <w:t xml:space="preserve"> beat, </w:t>
-            </w:r>
-            <w:r>
-              <w:rPr>
-                <w:rFonts w:ascii="Times New Roman" w:eastAsia="Times" w:hAnsi="Times New Roman" w:cs="Times New Roman"/>
-                <w:sz w:val="22"/>
-                <w:szCs w:val="22"/>
-              </w:rPr>
-              <w:t>since there is an accent</w:t>
-            </w:r>
-            <w:r>
-              <w:rPr>
-                <w:rFonts w:ascii="Times New Roman" w:eastAsia="Times" w:hAnsi="Times New Roman" w:cs="Times New Roman"/>
-                <w:sz w:val="22"/>
-                <w:szCs w:val="22"/>
-              </w:rPr>
-              <w:t xml:space="preserve"> </w:t>
-            </w:r>
-            <w:r>
-              <w:rPr>
-                <w:rFonts w:ascii="Times New Roman" w:eastAsia="Times" w:hAnsi="Times New Roman" w:cs="Times New Roman"/>
-                <w:sz w:val="22"/>
-                <w:szCs w:val="22"/>
-              </w:rPr>
-              <w:t xml:space="preserve">on the A, can we remove the slur? </w:t>
+              <w:t xml:space="preserve"> beat, since there is an accent on the A, can we remove the slur? </w:t>
             </w:r>
           </w:p>
         </w:tc>
@@ -4021,6 +4068,14 @@
                 <w:szCs w:val="22"/>
               </w:rPr>
             </w:pPr>
+            <w:r>
+              <w:rPr>
+                <w:rFonts w:ascii="Times New Roman" w:eastAsia="Times" w:hAnsi="Times New Roman" w:cs="Times New Roman"/>
+                <w:sz w:val="22"/>
+                <w:szCs w:val="22"/>
+              </w:rPr>
+              <w:t>Remove the tie</w:t>
+            </w:r>
           </w:p>
         </w:tc>
       </w:tr>
@@ -4165,6 +4220,26 @@
                 <w:szCs w:val="22"/>
               </w:rPr>
             </w:pPr>
+            <w:proofErr w:type="gramStart"/>
+            <w:r>
+              <w:rPr>
+                <w:rFonts w:ascii="Times New Roman" w:eastAsia="Times" w:hAnsi="Times New Roman" w:cs="Times New Roman"/>
+                <w:color w:val="000000" w:themeColor="text1"/>
+                <w:sz w:val="22"/>
+                <w:szCs w:val="22"/>
+              </w:rPr>
+              <w:t>No</w:t>
+            </w:r>
+            <w:proofErr w:type="gramEnd"/>
+            <w:r>
+              <w:rPr>
+                <w:rFonts w:ascii="Times New Roman" w:eastAsia="Times" w:hAnsi="Times New Roman" w:cs="Times New Roman"/>
+                <w:color w:val="000000" w:themeColor="text1"/>
+                <w:sz w:val="22"/>
+                <w:szCs w:val="22"/>
+              </w:rPr>
+              <w:t xml:space="preserve"> it's correct.</w:t>
+            </w:r>
           </w:p>
         </w:tc>
       </w:tr>
@@ -4289,6 +4364,15 @@
                 <w:szCs w:val="22"/>
               </w:rPr>
             </w:pPr>
+            <w:r>
+              <w:rPr>
+                <w:rFonts w:ascii="Times New Roman" w:eastAsia="Times" w:hAnsi="Times New Roman" w:cs="Times New Roman"/>
+                <w:color w:val="000000" w:themeColor="text1"/>
+                <w:sz w:val="22"/>
+                <w:szCs w:val="22"/>
+              </w:rPr>
+              <w:t>Leave in score, part should stay alto</w:t>
+            </w:r>
           </w:p>
         </w:tc>
       </w:tr>
@@ -4416,6 +4500,14 @@
                 <w:szCs w:val="22"/>
               </w:rPr>
             </w:pPr>
+            <w:r>
+              <w:rPr>
+                <w:rFonts w:ascii="Times New Roman" w:eastAsia="Times" w:hAnsi="Times New Roman" w:cs="Times New Roman"/>
+                <w:sz w:val="22"/>
+                <w:szCs w:val="22"/>
+              </w:rPr>
+              <w:t>Leave</w:t>
+            </w:r>
           </w:p>
         </w:tc>
       </w:tr>
@@ -4730,6 +4822,15 @@
                 <w:szCs w:val="22"/>
               </w:rPr>
             </w:pPr>
+            <w:r>
+              <w:rPr>
+                <w:rFonts w:ascii="Times New Roman" w:eastAsia="Times" w:hAnsi="Times New Roman" w:cs="Times New Roman"/>
+                <w:color w:val="E97132"/>
+                <w:sz w:val="22"/>
+                <w:szCs w:val="22"/>
+              </w:rPr>
+              <w:t>Ok</w:t>
+            </w:r>
           </w:p>
         </w:tc>
       </w:tr>
@@ -4840,31 +4941,7 @@
                 <w:sz w:val="22"/>
                 <w:szCs w:val="22"/>
               </w:rPr>
-              <w:t xml:space="preserve"> beat, h</w:t>
-            </w:r>
-            <w:r>
-              <w:rPr>
-                <w:rFonts w:ascii="Times New Roman" w:eastAsia="Times" w:hAnsi="Times New Roman" w:cs="Times New Roman"/>
-                <w:sz w:val="22"/>
-                <w:szCs w:val="22"/>
-              </w:rPr>
-              <w:t xml:space="preserve">ighly dissonant </w:t>
-            </w:r>
-            <w:r>
-              <w:rPr>
-                <w:rFonts w:ascii="Times New Roman" w:eastAsia="Times" w:hAnsi="Times New Roman" w:cs="Times New Roman"/>
-                <w:sz w:val="22"/>
-                <w:szCs w:val="22"/>
-              </w:rPr>
-              <w:t>chord.</w:t>
-            </w:r>
-            <w:r>
-              <w:rPr>
-                <w:rFonts w:ascii="Times New Roman" w:eastAsia="Times" w:hAnsi="Times New Roman" w:cs="Times New Roman"/>
-                <w:sz w:val="22"/>
-                <w:szCs w:val="22"/>
-              </w:rPr>
-              <w:t xml:space="preserve"> E</w:t>
+              <w:t xml:space="preserve"> beat, highly dissonant chord. E</w:t>
             </w:r>
             <w:r>
               <w:rPr>
@@ -4912,31 +4989,7 @@
                 <w:sz w:val="22"/>
                 <w:szCs w:val="22"/>
               </w:rPr>
-              <w:t xml:space="preserve"> </w:t>
-            </w:r>
-            <w:r>
-              <w:rPr>
-                <w:rFonts w:ascii="Times New Roman" w:eastAsia="Times" w:hAnsi="Times New Roman" w:cs="Times New Roman"/>
-                <w:sz w:val="22"/>
-                <w:szCs w:val="22"/>
-              </w:rPr>
-              <w:t xml:space="preserve">in </w:t>
-            </w:r>
-            <w:r>
-              <w:rPr>
-                <w:rFonts w:ascii="Times New Roman" w:eastAsia="Times" w:hAnsi="Times New Roman" w:cs="Times New Roman"/>
-                <w:sz w:val="22"/>
-                <w:szCs w:val="22"/>
-              </w:rPr>
-              <w:t>bassoon.</w:t>
-            </w:r>
-            <w:r>
-              <w:rPr>
-                <w:rFonts w:ascii="Times New Roman" w:eastAsia="Times" w:hAnsi="Times New Roman" w:cs="Times New Roman"/>
-                <w:sz w:val="22"/>
-                <w:szCs w:val="22"/>
-              </w:rPr>
-              <w:t xml:space="preserve"> Is this intentional? </w:t>
+              <w:t xml:space="preserve"> in bassoon. Is this intentional? </w:t>
             </w:r>
           </w:p>
         </w:tc>
@@ -4960,6 +5013,14 @@
                 <w:szCs w:val="22"/>
               </w:rPr>
             </w:pPr>
+            <w:r>
+              <w:rPr>
+                <w:rFonts w:ascii="Times New Roman" w:eastAsia="Times" w:hAnsi="Times New Roman" w:cs="Times New Roman"/>
+                <w:sz w:val="22"/>
+                <w:szCs w:val="22"/>
+              </w:rPr>
+              <w:t>Yup</w:t>
+            </w:r>
           </w:p>
         </w:tc>
       </w:tr>
@@ -5117,6 +5178,14 @@
                 <w:szCs w:val="22"/>
               </w:rPr>
             </w:pPr>
+            <w:r>
+              <w:rPr>
+                <w:rFonts w:ascii="Times New Roman" w:eastAsia="Times" w:hAnsi="Times New Roman" w:cs="Times New Roman"/>
+                <w:sz w:val="22"/>
+                <w:szCs w:val="22"/>
+              </w:rPr>
+              <w:t>G natural</w:t>
+            </w:r>
           </w:p>
         </w:tc>
       </w:tr>
@@ -5270,6 +5339,14 @@
                 <w:szCs w:val="22"/>
               </w:rPr>
             </w:pPr>
+            <w:r>
+              <w:rPr>
+                <w:rFonts w:ascii="Times New Roman" w:eastAsia="Times" w:hAnsi="Times New Roman" w:cs="Times New Roman"/>
+                <w:sz w:val="22"/>
+                <w:szCs w:val="22"/>
+              </w:rPr>
+              <w:t>Change to grace note and cut slur.</w:t>
+            </w:r>
           </w:p>
         </w:tc>
       </w:tr>
@@ -5363,23 +5440,7 @@
                 <w:sz w:val="22"/>
                 <w:szCs w:val="22"/>
               </w:rPr>
-              <w:t>What are the pitches for this harp glissand</w:t>
-            </w:r>
-            <w:r>
-              <w:rPr>
-                <w:rFonts w:ascii="Times New Roman" w:eastAsia="Times" w:hAnsi="Times New Roman" w:cs="Times New Roman"/>
-                <w:sz w:val="22"/>
-                <w:szCs w:val="22"/>
-              </w:rPr>
-              <w:t>o</w:t>
-            </w:r>
-            <w:r>
-              <w:rPr>
-                <w:rFonts w:ascii="Times New Roman" w:eastAsia="Times" w:hAnsi="Times New Roman" w:cs="Times New Roman"/>
-                <w:sz w:val="22"/>
-                <w:szCs w:val="22"/>
-              </w:rPr>
-              <w:t>? Is it still in G</w:t>
+              <w:t>What are the pitches for this harp glissando? Is it still in G</w:t>
             </w:r>
             <w:r>
               <w:rPr>
@@ -5419,6 +5480,14 @@
                 <w:szCs w:val="22"/>
               </w:rPr>
             </w:pPr>
+            <w:r>
+              <w:rPr>
+                <w:rFonts w:ascii="Times New Roman" w:eastAsia="Times" w:hAnsi="Times New Roman" w:cs="Times New Roman"/>
+                <w:sz w:val="22"/>
+                <w:szCs w:val="22"/>
+              </w:rPr>
+              <w:t>Yup it is.</w:t>
+            </w:r>
           </w:p>
         </w:tc>
       </w:tr>
@@ -5536,6 +5605,14 @@
                 <w:szCs w:val="22"/>
               </w:rPr>
             </w:pPr>
+            <w:r>
+              <w:rPr>
+                <w:rFonts w:ascii="Times New Roman" w:eastAsia="Times" w:hAnsi="Times New Roman" w:cs="Times New Roman"/>
+                <w:sz w:val="22"/>
+                <w:szCs w:val="22"/>
+              </w:rPr>
+              <w:t>Leave as is</w:t>
+            </w:r>
           </w:p>
         </w:tc>
       </w:tr>
@@ -5569,6 +5646,7 @@
                 <w:sz w:val="22"/>
                 <w:szCs w:val="22"/>
               </w:rPr>
+              <w:lastRenderedPageBreak/>
               <w:t>VC</w:t>
             </w:r>
           </w:p>
@@ -5681,6 +5759,14 @@
                 <w:szCs w:val="22"/>
               </w:rPr>
             </w:pPr>
+            <w:r>
+              <w:rPr>
+                <w:rFonts w:ascii="Times New Roman" w:eastAsia="Times" w:hAnsi="Times New Roman" w:cs="Times New Roman"/>
+                <w:sz w:val="22"/>
+                <w:szCs w:val="22"/>
+              </w:rPr>
+              <w:t>Yup but clean up</w:t>
+            </w:r>
           </w:p>
         </w:tc>
       </w:tr>
@@ -5790,23 +5876,7 @@
                 <w:sz w:val="22"/>
                 <w:szCs w:val="22"/>
               </w:rPr>
-              <w:t xml:space="preserve"> clash with F</w:t>
-            </w:r>
-            <w:r>
-              <w:rPr>
-                <w:rFonts w:ascii="Times New Roman" w:eastAsia="Times" w:hAnsi="Times New Roman" w:cs="Times New Roman"/>
-                <w:sz w:val="22"/>
-                <w:szCs w:val="22"/>
-              </w:rPr>
-              <w:t>♯</w:t>
-            </w:r>
-            <w:r>
-              <w:rPr>
-                <w:rFonts w:ascii="Times New Roman" w:eastAsia="Times" w:hAnsi="Times New Roman" w:cs="Times New Roman"/>
-                <w:sz w:val="22"/>
-                <w:szCs w:val="22"/>
-              </w:rPr>
-              <w:t>?</w:t>
+              <w:t xml:space="preserve"> clash with F♯?</w:t>
             </w:r>
           </w:p>
         </w:tc>
@@ -5830,6 +5900,14 @@
                 <w:szCs w:val="22"/>
               </w:rPr>
             </w:pPr>
+            <w:r>
+              <w:rPr>
+                <w:rFonts w:ascii="Times New Roman" w:eastAsia="Times" w:hAnsi="Times New Roman" w:cs="Times New Roman"/>
+                <w:sz w:val="22"/>
+                <w:szCs w:val="22"/>
+              </w:rPr>
+              <w:t>No</w:t>
+            </w:r>
           </w:p>
         </w:tc>
       </w:tr>
@@ -5947,6 +6025,14 @@
                 <w:szCs w:val="22"/>
               </w:rPr>
             </w:pPr>
+            <w:r>
+              <w:rPr>
+                <w:rFonts w:ascii="Times New Roman" w:eastAsia="Times" w:hAnsi="Times New Roman" w:cs="Times New Roman"/>
+                <w:sz w:val="22"/>
+                <w:szCs w:val="22"/>
+              </w:rPr>
+              <w:t>It's correct, B on D string not on A string so no string skip</w:t>
+            </w:r>
           </w:p>
         </w:tc>
       </w:tr>
@@ -5980,7 +6066,6 @@
                 <w:sz w:val="22"/>
                 <w:szCs w:val="22"/>
               </w:rPr>
-              <w:lastRenderedPageBreak/>
               <w:t>Cymbal</w:t>
             </w:r>
           </w:p>
@@ -6041,15 +6126,7 @@
                 <w:sz w:val="22"/>
                 <w:szCs w:val="22"/>
               </w:rPr>
-              <w:t>Is this a suspended cymbal or crash cymbal?</w:t>
-            </w:r>
-            <w:r>
-              <w:rPr>
-                <w:rFonts w:ascii="Times New Roman" w:eastAsia="Times" w:hAnsi="Times New Roman" w:cs="Times New Roman"/>
-                <w:sz w:val="22"/>
-                <w:szCs w:val="22"/>
-              </w:rPr>
-              <w:t xml:space="preserve"> Seems like the notation has a sizzling effect.</w:t>
+              <w:t>Is this a suspended cymbal or crash cymbal? Seems like the notation has a sizzling effect.</w:t>
             </w:r>
           </w:p>
         </w:tc>
@@ -6073,6 +6150,14 @@
                 <w:szCs w:val="22"/>
               </w:rPr>
             </w:pPr>
+            <w:r>
+              <w:rPr>
+                <w:rFonts w:ascii="Times New Roman" w:eastAsia="Times" w:hAnsi="Times New Roman" w:cs="Times New Roman"/>
+                <w:sz w:val="22"/>
+                <w:szCs w:val="22"/>
+              </w:rPr>
+              <w:t>Crash cymbal</w:t>
+            </w:r>
           </w:p>
         </w:tc>
       </w:tr>
@@ -6136,15 +6221,7 @@
                 <w:sz w:val="22"/>
                 <w:szCs w:val="22"/>
               </w:rPr>
-              <w:t>229-23</w:t>
-            </w:r>
-            <w:r>
-              <w:rPr>
-                <w:rFonts w:ascii="Times New Roman" w:eastAsia="Times" w:hAnsi="Times New Roman" w:cs="Times New Roman"/>
-                <w:sz w:val="22"/>
-                <w:szCs w:val="22"/>
-              </w:rPr>
-              <w:t>1</w:t>
+              <w:t>229-231</w:t>
             </w:r>
           </w:p>
         </w:tc>
@@ -6198,6 +6275,14 @@
                 <w:szCs w:val="22"/>
               </w:rPr>
             </w:pPr>
+            <w:r>
+              <w:rPr>
+                <w:rFonts w:ascii="Times New Roman" w:eastAsia="Times" w:hAnsi="Times New Roman" w:cs="Times New Roman"/>
+                <w:sz w:val="22"/>
+                <w:szCs w:val="22"/>
+              </w:rPr>
+              <w:t>It's 1 2 3</w:t>
+            </w:r>
           </w:p>
         </w:tc>
       </w:tr>

</xml_diff>

<commit_message>
Update TCB Mvt for Vn and Orch - Errata_v1.docx
</commit_message>
<xml_diff>
--- a/Proof Reading and Review/TCB Mvt for Vn and Orch - Errata_v1.docx
+++ b/Proof Reading and Review/TCB Mvt for Vn and Orch - Errata_v1.docx
@@ -6429,6 +6429,14 @@
                 <w:szCs w:val="22"/>
               </w:rPr>
             </w:pPr>
+            <w:r>
+              <w:rPr>
+                <w:rFonts w:ascii="Times New Roman" w:eastAsia="Times" w:hAnsi="Times New Roman" w:cs="Times New Roman"/>
+                <w:sz w:val="22"/>
+                <w:szCs w:val="22"/>
+              </w:rPr>
+              <w:t>Ensure Tam-tam is on F (lower than bass drum)</w:t>
+            </w:r>
           </w:p>
         </w:tc>
       </w:tr>

</xml_diff>

<commit_message>
v22: Cleaned up several alignment errors, misaligned hairpins and missing articulations. Not finished; to continue.
</commit_message>
<xml_diff>
--- a/Proof Reading and Review/TCB Mvt for Vn and Orch - Errata_v1.docx
+++ b/Proof Reading and Review/TCB Mvt for Vn and Orch - Errata_v1.docx
@@ -1045,7 +1045,6 @@
               </w:rPr>
               <w:t xml:space="preserve">Dynamics. Do you want them to crescendo before the </w:t>
             </w:r>
-            <w:proofErr w:type="spellStart"/>
             <w:r>
               <w:rPr>
                 <w:rFonts w:ascii="Times New Roman" w:eastAsia="Times" w:hAnsi="Times New Roman" w:cs="Times New Roman"/>
@@ -1058,7 +1057,6 @@
               </w:rPr>
               <w:t>mp</w:t>
             </w:r>
-            <w:proofErr w:type="spellEnd"/>
             <w:r>
               <w:rPr>
                 <w:rFonts w:ascii="Times New Roman" w:eastAsia="Times" w:hAnsi="Times New Roman" w:cs="Times New Roman"/>
@@ -1799,43 +1797,7 @@
                 <w:sz w:val="22"/>
                 <w:szCs w:val="22"/>
               </w:rPr>
-              <w:t xml:space="preserve">II, </w:t>
-            </w:r>
-            <w:proofErr w:type="spellStart"/>
-            <w:r>
-              <w:rPr>
-                <w:rFonts w:ascii="Times New Roman" w:eastAsia="Times" w:hAnsi="Times New Roman" w:cs="Times New Roman"/>
-                <w:sz w:val="22"/>
-                <w:szCs w:val="22"/>
-              </w:rPr>
-              <w:t>Vla</w:t>
-            </w:r>
-            <w:proofErr w:type="spellEnd"/>
-            <w:r>
-              <w:rPr>
-                <w:rFonts w:ascii="Times New Roman" w:eastAsia="Times" w:hAnsi="Times New Roman" w:cs="Times New Roman"/>
-                <w:sz w:val="22"/>
-                <w:szCs w:val="22"/>
-              </w:rPr>
-              <w:t xml:space="preserve">, </w:t>
-            </w:r>
-            <w:proofErr w:type="spellStart"/>
-            <w:r>
-              <w:rPr>
-                <w:rFonts w:ascii="Times New Roman" w:eastAsia="Times" w:hAnsi="Times New Roman" w:cs="Times New Roman"/>
-                <w:sz w:val="22"/>
-                <w:szCs w:val="22"/>
-              </w:rPr>
-              <w:t>Vc</w:t>
-            </w:r>
-            <w:proofErr w:type="spellEnd"/>
-            <w:r>
-              <w:rPr>
-                <w:rFonts w:ascii="Times New Roman" w:eastAsia="Times" w:hAnsi="Times New Roman" w:cs="Times New Roman"/>
-                <w:sz w:val="22"/>
-                <w:szCs w:val="22"/>
-              </w:rPr>
-              <w:t>.</w:t>
+              <w:t>II, Vla, Vc.</w:t>
             </w:r>
           </w:p>
         </w:tc>
@@ -2818,7 +2780,6 @@
                 <w:szCs w:val="22"/>
               </w:rPr>
             </w:pPr>
-            <w:proofErr w:type="spellStart"/>
             <w:r>
               <w:rPr>
                 <w:rFonts w:ascii="Times New Roman" w:eastAsia="Times" w:hAnsi="Times New Roman" w:cs="Times New Roman"/>
@@ -2826,17 +2787,7 @@
                 <w:sz w:val="22"/>
                 <w:szCs w:val="22"/>
               </w:rPr>
-              <w:t>Enharmonics</w:t>
-            </w:r>
-            <w:proofErr w:type="spellEnd"/>
-            <w:r>
-              <w:rPr>
-                <w:rFonts w:ascii="Times New Roman" w:eastAsia="Times" w:hAnsi="Times New Roman" w:cs="Times New Roman"/>
-                <w:color w:val="000000" w:themeColor="text1"/>
-                <w:sz w:val="22"/>
-                <w:szCs w:val="22"/>
-              </w:rPr>
-              <w:t xml:space="preserve">: should flats be sharp for voice leading purposes here instead? </w:t>
+              <w:t xml:space="preserve">Enharmonics: should flats be sharp for voice leading purposes here instead? </w:t>
             </w:r>
           </w:p>
         </w:tc>
@@ -2965,7 +2916,6 @@
               </w:rPr>
               <w:t xml:space="preserve">Staccatissimo on long held notes? Recommend using </w:t>
             </w:r>
-            <w:proofErr w:type="spellStart"/>
             <w:r>
               <w:rPr>
                 <w:rFonts w:ascii="Times New Roman" w:eastAsia="Times" w:hAnsi="Times New Roman" w:cs="Times New Roman"/>
@@ -2978,14 +2928,13 @@
               </w:rPr>
               <w:t>sfz</w:t>
             </w:r>
-            <w:proofErr w:type="spellEnd"/>
-            <w:r>
-              <w:rPr>
-                <w:rFonts w:ascii="Times New Roman" w:eastAsia="Times" w:hAnsi="Times New Roman" w:cs="Times New Roman"/>
-                <w:sz w:val="22"/>
-                <w:szCs w:val="22"/>
-              </w:rPr>
-              <w:t xml:space="preserve"> instead.  </w:t>
+            <w:r>
+              <w:rPr>
+                <w:rFonts w:ascii="Times New Roman" w:eastAsia="Times" w:hAnsi="Times New Roman" w:cs="Times New Roman"/>
+                <w:sz w:val="22"/>
+                <w:szCs w:val="22"/>
+              </w:rPr>
+              <w:t xml:space="preserve"> instead.</w:t>
             </w:r>
           </w:p>
         </w:tc>
@@ -3249,7 +3198,6 @@
                 <w:szCs w:val="22"/>
               </w:rPr>
             </w:pPr>
-            <w:proofErr w:type="spellStart"/>
             <w:r>
               <w:rPr>
                 <w:rFonts w:ascii="Times New Roman" w:eastAsia="Times" w:hAnsi="Times New Roman" w:cs="Times New Roman"/>
@@ -3258,7 +3206,6 @@
               </w:rPr>
               <w:t>Cbsn</w:t>
             </w:r>
-            <w:proofErr w:type="spellEnd"/>
           </w:p>
         </w:tc>
         <w:tc>
@@ -4175,19 +4122,31 @@
                 <w:sz w:val="22"/>
                 <w:szCs w:val="22"/>
               </w:rPr>
-              <w:t xml:space="preserve">Suggest swapping </w:t>
-            </w:r>
-            <w:proofErr w:type="spellStart"/>
-            <w:r>
+              <w:t xml:space="preserve">Suggest swapping Tpt. 2 and 3 voices around for easier score reading. </w:t>
+            </w:r>
+          </w:p>
+        </w:tc>
+        <w:tc>
+          <w:tcPr>
+            <w:tcW w:w="1024" w:type="pct"/>
+            <w:tcBorders>
+              <w:top w:val="single" w:sz="4" w:space="0" w:color="000000"/>
+              <w:left w:val="single" w:sz="4" w:space="0" w:color="000000"/>
+              <w:bottom w:val="single" w:sz="4" w:space="0" w:color="000000"/>
+              <w:right w:val="single" w:sz="4" w:space="0" w:color="000000"/>
+            </w:tcBorders>
+            <w:vAlign w:val="center"/>
+          </w:tcPr>
+          <w:p>
+            <w:pPr>
+              <w:spacing w:line="276" w:lineRule="auto"/>
               <w:rPr>
                 <w:rFonts w:ascii="Times New Roman" w:eastAsia="Times" w:hAnsi="Times New Roman" w:cs="Times New Roman"/>
                 <w:color w:val="000000" w:themeColor="text1"/>
                 <w:sz w:val="22"/>
                 <w:szCs w:val="22"/>
               </w:rPr>
-              <w:t>Tpt</w:t>
-            </w:r>
-            <w:proofErr w:type="spellEnd"/>
+            </w:pPr>
             <w:r>
               <w:rPr>
                 <w:rFonts w:ascii="Times New Roman" w:eastAsia="Times" w:hAnsi="Times New Roman" w:cs="Times New Roman"/>
@@ -4195,50 +4154,7 @@
                 <w:sz w:val="22"/>
                 <w:szCs w:val="22"/>
               </w:rPr>
-              <w:t xml:space="preserve">. 2 and 3 voices around for easier score reading. </w:t>
-            </w:r>
-          </w:p>
-        </w:tc>
-        <w:tc>
-          <w:tcPr>
-            <w:tcW w:w="1024" w:type="pct"/>
-            <w:tcBorders>
-              <w:top w:val="single" w:sz="4" w:space="0" w:color="000000"/>
-              <w:left w:val="single" w:sz="4" w:space="0" w:color="000000"/>
-              <w:bottom w:val="single" w:sz="4" w:space="0" w:color="000000"/>
-              <w:right w:val="single" w:sz="4" w:space="0" w:color="000000"/>
-            </w:tcBorders>
-            <w:vAlign w:val="center"/>
-          </w:tcPr>
-          <w:p>
-            <w:pPr>
-              <w:spacing w:line="276" w:lineRule="auto"/>
-              <w:rPr>
-                <w:rFonts w:ascii="Times New Roman" w:eastAsia="Times" w:hAnsi="Times New Roman" w:cs="Times New Roman"/>
-                <w:color w:val="000000" w:themeColor="text1"/>
-                <w:sz w:val="22"/>
-                <w:szCs w:val="22"/>
-              </w:rPr>
-            </w:pPr>
-            <w:proofErr w:type="gramStart"/>
-            <w:r>
-              <w:rPr>
-                <w:rFonts w:ascii="Times New Roman" w:eastAsia="Times" w:hAnsi="Times New Roman" w:cs="Times New Roman"/>
-                <w:color w:val="000000" w:themeColor="text1"/>
-                <w:sz w:val="22"/>
-                <w:szCs w:val="22"/>
-              </w:rPr>
-              <w:t>No</w:t>
-            </w:r>
-            <w:proofErr w:type="gramEnd"/>
-            <w:r>
-              <w:rPr>
-                <w:rFonts w:ascii="Times New Roman" w:eastAsia="Times" w:hAnsi="Times New Roman" w:cs="Times New Roman"/>
-                <w:color w:val="000000" w:themeColor="text1"/>
-                <w:sz w:val="22"/>
-                <w:szCs w:val="22"/>
-              </w:rPr>
-              <w:t xml:space="preserve"> it's correct.</w:t>
+              <w:t>No it's correct.</w:t>
             </w:r>
           </w:p>
         </w:tc>
@@ -4400,23 +4316,13 @@
                 <w:szCs w:val="22"/>
               </w:rPr>
             </w:pPr>
-            <w:proofErr w:type="spellStart"/>
-            <w:r>
-              <w:rPr>
-                <w:rFonts w:ascii="Times New Roman" w:eastAsia="Times" w:hAnsi="Times New Roman" w:cs="Times New Roman"/>
-                <w:sz w:val="22"/>
-                <w:szCs w:val="22"/>
-              </w:rPr>
-              <w:t>Picc</w:t>
-            </w:r>
-            <w:proofErr w:type="spellEnd"/>
-            <w:r>
-              <w:rPr>
-                <w:rFonts w:ascii="Times New Roman" w:eastAsia="Times" w:hAnsi="Times New Roman" w:cs="Times New Roman"/>
-                <w:sz w:val="22"/>
-                <w:szCs w:val="22"/>
-              </w:rPr>
-              <w:t>.</w:t>
+            <w:r>
+              <w:rPr>
+                <w:rFonts w:ascii="Times New Roman" w:eastAsia="Times" w:hAnsi="Times New Roman" w:cs="Times New Roman"/>
+                <w:sz w:val="22"/>
+                <w:szCs w:val="22"/>
+              </w:rPr>
+              <w:t>Picc.</w:t>
             </w:r>
           </w:p>
         </w:tc>
@@ -4535,23 +4441,13 @@
                 <w:szCs w:val="22"/>
               </w:rPr>
             </w:pPr>
-            <w:proofErr w:type="spellStart"/>
-            <w:r>
-              <w:rPr>
-                <w:rFonts w:ascii="Times New Roman" w:eastAsia="Times" w:hAnsi="Times New Roman" w:cs="Times New Roman"/>
-                <w:sz w:val="22"/>
-                <w:szCs w:val="22"/>
-              </w:rPr>
-              <w:t>Picc</w:t>
-            </w:r>
-            <w:proofErr w:type="spellEnd"/>
-            <w:r>
-              <w:rPr>
-                <w:rFonts w:ascii="Times New Roman" w:eastAsia="Times" w:hAnsi="Times New Roman" w:cs="Times New Roman"/>
-                <w:sz w:val="22"/>
-                <w:szCs w:val="22"/>
-              </w:rPr>
-              <w:t>.</w:t>
+            <w:r>
+              <w:rPr>
+                <w:rFonts w:ascii="Times New Roman" w:eastAsia="Times" w:hAnsi="Times New Roman" w:cs="Times New Roman"/>
+                <w:sz w:val="22"/>
+                <w:szCs w:val="22"/>
+              </w:rPr>
+              <w:t>Picc.</w:t>
             </w:r>
           </w:p>
         </w:tc>
@@ -5701,41 +5597,13 @@
                 <w:szCs w:val="22"/>
               </w:rPr>
             </w:pPr>
-            <w:proofErr w:type="spellStart"/>
-            <w:r>
-              <w:rPr>
-                <w:rFonts w:ascii="Times New Roman" w:eastAsia="Times" w:hAnsi="Times New Roman" w:cs="Times New Roman"/>
-                <w:sz w:val="22"/>
-                <w:szCs w:val="22"/>
-              </w:rPr>
-              <w:t>Tuplet</w:t>
-            </w:r>
-            <w:proofErr w:type="spellEnd"/>
-            <w:r>
-              <w:rPr>
-                <w:rFonts w:ascii="Times New Roman" w:eastAsia="Times" w:hAnsi="Times New Roman" w:cs="Times New Roman"/>
-                <w:sz w:val="22"/>
-                <w:szCs w:val="22"/>
-              </w:rPr>
-              <w:t xml:space="preserve"> within </w:t>
-            </w:r>
-            <w:proofErr w:type="spellStart"/>
-            <w:r>
-              <w:rPr>
-                <w:rFonts w:ascii="Times New Roman" w:eastAsia="Times" w:hAnsi="Times New Roman" w:cs="Times New Roman"/>
-                <w:sz w:val="22"/>
-                <w:szCs w:val="22"/>
-              </w:rPr>
-              <w:t>tuplet</w:t>
-            </w:r>
-            <w:proofErr w:type="spellEnd"/>
-            <w:r>
-              <w:rPr>
-                <w:rFonts w:ascii="Times New Roman" w:eastAsia="Times" w:hAnsi="Times New Roman" w:cs="Times New Roman"/>
-                <w:sz w:val="22"/>
-                <w:szCs w:val="22"/>
-              </w:rPr>
-              <w:t xml:space="preserve">. </w:t>
+            <w:r>
+              <w:rPr>
+                <w:rFonts w:ascii="Times New Roman" w:eastAsia="Times" w:hAnsi="Times New Roman" w:cs="Times New Roman"/>
+                <w:sz w:val="22"/>
+                <w:szCs w:val="22"/>
+              </w:rPr>
+              <w:t xml:space="preserve">Tuplet within tuplet. </w:t>
             </w:r>
           </w:p>
         </w:tc>
@@ -6471,7 +6339,6 @@
           <w:rFonts w:ascii="Times New Roman" w:hAnsi="Times New Roman" w:cs="Times New Roman"/>
         </w:rPr>
       </w:pPr>
-      <w:proofErr w:type="spellStart"/>
       <w:r>
         <w:rPr>
           <w:rFonts w:ascii="Times New Roman" w:hAnsi="Times New Roman" w:cs="Times New Roman"/>
@@ -6479,34 +6346,7 @@
           <w:bCs/>
         </w:rPr>
         <w:lastRenderedPageBreak/>
-        <w:t>Prevous</w:t>
-      </w:r>
-      <w:proofErr w:type="spellEnd"/>
-      <w:r>
-        <w:rPr>
-          <w:rFonts w:ascii="Times New Roman" w:hAnsi="Times New Roman" w:cs="Times New Roman"/>
-          <w:b/>
-          <w:bCs/>
-        </w:rPr>
-        <w:t xml:space="preserve"> Errata (version 0 - solo </w:t>
-      </w:r>
-      <w:proofErr w:type="spellStart"/>
-      <w:r>
-        <w:rPr>
-          <w:rFonts w:ascii="Times New Roman" w:hAnsi="Times New Roman" w:cs="Times New Roman"/>
-          <w:b/>
-          <w:bCs/>
-        </w:rPr>
-        <w:t>vn</w:t>
-      </w:r>
-      <w:proofErr w:type="spellEnd"/>
-      <w:r>
-        <w:rPr>
-          <w:rFonts w:ascii="Times New Roman" w:hAnsi="Times New Roman" w:cs="Times New Roman"/>
-          <w:b/>
-          <w:bCs/>
-        </w:rPr>
-        <w:t xml:space="preserve"> only)</w:t>
+        <w:t>Prevous Errata (version 0 - solo vn only)</w:t>
       </w:r>
     </w:p>
     <w:tbl>
@@ -6554,16 +6394,8 @@
               <w:rPr>
                 <w:rFonts w:ascii="Times New Roman" w:eastAsia="Times" w:hAnsi="Times New Roman" w:cs="Times New Roman"/>
               </w:rPr>
-              <w:t xml:space="preserve">Solo </w:t>
-            </w:r>
-            <w:proofErr w:type="spellStart"/>
-            <w:r>
-              <w:rPr>
-                <w:rFonts w:ascii="Times New Roman" w:eastAsia="Times" w:hAnsi="Times New Roman" w:cs="Times New Roman"/>
-              </w:rPr>
-              <w:t>Vn</w:t>
-            </w:r>
-            <w:proofErr w:type="spellEnd"/>
+              <w:t>Solo Vn</w:t>
+            </w:r>
           </w:p>
         </w:tc>
         <w:tc>
@@ -7034,21 +6866,7 @@
               <w:rPr>
                 <w:rFonts w:ascii="Times New Roman" w:eastAsia="Times" w:hAnsi="Times New Roman" w:cs="Times New Roman"/>
               </w:rPr>
-              <w:t xml:space="preserve">Does </w:t>
-            </w:r>
-            <w:proofErr w:type="spellStart"/>
-            <w:r>
-              <w:rPr>
-                <w:rFonts w:ascii="Times New Roman" w:eastAsia="Times" w:hAnsi="Times New Roman" w:cs="Times New Roman"/>
-              </w:rPr>
-              <w:t>meno</w:t>
-            </w:r>
-            <w:proofErr w:type="spellEnd"/>
-            <w:r>
-              <w:rPr>
-                <w:rFonts w:ascii="Times New Roman" w:eastAsia="Times" w:hAnsi="Times New Roman" w:cs="Times New Roman"/>
-              </w:rPr>
-              <w:t xml:space="preserve"> mosso start at beat 1 of this bar or another beat?</w:t>
+              <w:t>Does meno mosso start at beat 1 of this bar or another beat?</w:t>
             </w:r>
           </w:p>
         </w:tc>

</xml_diff>

<commit_message>
V25: All cleaned up. Incorrect notes amended.
</commit_message>
<xml_diff>
--- a/Proof Reading and Review/TCB Mvt for Vn and Orch - Errata_v1.docx
+++ b/Proof Reading and Review/TCB Mvt for Vn and Orch - Errata_v1.docx
@@ -1045,6 +1045,7 @@
               </w:rPr>
               <w:t xml:space="preserve">Dynamics. Do you want them to crescendo before the </w:t>
             </w:r>
+            <w:proofErr w:type="spellStart"/>
             <w:r>
               <w:rPr>
                 <w:rFonts w:ascii="Times New Roman" w:eastAsia="Times" w:hAnsi="Times New Roman" w:cs="Times New Roman"/>
@@ -1057,6 +1058,7 @@
               </w:rPr>
               <w:t>mp</w:t>
             </w:r>
+            <w:proofErr w:type="spellEnd"/>
             <w:r>
               <w:rPr>
                 <w:rFonts w:ascii="Times New Roman" w:eastAsia="Times" w:hAnsi="Times New Roman" w:cs="Times New Roman"/>
@@ -1474,7 +1476,25 @@
                 <w:sz w:val="22"/>
                 <w:szCs w:val="22"/>
               </w:rPr>
-              <w:t>Do you want non div for the entire bar as we have written?</w:t>
+              <w:t xml:space="preserve">Do you want </w:t>
+            </w:r>
+            <w:proofErr w:type="gramStart"/>
+            <w:r>
+              <w:rPr>
+                <w:rFonts w:ascii="Times New Roman" w:eastAsia="Times" w:hAnsi="Times New Roman" w:cs="Times New Roman"/>
+                <w:sz w:val="22"/>
+                <w:szCs w:val="22"/>
+              </w:rPr>
+              <w:t>non div</w:t>
+            </w:r>
+            <w:proofErr w:type="gramEnd"/>
+            <w:r>
+              <w:rPr>
+                <w:rFonts w:ascii="Times New Roman" w:eastAsia="Times" w:hAnsi="Times New Roman" w:cs="Times New Roman"/>
+                <w:sz w:val="22"/>
+                <w:szCs w:val="22"/>
+              </w:rPr>
+              <w:t xml:space="preserve"> for the entire bar as we have written?</w:t>
             </w:r>
           </w:p>
         </w:tc>
@@ -1797,7 +1817,43 @@
                 <w:sz w:val="22"/>
                 <w:szCs w:val="22"/>
               </w:rPr>
-              <w:t>II, Vla, Vc.</w:t>
+              <w:t xml:space="preserve">II, </w:t>
+            </w:r>
+            <w:proofErr w:type="spellStart"/>
+            <w:r>
+              <w:rPr>
+                <w:rFonts w:ascii="Times New Roman" w:eastAsia="Times" w:hAnsi="Times New Roman" w:cs="Times New Roman"/>
+                <w:sz w:val="22"/>
+                <w:szCs w:val="22"/>
+              </w:rPr>
+              <w:t>Vla</w:t>
+            </w:r>
+            <w:proofErr w:type="spellEnd"/>
+            <w:r>
+              <w:rPr>
+                <w:rFonts w:ascii="Times New Roman" w:eastAsia="Times" w:hAnsi="Times New Roman" w:cs="Times New Roman"/>
+                <w:sz w:val="22"/>
+                <w:szCs w:val="22"/>
+              </w:rPr>
+              <w:t xml:space="preserve">, </w:t>
+            </w:r>
+            <w:proofErr w:type="spellStart"/>
+            <w:r>
+              <w:rPr>
+                <w:rFonts w:ascii="Times New Roman" w:eastAsia="Times" w:hAnsi="Times New Roman" w:cs="Times New Roman"/>
+                <w:sz w:val="22"/>
+                <w:szCs w:val="22"/>
+              </w:rPr>
+              <w:t>Vc</w:t>
+            </w:r>
+            <w:proofErr w:type="spellEnd"/>
+            <w:r>
+              <w:rPr>
+                <w:rFonts w:ascii="Times New Roman" w:eastAsia="Times" w:hAnsi="Times New Roman" w:cs="Times New Roman"/>
+                <w:sz w:val="22"/>
+                <w:szCs w:val="22"/>
+              </w:rPr>
+              <w:t>.</w:t>
             </w:r>
           </w:p>
         </w:tc>
@@ -1891,6 +1947,7 @@
               </w:rPr>
               <w:t xml:space="preserve">nderstand the </w:t>
             </w:r>
+            <w:proofErr w:type="gramStart"/>
             <w:r>
               <w:rPr>
                 <w:rFonts w:ascii="Times New Roman" w:eastAsia="Times" w:hAnsi="Times New Roman" w:cs="Times New Roman"/>
@@ -1905,7 +1962,16 @@
                 <w:sz w:val="22"/>
                 <w:szCs w:val="22"/>
               </w:rPr>
-              <w:t xml:space="preserve"> but this </w:t>
+              <w:t xml:space="preserve"> but</w:t>
+            </w:r>
+            <w:proofErr w:type="gramEnd"/>
+            <w:r>
+              <w:rPr>
+                <w:rFonts w:ascii="Times New Roman" w:eastAsia="Times" w:hAnsi="Times New Roman" w:cs="Times New Roman"/>
+                <w:sz w:val="22"/>
+                <w:szCs w:val="22"/>
+              </w:rPr>
+              <w:t xml:space="preserve"> this </w:t>
             </w:r>
             <w:r>
               <w:rPr>
@@ -2780,6 +2846,7 @@
                 <w:szCs w:val="22"/>
               </w:rPr>
             </w:pPr>
+            <w:proofErr w:type="spellStart"/>
             <w:r>
               <w:rPr>
                 <w:rFonts w:ascii="Times New Roman" w:eastAsia="Times" w:hAnsi="Times New Roman" w:cs="Times New Roman"/>
@@ -2787,7 +2854,17 @@
                 <w:sz w:val="22"/>
                 <w:szCs w:val="22"/>
               </w:rPr>
-              <w:t xml:space="preserve">Enharmonics: should flats be sharp for voice leading purposes here instead? </w:t>
+              <w:t>Enharmonics</w:t>
+            </w:r>
+            <w:proofErr w:type="spellEnd"/>
+            <w:r>
+              <w:rPr>
+                <w:rFonts w:ascii="Times New Roman" w:eastAsia="Times" w:hAnsi="Times New Roman" w:cs="Times New Roman"/>
+                <w:color w:val="000000" w:themeColor="text1"/>
+                <w:sz w:val="22"/>
+                <w:szCs w:val="22"/>
+              </w:rPr>
+              <w:t xml:space="preserve">: should flats be sharp for voice leading purposes here instead? </w:t>
             </w:r>
           </w:p>
         </w:tc>
@@ -2916,6 +2993,7 @@
               </w:rPr>
               <w:t xml:space="preserve">Staccatissimo on long held notes? Recommend using </w:t>
             </w:r>
+            <w:proofErr w:type="spellStart"/>
             <w:r>
               <w:rPr>
                 <w:rFonts w:ascii="Times New Roman" w:eastAsia="Times" w:hAnsi="Times New Roman" w:cs="Times New Roman"/>
@@ -2928,6 +3006,7 @@
               </w:rPr>
               <w:t>sfz</w:t>
             </w:r>
+            <w:proofErr w:type="spellEnd"/>
             <w:r>
               <w:rPr>
                 <w:rFonts w:ascii="Times New Roman" w:eastAsia="Times" w:hAnsi="Times New Roman" w:cs="Times New Roman"/>
@@ -3198,6 +3277,7 @@
                 <w:szCs w:val="22"/>
               </w:rPr>
             </w:pPr>
+            <w:proofErr w:type="spellStart"/>
             <w:r>
               <w:rPr>
                 <w:rFonts w:ascii="Times New Roman" w:eastAsia="Times" w:hAnsi="Times New Roman" w:cs="Times New Roman"/>
@@ -3206,6 +3286,7 @@
               </w:rPr>
               <w:t>Cbsn</w:t>
             </w:r>
+            <w:proofErr w:type="spellEnd"/>
           </w:p>
         </w:tc>
         <w:tc>
@@ -3904,13 +3985,15 @@
               <w:spacing w:line="276" w:lineRule="auto"/>
               <w:rPr>
                 <w:rFonts w:ascii="Times New Roman" w:eastAsia="Times" w:hAnsi="Times New Roman" w:cs="Times New Roman"/>
-                <w:sz w:val="22"/>
-                <w:szCs w:val="22"/>
-              </w:rPr>
-            </w:pPr>
-            <w:r>
-              <w:rPr>
-                <w:rFonts w:ascii="Times New Roman" w:eastAsia="Times" w:hAnsi="Times New Roman" w:cs="Times New Roman"/>
+                <w:color w:val="0066FF"/>
+                <w:sz w:val="22"/>
+                <w:szCs w:val="22"/>
+              </w:rPr>
+            </w:pPr>
+            <w:r>
+              <w:rPr>
+                <w:rFonts w:ascii="Times New Roman" w:eastAsia="Times" w:hAnsi="Times New Roman" w:cs="Times New Roman"/>
+                <w:color w:val="0066FF"/>
                 <w:sz w:val="22"/>
                 <w:szCs w:val="22"/>
               </w:rPr>
@@ -3934,13 +4017,15 @@
               <w:spacing w:line="276" w:lineRule="auto"/>
               <w:rPr>
                 <w:rFonts w:ascii="Times New Roman" w:eastAsia="Times" w:hAnsi="Times New Roman" w:cs="Times New Roman"/>
-                <w:sz w:val="22"/>
-                <w:szCs w:val="22"/>
-              </w:rPr>
-            </w:pPr>
-            <w:r>
-              <w:rPr>
-                <w:rFonts w:ascii="Times New Roman" w:eastAsia="Times" w:hAnsi="Times New Roman" w:cs="Times New Roman"/>
+                <w:color w:val="0066FF"/>
+                <w:sz w:val="22"/>
+                <w:szCs w:val="22"/>
+              </w:rPr>
+            </w:pPr>
+            <w:r>
+              <w:rPr>
+                <w:rFonts w:ascii="Times New Roman" w:eastAsia="Times" w:hAnsi="Times New Roman" w:cs="Times New Roman"/>
+                <w:color w:val="0066FF"/>
                 <w:sz w:val="22"/>
                 <w:szCs w:val="22"/>
               </w:rPr>
@@ -3964,13 +4049,15 @@
               <w:spacing w:line="276" w:lineRule="auto"/>
               <w:rPr>
                 <w:rFonts w:ascii="Times New Roman" w:eastAsia="Times" w:hAnsi="Times New Roman" w:cs="Times New Roman"/>
-                <w:sz w:val="22"/>
-                <w:szCs w:val="22"/>
-              </w:rPr>
-            </w:pPr>
-            <w:r>
-              <w:rPr>
-                <w:rFonts w:ascii="Times New Roman" w:eastAsia="Times" w:hAnsi="Times New Roman" w:cs="Times New Roman"/>
+                <w:color w:val="0066FF"/>
+                <w:sz w:val="22"/>
+                <w:szCs w:val="22"/>
+              </w:rPr>
+            </w:pPr>
+            <w:r>
+              <w:rPr>
+                <w:rFonts w:ascii="Times New Roman" w:eastAsia="Times" w:hAnsi="Times New Roman" w:cs="Times New Roman"/>
+                <w:color w:val="0066FF"/>
                 <w:sz w:val="22"/>
                 <w:szCs w:val="22"/>
               </w:rPr>
@@ -3979,6 +4066,7 @@
             <w:r>
               <w:rPr>
                 <w:rFonts w:ascii="Times New Roman" w:eastAsia="Times" w:hAnsi="Times New Roman" w:cs="Times New Roman"/>
+                <w:color w:val="0066FF"/>
                 <w:sz w:val="22"/>
                 <w:szCs w:val="22"/>
                 <w:vertAlign w:val="superscript"/>
@@ -3988,6 +4076,7 @@
             <w:r>
               <w:rPr>
                 <w:rFonts w:ascii="Times New Roman" w:eastAsia="Times" w:hAnsi="Times New Roman" w:cs="Times New Roman"/>
+                <w:color w:val="0066FF"/>
                 <w:sz w:val="22"/>
                 <w:szCs w:val="22"/>
               </w:rPr>
@@ -4011,13 +4100,15 @@
               <w:spacing w:line="276" w:lineRule="auto"/>
               <w:rPr>
                 <w:rFonts w:ascii="Times New Roman" w:eastAsia="Times" w:hAnsi="Times New Roman" w:cs="Times New Roman"/>
-                <w:sz w:val="22"/>
-                <w:szCs w:val="22"/>
-              </w:rPr>
-            </w:pPr>
-            <w:r>
-              <w:rPr>
-                <w:rFonts w:ascii="Times New Roman" w:eastAsia="Times" w:hAnsi="Times New Roman" w:cs="Times New Roman"/>
+                <w:color w:val="0066FF"/>
+                <w:sz w:val="22"/>
+                <w:szCs w:val="22"/>
+              </w:rPr>
+            </w:pPr>
+            <w:r>
+              <w:rPr>
+                <w:rFonts w:ascii="Times New Roman" w:eastAsia="Times" w:hAnsi="Times New Roman" w:cs="Times New Roman"/>
+                <w:color w:val="0066FF"/>
                 <w:sz w:val="22"/>
                 <w:szCs w:val="22"/>
               </w:rPr>
@@ -4122,7 +4213,27 @@
                 <w:sz w:val="22"/>
                 <w:szCs w:val="22"/>
               </w:rPr>
-              <w:t xml:space="preserve">Suggest swapping Tpt. 2 and 3 voices around for easier score reading. </w:t>
+              <w:t xml:space="preserve">Suggest swapping </w:t>
+            </w:r>
+            <w:proofErr w:type="spellStart"/>
+            <w:r>
+              <w:rPr>
+                <w:rFonts w:ascii="Times New Roman" w:eastAsia="Times" w:hAnsi="Times New Roman" w:cs="Times New Roman"/>
+                <w:color w:val="000000" w:themeColor="text1"/>
+                <w:sz w:val="22"/>
+                <w:szCs w:val="22"/>
+              </w:rPr>
+              <w:t>Tpt</w:t>
+            </w:r>
+            <w:proofErr w:type="spellEnd"/>
+            <w:r>
+              <w:rPr>
+                <w:rFonts w:ascii="Times New Roman" w:eastAsia="Times" w:hAnsi="Times New Roman" w:cs="Times New Roman"/>
+                <w:color w:val="000000" w:themeColor="text1"/>
+                <w:sz w:val="22"/>
+                <w:szCs w:val="22"/>
+              </w:rPr>
+              <w:t xml:space="preserve">. 2 and 3 voices around for easier score reading. </w:t>
             </w:r>
           </w:p>
         </w:tc>
@@ -4147,6 +4258,7 @@
                 <w:szCs w:val="22"/>
               </w:rPr>
             </w:pPr>
+            <w:proofErr w:type="gramStart"/>
             <w:r>
               <w:rPr>
                 <w:rFonts w:ascii="Times New Roman" w:eastAsia="Times" w:hAnsi="Times New Roman" w:cs="Times New Roman"/>
@@ -4154,7 +4266,17 @@
                 <w:sz w:val="22"/>
                 <w:szCs w:val="22"/>
               </w:rPr>
-              <w:t>No it's correct.</w:t>
+              <w:t>No</w:t>
+            </w:r>
+            <w:proofErr w:type="gramEnd"/>
+            <w:r>
+              <w:rPr>
+                <w:rFonts w:ascii="Times New Roman" w:eastAsia="Times" w:hAnsi="Times New Roman" w:cs="Times New Roman"/>
+                <w:color w:val="000000" w:themeColor="text1"/>
+                <w:sz w:val="22"/>
+                <w:szCs w:val="22"/>
+              </w:rPr>
+              <w:t xml:space="preserve"> it's correct.</w:t>
             </w:r>
           </w:p>
         </w:tc>
@@ -4255,7 +4377,27 @@
                 <w:sz w:val="22"/>
                 <w:szCs w:val="22"/>
               </w:rPr>
-              <w:t xml:space="preserve">Added treble clef change to reduce ledger lines in original alto clef. Lasts for 2 bars. </w:t>
+              <w:t xml:space="preserve">Added treble clef change to reduce ledger lines in original alto clef. </w:t>
+            </w:r>
+            <w:proofErr w:type="gramStart"/>
+            <w:r>
+              <w:rPr>
+                <w:rFonts w:ascii="Times New Roman" w:eastAsia="Times" w:hAnsi="Times New Roman" w:cs="Times New Roman"/>
+                <w:color w:val="E97132"/>
+                <w:sz w:val="22"/>
+                <w:szCs w:val="22"/>
+              </w:rPr>
+              <w:t>Lasts</w:t>
+            </w:r>
+            <w:proofErr w:type="gramEnd"/>
+            <w:r>
+              <w:rPr>
+                <w:rFonts w:ascii="Times New Roman" w:eastAsia="Times" w:hAnsi="Times New Roman" w:cs="Times New Roman"/>
+                <w:color w:val="E97132"/>
+                <w:sz w:val="22"/>
+                <w:szCs w:val="22"/>
+              </w:rPr>
+              <w:t xml:space="preserve"> for 2 bars. </w:t>
             </w:r>
           </w:p>
         </w:tc>
@@ -4316,13 +4458,23 @@
                 <w:szCs w:val="22"/>
               </w:rPr>
             </w:pPr>
-            <w:r>
-              <w:rPr>
-                <w:rFonts w:ascii="Times New Roman" w:eastAsia="Times" w:hAnsi="Times New Roman" w:cs="Times New Roman"/>
-                <w:sz w:val="22"/>
-                <w:szCs w:val="22"/>
-              </w:rPr>
-              <w:t>Picc.</w:t>
+            <w:proofErr w:type="spellStart"/>
+            <w:r>
+              <w:rPr>
+                <w:rFonts w:ascii="Times New Roman" w:eastAsia="Times" w:hAnsi="Times New Roman" w:cs="Times New Roman"/>
+                <w:sz w:val="22"/>
+                <w:szCs w:val="22"/>
+              </w:rPr>
+              <w:t>Picc</w:t>
+            </w:r>
+            <w:proofErr w:type="spellEnd"/>
+            <w:r>
+              <w:rPr>
+                <w:rFonts w:ascii="Times New Roman" w:eastAsia="Times" w:hAnsi="Times New Roman" w:cs="Times New Roman"/>
+                <w:sz w:val="22"/>
+                <w:szCs w:val="22"/>
+              </w:rPr>
+              <w:t>.</w:t>
             </w:r>
           </w:p>
         </w:tc>
@@ -4441,13 +4593,23 @@
                 <w:szCs w:val="22"/>
               </w:rPr>
             </w:pPr>
-            <w:r>
-              <w:rPr>
-                <w:rFonts w:ascii="Times New Roman" w:eastAsia="Times" w:hAnsi="Times New Roman" w:cs="Times New Roman"/>
-                <w:sz w:val="22"/>
-                <w:szCs w:val="22"/>
-              </w:rPr>
-              <w:t>Picc.</w:t>
+            <w:proofErr w:type="spellStart"/>
+            <w:r>
+              <w:rPr>
+                <w:rFonts w:ascii="Times New Roman" w:eastAsia="Times" w:hAnsi="Times New Roman" w:cs="Times New Roman"/>
+                <w:sz w:val="22"/>
+                <w:szCs w:val="22"/>
+              </w:rPr>
+              <w:t>Picc</w:t>
+            </w:r>
+            <w:proofErr w:type="spellEnd"/>
+            <w:r>
+              <w:rPr>
+                <w:rFonts w:ascii="Times New Roman" w:eastAsia="Times" w:hAnsi="Times New Roman" w:cs="Times New Roman"/>
+                <w:sz w:val="22"/>
+                <w:szCs w:val="22"/>
+              </w:rPr>
+              <w:t>.</w:t>
             </w:r>
           </w:p>
         </w:tc>
@@ -5597,13 +5759,41 @@
                 <w:szCs w:val="22"/>
               </w:rPr>
             </w:pPr>
-            <w:r>
-              <w:rPr>
-                <w:rFonts w:ascii="Times New Roman" w:eastAsia="Times" w:hAnsi="Times New Roman" w:cs="Times New Roman"/>
-                <w:sz w:val="22"/>
-                <w:szCs w:val="22"/>
-              </w:rPr>
-              <w:t xml:space="preserve">Tuplet within tuplet. </w:t>
+            <w:proofErr w:type="spellStart"/>
+            <w:r>
+              <w:rPr>
+                <w:rFonts w:ascii="Times New Roman" w:eastAsia="Times" w:hAnsi="Times New Roman" w:cs="Times New Roman"/>
+                <w:sz w:val="22"/>
+                <w:szCs w:val="22"/>
+              </w:rPr>
+              <w:t>Tuplet</w:t>
+            </w:r>
+            <w:proofErr w:type="spellEnd"/>
+            <w:r>
+              <w:rPr>
+                <w:rFonts w:ascii="Times New Roman" w:eastAsia="Times" w:hAnsi="Times New Roman" w:cs="Times New Roman"/>
+                <w:sz w:val="22"/>
+                <w:szCs w:val="22"/>
+              </w:rPr>
+              <w:t xml:space="preserve"> within </w:t>
+            </w:r>
+            <w:proofErr w:type="spellStart"/>
+            <w:r>
+              <w:rPr>
+                <w:rFonts w:ascii="Times New Roman" w:eastAsia="Times" w:hAnsi="Times New Roman" w:cs="Times New Roman"/>
+                <w:sz w:val="22"/>
+                <w:szCs w:val="22"/>
+              </w:rPr>
+              <w:t>tuplet</w:t>
+            </w:r>
+            <w:proofErr w:type="spellEnd"/>
+            <w:r>
+              <w:rPr>
+                <w:rFonts w:ascii="Times New Roman" w:eastAsia="Times" w:hAnsi="Times New Roman" w:cs="Times New Roman"/>
+                <w:sz w:val="22"/>
+                <w:szCs w:val="22"/>
+              </w:rPr>
+              <w:t xml:space="preserve">. </w:t>
             </w:r>
           </w:p>
         </w:tc>
@@ -6339,6 +6529,7 @@
           <w:rFonts w:ascii="Times New Roman" w:hAnsi="Times New Roman" w:cs="Times New Roman"/>
         </w:rPr>
       </w:pPr>
+      <w:proofErr w:type="spellStart"/>
       <w:r>
         <w:rPr>
           <w:rFonts w:ascii="Times New Roman" w:hAnsi="Times New Roman" w:cs="Times New Roman"/>
@@ -6346,7 +6537,34 @@
           <w:bCs/>
         </w:rPr>
         <w:lastRenderedPageBreak/>
-        <w:t>Prevous Errata (version 0 - solo vn only)</w:t>
+        <w:t>Prevous</w:t>
+      </w:r>
+      <w:proofErr w:type="spellEnd"/>
+      <w:r>
+        <w:rPr>
+          <w:rFonts w:ascii="Times New Roman" w:hAnsi="Times New Roman" w:cs="Times New Roman"/>
+          <w:b/>
+          <w:bCs/>
+        </w:rPr>
+        <w:t xml:space="preserve"> Errata (version 0 - solo </w:t>
+      </w:r>
+      <w:proofErr w:type="spellStart"/>
+      <w:r>
+        <w:rPr>
+          <w:rFonts w:ascii="Times New Roman" w:hAnsi="Times New Roman" w:cs="Times New Roman"/>
+          <w:b/>
+          <w:bCs/>
+        </w:rPr>
+        <w:t>vn</w:t>
+      </w:r>
+      <w:proofErr w:type="spellEnd"/>
+      <w:r>
+        <w:rPr>
+          <w:rFonts w:ascii="Times New Roman" w:hAnsi="Times New Roman" w:cs="Times New Roman"/>
+          <w:b/>
+          <w:bCs/>
+        </w:rPr>
+        <w:t xml:space="preserve"> only)</w:t>
       </w:r>
     </w:p>
     <w:tbl>
@@ -6394,8 +6612,16 @@
               <w:rPr>
                 <w:rFonts w:ascii="Times New Roman" w:eastAsia="Times" w:hAnsi="Times New Roman" w:cs="Times New Roman"/>
               </w:rPr>
-              <w:t>Solo Vn</w:t>
-            </w:r>
+              <w:t xml:space="preserve">Solo </w:t>
+            </w:r>
+            <w:proofErr w:type="spellStart"/>
+            <w:r>
+              <w:rPr>
+                <w:rFonts w:ascii="Times New Roman" w:eastAsia="Times" w:hAnsi="Times New Roman" w:cs="Times New Roman"/>
+              </w:rPr>
+              <w:t>Vn</w:t>
+            </w:r>
+            <w:proofErr w:type="spellEnd"/>
           </w:p>
         </w:tc>
         <w:tc>
@@ -6444,7 +6670,21 @@
               <w:rPr>
                 <w:rFonts w:ascii="Times New Roman" w:eastAsia="Times" w:hAnsi="Times New Roman" w:cs="Times New Roman"/>
               </w:rPr>
-              <w:t xml:space="preserve">s are redundant given the tenuto symbols. However, if it is a preference or the intention is for a more pronounced tenuto, let me know. If no preference, we could potentially remove them, except at key moments, and just ensure a tenuto symbol is present. </w:t>
+              <w:t xml:space="preserve">s are redundant given the tenuto symbols. However, if it is a preference or the intention is for a more pronounced tenuto, let me know. If </w:t>
+            </w:r>
+            <w:proofErr w:type="gramStart"/>
+            <w:r>
+              <w:rPr>
+                <w:rFonts w:ascii="Times New Roman" w:eastAsia="Times" w:hAnsi="Times New Roman" w:cs="Times New Roman"/>
+              </w:rPr>
+              <w:t>no</w:t>
+            </w:r>
+            <w:proofErr w:type="gramEnd"/>
+            <w:r>
+              <w:rPr>
+                <w:rFonts w:ascii="Times New Roman" w:eastAsia="Times" w:hAnsi="Times New Roman" w:cs="Times New Roman"/>
+              </w:rPr>
+              <w:t xml:space="preserve"> preference, we could potentially remove them, except at key moments, and just ensure a tenuto symbol is present. </w:t>
             </w:r>
           </w:p>
         </w:tc>
@@ -6530,7 +6770,21 @@
               <w:rPr>
                 <w:rFonts w:ascii="Times New Roman" w:eastAsia="Times" w:hAnsi="Times New Roman" w:cs="Times New Roman"/>
               </w:rPr>
-              <w:t>Technically does the sul G continue from m. 19 till the F in m. 27? Will format accordingly</w:t>
+              <w:t xml:space="preserve">Technically does the sul G continue from m. 19 till the F </w:t>
+            </w:r>
+            <w:proofErr w:type="gramStart"/>
+            <w:r>
+              <w:rPr>
+                <w:rFonts w:ascii="Times New Roman" w:eastAsia="Times" w:hAnsi="Times New Roman" w:cs="Times New Roman"/>
+              </w:rPr>
+              <w:t>in</w:t>
+            </w:r>
+            <w:proofErr w:type="gramEnd"/>
+            <w:r>
+              <w:rPr>
+                <w:rFonts w:ascii="Times New Roman" w:eastAsia="Times" w:hAnsi="Times New Roman" w:cs="Times New Roman"/>
+              </w:rPr>
+              <w:t xml:space="preserve"> m. 27? Will format accordingly</w:t>
             </w:r>
           </w:p>
         </w:tc>
@@ -6658,7 +6912,21 @@
               <w:rPr>
                 <w:rFonts w:ascii="Times New Roman" w:eastAsia="Times" w:hAnsi="Times New Roman" w:cs="Times New Roman"/>
               </w:rPr>
-              <w:t xml:space="preserve">. Should it dim. to a different dynamic, with a sub. </w:t>
+              <w:t xml:space="preserve">. Should it </w:t>
+            </w:r>
+            <w:proofErr w:type="gramStart"/>
+            <w:r>
+              <w:rPr>
+                <w:rFonts w:ascii="Times New Roman" w:eastAsia="Times" w:hAnsi="Times New Roman" w:cs="Times New Roman"/>
+              </w:rPr>
+              <w:t>dim.</w:t>
+            </w:r>
+            <w:proofErr w:type="gramEnd"/>
+            <w:r>
+              <w:rPr>
+                <w:rFonts w:ascii="Times New Roman" w:eastAsia="Times" w:hAnsi="Times New Roman" w:cs="Times New Roman"/>
+              </w:rPr>
+              <w:t xml:space="preserve"> to a different dynamic, with a sub. </w:t>
             </w:r>
             <w:r>
               <w:rPr>
@@ -6866,7 +7134,21 @@
               <w:rPr>
                 <w:rFonts w:ascii="Times New Roman" w:eastAsia="Times" w:hAnsi="Times New Roman" w:cs="Times New Roman"/>
               </w:rPr>
-              <w:t>Does meno mosso start at beat 1 of this bar or another beat?</w:t>
+              <w:t xml:space="preserve">Does </w:t>
+            </w:r>
+            <w:proofErr w:type="spellStart"/>
+            <w:r>
+              <w:rPr>
+                <w:rFonts w:ascii="Times New Roman" w:eastAsia="Times" w:hAnsi="Times New Roman" w:cs="Times New Roman"/>
+              </w:rPr>
+              <w:t>meno</w:t>
+            </w:r>
+            <w:proofErr w:type="spellEnd"/>
+            <w:r>
+              <w:rPr>
+                <w:rFonts w:ascii="Times New Roman" w:eastAsia="Times" w:hAnsi="Times New Roman" w:cs="Times New Roman"/>
+              </w:rPr>
+              <w:t xml:space="preserve"> mosso start at beat 1 of this bar or another beat?</w:t>
             </w:r>
           </w:p>
         </w:tc>

</xml_diff>